<commit_message>
Esquema general de conexiones del sistema GRIS
Se genera desde SVG (src/esquema_general.py) a partir del esquema EL CID y
se incluye como Figura 1 del procedimiento y como PDF A4 apaisado.
Las conexiones no confirmadas se dibujan a trazos.

Co-Authored-By: Claude Opus 5.5 <noreply@anthropic.com>
Claude-Session: https://claude.ai/code/session_01Nz5qZw2jp5HghH6VEfj4aK
</commit_message>
<xml_diff>
--- a/procedimientos_gris/00503-00-EPG001 Procedimiento Inspeccion Robotizada GRIS.docx
+++ b/procedimientos_gris/00503-00-EPG001 Procedimiento Inspeccion Robotizada GRIS.docx
@@ -469,7 +469,7 @@
           <w:sz w:val="19"/>
         </w:rPr>
         <w:tab/>
-        <w:t>8</w:t>
+        <w:t>10</w:t>
       </w:r>
     </w:p>
     <w:p>
@@ -491,7 +491,7 @@
           <w:sz w:val="19"/>
         </w:rPr>
         <w:tab/>
-        <w:t>8</w:t>
+        <w:t>10</w:t>
       </w:r>
     </w:p>
     <w:p>
@@ -513,7 +513,7 @@
           <w:sz w:val="19"/>
         </w:rPr>
         <w:tab/>
-        <w:t>9</w:t>
+        <w:t>11</w:t>
       </w:r>
     </w:p>
     <w:p>
@@ -536,7 +536,7 @@
           <w:sz w:val="19"/>
         </w:rPr>
         <w:tab/>
-        <w:t>10</w:t>
+        <w:t>12</w:t>
       </w:r>
       <w:r>
         <w:fldChar w:fldCharType="end"/>
@@ -2601,77 +2601,6 @@
                 <w:sz w:val="19"/>
                 <w:szCs w:val="19"/>
               </w:rPr>
-              <w:t xml:space="preserve">Esquema de conexiones</w:t>
-            </w:r>
-          </w:p>
-        </w:tc>
-        <w:tc>
-          <w:tcPr>
-            <w:tcW w:type="dxa" w:w="5838"/>
-            <w:tcBorders>
-              <w:top w:val="single" w:color="A6B4B8" w:sz="4"/>
-              <w:left w:val="single" w:color="A6B4B8" w:sz="4"/>
-              <w:bottom w:val="single" w:color="A6B4B8" w:sz="4"/>
-              <w:right w:val="single" w:color="A6B4B8" w:sz="4"/>
-            </w:tcBorders>
-            <w:tcMar>
-              <w:top w:type="dxa" w:w="50"/>
-              <w:left w:type="dxa" w:w="90"/>
-              <w:bottom w:type="dxa" w:w="50"/>
-              <w:right w:type="dxa" w:w="90"/>
-            </w:tcMar>
-            <w:vAlign w:val="top"/>
-          </w:tcPr>
-          <w:p>
-            <w:pPr>
-              <w:spacing w:after="0" w:line="252"/>
-              <w:jc w:val="left"/>
-            </w:pPr>
-            <w:r>
-              <w:rPr>
-                <w:b w:val="false"/>
-                <w:bCs w:val="false"/>
-                <w:sz w:val="19"/>
-                <w:szCs w:val="19"/>
-              </w:rPr>
-              <w:t xml:space="preserve">Conexionado del robot, la rampa, el control box, el tablero EL CID, el Variac y la PC.</w:t>
-            </w:r>
-          </w:p>
-        </w:tc>
-      </w:tr>
-      <w:tr>
-        <w:trPr>
-          <w:cantSplit/>
-        </w:trPr>
-        <w:tc>
-          <w:tcPr>
-            <w:tcW w:type="dxa" w:w="3800"/>
-            <w:tcBorders>
-              <w:top w:val="single" w:color="A6B4B8" w:sz="4"/>
-              <w:left w:val="single" w:color="A6B4B8" w:sz="4"/>
-              <w:bottom w:val="single" w:color="A6B4B8" w:sz="4"/>
-              <w:right w:val="single" w:color="A6B4B8" w:sz="4"/>
-            </w:tcBorders>
-            <w:tcMar>
-              <w:top w:type="dxa" w:w="50"/>
-              <w:left w:type="dxa" w:w="90"/>
-              <w:bottom w:type="dxa" w:w="50"/>
-              <w:right w:type="dxa" w:w="90"/>
-            </w:tcMar>
-            <w:vAlign w:val="top"/>
-          </w:tcPr>
-          <w:p>
-            <w:pPr>
-              <w:spacing w:after="0" w:line="252"/>
-              <w:jc w:val="left"/>
-            </w:pPr>
-            <w:r>
-              <w:rPr>
-                <w:b w:val="false"/>
-                <w:bCs w:val="false"/>
-                <w:sz w:val="19"/>
-                <w:szCs w:val="19"/>
-              </w:rPr>
               <w:t xml:space="preserve">00503-00-ZIT003 – Residual Part Detachment Risk Assessment</w:t>
             </w:r>
           </w:p>
@@ -3441,7 +3370,7 @@
                 <w:sz w:val="19"/>
                 <w:szCs w:val="19"/>
               </w:rPr>
-              <w:t xml:space="preserve">00503-00-EPG002 – Protocolo 3 / Manual de software GRIS</w:t>
+              <w:t xml:space="preserve">00503-00-EPG002 – Protocolo 3 / Manual de software GRIS / Figura 1</w:t>
             </w:r>
           </w:p>
         </w:tc>
@@ -8413,6 +8342,15 @@
         <w:t xml:space="preserve">2.8 CONFIGURACIÓN Y MONTAJE DEL SISTEMA GRIS</w:t>
       </w:r>
     </w:p>
+    <w:p>
+      <w:pPr>
+        <w:spacing w:after="100" w:line="264"/>
+        <w:jc w:val="both"/>
+      </w:pPr>
+      <w:r>
+        <w:t xml:space="preserve">Las conexiones se realizan según el esquema general de la Figura 1.</w:t>
+      </w:r>
+    </w:p>
     <w:tbl>
       <w:tblPr>
         <w:tblW w:type="dxa" w:w="9638"/>
@@ -9157,7 +9095,7 @@
                 <w:sz w:val="19"/>
                 <w:szCs w:val="19"/>
               </w:rPr>
-              <w:t xml:space="preserve">Esquema de conexiones / 00503-00-EPG002 – Protocolo 1</w:t>
+              <w:t xml:space="preserve">Figura 1 / 00503-00-EPG002 – Protocolo 1</w:t>
             </w:r>
           </w:p>
         </w:tc>
@@ -9579,6 +9517,74 @@
         </w:tc>
       </w:tr>
     </w:tbl>
+    <w:p>
+      <w:r>
+        <w:br w:type="page"/>
+      </w:r>
+    </w:p>
+    <w:p>
+      <w:pPr>
+        <w:keepNext/>
+        <w:spacing w:after="60" w:before="120"/>
+        <w:jc w:val="center"/>
+      </w:pPr>
+      <w:r>
+        <w:drawing>
+          <wp:inline distT="0" distB="0" distL="0" distR="0">
+            <wp:extent cx="5467350" cy="7953375"/>
+            <wp:effectExtent t="0" r="0" b="0" l="0"/>
+            <wp:docPr id="1" name="esquema_general_vertical.png" descr="Figura 1: Esquema general de conexiones del sistema GRIS (líneas a trazos: conexiones a confirmar)" title="Figura 1: Esquema general de conexiones del sistema GRIS (líneas a trazos: conexiones a confirmar)"/>
+            <wp:cNvGraphicFramePr>
+              <a:graphicFrameLocks xmlns:a="http://schemas.openxmlformats.org/drawingml/2006/main" noChangeAspect="1"/>
+            </wp:cNvGraphicFramePr>
+            <a:graphic xmlns:a="http://schemas.openxmlformats.org/drawingml/2006/main">
+              <a:graphicData uri="http://schemas.openxmlformats.org/drawingml/2006/picture">
+                <pic:pic xmlns:pic="http://schemas.openxmlformats.org/drawingml/2006/picture">
+                  <pic:nvPicPr>
+                    <pic:cNvPr id="0" name="" descr=""/>
+                    <pic:cNvPicPr>
+                      <a:picLocks noChangeAspect="1" noChangeArrowheads="1"/>
+                    </pic:cNvPicPr>
+                  </pic:nvPicPr>
+                  <pic:blipFill>
+                    <a:blip r:embed="rId9" cstate="none"/>
+                    <a:srcRect/>
+                    <a:stretch>
+                      <a:fillRect/>
+                    </a:stretch>
+                  </pic:blipFill>
+                  <pic:spPr bwMode="auto">
+                    <a:xfrm>
+                      <a:off x="0" y="0"/>
+                      <a:ext cx="5467350" cy="7953375"/>
+                    </a:xfrm>
+                    <a:prstGeom prst="rect">
+                      <a:avLst/>
+                    </a:prstGeom>
+                  </pic:spPr>
+                </pic:pic>
+              </a:graphicData>
+            </a:graphic>
+          </wp:inline>
+        </w:drawing>
+      </w:r>
+    </w:p>
+    <w:p>
+      <w:pPr>
+        <w:spacing w:after="200"/>
+        <w:jc w:val="center"/>
+      </w:pPr>
+      <w:r>
+        <w:rPr>
+          <w:i/>
+          <w:iCs/>
+          <w:color w:val="6D8289"/>
+          <w:sz w:val="18"/>
+          <w:szCs w:val="18"/>
+        </w:rPr>
+        <w:t xml:space="preserve">Figura 1: Esquema general de conexiones del sistema GRIS (líneas a trazos: conexiones a confirmar)</w:t>
+      </w:r>
+    </w:p>
     <w:p>
       <w:pPr>
         <w:pStyle w:val="Heading2"/>

</xml_diff>

<commit_message>
Esquema general de conexiones rediseñado
Dos PC (GRIS y EL CID), rampa sin conexión, captor y posición del robot al
tablero EL CID. Zonas, cables numerados con lista, rótulo con logo.
El procedimiento se actualiza para las dos PC.

Co-Authored-By: Claude Opus 5.5 <noreply@anthropic.com>
Claude-Session: https://claude.ai/code/session_01Nz5qZw2jp5HghH6VEfj4aK
</commit_message>
<xml_diff>
--- a/procedimientos_gris/00503-00-EPG001 Procedimiento Inspeccion Robotizada GRIS.docx
+++ b/procedimientos_gris/00503-00-EPG001 Procedimiento Inspeccion Robotizada GRIS.docx
@@ -855,7 +855,7 @@
                 <w:sz w:val="19"/>
                 <w:szCs w:val="19"/>
               </w:rPr>
-              <w:t xml:space="preserve">Caja de control que alimenta y comanda el robot y la rampa.</w:t>
+              <w:t xml:space="preserve">Caja de control que alimenta y comanda el robot.</w:t>
             </w:r>
           </w:p>
         </w:tc>
@@ -2563,7 +2563,7 @@
                 <w:sz w:val="19"/>
                 <w:szCs w:val="19"/>
               </w:rPr>
-              <w:t xml:space="preserve">Operación del software de control del robot y de la rampa.</w:t>
+              <w:t xml:space="preserve">Operación del software de control del robot.</w:t>
             </w:r>
           </w:p>
         </w:tc>
@@ -4117,7 +4117,7 @@
                 <w:sz w:val="19"/>
                 <w:szCs w:val="19"/>
               </w:rPr>
-              <w:t xml:space="preserve">Alimentación y control del robot y de la rampa.</w:t>
+              <w:t xml:space="preserve">Alimentación y control del robot.</w:t>
             </w:r>
           </w:p>
         </w:tc>
@@ -5130,7 +5130,7 @@
                 <w:sz w:val="19"/>
                 <w:szCs w:val="19"/>
               </w:rPr>
-              <w:t xml:space="preserve">PC portátil con software GRIS y ELCSoft</w:t>
+              <w:t xml:space="preserve">PC GRIS</w:t>
             </w:r>
           </w:p>
         </w:tc>
@@ -5163,7 +5163,78 @@
                 <w:sz w:val="19"/>
                 <w:szCs w:val="19"/>
               </w:rPr>
-              <w:t xml:space="preserve">Control del sistema, adquisición y almacenamiento de datos.</w:t>
+              <w:t xml:space="preserve">Control del robot (software GRIS), conectada al control box por USB y Ethernet.</w:t>
+            </w:r>
+          </w:p>
+        </w:tc>
+      </w:tr>
+      <w:tr>
+        <w:trPr>
+          <w:cantSplit/>
+        </w:trPr>
+        <w:tc>
+          <w:tcPr>
+            <w:tcW w:type="dxa" w:w="3600"/>
+            <w:tcBorders>
+              <w:top w:val="single" w:color="A6B4B8" w:sz="4"/>
+              <w:left w:val="single" w:color="A6B4B8" w:sz="4"/>
+              <w:bottom w:val="single" w:color="A6B4B8" w:sz="4"/>
+              <w:right w:val="single" w:color="A6B4B8" w:sz="4"/>
+            </w:tcBorders>
+            <w:tcMar>
+              <w:top w:type="dxa" w:w="50"/>
+              <w:left w:type="dxa" w:w="90"/>
+              <w:bottom w:type="dxa" w:w="50"/>
+              <w:right w:type="dxa" w:w="90"/>
+            </w:tcMar>
+            <w:vAlign w:val="top"/>
+          </w:tcPr>
+          <w:p>
+            <w:pPr>
+              <w:spacing w:after="0" w:line="252"/>
+              <w:jc w:val="left"/>
+            </w:pPr>
+            <w:r>
+              <w:rPr>
+                <w:b w:val="false"/>
+                <w:bCs w:val="false"/>
+                <w:sz w:val="19"/>
+                <w:szCs w:val="19"/>
+              </w:rPr>
+              <w:t xml:space="preserve">PC EL CID</w:t>
+            </w:r>
+          </w:p>
+        </w:tc>
+        <w:tc>
+          <w:tcPr>
+            <w:tcW w:type="dxa" w:w="6038"/>
+            <w:tcBorders>
+              <w:top w:val="single" w:color="A6B4B8" w:sz="4"/>
+              <w:left w:val="single" w:color="A6B4B8" w:sz="4"/>
+              <w:bottom w:val="single" w:color="A6B4B8" w:sz="4"/>
+              <w:right w:val="single" w:color="A6B4B8" w:sz="4"/>
+            </w:tcBorders>
+            <w:tcMar>
+              <w:top w:type="dxa" w:w="50"/>
+              <w:left w:type="dxa" w:w="90"/>
+              <w:bottom w:type="dxa" w:w="50"/>
+              <w:right w:type="dxa" w:w="90"/>
+            </w:tcMar>
+            <w:vAlign w:val="top"/>
+          </w:tcPr>
+          <w:p>
+            <w:pPr>
+              <w:spacing w:after="0" w:line="252"/>
+              <w:jc w:val="left"/>
+            </w:pPr>
+            <w:r>
+              <w:rPr>
+                <w:b w:val="false"/>
+                <w:bCs w:val="false"/>
+                <w:sz w:val="19"/>
+                <w:szCs w:val="19"/>
+              </w:rPr>
+              <w:t xml:space="preserve">Adquisición del ensayo EL CID (ELCSoft), conectada al tablero EL CID por USB.</w:t>
             </w:r>
           </w:p>
         </w:tc>
@@ -6617,7 +6688,7 @@
                 <w:sz w:val="19"/>
                 <w:szCs w:val="19"/>
               </w:rPr>
-              <w:t xml:space="preserve">Confirmar la disponibilidad de alimentación para la PC, el tablero EL CID, el control box, la rampa y el Variac. Verificar la protección diferencial.</w:t>
+              <w:t xml:space="preserve">Confirmar la disponibilidad de alimentación para la PC GRIS, la PC EL CID, el control box, el tablero EL CID y el Variac. Verificar la protección diferencial.</w:t>
             </w:r>
           </w:p>
         </w:tc>
@@ -9062,7 +9133,7 @@
                 <w:sz w:val="19"/>
                 <w:szCs w:val="19"/>
               </w:rPr>
-              <w:t xml:space="preserve">Conectar el control box, el tablero EL CID, la rampa, el Variac, la PC y todos los dispositivos de control, adquisición y potencia, respetando el esquema de puesta a tierra.</w:t>
+              <w:t xml:space="preserve">Realizar las conexiones de la Figura 1: robot con control box y con tablero EL CID; PC GRIS con control box (USB y Ethernet); PC EL CID con tablero EL CID (USB); circuito de excitación y alimentaciones, respetando el esquema de puesta a tierra.</w:t>
             </w:r>
           </w:p>
         </w:tc>
@@ -12317,7 +12388,7 @@
                 <w:sz w:val="19"/>
                 <w:szCs w:val="19"/>
               </w:rPr>
-              <w:t xml:space="preserve">Guardar los datos periódicamente en la PC y en un segundo dispositivo de almacenamiento.</w:t>
+              <w:t xml:space="preserve">Guardar los datos periódicamente en las PC y en un segundo dispositivo de almacenamiento.</w:t>
             </w:r>
           </w:p>
         </w:tc>

</xml_diff>

<commit_message>
Esquema general de conexiones en estilo simple y didáctico
Rectángulos y líneas finas como el esquema EL CID original, sin sombras ni
rótulo. Dos PC dibujadas, alimentación de cada equipo desde la zapatilla,
puentes en los cruces de la tierra y arrollamiento a través del núcleo.

Co-Authored-By: Claude Opus 5.5 <noreply@anthropic.com>
Claude-Session: https://claude.ai/code/session_01Nz5qZw2jp5HghH6VEfj4aK
</commit_message>
<xml_diff>
--- a/procedimientos_gris/00503-00-EPG001 Procedimiento Inspeccion Robotizada GRIS.docx
+++ b/procedimientos_gris/00503-00-EPG001 Procedimiento Inspeccion Robotizada GRIS.docx
@@ -9604,7 +9604,7 @@
           <wp:inline distT="0" distB="0" distL="0" distR="0">
             <wp:extent cx="5467350" cy="7953375"/>
             <wp:effectExtent t="0" r="0" b="0" l="0"/>
-            <wp:docPr id="1" name="esquema_general_vertical.png" descr="Figura 1: Esquema general de conexiones del sistema GRIS (líneas a trazos: conexiones a confirmar)" title="Figura 1: Esquema general de conexiones del sistema GRIS (líneas a trazos: conexiones a confirmar)"/>
+            <wp:docPr id="1" name="esquema_general_vertical.png" descr="Figura 1: Esquema general de conexiones del sistema GRIS" title="Figura 1: Esquema general de conexiones del sistema GRIS"/>
             <wp:cNvGraphicFramePr>
               <a:graphicFrameLocks xmlns:a="http://schemas.openxmlformats.org/drawingml/2006/main" noChangeAspect="1"/>
             </wp:cNvGraphicFramePr>
@@ -9653,7 +9653,7 @@
           <w:sz w:val="18"/>
           <w:szCs w:val="18"/>
         </w:rPr>
-        <w:t xml:space="preserve">Figura 1: Esquema general de conexiones del sistema GRIS (líneas a trazos: conexiones a confirmar)</w:t>
+        <w:t xml:space="preserve">Figura 1: Esquema general de conexiones del sistema GRIS</w:t>
       </w:r>
     </w:p>
     <w:p>

</xml_diff>

<commit_message>
Esquema con ilustraciones de los tableros y tablero de excitación
Control box, tablero EL CID y tablero de excitación dibujados a partir de
fotos, con colores y proporciones reales. Se quita el tablero de control del
Variac; la excitación se hace con cable de 5 hilos en serie en el tablero de
excitación, que también aloja el circuito de la espira auxiliar. Los cruces
de líneas se dibujan con puentes.

Co-Authored-By: Claude Opus 5.5 <noreply@anthropic.com>
Claude-Session: https://claude.ai/code/session_01Nz5qZw2jp5HghH6VEfj4aK
</commit_message>
<xml_diff>
--- a/procedimientos_gris/00503-00-EPG001 Procedimiento Inspeccion Robotizada GRIS.docx
+++ b/procedimientos_gris/00503-00-EPG001 Procedimiento Inspeccion Robotizada GRIS.docx
@@ -1281,7 +1281,78 @@
                 <w:sz w:val="19"/>
                 <w:szCs w:val="19"/>
               </w:rPr>
-              <w:t xml:space="preserve">Fuente de CA de tensión variable que alimenta el arrollamiento de excitación.</w:t>
+              <w:t xml:space="preserve">Fuente de CA de tensión variable que alimenta el circuito de excitación.</w:t>
+            </w:r>
+          </w:p>
+        </w:tc>
+      </w:tr>
+      <w:tr>
+        <w:trPr>
+          <w:cantSplit/>
+        </w:trPr>
+        <w:tc>
+          <w:tcPr>
+            <w:tcW w:type="dxa" w:w="1700"/>
+            <w:tcBorders>
+              <w:top w:val="single" w:color="A6B4B8" w:sz="4"/>
+              <w:left w:val="single" w:color="A6B4B8" w:sz="4"/>
+              <w:bottom w:val="single" w:color="A6B4B8" w:sz="4"/>
+              <w:right w:val="single" w:color="A6B4B8" w:sz="4"/>
+            </w:tcBorders>
+            <w:tcMar>
+              <w:top w:type="dxa" w:w="50"/>
+              <w:left w:type="dxa" w:w="90"/>
+              <w:bottom w:type="dxa" w:w="50"/>
+              <w:right w:type="dxa" w:w="90"/>
+            </w:tcMar>
+            <w:vAlign w:val="top"/>
+          </w:tcPr>
+          <w:p>
+            <w:pPr>
+              <w:spacing w:after="0" w:line="252"/>
+              <w:jc w:val="left"/>
+            </w:pPr>
+            <w:r>
+              <w:rPr>
+                <w:b w:val="false"/>
+                <w:bCs w:val="false"/>
+                <w:sz w:val="19"/>
+                <w:szCs w:val="19"/>
+              </w:rPr>
+              <w:t xml:space="preserve">Tablero de excitación</w:t>
+            </w:r>
+          </w:p>
+        </w:tc>
+        <w:tc>
+          <w:tcPr>
+            <w:tcW w:type="dxa" w:w="7938"/>
+            <w:tcBorders>
+              <w:top w:val="single" w:color="A6B4B8" w:sz="4"/>
+              <w:left w:val="single" w:color="A6B4B8" w:sz="4"/>
+              <w:bottom w:val="single" w:color="A6B4B8" w:sz="4"/>
+              <w:right w:val="single" w:color="A6B4B8" w:sz="4"/>
+            </w:tcBorders>
+            <w:tcMar>
+              <w:top w:type="dxa" w:w="50"/>
+              <w:left w:type="dxa" w:w="90"/>
+              <w:bottom w:type="dxa" w:w="50"/>
+              <w:right w:type="dxa" w:w="90"/>
+            </w:tcMar>
+            <w:vAlign w:val="top"/>
+          </w:tcPr>
+          <w:p>
+            <w:pPr>
+              <w:spacing w:after="0" w:line="252"/>
+              <w:jc w:val="left"/>
+            </w:pPr>
+            <w:r>
+              <w:rPr>
+                <w:b w:val="false"/>
+                <w:bCs w:val="false"/>
+                <w:sz w:val="19"/>
+                <w:szCs w:val="19"/>
+              </w:rPr>
+              <w:t xml:space="preserve">Tablero donde se conectan en serie los hilos del cable de excitación y el circuito de la espira auxiliar.</w:t>
             </w:r>
           </w:p>
         </w:tc>
@@ -4442,7 +4513,7 @@
                 <w:sz w:val="19"/>
                 <w:szCs w:val="19"/>
               </w:rPr>
-              <w:t xml:space="preserve">Alimentación del arrollamiento de excitación del núcleo.</w:t>
+              <w:t xml:space="preserve">Alimentación del circuito de excitación (salida 0–250 V).</w:t>
             </w:r>
           </w:p>
         </w:tc>
@@ -4480,7 +4551,7 @@
                 <w:sz w:val="19"/>
                 <w:szCs w:val="19"/>
               </w:rPr>
-              <w:t xml:space="preserve">Cable de excitación (50 m)</w:t>
+              <w:t xml:space="preserve">Tablero de excitación</w:t>
             </w:r>
           </w:p>
         </w:tc>
@@ -4513,7 +4584,7 @@
                 <w:sz w:val="19"/>
                 <w:szCs w:val="19"/>
               </w:rPr>
-              <w:t xml:space="preserve">Arrollamiento de excitación del núcleo.</w:t>
+              <w:t xml:space="preserve">Bornera EXCITATION para conectar en serie los hilos del cable de excitación y salida de la corriente de magnetización al tablero EL CID; bornera AUXILIAR con resistencias de calibración, llave del circuito y fichas banana para medir la tensión por espira (00503-00-EPG002 – Protocolo 2).</w:t>
             </w:r>
           </w:p>
         </w:tc>
@@ -4551,7 +4622,7 @@
                 <w:sz w:val="19"/>
                 <w:szCs w:val="19"/>
               </w:rPr>
-              <w:t xml:space="preserve">Cable de espira auxiliar</w:t>
+              <w:t xml:space="preserve">Cable de excitación de 5 hilos</w:t>
             </w:r>
           </w:p>
         </w:tc>
@@ -4584,7 +4655,7 @@
                 <w:sz w:val="19"/>
                 <w:szCs w:val="19"/>
               </w:rPr>
-              <w:t xml:space="preserve">Medición de la tensión por espira y calibración.</w:t>
+              <w:t xml:space="preserve">Espiras de excitación del núcleo, conectadas en serie en el tablero de excitación.</w:t>
             </w:r>
           </w:p>
         </w:tc>
@@ -4622,7 +4693,7 @@
                 <w:sz w:val="19"/>
                 <w:szCs w:val="19"/>
               </w:rPr>
-              <w:t xml:space="preserve">Kit de calibración</w:t>
+              <w:t xml:space="preserve">Cable de espira auxiliar</w:t>
             </w:r>
           </w:p>
         </w:tc>
@@ -4655,7 +4726,7 @@
                 <w:sz w:val="19"/>
                 <w:szCs w:val="19"/>
               </w:rPr>
-              <w:t xml:space="preserve">Resistencias de calibración y cables con fichas banana para la falla controlada (00503-00-EPG002 – Protocolo 2).</w:t>
+              <w:t xml:space="preserve">Medición de la tensión por espira y calibración.</w:t>
             </w:r>
           </w:p>
         </w:tc>
@@ -8052,7 +8123,7 @@
                 <w:sz w:val="19"/>
                 <w:szCs w:val="19"/>
               </w:rPr>
-              <w:t xml:space="preserve">Montar el arrollamiento de excitación y el Variac según el cálculo aprobado.</w:t>
+              <w:t xml:space="preserve">Montar el cable de excitación de 5 hilos a través del entrehierro y conectar sus extremos a la bornera EXCITATION del tablero de excitación, haciendo coincidir números y colores, de modo que las espiras queden en serie. Conectar el Variac a la ficha del tablero de excitación, según el cálculo aprobado.</w:t>
             </w:r>
           </w:p>
         </w:tc>
@@ -9133,7 +9204,7 @@
                 <w:sz w:val="19"/>
                 <w:szCs w:val="19"/>
               </w:rPr>
-              <w:t xml:space="preserve">Realizar las conexiones de la Figura 1: arnés del robot al control box (cable principal) y al tablero EL CID (señal del captor); control box al tablero EL CID (señal de posición); PC GRIS al control box (USB y Ethernet); PC EL CID al tablero EL CID (USB); circuito de excitación y alimentaciones desde la zapatilla, respetando el esquema de puesta a tierra.</w:t>
+              <w:t xml:space="preserve">Realizar las conexiones de la Figura 1: arnés del robot al control box (cable principal) y al tablero EL CID (señal del captor); control box al tablero EL CID (señal de posición); PC GRIS al control box (USB y Ethernet); PC EL CID al tablero EL CID (USB); tablero de excitación (Variac, cable de 5 hilos, espira auxiliar y salida al tablero EL CID) y alimentaciones desde la zapatilla, respetando el esquema de puesta a tierra.</w:t>
             </w:r>
           </w:p>
         </w:tc>
@@ -12700,7 +12771,7 @@
                 <w:sz w:val="19"/>
                 <w:szCs w:val="19"/>
               </w:rPr>
-              <w:t xml:space="preserve">Desmontar el robot, la rampa, el tablero EL CID, el control box, el Variac, el arrollamiento de excitación, la espira auxiliar, las barreras y la cartelería. Limpiar el área y cerrar los permisos.</w:t>
+              <w:t xml:space="preserve">Desmontar el robot, la rampa, el tablero EL CID, el control box, el tablero de excitación, el Variac, el arrollamiento de excitación, la espira auxiliar, las barreras y la cartelería. Limpiar el área y cerrar los permisos.</w:t>
             </w:r>
           </w:p>
         </w:tc>

</xml_diff>

<commit_message>
Esquema: PC a la izquierda, conexiones internas del tablero de excitación
PC y zapatilla a la izquierda, tableros al centro y estator a la derecha.
Bornera de 7 bornes de dos niveles con puentes internos, interruptor,
ficha del Variac (cable grueso) y circuito auxiliar con resistencias, llave
y fichas banana. Corriente de excitación en rojo, arnés del robot como malla
negra, robot redibujado, y voltímetro y pinza UNI-T en la espira auxiliar.

Co-Authored-By: Claude Opus 5.5 <noreply@anthropic.com>
Claude-Session: https://claude.ai/code/session_01Nz5qZw2jp5HghH6VEfj4aK
</commit_message>
<xml_diff>
--- a/procedimientos_gris/00503-00-EPG001 Procedimiento Inspeccion Robotizada GRIS.docx
+++ b/procedimientos_gris/00503-00-EPG001 Procedimiento Inspeccion Robotizada GRIS.docx
@@ -4947,7 +4947,7 @@
                 <w:sz w:val="19"/>
                 <w:szCs w:val="19"/>
               </w:rPr>
-              <w:t xml:space="preserve">Multímetro y pinza amperométrica</w:t>
+              <w:t xml:space="preserve">Multímetro y pinza amperométrica (UNI-T)</w:t>
             </w:r>
           </w:p>
         </w:tc>
@@ -4980,7 +4980,7 @@
                 <w:sz w:val="19"/>
                 <w:szCs w:val="19"/>
               </w:rPr>
-              <w:t xml:space="preserve">Control de la tensión por espira y de la corriente de excitación.</w:t>
+              <w:t xml:space="preserve">Medición de la tensión por espira (fichas banana del tablero de excitación) y de la corriente en la espira auxiliar.</w:t>
             </w:r>
           </w:p>
         </w:tc>

</xml_diff>

<commit_message>
Esquema y procedimiento: circuito auxiliar separado y precaución del tablero de excitación
Bornera EXCITATION numerada 1–5 según los colores de los hilos (fila
inferior corrida una posición). Llave Schneider separada, en el circuito de
la espira auxiliar; la espira llega sola por arriba a AUX 1 y 2 y las
fichas banana, la llave y la protoboard se conectan por abajo. Señal del
captor saliendo del arnés; pinza girada para no tapar el cable de
excitación; instrumentos sin marca. Advertencia de tablero en desarrollo y
paso de conexión segura de la ficha del Variac.

Co-Authored-By: Claude Opus 5.5 <noreply@anthropic.com>
Claude-Session: https://claude.ai/code/session_01Nz5qZw2jp5HghH6VEfj4aK
</commit_message>
<xml_diff>
--- a/procedimientos_gris/00503-00-EPG001 Procedimiento Inspeccion Robotizada GRIS.docx
+++ b/procedimientos_gris/00503-00-EPG001 Procedimiento Inspeccion Robotizada GRIS.docx
@@ -447,7 +447,7 @@
           <w:sz w:val="19"/>
         </w:rPr>
         <w:tab/>
-        <w:t>7</w:t>
+        <w:t>8</w:t>
       </w:r>
     </w:p>
     <w:p>
@@ -1966,7 +1966,7 @@
                 <w:sz w:val="19"/>
                 <w:szCs w:val="19"/>
               </w:rPr>
-              <w:t xml:space="preserve">Pasada de reconocimiento (paso 28); cuerdas de seguridad con tensión constante.</w:t>
+              <w:t xml:space="preserve">Pasada de reconocimiento (paso 29); cuerdas de seguridad con tensión constante.</w:t>
             </w:r>
           </w:p>
         </w:tc>
@@ -2070,7 +2070,7 @@
                 <w:sz w:val="19"/>
                 <w:szCs w:val="19"/>
               </w:rPr>
-              <w:t xml:space="preserve">Límite de avance axial seguro (paso 30); cuerdas de seguridad.</w:t>
+              <w:t xml:space="preserve">Límite de avance axial seguro (paso 31); cuerdas de seguridad.</w:t>
             </w:r>
           </w:p>
         </w:tc>
@@ -2174,7 +2174,111 @@
                 <w:sz w:val="19"/>
                 <w:szCs w:val="19"/>
               </w:rPr>
-              <w:t xml:space="preserve">Riesgo residual evaluado en 00503-00-ZIT003 (todas las posiciones: bajo o muy bajo). Verificación pre y post-ensayo con 00503-00-ZRQ001 (pasos 26 y 45).</w:t>
+              <w:t xml:space="preserve">Riesgo residual evaluado en 00503-00-ZIT003 (todas las posiciones: bajo o muy bajo). Verificación pre y post-ensayo con 00503-00-ZRQ001 (pasos 27 y 46).</w:t>
+            </w:r>
+          </w:p>
+        </w:tc>
+      </w:tr>
+      <w:tr>
+        <w:trPr>
+          <w:cantSplit/>
+        </w:trPr>
+        <w:tc>
+          <w:tcPr>
+            <w:tcW w:type="dxa" w:w="3500"/>
+            <w:tcBorders>
+              <w:top w:val="single" w:color="A6B4B8" w:sz="4"/>
+              <w:left w:val="single" w:color="A6B4B8" w:sz="4"/>
+              <w:bottom w:val="single" w:color="A6B4B8" w:sz="4"/>
+              <w:right w:val="single" w:color="A6B4B8" w:sz="4"/>
+            </w:tcBorders>
+            <w:tcMar>
+              <w:top w:type="dxa" w:w="50"/>
+              <w:left w:type="dxa" w:w="90"/>
+              <w:bottom w:type="dxa" w:w="50"/>
+              <w:right w:type="dxa" w:w="90"/>
+            </w:tcMar>
+            <w:vAlign w:val="top"/>
+          </w:tcPr>
+          <w:p>
+            <w:pPr>
+              <w:spacing w:after="0" w:line="252"/>
+              <w:jc w:val="left"/>
+            </w:pPr>
+            <w:r>
+              <w:rPr>
+                <w:b w:val="false"/>
+                <w:bCs w:val="false"/>
+                <w:sz w:val="19"/>
+                <w:szCs w:val="19"/>
+              </w:rPr>
+              <w:t xml:space="preserve">Tablero de excitación en desarrollo; ficha del Variac con contactos macho expuestos.</w:t>
+            </w:r>
+          </w:p>
+        </w:tc>
+        <w:tc>
+          <w:tcPr>
+            <w:tcW w:type="dxa" w:w="2900"/>
+            <w:tcBorders>
+              <w:top w:val="single" w:color="A6B4B8" w:sz="4"/>
+              <w:left w:val="single" w:color="A6B4B8" w:sz="4"/>
+              <w:bottom w:val="single" w:color="A6B4B8" w:sz="4"/>
+              <w:right w:val="single" w:color="A6B4B8" w:sz="4"/>
+            </w:tcBorders>
+            <w:tcMar>
+              <w:top w:type="dxa" w:w="50"/>
+              <w:left w:type="dxa" w:w="90"/>
+              <w:bottom w:type="dxa" w:w="50"/>
+              <w:right w:type="dxa" w:w="90"/>
+            </w:tcMar>
+            <w:vAlign w:val="top"/>
+          </w:tcPr>
+          <w:p>
+            <w:pPr>
+              <w:spacing w:after="0" w:line="252"/>
+              <w:jc w:val="left"/>
+            </w:pPr>
+            <w:r>
+              <w:rPr>
+                <w:b w:val="false"/>
+                <w:bCs w:val="false"/>
+                <w:sz w:val="19"/>
+                <w:szCs w:val="19"/>
+              </w:rPr>
+              <w:t xml:space="preserve">Choque eléctrico.</w:t>
+            </w:r>
+          </w:p>
+        </w:tc>
+        <w:tc>
+          <w:tcPr>
+            <w:tcW w:type="dxa" w:w="3238"/>
+            <w:tcBorders>
+              <w:top w:val="single" w:color="A6B4B8" w:sz="4"/>
+              <w:left w:val="single" w:color="A6B4B8" w:sz="4"/>
+              <w:bottom w:val="single" w:color="A6B4B8" w:sz="4"/>
+              <w:right w:val="single" w:color="A6B4B8" w:sz="4"/>
+            </w:tcBorders>
+            <w:tcMar>
+              <w:top w:type="dxa" w:w="50"/>
+              <w:left w:type="dxa" w:w="90"/>
+              <w:bottom w:type="dxa" w:w="50"/>
+              <w:right w:type="dxa" w:w="90"/>
+            </w:tcMar>
+            <w:vAlign w:val="top"/>
+          </w:tcPr>
+          <w:p>
+            <w:pPr>
+              <w:spacing w:after="0" w:line="252"/>
+              <w:jc w:val="left"/>
+            </w:pPr>
+            <w:r>
+              <w:rPr>
+                <w:b w:val="false"/>
+                <w:bCs w:val="false"/>
+                <w:sz w:val="19"/>
+                <w:szCs w:val="19"/>
+              </w:rPr>
+              <w:t xml:space="preserve">No operar ni manipular el tablero con tensión; conectar el Variac a la red solo con la ficha ya conectada (paso 15).</w:t>
             </w:r>
           </w:p>
         </w:tc>
@@ -3304,7 +3408,7 @@
                 <w:sz w:val="19"/>
                 <w:szCs w:val="19"/>
               </w:rPr>
-              <w:t xml:space="preserve">14 – 17</w:t>
+              <w:t xml:space="preserve">14 – 18</w:t>
             </w:r>
           </w:p>
         </w:tc>
@@ -3408,7 +3512,7 @@
                 <w:sz w:val="19"/>
                 <w:szCs w:val="19"/>
               </w:rPr>
-              <w:t xml:space="preserve">18 – 27</w:t>
+              <w:t xml:space="preserve">19 – 28</w:t>
             </w:r>
           </w:p>
         </w:tc>
@@ -3512,7 +3616,7 @@
                 <w:sz w:val="19"/>
                 <w:szCs w:val="19"/>
               </w:rPr>
-              <w:t xml:space="preserve">28 – 33</w:t>
+              <w:t xml:space="preserve">29 – 34</w:t>
             </w:r>
           </w:p>
         </w:tc>
@@ -3616,7 +3720,7 @@
                 <w:sz w:val="19"/>
                 <w:szCs w:val="19"/>
               </w:rPr>
-              <w:t xml:space="preserve">34 – 42</w:t>
+              <w:t xml:space="preserve">35 – 43</w:t>
             </w:r>
           </w:p>
         </w:tc>
@@ -3720,7 +3824,7 @@
                 <w:sz w:val="19"/>
                 <w:szCs w:val="19"/>
               </w:rPr>
-              <w:t xml:space="preserve">43 – 47</w:t>
+              <w:t xml:space="preserve">44 – 48</w:t>
             </w:r>
           </w:p>
         </w:tc>
@@ -8123,7 +8227,7 @@
                 <w:sz w:val="19"/>
                 <w:szCs w:val="19"/>
               </w:rPr>
-              <w:t xml:space="preserve">Montar el cable de excitación de 5 hilos a través del entrehierro y conectar sus extremos a la bornera EXCITATION del tablero de excitación, haciendo coincidir números y colores, de modo que las espiras queden en serie. Conectar el Variac a la ficha del tablero de excitación, según el cálculo aprobado.</w:t>
+              <w:t xml:space="preserve">Montar el cable de excitación de 5 hilos a través del entrehierro y conectar sus extremos a la bornera EXCITATION del tablero de excitación, haciendo coincidir números y colores, de modo que las espiras queden en serie.</w:t>
             </w:r>
           </w:p>
         </w:tc>
@@ -8227,7 +8331,7 @@
                 <w:sz w:val="19"/>
                 <w:szCs w:val="19"/>
               </w:rPr>
-              <w:t xml:space="preserve">Ubicar inicialmente el arrollamiento a 120° de la primera ranura a inspeccionar, en sentido opuesto al avance angular previsto.</w:t>
+              <w:t xml:space="preserve">Con el Variac desconectado de la red, conectar su ficha al tablero de excitación. Recién entonces conectar el Variac a la red. Para desconectar, seguir el orden inverso: primero desconectar el Variac de la red y luego la ficha.</w:t>
             </w:r>
           </w:p>
         </w:tc>
@@ -8260,7 +8364,7 @@
                 <w:sz w:val="19"/>
                 <w:szCs w:val="19"/>
               </w:rPr>
-              <w:t xml:space="preserve">—</w:t>
+              <w:t xml:space="preserve">Apartado 2.1</w:t>
             </w:r>
           </w:p>
         </w:tc>
@@ -8331,7 +8435,7 @@
                 <w:sz w:val="19"/>
                 <w:szCs w:val="19"/>
               </w:rPr>
-              <w:t xml:space="preserve">Planificar la reubicación del arrollamiento cada 120° de avance angular, de modo que durante el ensayo nunca quede a menos de 120° de la ranura inspeccionada.</w:t>
+              <w:t xml:space="preserve">Ubicar inicialmente el arrollamiento a 120° de la primera ranura a inspeccionar, en sentido opuesto al avance angular previsto.</w:t>
             </w:r>
           </w:p>
         </w:tc>
@@ -8364,7 +8468,7 @@
                 <w:sz w:val="19"/>
                 <w:szCs w:val="19"/>
               </w:rPr>
-              <w:t xml:space="preserve">Paso 42</w:t>
+              <w:t xml:space="preserve">—</w:t>
             </w:r>
           </w:p>
         </w:tc>
@@ -8435,6 +8539,110 @@
                 <w:sz w:val="19"/>
                 <w:szCs w:val="19"/>
               </w:rPr>
+              <w:t xml:space="preserve">Planificar la reubicación del arrollamiento cada 120° de avance angular, de modo que durante el ensayo nunca quede a menos de 120° de la ranura inspeccionada.</w:t>
+            </w:r>
+          </w:p>
+        </w:tc>
+        <w:tc>
+          <w:tcPr>
+            <w:tcW w:type="dxa" w:w="2200"/>
+            <w:tcBorders>
+              <w:top w:val="single" w:color="A6B4B8" w:sz="4"/>
+              <w:left w:val="single" w:color="A6B4B8" w:sz="4"/>
+              <w:bottom w:val="single" w:color="A6B4B8" w:sz="4"/>
+              <w:right w:val="single" w:color="A6B4B8" w:sz="4"/>
+            </w:tcBorders>
+            <w:tcMar>
+              <w:top w:type="dxa" w:w="50"/>
+              <w:left w:type="dxa" w:w="90"/>
+              <w:bottom w:type="dxa" w:w="50"/>
+              <w:right w:type="dxa" w:w="90"/>
+            </w:tcMar>
+            <w:vAlign w:val="top"/>
+          </w:tcPr>
+          <w:p>
+            <w:pPr>
+              <w:spacing w:after="0" w:line="252"/>
+              <w:jc w:val="left"/>
+            </w:pPr>
+            <w:r>
+              <w:rPr>
+                <w:b w:val="false"/>
+                <w:bCs w:val="false"/>
+                <w:sz w:val="19"/>
+                <w:szCs w:val="19"/>
+              </w:rPr>
+              <w:t xml:space="preserve">Paso 43</w:t>
+            </w:r>
+          </w:p>
+        </w:tc>
+      </w:tr>
+      <w:tr>
+        <w:trPr>
+          <w:cantSplit/>
+        </w:trPr>
+        <w:tc>
+          <w:tcPr>
+            <w:tcW w:type="dxa" w:w="560"/>
+            <w:tcBorders>
+              <w:top w:val="single" w:color="A6B4B8" w:sz="4"/>
+              <w:left w:val="single" w:color="A6B4B8" w:sz="4"/>
+              <w:bottom w:val="single" w:color="A6B4B8" w:sz="4"/>
+              <w:right w:val="single" w:color="A6B4B8" w:sz="4"/>
+            </w:tcBorders>
+            <w:tcMar>
+              <w:top w:type="dxa" w:w="50"/>
+              <w:left w:type="dxa" w:w="90"/>
+              <w:bottom w:type="dxa" w:w="50"/>
+              <w:right w:type="dxa" w:w="90"/>
+            </w:tcMar>
+            <w:vAlign w:val="top"/>
+          </w:tcPr>
+          <w:p>
+            <w:pPr>
+              <w:spacing w:after="0" w:line="252"/>
+              <w:jc w:val="center"/>
+            </w:pPr>
+            <w:r>
+              <w:rPr>
+                <w:b/>
+                <w:bCs/>
+                <w:sz w:val="19"/>
+                <w:szCs w:val="19"/>
+              </w:rPr>
+              <w:t xml:space="preserve">18</w:t>
+            </w:r>
+          </w:p>
+        </w:tc>
+        <w:tc>
+          <w:tcPr>
+            <w:tcW w:type="dxa" w:w="6878"/>
+            <w:tcBorders>
+              <w:top w:val="single" w:color="A6B4B8" w:sz="4"/>
+              <w:left w:val="single" w:color="A6B4B8" w:sz="4"/>
+              <w:bottom w:val="single" w:color="A6B4B8" w:sz="4"/>
+              <w:right w:val="single" w:color="A6B4B8" w:sz="4"/>
+            </w:tcBorders>
+            <w:tcMar>
+              <w:top w:type="dxa" w:w="50"/>
+              <w:left w:type="dxa" w:w="90"/>
+              <w:bottom w:type="dxa" w:w="50"/>
+              <w:right w:type="dxa" w:w="90"/>
+            </w:tcMar>
+            <w:vAlign w:val="top"/>
+          </w:tcPr>
+          <w:p>
+            <w:pPr>
+              <w:spacing w:after="0" w:line="252"/>
+              <w:jc w:val="left"/>
+            </w:pPr>
+            <w:r>
+              <w:rPr>
+                <w:b w:val="false"/>
+                <w:bCs w:val="false"/>
+                <w:sz w:val="19"/>
+                <w:szCs w:val="19"/>
+              </w:rPr>
               <w:t xml:space="preserve">Instalar la espira auxiliar en la primera ranura a inspeccionar o en la ranura definida por Ingeniería.</w:t>
             </w:r>
           </w:p>
@@ -8469,6 +8677,64 @@
                 <w:szCs w:val="19"/>
               </w:rPr>
               <w:t xml:space="preserve">00503-00-EPG002 – Protocolo 1</w:t>
+            </w:r>
+          </w:p>
+        </w:tc>
+      </w:tr>
+    </w:tbl>
+    <w:p>
+      <w:pPr>
+        <w:spacing w:after="120" w:before="0"/>
+      </w:pPr>
+    </w:p>
+    <w:tbl>
+      <w:tblPr>
+        <w:tblW w:type="dxa" w:w="9638"/>
+        <w:tblBorders>
+          <w:top w:val="single" w:color="auto" w:sz="4"/>
+          <w:left w:val="single" w:color="auto" w:sz="4"/>
+          <w:bottom w:val="single" w:color="auto" w:sz="4"/>
+          <w:right w:val="single" w:color="auto" w:sz="4"/>
+          <w:insideH w:val="single" w:color="auto" w:sz="4"/>
+          <w:insideV w:val="single" w:color="auto" w:sz="4"/>
+        </w:tblBorders>
+      </w:tblPr>
+      <w:tblGrid>
+        <w:gridCol w:w="9638"/>
+      </w:tblGrid>
+      <w:tr>
+        <w:tc>
+          <w:tcPr>
+            <w:tcW w:type="dxa" w:w="9638"/>
+            <w:tcBorders>
+              <w:top w:val="single" w:color="E36C0A" w:sz="4"/>
+              <w:left w:val="single" w:color="E36C0A" w:sz="24"/>
+              <w:bottom w:val="single" w:color="E36C0A" w:sz="4"/>
+              <w:right w:val="single" w:color="E36C0A" w:sz="4"/>
+            </w:tcBorders>
+            <w:shd w:fill="FDF0E6" w:val="clear"/>
+            <w:tcMar>
+              <w:top w:type="dxa" w:w="80"/>
+              <w:left w:type="dxa" w:w="160"/>
+              <w:bottom w:type="dxa" w:w="80"/>
+              <w:right w:type="dxa" w:w="160"/>
+            </w:tcMar>
+          </w:tcPr>
+          <w:p>
+            <w:pPr>
+              <w:spacing w:after="0" w:line="264"/>
+              <w:jc w:val="both"/>
+            </w:pPr>
+            <w:r>
+              <w:rPr>
+                <w:b/>
+                <w:bCs/>
+                <w:color w:val="E36C0A"/>
+              </w:rPr>
+              <w:t xml:space="preserve">Precaución: </w:t>
+            </w:r>
+            <w:r>
+              <w:t xml:space="preserve">el tablero de excitación se encuentra en desarrollo. No operarlo ni manipularlo con tensión. La ficha que viene del Variac queda con los contactos macho expuestos: nunca manipularla con el Variac conectado a la red (paso 15).</w:t>
             </w:r>
           </w:p>
         </w:tc>
@@ -8651,7 +8917,7 @@
                 <w:sz w:val="19"/>
                 <w:szCs w:val="19"/>
               </w:rPr>
-              <w:t xml:space="preserve">18</w:t>
+              <w:t xml:space="preserve">19</w:t>
             </w:r>
           </w:p>
         </w:tc>
@@ -8755,7 +9021,7 @@
                 <w:sz w:val="19"/>
                 <w:szCs w:val="19"/>
               </w:rPr>
-              <w:t xml:space="preserve">19</w:t>
+              <w:t xml:space="preserve">20</w:t>
             </w:r>
           </w:p>
         </w:tc>
@@ -8859,7 +9125,7 @@
                 <w:sz w:val="19"/>
                 <w:szCs w:val="19"/>
               </w:rPr>
-              <w:t xml:space="preserve">20</w:t>
+              <w:t xml:space="preserve">21</w:t>
             </w:r>
           </w:p>
         </w:tc>
@@ -8963,7 +9229,7 @@
                 <w:sz w:val="19"/>
                 <w:szCs w:val="19"/>
               </w:rPr>
-              <w:t xml:space="preserve">21</w:t>
+              <w:t xml:space="preserve">22</w:t>
             </w:r>
           </w:p>
         </w:tc>
@@ -9067,7 +9333,7 @@
                 <w:sz w:val="19"/>
                 <w:szCs w:val="19"/>
               </w:rPr>
-              <w:t xml:space="preserve">22</w:t>
+              <w:t xml:space="preserve">23</w:t>
             </w:r>
           </w:p>
         </w:tc>
@@ -9171,7 +9437,7 @@
                 <w:sz w:val="19"/>
                 <w:szCs w:val="19"/>
               </w:rPr>
-              <w:t xml:space="preserve">23</w:t>
+              <w:t xml:space="preserve">24</w:t>
             </w:r>
           </w:p>
         </w:tc>
@@ -9275,7 +9541,7 @@
                 <w:sz w:val="19"/>
                 <w:szCs w:val="19"/>
               </w:rPr>
-              <w:t xml:space="preserve">24</w:t>
+              <w:t xml:space="preserve">25</w:t>
             </w:r>
           </w:p>
         </w:tc>
@@ -9379,7 +9645,7 @@
                 <w:sz w:val="19"/>
                 <w:szCs w:val="19"/>
               </w:rPr>
-              <w:t xml:space="preserve">25</w:t>
+              <w:t xml:space="preserve">26</w:t>
             </w:r>
           </w:p>
         </w:tc>
@@ -9483,7 +9749,7 @@
                 <w:sz w:val="19"/>
                 <w:szCs w:val="19"/>
               </w:rPr>
-              <w:t xml:space="preserve">26</w:t>
+              <w:t xml:space="preserve">27</w:t>
             </w:r>
           </w:p>
         </w:tc>
@@ -9587,7 +9853,7 @@
                 <w:sz w:val="19"/>
                 <w:szCs w:val="19"/>
               </w:rPr>
-              <w:t xml:space="preserve">27</w:t>
+              <w:t xml:space="preserve">28</w:t>
             </w:r>
           </w:p>
         </w:tc>
@@ -9904,7 +10170,7 @@
                 <w:sz w:val="19"/>
                 <w:szCs w:val="19"/>
               </w:rPr>
-              <w:t xml:space="preserve">28</w:t>
+              <w:t xml:space="preserve">29</w:t>
             </w:r>
           </w:p>
         </w:tc>
@@ -10008,7 +10274,7 @@
                 <w:sz w:val="19"/>
                 <w:szCs w:val="19"/>
               </w:rPr>
-              <w:t xml:space="preserve">29</w:t>
+              <w:t xml:space="preserve">30</w:t>
             </w:r>
           </w:p>
         </w:tc>
@@ -10112,7 +10378,7 @@
                 <w:sz w:val="19"/>
                 <w:szCs w:val="19"/>
               </w:rPr>
-              <w:t xml:space="preserve">30</w:t>
+              <w:t xml:space="preserve">31</w:t>
             </w:r>
           </w:p>
         </w:tc>
@@ -10216,7 +10482,7 @@
                 <w:sz w:val="19"/>
                 <w:szCs w:val="19"/>
               </w:rPr>
-              <w:t xml:space="preserve">31</w:t>
+              <w:t xml:space="preserve">32</w:t>
             </w:r>
           </w:p>
         </w:tc>
@@ -10320,7 +10586,7 @@
                 <w:sz w:val="19"/>
                 <w:szCs w:val="19"/>
               </w:rPr>
-              <w:t xml:space="preserve">32</w:t>
+              <w:t xml:space="preserve">33</w:t>
             </w:r>
           </w:p>
         </w:tc>
@@ -10424,7 +10690,7 @@
                 <w:sz w:val="19"/>
                 <w:szCs w:val="19"/>
               </w:rPr>
-              <w:t xml:space="preserve">33</w:t>
+              <w:t xml:space="preserve">34</w:t>
             </w:r>
           </w:p>
         </w:tc>
@@ -10553,7 +10819,7 @@
               <w:t xml:space="preserve">Ciclo repetitivo: </w:t>
             </w:r>
             <w:r>
-              <w:t xml:space="preserve">los pasos 34 a 41 se repiten para cada ranura a inspeccionar. El paso 42 se ejecuta cuando se alcanza la condición indicada.</w:t>
+              <w:t xml:space="preserve">los pasos 35 a 42 se repiten para cada ranura a inspeccionar. El paso 43 se ejecuta cuando se alcanza la condición indicada.</w:t>
             </w:r>
           </w:p>
         </w:tc>
@@ -10763,7 +11029,7 @@
                 <w:sz w:val="19"/>
                 <w:szCs w:val="19"/>
               </w:rPr>
-              <w:t xml:space="preserve">34</w:t>
+              <w:t xml:space="preserve">35</w:t>
             </w:r>
           </w:p>
         </w:tc>
@@ -10867,7 +11133,7 @@
                 <w:sz w:val="19"/>
                 <w:szCs w:val="19"/>
               </w:rPr>
-              <w:t xml:space="preserve">35</w:t>
+              <w:t xml:space="preserve">36</w:t>
             </w:r>
           </w:p>
         </w:tc>
@@ -10971,7 +11237,7 @@
                 <w:sz w:val="19"/>
                 <w:szCs w:val="19"/>
               </w:rPr>
-              <w:t xml:space="preserve">36</w:t>
+              <w:t xml:space="preserve">37</w:t>
             </w:r>
           </w:p>
         </w:tc>
@@ -11116,7 +11382,7 @@
                 <w:sz w:val="19"/>
                 <w:szCs w:val="19"/>
               </w:rPr>
-              <w:t xml:space="preserve">37</w:t>
+              <w:t xml:space="preserve">38</w:t>
             </w:r>
           </w:p>
         </w:tc>
@@ -11149,7 +11415,7 @@
                 <w:sz w:val="19"/>
                 <w:szCs w:val="19"/>
               </w:rPr>
-              <w:t xml:space="preserve">Avanzar axialmente a velocidad constante (recomendada: 50 mm/s) registrando el EL CID, sin superar el límite de avance seguro definido en el paso 30. Activar las cámaras laterales y monitorearlas junto con las demás para detectar anomalías.</w:t>
+              <w:t xml:space="preserve">Avanzar axialmente a velocidad constante (recomendada: 50 mm/s) registrando el EL CID, sin superar el límite de avance seguro definido en el paso 31. Activar las cámaras laterales y monitorearlas junto con las demás para detectar anomalías.</w:t>
             </w:r>
           </w:p>
         </w:tc>
@@ -11220,7 +11486,7 @@
                 <w:sz w:val="19"/>
                 <w:szCs w:val="19"/>
               </w:rPr>
-              <w:t xml:space="preserve">38</w:t>
+              <w:t xml:space="preserve">39</w:t>
             </w:r>
           </w:p>
         </w:tc>
@@ -11365,7 +11631,7 @@
                 <w:sz w:val="19"/>
                 <w:szCs w:val="19"/>
               </w:rPr>
-              <w:t xml:space="preserve">39</w:t>
+              <w:t xml:space="preserve">40</w:t>
             </w:r>
           </w:p>
         </w:tc>
@@ -11469,7 +11735,7 @@
                 <w:sz w:val="19"/>
                 <w:szCs w:val="19"/>
               </w:rPr>
-              <w:t xml:space="preserve">40</w:t>
+              <w:t xml:space="preserve">41</w:t>
             </w:r>
           </w:p>
         </w:tc>
@@ -11614,7 +11880,7 @@
                 <w:sz w:val="19"/>
                 <w:szCs w:val="19"/>
               </w:rPr>
-              <w:t xml:space="preserve">41</w:t>
+              <w:t xml:space="preserve">42</w:t>
             </w:r>
           </w:p>
         </w:tc>
@@ -11647,7 +11913,7 @@
                 <w:sz w:val="19"/>
                 <w:szCs w:val="19"/>
               </w:rPr>
-              <w:t xml:space="preserve">Desplazar la rampa a la ranura siguiente, verificar la alineación y repetir desde el paso 34.</w:t>
+              <w:t xml:space="preserve">Desplazar la rampa a la ranura siguiente, verificar la alineación y repetir desde el paso 35.</w:t>
             </w:r>
           </w:p>
         </w:tc>
@@ -11718,7 +11984,7 @@
                 <w:sz w:val="19"/>
                 <w:szCs w:val="19"/>
               </w:rPr>
-              <w:t xml:space="preserve">42</w:t>
+              <w:t xml:space="preserve">43</w:t>
             </w:r>
           </w:p>
         </w:tc>
@@ -12426,7 +12692,7 @@
                 <w:sz w:val="19"/>
                 <w:szCs w:val="19"/>
               </w:rPr>
-              <w:t xml:space="preserve">43</w:t>
+              <w:t xml:space="preserve">44</w:t>
             </w:r>
           </w:p>
         </w:tc>
@@ -12530,7 +12796,7 @@
                 <w:sz w:val="19"/>
                 <w:szCs w:val="19"/>
               </w:rPr>
-              <w:t xml:space="preserve">44</w:t>
+              <w:t xml:space="preserve">45</w:t>
             </w:r>
           </w:p>
         </w:tc>
@@ -12634,7 +12900,7 @@
                 <w:sz w:val="19"/>
                 <w:szCs w:val="19"/>
               </w:rPr>
-              <w:t xml:space="preserve">45</w:t>
+              <w:t xml:space="preserve">46</w:t>
             </w:r>
           </w:p>
         </w:tc>
@@ -12738,7 +13004,7 @@
                 <w:sz w:val="19"/>
                 <w:szCs w:val="19"/>
               </w:rPr>
-              <w:t xml:space="preserve">46</w:t>
+              <w:t xml:space="preserve">47</w:t>
             </w:r>
           </w:p>
         </w:tc>
@@ -12842,7 +13108,7 @@
                 <w:sz w:val="19"/>
                 <w:szCs w:val="19"/>
               </w:rPr>
-              <w:t xml:space="preserve">47</w:t>
+              <w:t xml:space="preserve">48</w:t>
             </w:r>
           </w:p>
         </w:tc>

</xml_diff>

<commit_message>
Esquema GRIS: Figura 1 en pliego A3, llave y protoboard según foto, ampliación de borneras
- Figura 1 armada como pliego de dos páginas A4 enfrentadas (página par + impar),
  con la franja del pliegue libre de equipos y textos; PDF suelto en A3.
- Tablero de excitación: llave junto a la bornera EXCITATION, protoboard ancha bajo
  el riel, riel DIN y bornes en proporciones de la foto; AUX con el mismo ancho de borne.
- Nueva Figura 3: ampliación de las borneras con la numeración legible (>= 10 pt).
- Exportación PDF con las páginas en blanco que fuerza el pliego.

Co-Authored-By: Claude Opus 5.5 <noreply@anthropic.com>
Claude-Session: https://claude.ai/code/session_01Nz5qZw2jp5HghH6VEfj4aK
</commit_message>
<xml_diff>
--- a/procedimientos_gris/00503-00-EPG001 Procedimiento Inspeccion Robotizada GRIS.docx
+++ b/procedimientos_gris/00503-00-EPG001 Procedimiento Inspeccion Robotizada GRIS.docx
@@ -469,7 +469,7 @@
           <w:sz w:val="19"/>
         </w:rPr>
         <w:tab/>
-        <w:t>10</w:t>
+        <w:t>12</w:t>
       </w:r>
     </w:p>
     <w:p>
@@ -491,7 +491,7 @@
           <w:sz w:val="19"/>
         </w:rPr>
         <w:tab/>
-        <w:t>10</w:t>
+        <w:t>13</w:t>
       </w:r>
     </w:p>
     <w:p>
@@ -513,7 +513,7 @@
           <w:sz w:val="19"/>
         </w:rPr>
         <w:tab/>
-        <w:t>11</w:t>
+        <w:t>14</w:t>
       </w:r>
     </w:p>
     <w:p>
@@ -536,7 +536,7 @@
           <w:sz w:val="19"/>
         </w:rPr>
         <w:tab/>
-        <w:t>12</w:t>
+        <w:t>15</w:t>
       </w:r>
       <w:r>
         <w:fldChar w:fldCharType="end"/>
@@ -8260,7 +8260,7 @@
                 <w:sz w:val="19"/>
                 <w:szCs w:val="19"/>
               </w:rPr>
-              <w:t xml:space="preserve">00503-00-EPG002 – Protocolo 1</w:t>
+              <w:t xml:space="preserve">00503-00-EPG002 – Protocolo 1 / Figuras 2 y 3</w:t>
             </w:r>
           </w:p>
         </w:tc>
@@ -8364,7 +8364,7 @@
                 <w:sz w:val="19"/>
                 <w:szCs w:val="19"/>
               </w:rPr>
-              <w:t xml:space="preserve">Apartado 2.1</w:t>
+              <w:t xml:space="preserve">Apartado 2.1 / Figura 2</w:t>
             </w:r>
           </w:p>
         </w:tc>
@@ -9926,22 +9926,30 @@
       </w:tr>
     </w:tbl>
     <w:p>
-      <w:r>
-        <w:br w:type="page"/>
-      </w:r>
+      <w:pPr>
+        <w:sectPr>
+          <w:headerReference w:type="default" r:id="rId7"/>
+          <w:footerReference w:type="default" r:id="rId8"/>
+          <w:pgSz w:w="11906" w:h="16838" w:orient="portrait"/>
+          <w:pgMar w:top="2100" w:right="1134" w:bottom="1700" w:left="1134" w:header="500" w:footer="400" w:gutter="0"/>
+          <w:pgNumType/>
+          <w:docGrid w:linePitch="360"/>
+        </w:sectPr>
+      </w:pPr>
     </w:p>
     <w:p>
       <w:pPr>
         <w:keepNext/>
-        <w:spacing w:after="60" w:before="120"/>
-        <w:jc w:val="center"/>
+        <w:spacing w:after="60" w:before="0"/>
+        <w:ind w:left="1838" w:right="-800"/>
+        <w:jc w:val="left"/>
       </w:pPr>
       <w:r>
         <w:drawing>
           <wp:inline distT="0" distB="0" distL="0" distR="0">
-            <wp:extent cx="5467350" cy="7953375"/>
+            <wp:extent cx="5448300" cy="7629525"/>
             <wp:effectExtent t="0" r="0" b="0" l="0"/>
-            <wp:docPr id="1" name="esquema_general_vertical.png" descr="Figura 1: Esquema general de conexiones del sistema GRIS" title="Figura 1: Esquema general de conexiones del sistema GRIS"/>
+            <wp:docPr id="1" name="esquema_general_izq.png" descr="Figura 1: Esquema general de conexiones del sistema GRIS" title="Figura 1: Esquema general de conexiones del sistema GRIS"/>
             <wp:cNvGraphicFramePr>
               <a:graphicFrameLocks xmlns:a="http://schemas.openxmlformats.org/drawingml/2006/main" noChangeAspect="1"/>
             </wp:cNvGraphicFramePr>
@@ -9955,7 +9963,7 @@
                     </pic:cNvPicPr>
                   </pic:nvPicPr>
                   <pic:blipFill>
-                    <a:blip r:embed="rId9" cstate="none"/>
+                    <a:blip r:embed="rId13" cstate="none"/>
                     <a:srcRect/>
                     <a:stretch>
                       <a:fillRect/>
@@ -9964,7 +9972,150 @@
                   <pic:spPr bwMode="auto">
                     <a:xfrm>
                       <a:off x="0" y="0"/>
-                      <a:ext cx="5467350" cy="7953375"/>
+                      <a:ext cx="5448300" cy="7629525"/>
+                    </a:xfrm>
+                    <a:prstGeom prst="rect">
+                      <a:avLst/>
+                    </a:prstGeom>
+                  </pic:spPr>
+                </pic:pic>
+              </a:graphicData>
+            </a:graphic>
+          </wp:inline>
+        </w:drawing>
+      </w:r>
+    </w:p>
+    <w:p>
+      <w:pPr>
+        <w:jc w:val="center"/>
+      </w:pPr>
+      <w:r>
+        <w:rPr>
+          <w:i/>
+          <w:iCs/>
+          <w:color w:val="6D8289"/>
+          <w:sz w:val="18"/>
+          <w:szCs w:val="18"/>
+        </w:rPr>
+        <w:t xml:space="preserve">Figura 1: Esquema general de conexiones del sistema GRIS (pliego de dos páginas; continúa en la página siguiente)</w:t>
+      </w:r>
+    </w:p>
+    <w:p>
+      <w:r>
+        <w:br w:type="page"/>
+      </w:r>
+    </w:p>
+    <w:p>
+      <w:pPr>
+        <w:keepNext/>
+        <w:spacing w:after="60" w:before="0"/>
+        <w:ind w:left="-800"/>
+        <w:jc w:val="left"/>
+      </w:pPr>
+      <w:r>
+        <w:drawing>
+          <wp:inline distT="0" distB="0" distL="0" distR="0">
+            <wp:extent cx="5448300" cy="7629525"/>
+            <wp:effectExtent t="0" r="0" b="0" l="0"/>
+            <wp:docPr id="1" name="esquema_general_der.png" descr="Figura 1: Esquema general de conexiones del sistema GRIS" title="Figura 1: Esquema general de conexiones del sistema GRIS"/>
+            <wp:cNvGraphicFramePr>
+              <a:graphicFrameLocks xmlns:a="http://schemas.openxmlformats.org/drawingml/2006/main" noChangeAspect="1"/>
+            </wp:cNvGraphicFramePr>
+            <a:graphic xmlns:a="http://schemas.openxmlformats.org/drawingml/2006/main">
+              <a:graphicData uri="http://schemas.openxmlformats.org/drawingml/2006/picture">
+                <pic:pic xmlns:pic="http://schemas.openxmlformats.org/drawingml/2006/picture">
+                  <pic:nvPicPr>
+                    <pic:cNvPr id="0" name="" descr=""/>
+                    <pic:cNvPicPr>
+                      <a:picLocks noChangeAspect="1" noChangeArrowheads="1"/>
+                    </pic:cNvPicPr>
+                  </pic:nvPicPr>
+                  <pic:blipFill>
+                    <a:blip r:embed="rId14" cstate="none"/>
+                    <a:srcRect/>
+                    <a:stretch>
+                      <a:fillRect/>
+                    </a:stretch>
+                  </pic:blipFill>
+                  <pic:spPr bwMode="auto">
+                    <a:xfrm>
+                      <a:off x="0" y="0"/>
+                      <a:ext cx="5448300" cy="7629525"/>
+                    </a:xfrm>
+                    <a:prstGeom prst="rect">
+                      <a:avLst/>
+                    </a:prstGeom>
+                  </pic:spPr>
+                </pic:pic>
+              </a:graphicData>
+            </a:graphic>
+          </wp:inline>
+        </w:drawing>
+      </w:r>
+    </w:p>
+    <w:p>
+      <w:pPr>
+        <w:jc w:val="center"/>
+      </w:pPr>
+      <w:r>
+        <w:rPr>
+          <w:i/>
+          <w:iCs/>
+          <w:color w:val="6D8289"/>
+          <w:sz w:val="18"/>
+          <w:szCs w:val="18"/>
+        </w:rPr>
+        <w:t xml:space="preserve">Figura 1: Esquema general de conexiones del sistema GRIS (continuación)</w:t>
+      </w:r>
+    </w:p>
+    <w:p>
+      <w:pPr>
+        <w:sectPr>
+          <w:headerReference w:type="default" r:id="rId9"/>
+          <w:footerReference w:type="default" r:id="rId10"/>
+          <w:type w:val="evenPage"/>
+          <w:pgSz w:w="11906" w:h="16838" w:orient="portrait"/>
+          <w:pgMar w:top="2100" w:right="1134" w:bottom="1700" w:left="1134" w:header="500" w:footer="400" w:gutter="0"/>
+          <w:pgNumType/>
+          <w:docGrid w:linePitch="360"/>
+        </w:sectPr>
+      </w:pPr>
+    </w:p>
+    <w:p>
+      <w:pPr>
+        <w:keepNext/>
+        <w:spacing w:after="60" w:before="120"/>
+        <w:jc w:val="center"/>
+      </w:pPr>
+      <w:r>
+        <w:drawing>
+          <wp:inline distT="0" distB="0" distL="0" distR="0">
+            <wp:extent cx="6124575" cy="2895600"/>
+            <wp:effectExtent t="0" r="0" b="0" l="0"/>
+            <wp:docPr id="1" name="detalle_tablero_excitacion.png" descr="Figura 2: Detalle del tablero de excitación (conexiones internas)" title="Figura 2: Detalle del tablero de excitación (conexiones internas)"/>
+            <wp:cNvGraphicFramePr>
+              <a:graphicFrameLocks xmlns:a="http://schemas.openxmlformats.org/drawingml/2006/main" noChangeAspect="1"/>
+            </wp:cNvGraphicFramePr>
+            <a:graphic xmlns:a="http://schemas.openxmlformats.org/drawingml/2006/main">
+              <a:graphicData uri="http://schemas.openxmlformats.org/drawingml/2006/picture">
+                <pic:pic xmlns:pic="http://schemas.openxmlformats.org/drawingml/2006/picture">
+                  <pic:nvPicPr>
+                    <pic:cNvPr id="0" name="" descr=""/>
+                    <pic:cNvPicPr>
+                      <a:picLocks noChangeAspect="1" noChangeArrowheads="1"/>
+                    </pic:cNvPicPr>
+                  </pic:nvPicPr>
+                  <pic:blipFill>
+                    <a:blip r:embed="rId15" cstate="none"/>
+                    <a:srcRect/>
+                    <a:stretch>
+                      <a:fillRect/>
+                    </a:stretch>
+                  </pic:blipFill>
+                  <pic:spPr bwMode="auto">
+                    <a:xfrm>
+                      <a:off x="0" y="0"/>
+                      <a:ext cx="6124575" cy="2895600"/>
                     </a:xfrm>
                     <a:prstGeom prst="rect">
                       <a:avLst/>
@@ -9990,7 +10141,70 @@
           <w:sz w:val="18"/>
           <w:szCs w:val="18"/>
         </w:rPr>
-        <w:t xml:space="preserve">Figura 1: Esquema general de conexiones del sistema GRIS</w:t>
+        <w:t xml:space="preserve">Figura 2: Detalle del tablero de excitación (conexiones internas)</w:t>
+      </w:r>
+    </w:p>
+    <w:p>
+      <w:pPr>
+        <w:keepNext/>
+        <w:spacing w:after="60" w:before="120"/>
+        <w:jc w:val="center"/>
+      </w:pPr>
+      <w:r>
+        <w:drawing>
+          <wp:inline distT="0" distB="0" distL="0" distR="0">
+            <wp:extent cx="6124575" cy="3676650"/>
+            <wp:effectExtent t="0" r="0" b="0" l="0"/>
+            <wp:docPr id="1" name="detalle_borneras.png" descr="Figura 3: Ampliación de las borneras EXCITATION y AUX (numeración de bornes)" title="Figura 3: Ampliación de las borneras EXCITATION y AUX (numeración de bornes)"/>
+            <wp:cNvGraphicFramePr>
+              <a:graphicFrameLocks xmlns:a="http://schemas.openxmlformats.org/drawingml/2006/main" noChangeAspect="1"/>
+            </wp:cNvGraphicFramePr>
+            <a:graphic xmlns:a="http://schemas.openxmlformats.org/drawingml/2006/main">
+              <a:graphicData uri="http://schemas.openxmlformats.org/drawingml/2006/picture">
+                <pic:pic xmlns:pic="http://schemas.openxmlformats.org/drawingml/2006/picture">
+                  <pic:nvPicPr>
+                    <pic:cNvPr id="0" name="" descr=""/>
+                    <pic:cNvPicPr>
+                      <a:picLocks noChangeAspect="1" noChangeArrowheads="1"/>
+                    </pic:cNvPicPr>
+                  </pic:nvPicPr>
+                  <pic:blipFill>
+                    <a:blip r:embed="rId16" cstate="none"/>
+                    <a:srcRect/>
+                    <a:stretch>
+                      <a:fillRect/>
+                    </a:stretch>
+                  </pic:blipFill>
+                  <pic:spPr bwMode="auto">
+                    <a:xfrm>
+                      <a:off x="0" y="0"/>
+                      <a:ext cx="6124575" cy="3676650"/>
+                    </a:xfrm>
+                    <a:prstGeom prst="rect">
+                      <a:avLst/>
+                    </a:prstGeom>
+                  </pic:spPr>
+                </pic:pic>
+              </a:graphicData>
+            </a:graphic>
+          </wp:inline>
+        </w:drawing>
+      </w:r>
+    </w:p>
+    <w:p>
+      <w:pPr>
+        <w:spacing w:after="200"/>
+        <w:jc w:val="center"/>
+      </w:pPr>
+      <w:r>
+        <w:rPr>
+          <w:i/>
+          <w:iCs/>
+          <w:color w:val="6D8289"/>
+          <w:sz w:val="18"/>
+          <w:szCs w:val="18"/>
+        </w:rPr>
+        <w:t xml:space="preserve">Figura 3: Ampliación de las borneras EXCITATION y AUX (numeración de bornes)</w:t>
       </w:r>
     </w:p>
     <w:p>
@@ -14003,8 +14217,9 @@
       </w:r>
     </w:p>
     <w:sectPr>
-      <w:headerReference w:type="default" r:id="rId7"/>
-      <w:footerReference w:type="default" r:id="rId8"/>
+      <w:headerReference w:type="default" r:id="rId11"/>
+      <w:footerReference w:type="default" r:id="rId12"/>
+      <w:type w:val="nextPage"/>
       <w:pgSz w:w="11906" w:h="16838" w:orient="portrait"/>
       <w:pgMar w:top="2100" w:right="1134" w:bottom="1700" w:left="1134" w:header="500" w:footer="400" w:gutter="0"/>
       <w:pgNumType/>
@@ -14203,6 +14418,302 @@
 </w:ftr>
 </file>
 
+<file path=word/footer2.xml><?xml version="1.0" encoding="utf-8"?>
+<w:ftr xmlns:wpc="http://schemas.microsoft.com/office/word/2010/wordprocessingCanvas" xmlns:mc="http://schemas.openxmlformats.org/markup-compatibility/2006" xmlns:o="urn:schemas-microsoft-com:office:office" xmlns:r="http://schemas.openxmlformats.org/officeDocument/2006/relationships" xmlns:m="http://schemas.openxmlformats.org/officeDocument/2006/math" xmlns:v="urn:schemas-microsoft-com:vml" xmlns:wp14="http://schemas.microsoft.com/office/word/2010/wordprocessingDrawing" xmlns:wp="http://schemas.openxmlformats.org/drawingml/2006/wordprocessingDrawing" xmlns:w10="urn:schemas-microsoft-com:office:word" xmlns:w="http://schemas.openxmlformats.org/wordprocessingml/2006/main" xmlns:w14="http://schemas.microsoft.com/office/word/2010/wordml" xmlns:w15="http://schemas.microsoft.com/office/word/2012/wordml" xmlns:wpg="http://schemas.microsoft.com/office/word/2010/wordprocessingGroup" xmlns:wpi="http://schemas.microsoft.com/office/word/2010/wordprocessingInk" xmlns:wne="http://schemas.microsoft.com/office/word/2006/wordml" xmlns:wps="http://schemas.microsoft.com/office/word/2010/wordprocessingShape">
+  <w:p>
+    <w:pPr>
+      <w:spacing w:after="80"/>
+      <w:jc w:val="center"/>
+    </w:pPr>
+    <w:r>
+      <w:rPr>
+        <w:b/>
+        <w:bCs/>
+        <w:i/>
+        <w:iCs/>
+        <w:sz w:val="16"/>
+        <w:szCs w:val="16"/>
+      </w:rPr>
+      <w:t xml:space="preserve">SI ESTE DOCUMENTO SE ENCUENTRA IMPRESO SE CONSIDERA COPIA NO CONTROLADA</w:t>
+    </w:r>
+  </w:p>
+  <w:tbl>
+    <w:tblPr>
+      <w:tblW w:type="dxa" w:w="9638"/>
+      <w:tblBorders>
+        <w:top w:val="single" w:color="auto" w:sz="4"/>
+        <w:left w:val="single" w:color="auto" w:sz="4"/>
+        <w:bottom w:val="single" w:color="auto" w:sz="4"/>
+        <w:right w:val="single" w:color="auto" w:sz="4"/>
+        <w:insideH w:val="single" w:color="auto" w:sz="4"/>
+        <w:insideV w:val="single" w:color="auto" w:sz="4"/>
+      </w:tblBorders>
+    </w:tblPr>
+    <w:tblGrid>
+      <w:gridCol w:w="6638"/>
+      <w:gridCol w:w="3000"/>
+    </w:tblGrid>
+    <w:tr>
+      <w:tc>
+        <w:tcPr>
+          <w:tcW w:type="dxa" w:w="6638"/>
+          <w:tcBorders>
+            <w:top w:val="none" w:color="FFFFFF" w:sz="0"/>
+            <w:left w:val="none" w:color="FFFFFF" w:sz="0"/>
+            <w:bottom w:val="none" w:color="FFFFFF" w:sz="0"/>
+            <w:right w:val="none" w:color="FFFFFF" w:sz="0"/>
+          </w:tcBorders>
+          <w:tcMar>
+            <w:top w:type="dxa" w:w="50"/>
+            <w:left w:type="dxa" w:w="90"/>
+            <w:bottom w:type="dxa" w:w="50"/>
+            <w:right w:type="dxa" w:w="90"/>
+          </w:tcMar>
+          <w:vAlign w:val="center"/>
+        </w:tcPr>
+        <w:p>
+          <w:pPr>
+            <w:spacing w:after="0"/>
+          </w:pPr>
+          <w:r>
+            <w:rPr>
+              <w:color w:val="595959"/>
+              <w:sz w:val="16"/>
+              <w:szCs w:val="16"/>
+            </w:rPr>
+            <w:t xml:space="preserve">www.mecanalisis.com.ar | +54 261 476 9010</w:t>
+          </w:r>
+        </w:p>
+        <w:p>
+          <w:pPr>
+            <w:spacing w:after="0"/>
+          </w:pPr>
+          <w:r>
+            <w:rPr>
+              <w:color w:val="595959"/>
+              <w:sz w:val="16"/>
+              <w:szCs w:val="16"/>
+            </w:rPr>
+            <w:t xml:space="preserve">Pedro del Castillo 3160 . 5519 Guaymallén – Mendoza, Argentina.</w:t>
+          </w:r>
+        </w:p>
+      </w:tc>
+      <w:tc>
+        <w:tcPr>
+          <w:tcW w:type="dxa" w:w="3000"/>
+          <w:tcBorders>
+            <w:top w:val="none" w:color="FFFFFF" w:sz="0"/>
+            <w:left w:val="none" w:color="FFFFFF" w:sz="0"/>
+            <w:bottom w:val="none" w:color="FFFFFF" w:sz="0"/>
+            <w:right w:val="none" w:color="FFFFFF" w:sz="0"/>
+          </w:tcBorders>
+          <w:tcMar>
+            <w:top w:type="dxa" w:w="50"/>
+            <w:left w:type="dxa" w:w="90"/>
+            <w:bottom w:type="dxa" w:w="50"/>
+            <w:right w:type="dxa" w:w="90"/>
+          </w:tcMar>
+          <w:vAlign w:val="center"/>
+        </w:tcPr>
+        <w:p>
+          <w:pPr>
+            <w:jc w:val="right"/>
+          </w:pPr>
+          <w:r>
+            <w:drawing>
+              <wp:inline distT="0" distB="0" distL="0" distR="0">
+                <wp:extent cx="1428750" cy="400050"/>
+                <wp:effectExtent t="0" r="0" b="0" l="0"/>
+                <wp:docPr id="1" name="logo" descr="Logo Mecanálisis" title="Mecanálisis"/>
+                <wp:cNvGraphicFramePr>
+                  <a:graphicFrameLocks xmlns:a="http://schemas.openxmlformats.org/drawingml/2006/main" noChangeAspect="1"/>
+                </wp:cNvGraphicFramePr>
+                <a:graphic xmlns:a="http://schemas.openxmlformats.org/drawingml/2006/main">
+                  <a:graphicData uri="http://schemas.openxmlformats.org/drawingml/2006/picture">
+                    <pic:pic xmlns:pic="http://schemas.openxmlformats.org/drawingml/2006/picture">
+                      <pic:nvPicPr>
+                        <pic:cNvPr id="0" name="" descr=""/>
+                        <pic:cNvPicPr>
+                          <a:picLocks noChangeAspect="1" noChangeArrowheads="1"/>
+                        </pic:cNvPicPr>
+                      </pic:nvPicPr>
+                      <pic:blipFill>
+                        <a:blip r:embed="rId0" cstate="none"/>
+                        <a:srcRect/>
+                        <a:stretch>
+                          <a:fillRect/>
+                        </a:stretch>
+                      </pic:blipFill>
+                      <pic:spPr bwMode="auto">
+                        <a:xfrm>
+                          <a:off x="0" y="0"/>
+                          <a:ext cx="1428750" cy="400050"/>
+                        </a:xfrm>
+                        <a:prstGeom prst="rect">
+                          <a:avLst/>
+                        </a:prstGeom>
+                      </pic:spPr>
+                    </pic:pic>
+                  </a:graphicData>
+                </a:graphic>
+              </wp:inline>
+            </w:drawing>
+          </w:r>
+        </w:p>
+      </w:tc>
+    </w:tr>
+  </w:tbl>
+</w:ftr>
+</file>
+
+<file path=word/footer3.xml><?xml version="1.0" encoding="utf-8"?>
+<w:ftr xmlns:wpc="http://schemas.microsoft.com/office/word/2010/wordprocessingCanvas" xmlns:mc="http://schemas.openxmlformats.org/markup-compatibility/2006" xmlns:o="urn:schemas-microsoft-com:office:office" xmlns:r="http://schemas.openxmlformats.org/officeDocument/2006/relationships" xmlns:m="http://schemas.openxmlformats.org/officeDocument/2006/math" xmlns:v="urn:schemas-microsoft-com:vml" xmlns:wp14="http://schemas.microsoft.com/office/word/2010/wordprocessingDrawing" xmlns:wp="http://schemas.openxmlformats.org/drawingml/2006/wordprocessingDrawing" xmlns:w10="urn:schemas-microsoft-com:office:word" xmlns:w="http://schemas.openxmlformats.org/wordprocessingml/2006/main" xmlns:w14="http://schemas.microsoft.com/office/word/2010/wordml" xmlns:w15="http://schemas.microsoft.com/office/word/2012/wordml" xmlns:wpg="http://schemas.microsoft.com/office/word/2010/wordprocessingGroup" xmlns:wpi="http://schemas.microsoft.com/office/word/2010/wordprocessingInk" xmlns:wne="http://schemas.microsoft.com/office/word/2006/wordml" xmlns:wps="http://schemas.microsoft.com/office/word/2010/wordprocessingShape">
+  <w:p>
+    <w:pPr>
+      <w:spacing w:after="80"/>
+      <w:jc w:val="center"/>
+    </w:pPr>
+    <w:r>
+      <w:rPr>
+        <w:b/>
+        <w:bCs/>
+        <w:i/>
+        <w:iCs/>
+        <w:sz w:val="16"/>
+        <w:szCs w:val="16"/>
+      </w:rPr>
+      <w:t xml:space="preserve">SI ESTE DOCUMENTO SE ENCUENTRA IMPRESO SE CONSIDERA COPIA NO CONTROLADA</w:t>
+    </w:r>
+  </w:p>
+  <w:tbl>
+    <w:tblPr>
+      <w:tblW w:type="dxa" w:w="9638"/>
+      <w:tblBorders>
+        <w:top w:val="single" w:color="auto" w:sz="4"/>
+        <w:left w:val="single" w:color="auto" w:sz="4"/>
+        <w:bottom w:val="single" w:color="auto" w:sz="4"/>
+        <w:right w:val="single" w:color="auto" w:sz="4"/>
+        <w:insideH w:val="single" w:color="auto" w:sz="4"/>
+        <w:insideV w:val="single" w:color="auto" w:sz="4"/>
+      </w:tblBorders>
+    </w:tblPr>
+    <w:tblGrid>
+      <w:gridCol w:w="6638"/>
+      <w:gridCol w:w="3000"/>
+    </w:tblGrid>
+    <w:tr>
+      <w:tc>
+        <w:tcPr>
+          <w:tcW w:type="dxa" w:w="6638"/>
+          <w:tcBorders>
+            <w:top w:val="none" w:color="FFFFFF" w:sz="0"/>
+            <w:left w:val="none" w:color="FFFFFF" w:sz="0"/>
+            <w:bottom w:val="none" w:color="FFFFFF" w:sz="0"/>
+            <w:right w:val="none" w:color="FFFFFF" w:sz="0"/>
+          </w:tcBorders>
+          <w:tcMar>
+            <w:top w:type="dxa" w:w="50"/>
+            <w:left w:type="dxa" w:w="90"/>
+            <w:bottom w:type="dxa" w:w="50"/>
+            <w:right w:type="dxa" w:w="90"/>
+          </w:tcMar>
+          <w:vAlign w:val="center"/>
+        </w:tcPr>
+        <w:p>
+          <w:pPr>
+            <w:spacing w:after="0"/>
+          </w:pPr>
+          <w:r>
+            <w:rPr>
+              <w:color w:val="595959"/>
+              <w:sz w:val="16"/>
+              <w:szCs w:val="16"/>
+            </w:rPr>
+            <w:t xml:space="preserve">www.mecanalisis.com.ar | +54 261 476 9010</w:t>
+          </w:r>
+        </w:p>
+        <w:p>
+          <w:pPr>
+            <w:spacing w:after="0"/>
+          </w:pPr>
+          <w:r>
+            <w:rPr>
+              <w:color w:val="595959"/>
+              <w:sz w:val="16"/>
+              <w:szCs w:val="16"/>
+            </w:rPr>
+            <w:t xml:space="preserve">Pedro del Castillo 3160 . 5519 Guaymallén – Mendoza, Argentina.</w:t>
+          </w:r>
+        </w:p>
+      </w:tc>
+      <w:tc>
+        <w:tcPr>
+          <w:tcW w:type="dxa" w:w="3000"/>
+          <w:tcBorders>
+            <w:top w:val="none" w:color="FFFFFF" w:sz="0"/>
+            <w:left w:val="none" w:color="FFFFFF" w:sz="0"/>
+            <w:bottom w:val="none" w:color="FFFFFF" w:sz="0"/>
+            <w:right w:val="none" w:color="FFFFFF" w:sz="0"/>
+          </w:tcBorders>
+          <w:tcMar>
+            <w:top w:type="dxa" w:w="50"/>
+            <w:left w:type="dxa" w:w="90"/>
+            <w:bottom w:type="dxa" w:w="50"/>
+            <w:right w:type="dxa" w:w="90"/>
+          </w:tcMar>
+          <w:vAlign w:val="center"/>
+        </w:tcPr>
+        <w:p>
+          <w:pPr>
+            <w:jc w:val="right"/>
+          </w:pPr>
+          <w:r>
+            <w:drawing>
+              <wp:inline distT="0" distB="0" distL="0" distR="0">
+                <wp:extent cx="1428750" cy="400050"/>
+                <wp:effectExtent t="0" r="0" b="0" l="0"/>
+                <wp:docPr id="1" name="logo" descr="Logo Mecanálisis" title="Mecanálisis"/>
+                <wp:cNvGraphicFramePr>
+                  <a:graphicFrameLocks xmlns:a="http://schemas.openxmlformats.org/drawingml/2006/main" noChangeAspect="1"/>
+                </wp:cNvGraphicFramePr>
+                <a:graphic xmlns:a="http://schemas.openxmlformats.org/drawingml/2006/main">
+                  <a:graphicData uri="http://schemas.openxmlformats.org/drawingml/2006/picture">
+                    <pic:pic xmlns:pic="http://schemas.openxmlformats.org/drawingml/2006/picture">
+                      <pic:nvPicPr>
+                        <pic:cNvPr id="0" name="" descr=""/>
+                        <pic:cNvPicPr>
+                          <a:picLocks noChangeAspect="1" noChangeArrowheads="1"/>
+                        </pic:cNvPicPr>
+                      </pic:nvPicPr>
+                      <pic:blipFill>
+                        <a:blip r:embed="rId0" cstate="none"/>
+                        <a:srcRect/>
+                        <a:stretch>
+                          <a:fillRect/>
+                        </a:stretch>
+                      </pic:blipFill>
+                      <pic:spPr bwMode="auto">
+                        <a:xfrm>
+                          <a:off x="0" y="0"/>
+                          <a:ext cx="1428750" cy="400050"/>
+                        </a:xfrm>
+                        <a:prstGeom prst="rect">
+                          <a:avLst/>
+                        </a:prstGeom>
+                      </pic:spPr>
+                    </pic:pic>
+                  </a:graphicData>
+                </a:graphic>
+              </wp:inline>
+            </w:drawing>
+          </w:r>
+        </w:p>
+      </w:tc>
+    </w:tr>
+  </w:tbl>
+</w:ftr>
+</file>
+
 <file path=word/footnotes.xml><?xml version="1.0" encoding="utf-8"?>
 <w:footnotes xmlns:wpc="http://schemas.microsoft.com/office/word/2010/wordprocessingCanvas" xmlns:mc="http://schemas.openxmlformats.org/markup-compatibility/2006" xmlns:o="urn:schemas-microsoft-com:office:office" xmlns:r="http://schemas.openxmlformats.org/officeDocument/2006/relationships" xmlns:m="http://schemas.openxmlformats.org/officeDocument/2006/math" xmlns:v="urn:schemas-microsoft-com:vml" xmlns:wp14="http://schemas.microsoft.com/office/word/2010/wordprocessingDrawing" xmlns:wp="http://schemas.openxmlformats.org/drawingml/2006/wordprocessingDrawing" xmlns:w10="urn:schemas-microsoft-com:office:word" xmlns:w="http://schemas.openxmlformats.org/wordprocessingml/2006/main" xmlns:w14="http://schemas.microsoft.com/office/word/2010/wordml" xmlns:w15="http://schemas.microsoft.com/office/word/2012/wordml" xmlns:wpg="http://schemas.microsoft.com/office/word/2010/wordprocessingGroup" xmlns:wpi="http://schemas.microsoft.com/office/word/2010/wordprocessingInk" xmlns:wne="http://schemas.microsoft.com/office/word/2006/wordml" xmlns:wps="http://schemas.microsoft.com/office/word/2010/wordprocessingShape" mc:Ignorable="w14 w15 wp14">
   <w:footnote w:type="separator" w:id="-1">
@@ -14241,6 +14752,616 @@
 </file>
 
 <file path=word/header1.xml><?xml version="1.0" encoding="utf-8"?>
+<w:hdr xmlns:wpc="http://schemas.microsoft.com/office/word/2010/wordprocessingCanvas" xmlns:mc="http://schemas.openxmlformats.org/markup-compatibility/2006" xmlns:o="urn:schemas-microsoft-com:office:office" xmlns:r="http://schemas.openxmlformats.org/officeDocument/2006/relationships" xmlns:m="http://schemas.openxmlformats.org/officeDocument/2006/math" xmlns:v="urn:schemas-microsoft-com:vml" xmlns:wp14="http://schemas.microsoft.com/office/word/2010/wordprocessingDrawing" xmlns:wp="http://schemas.openxmlformats.org/drawingml/2006/wordprocessingDrawing" xmlns:w10="urn:schemas-microsoft-com:office:word" xmlns:w="http://schemas.openxmlformats.org/wordprocessingml/2006/main" xmlns:w14="http://schemas.microsoft.com/office/word/2010/wordml" xmlns:w15="http://schemas.microsoft.com/office/word/2012/wordml" xmlns:wpg="http://schemas.microsoft.com/office/word/2010/wordprocessingGroup" xmlns:wpi="http://schemas.microsoft.com/office/word/2010/wordprocessingInk" xmlns:wne="http://schemas.microsoft.com/office/word/2006/wordml" xmlns:wps="http://schemas.microsoft.com/office/word/2010/wordprocessingShape" xmlns:cx="http://schemas.microsoft.com/office/drawing/2014/chartex" xmlns:cx1="http://schemas.microsoft.com/office/drawing/2015/9/8/chartex" xmlns:cx2="http://schemas.microsoft.com/office/drawing/2015/10/21/chartex" xmlns:cx3="http://schemas.microsoft.com/office/drawing/2016/5/9/chartex" xmlns:cx4="http://schemas.microsoft.com/office/drawing/2016/5/10/chartex" xmlns:cx5="http://schemas.microsoft.com/office/drawing/2016/5/11/chartex" xmlns:cx6="http://schemas.microsoft.com/office/drawing/2016/5/12/chartex" xmlns:cx7="http://schemas.microsoft.com/office/drawing/2016/5/13/chartex" xmlns:cx8="http://schemas.microsoft.com/office/drawing/2016/5/14/chartex" xmlns:w16cid="http://schemas.microsoft.com/office/word/2016/wordml/cid" xmlns:w16se="http://schemas.microsoft.com/office/word/2015/wordml/symex">
+  <w:tbl>
+    <w:tblPr>
+      <w:tblW w:type="dxa" w:w="9638"/>
+      <w:tblBorders>
+        <w:top w:val="single" w:color="auto" w:sz="4"/>
+        <w:left w:val="single" w:color="auto" w:sz="4"/>
+        <w:bottom w:val="single" w:color="auto" w:sz="4"/>
+        <w:right w:val="single" w:color="auto" w:sz="4"/>
+        <w:insideH w:val="single" w:color="auto" w:sz="4"/>
+        <w:insideV w:val="single" w:color="auto" w:sz="4"/>
+      </w:tblBorders>
+    </w:tblPr>
+    <w:tblGrid>
+      <w:gridCol w:w="1750"/>
+      <w:gridCol w:w="3900"/>
+      <w:gridCol w:w="1900"/>
+      <w:gridCol w:w="2088"/>
+    </w:tblGrid>
+    <w:tr>
+      <w:tc>
+        <w:tcPr>
+          <w:tcW w:type="dxa" w:w="1750"/>
+          <w:tcBorders>
+            <w:top w:val="none" w:color="FFFFFF" w:sz="0"/>
+            <w:left w:val="none" w:color="FFFFFF" w:sz="0"/>
+            <w:bottom w:val="none" w:color="FFFFFF" w:sz="0"/>
+            <w:right w:val="none" w:color="FFFFFF" w:sz="0"/>
+          </w:tcBorders>
+          <w:tcMar>
+            <w:top w:type="dxa" w:w="50"/>
+            <w:left w:type="dxa" w:w="90"/>
+            <w:bottom w:type="dxa" w:w="50"/>
+            <w:right w:type="dxa" w:w="90"/>
+          </w:tcMar>
+          <w:vAlign w:val="top"/>
+        </w:tcPr>
+        <w:p>
+          <w:pPr>
+            <w:spacing w:after="20"/>
+            <w:jc w:val="left"/>
+          </w:pPr>
+          <w:r>
+            <w:rPr>
+              <w:rFonts w:ascii="Calibri" w:cs="Calibri" w:eastAsia="Calibri" w:hAnsi="Calibri"/>
+              <w:sz w:val="14"/>
+              <w:szCs w:val="14"/>
+            </w:rPr>
+            <w:t xml:space="preserve">TIPO DE DOCUMENTO</w:t>
+          </w:r>
+        </w:p>
+        <w:p>
+          <w:pPr>
+            <w:spacing w:after="20"/>
+            <w:jc w:val="left"/>
+          </w:pPr>
+          <w:r>
+            <w:rPr>
+              <w:rFonts w:ascii="Calibri" w:cs="Calibri" w:eastAsia="Calibri" w:hAnsi="Calibri"/>
+              <w:sz w:val="14"/>
+              <w:szCs w:val="14"/>
+            </w:rPr>
+            <w:t xml:space="preserve">TÍTULO DE DOCUMENTO</w:t>
+          </w:r>
+        </w:p>
+      </w:tc>
+      <w:tc>
+        <w:tcPr>
+          <w:tcW w:type="dxa" w:w="3900"/>
+          <w:tcBorders>
+            <w:top w:val="none" w:color="FFFFFF" w:sz="0"/>
+            <w:left w:val="none" w:color="FFFFFF" w:sz="0"/>
+            <w:bottom w:val="none" w:color="FFFFFF" w:sz="0"/>
+            <w:right w:val="none" w:color="FFFFFF" w:sz="0"/>
+          </w:tcBorders>
+          <w:tcMar>
+            <w:top w:type="dxa" w:w="50"/>
+            <w:left w:type="dxa" w:w="90"/>
+            <w:bottom w:type="dxa" w:w="50"/>
+            <w:right w:type="dxa" w:w="90"/>
+          </w:tcMar>
+          <w:vAlign w:val="top"/>
+        </w:tcPr>
+        <w:p>
+          <w:pPr>
+            <w:spacing w:after="0"/>
+            <w:jc w:val="left"/>
+          </w:pPr>
+          <w:r>
+            <w:rPr>
+              <w:rFonts w:ascii="Calibri" w:cs="Calibri" w:eastAsia="Calibri" w:hAnsi="Calibri"/>
+              <w:b/>
+              <w:bCs/>
+              <w:color w:val="6D8289"/>
+              <w:sz w:val="16"/>
+              <w:szCs w:val="16"/>
+            </w:rPr>
+            <w:t xml:space="preserve">PROCEDIMIENTO</w:t>
+          </w:r>
+        </w:p>
+        <w:p>
+          <w:pPr>
+            <w:spacing w:after="0"/>
+            <w:jc w:val="left"/>
+          </w:pPr>
+          <w:r>
+            <w:rPr>
+              <w:rFonts w:ascii="Calibri" w:cs="Calibri" w:eastAsia="Calibri" w:hAnsi="Calibri"/>
+              <w:b/>
+              <w:bCs/>
+              <w:color w:val="6D8289"/>
+              <w:sz w:val="16"/>
+              <w:szCs w:val="16"/>
+            </w:rPr>
+            <w:t xml:space="preserve">INSPECCIÓN ROBOTIZADA GRIS</w:t>
+          </w:r>
+        </w:p>
+        <w:p>
+          <w:pPr>
+            <w:spacing w:after="0"/>
+            <w:jc w:val="left"/>
+          </w:pPr>
+          <w:r>
+            <w:rPr>
+              <w:rFonts w:ascii="Calibri" w:cs="Calibri" w:eastAsia="Calibri" w:hAnsi="Calibri"/>
+              <w:b/>
+              <w:bCs/>
+              <w:color w:val="6D8289"/>
+              <w:sz w:val="16"/>
+              <w:szCs w:val="16"/>
+            </w:rPr>
+            <w:t xml:space="preserve">ENSAYOS EL CID Y WTT EN ENTREHIERRO</w:t>
+          </w:r>
+        </w:p>
+      </w:tc>
+      <w:tc>
+        <w:tcPr>
+          <w:tcW w:type="dxa" w:w="1900"/>
+          <w:tcBorders>
+            <w:top w:val="none" w:color="FFFFFF" w:sz="0"/>
+            <w:left w:val="none" w:color="FFFFFF" w:sz="0"/>
+            <w:bottom w:val="none" w:color="FFFFFF" w:sz="0"/>
+            <w:right w:val="none" w:color="FFFFFF" w:sz="0"/>
+          </w:tcBorders>
+          <w:tcMar>
+            <w:top w:type="dxa" w:w="50"/>
+            <w:left w:type="dxa" w:w="90"/>
+            <w:bottom w:type="dxa" w:w="50"/>
+            <w:right w:type="dxa" w:w="90"/>
+          </w:tcMar>
+          <w:vAlign w:val="top"/>
+        </w:tcPr>
+        <w:p>
+          <w:pPr>
+            <w:spacing w:after="40" w:before="40"/>
+            <w:jc w:val="right"/>
+          </w:pPr>
+          <w:r>
+            <w:rPr>
+              <w:sz w:val="14"/>
+              <w:szCs w:val="14"/>
+            </w:rPr>
+            <w:t xml:space="preserve">CÓDIGO</w:t>
+          </w:r>
+        </w:p>
+        <w:p>
+          <w:pPr>
+            <w:spacing w:after="20"/>
+            <w:jc w:val="right"/>
+          </w:pPr>
+          <w:r>
+            <w:rPr>
+              <w:rFonts w:ascii="Calibri" w:cs="Calibri" w:eastAsia="Calibri" w:hAnsi="Calibri"/>
+              <w:sz w:val="14"/>
+              <w:szCs w:val="14"/>
+            </w:rPr>
+            <w:t xml:space="preserve">VERSIÓN</w:t>
+          </w:r>
+        </w:p>
+        <w:p>
+          <w:pPr>
+            <w:spacing w:after="20"/>
+            <w:jc w:val="right"/>
+          </w:pPr>
+          <w:r>
+            <w:rPr>
+              <w:rFonts w:ascii="Calibri" w:cs="Calibri" w:eastAsia="Calibri" w:hAnsi="Calibri"/>
+              <w:sz w:val="14"/>
+              <w:szCs w:val="14"/>
+            </w:rPr>
+            <w:t xml:space="preserve">FECHA DE REVISIÓN</w:t>
+          </w:r>
+        </w:p>
+      </w:tc>
+      <w:tc>
+        <w:tcPr>
+          <w:tcW w:type="dxa" w:w="2088"/>
+          <w:tcBorders>
+            <w:top w:val="none" w:color="FFFFFF" w:sz="0"/>
+            <w:left w:val="none" w:color="FFFFFF" w:sz="0"/>
+            <w:bottom w:val="none" w:color="FFFFFF" w:sz="0"/>
+            <w:right w:val="single" w:color="E36C0A" w:sz="12"/>
+          </w:tcBorders>
+          <w:tcMar>
+            <w:top w:type="dxa" w:w="50"/>
+            <w:left w:type="dxa" w:w="90"/>
+            <w:bottom w:type="dxa" w:w="50"/>
+            <w:right w:type="dxa" w:w="90"/>
+          </w:tcMar>
+          <w:vAlign w:val="top"/>
+        </w:tcPr>
+        <w:p>
+          <w:pPr>
+            <w:spacing w:after="0"/>
+            <w:jc w:val="right"/>
+          </w:pPr>
+          <w:r>
+            <w:rPr>
+              <w:rFonts w:ascii="Calibri" w:cs="Calibri" w:eastAsia="Calibri" w:hAnsi="Calibri"/>
+              <w:b/>
+              <w:bCs/>
+              <w:color w:val="E36C0A"/>
+              <w:sz w:val="22"/>
+              <w:szCs w:val="22"/>
+            </w:rPr>
+            <w:t xml:space="preserve">00503-00-EPG001</w:t>
+          </w:r>
+        </w:p>
+        <w:p>
+          <w:pPr>
+            <w:spacing w:after="0"/>
+            <w:jc w:val="right"/>
+          </w:pPr>
+          <w:r>
+            <w:rPr>
+              <w:rFonts w:ascii="Calibri" w:cs="Calibri" w:eastAsia="Calibri" w:hAnsi="Calibri"/>
+              <w:b/>
+              <w:bCs/>
+              <w:color w:val="E36C0A"/>
+              <w:sz w:val="16"/>
+              <w:szCs w:val="16"/>
+            </w:rPr>
+            <w:t xml:space="preserve">00</w:t>
+          </w:r>
+        </w:p>
+        <w:p>
+          <w:pPr>
+            <w:spacing w:after="0"/>
+            <w:jc w:val="right"/>
+          </w:pPr>
+          <w:r>
+            <w:rPr>
+              <w:rFonts w:ascii="Calibri" w:cs="Calibri" w:eastAsia="Calibri" w:hAnsi="Calibri"/>
+              <w:b/>
+              <w:bCs/>
+              <w:color w:val="E36C0A"/>
+              <w:sz w:val="16"/>
+              <w:szCs w:val="16"/>
+            </w:rPr>
+            <w:t xml:space="preserve">28/10/2026</w:t>
+          </w:r>
+        </w:p>
+      </w:tc>
+    </w:tr>
+  </w:tbl>
+  <w:p>
+    <w:pPr>
+      <w:spacing w:after="0" w:before="60"/>
+      <w:jc w:val="right"/>
+    </w:pPr>
+    <w:r>
+      <w:rPr>
+        <w:color w:val="6D8289"/>
+        <w:sz w:val="28"/>
+        <w:szCs w:val="28"/>
+      </w:rPr>
+      <w:fldChar w:fldCharType="begin"/>
+      <w:instrText xml:space="preserve">PAGE</w:instrText>
+      <w:fldChar w:fldCharType="separate"/>
+      <w:fldChar w:fldCharType="end"/>
+    </w:r>
+    <w:r>
+      <w:rPr>
+        <w:color w:val="6D8289"/>
+        <w:sz w:val="28"/>
+        <w:szCs w:val="28"/>
+      </w:rPr>
+      <w:t xml:space="preserve">/</w:t>
+    </w:r>
+    <w:r>
+      <w:rPr>
+        <w:color w:val="6D8289"/>
+        <w:sz w:val="28"/>
+        <w:szCs w:val="28"/>
+      </w:rPr>
+      <w:fldChar w:fldCharType="begin"/>
+      <w:instrText xml:space="preserve">NUMPAGES</w:instrText>
+      <w:fldChar w:fldCharType="separate"/>
+      <w:fldChar w:fldCharType="end"/>
+    </w:r>
+  </w:p>
+</w:hdr>
+</file>
+
+<file path=word/header2.xml><?xml version="1.0" encoding="utf-8"?>
+<w:hdr xmlns:wpc="http://schemas.microsoft.com/office/word/2010/wordprocessingCanvas" xmlns:mc="http://schemas.openxmlformats.org/markup-compatibility/2006" xmlns:o="urn:schemas-microsoft-com:office:office" xmlns:r="http://schemas.openxmlformats.org/officeDocument/2006/relationships" xmlns:m="http://schemas.openxmlformats.org/officeDocument/2006/math" xmlns:v="urn:schemas-microsoft-com:vml" xmlns:wp14="http://schemas.microsoft.com/office/word/2010/wordprocessingDrawing" xmlns:wp="http://schemas.openxmlformats.org/drawingml/2006/wordprocessingDrawing" xmlns:w10="urn:schemas-microsoft-com:office:word" xmlns:w="http://schemas.openxmlformats.org/wordprocessingml/2006/main" xmlns:w14="http://schemas.microsoft.com/office/word/2010/wordml" xmlns:w15="http://schemas.microsoft.com/office/word/2012/wordml" xmlns:wpg="http://schemas.microsoft.com/office/word/2010/wordprocessingGroup" xmlns:wpi="http://schemas.microsoft.com/office/word/2010/wordprocessingInk" xmlns:wne="http://schemas.microsoft.com/office/word/2006/wordml" xmlns:wps="http://schemas.microsoft.com/office/word/2010/wordprocessingShape" xmlns:cx="http://schemas.microsoft.com/office/drawing/2014/chartex" xmlns:cx1="http://schemas.microsoft.com/office/drawing/2015/9/8/chartex" xmlns:cx2="http://schemas.microsoft.com/office/drawing/2015/10/21/chartex" xmlns:cx3="http://schemas.microsoft.com/office/drawing/2016/5/9/chartex" xmlns:cx4="http://schemas.microsoft.com/office/drawing/2016/5/10/chartex" xmlns:cx5="http://schemas.microsoft.com/office/drawing/2016/5/11/chartex" xmlns:cx6="http://schemas.microsoft.com/office/drawing/2016/5/12/chartex" xmlns:cx7="http://schemas.microsoft.com/office/drawing/2016/5/13/chartex" xmlns:cx8="http://schemas.microsoft.com/office/drawing/2016/5/14/chartex" xmlns:w16cid="http://schemas.microsoft.com/office/word/2016/wordml/cid" xmlns:w16se="http://schemas.microsoft.com/office/word/2015/wordml/symex">
+  <w:tbl>
+    <w:tblPr>
+      <w:tblW w:type="dxa" w:w="9638"/>
+      <w:tblBorders>
+        <w:top w:val="single" w:color="auto" w:sz="4"/>
+        <w:left w:val="single" w:color="auto" w:sz="4"/>
+        <w:bottom w:val="single" w:color="auto" w:sz="4"/>
+        <w:right w:val="single" w:color="auto" w:sz="4"/>
+        <w:insideH w:val="single" w:color="auto" w:sz="4"/>
+        <w:insideV w:val="single" w:color="auto" w:sz="4"/>
+      </w:tblBorders>
+    </w:tblPr>
+    <w:tblGrid>
+      <w:gridCol w:w="1750"/>
+      <w:gridCol w:w="3900"/>
+      <w:gridCol w:w="1900"/>
+      <w:gridCol w:w="2088"/>
+    </w:tblGrid>
+    <w:tr>
+      <w:tc>
+        <w:tcPr>
+          <w:tcW w:type="dxa" w:w="1750"/>
+          <w:tcBorders>
+            <w:top w:val="none" w:color="FFFFFF" w:sz="0"/>
+            <w:left w:val="none" w:color="FFFFFF" w:sz="0"/>
+            <w:bottom w:val="none" w:color="FFFFFF" w:sz="0"/>
+            <w:right w:val="none" w:color="FFFFFF" w:sz="0"/>
+          </w:tcBorders>
+          <w:tcMar>
+            <w:top w:type="dxa" w:w="50"/>
+            <w:left w:type="dxa" w:w="90"/>
+            <w:bottom w:type="dxa" w:w="50"/>
+            <w:right w:type="dxa" w:w="90"/>
+          </w:tcMar>
+          <w:vAlign w:val="top"/>
+        </w:tcPr>
+        <w:p>
+          <w:pPr>
+            <w:spacing w:after="20"/>
+            <w:jc w:val="left"/>
+          </w:pPr>
+          <w:r>
+            <w:rPr>
+              <w:rFonts w:ascii="Calibri" w:cs="Calibri" w:eastAsia="Calibri" w:hAnsi="Calibri"/>
+              <w:sz w:val="14"/>
+              <w:szCs w:val="14"/>
+            </w:rPr>
+            <w:t xml:space="preserve">TIPO DE DOCUMENTO</w:t>
+          </w:r>
+        </w:p>
+        <w:p>
+          <w:pPr>
+            <w:spacing w:after="20"/>
+            <w:jc w:val="left"/>
+          </w:pPr>
+          <w:r>
+            <w:rPr>
+              <w:rFonts w:ascii="Calibri" w:cs="Calibri" w:eastAsia="Calibri" w:hAnsi="Calibri"/>
+              <w:sz w:val="14"/>
+              <w:szCs w:val="14"/>
+            </w:rPr>
+            <w:t xml:space="preserve">TÍTULO DE DOCUMENTO</w:t>
+          </w:r>
+        </w:p>
+      </w:tc>
+      <w:tc>
+        <w:tcPr>
+          <w:tcW w:type="dxa" w:w="3900"/>
+          <w:tcBorders>
+            <w:top w:val="none" w:color="FFFFFF" w:sz="0"/>
+            <w:left w:val="none" w:color="FFFFFF" w:sz="0"/>
+            <w:bottom w:val="none" w:color="FFFFFF" w:sz="0"/>
+            <w:right w:val="none" w:color="FFFFFF" w:sz="0"/>
+          </w:tcBorders>
+          <w:tcMar>
+            <w:top w:type="dxa" w:w="50"/>
+            <w:left w:type="dxa" w:w="90"/>
+            <w:bottom w:type="dxa" w:w="50"/>
+            <w:right w:type="dxa" w:w="90"/>
+          </w:tcMar>
+          <w:vAlign w:val="top"/>
+        </w:tcPr>
+        <w:p>
+          <w:pPr>
+            <w:spacing w:after="0"/>
+            <w:jc w:val="left"/>
+          </w:pPr>
+          <w:r>
+            <w:rPr>
+              <w:rFonts w:ascii="Calibri" w:cs="Calibri" w:eastAsia="Calibri" w:hAnsi="Calibri"/>
+              <w:b/>
+              <w:bCs/>
+              <w:color w:val="6D8289"/>
+              <w:sz w:val="16"/>
+              <w:szCs w:val="16"/>
+            </w:rPr>
+            <w:t xml:space="preserve">PROCEDIMIENTO</w:t>
+          </w:r>
+        </w:p>
+        <w:p>
+          <w:pPr>
+            <w:spacing w:after="0"/>
+            <w:jc w:val="left"/>
+          </w:pPr>
+          <w:r>
+            <w:rPr>
+              <w:rFonts w:ascii="Calibri" w:cs="Calibri" w:eastAsia="Calibri" w:hAnsi="Calibri"/>
+              <w:b/>
+              <w:bCs/>
+              <w:color w:val="6D8289"/>
+              <w:sz w:val="16"/>
+              <w:szCs w:val="16"/>
+            </w:rPr>
+            <w:t xml:space="preserve">INSPECCIÓN ROBOTIZADA GRIS</w:t>
+          </w:r>
+        </w:p>
+        <w:p>
+          <w:pPr>
+            <w:spacing w:after="0"/>
+            <w:jc w:val="left"/>
+          </w:pPr>
+          <w:r>
+            <w:rPr>
+              <w:rFonts w:ascii="Calibri" w:cs="Calibri" w:eastAsia="Calibri" w:hAnsi="Calibri"/>
+              <w:b/>
+              <w:bCs/>
+              <w:color w:val="6D8289"/>
+              <w:sz w:val="16"/>
+              <w:szCs w:val="16"/>
+            </w:rPr>
+            <w:t xml:space="preserve">ENSAYOS EL CID Y WTT EN ENTREHIERRO</w:t>
+          </w:r>
+        </w:p>
+      </w:tc>
+      <w:tc>
+        <w:tcPr>
+          <w:tcW w:type="dxa" w:w="1900"/>
+          <w:tcBorders>
+            <w:top w:val="none" w:color="FFFFFF" w:sz="0"/>
+            <w:left w:val="none" w:color="FFFFFF" w:sz="0"/>
+            <w:bottom w:val="none" w:color="FFFFFF" w:sz="0"/>
+            <w:right w:val="none" w:color="FFFFFF" w:sz="0"/>
+          </w:tcBorders>
+          <w:tcMar>
+            <w:top w:type="dxa" w:w="50"/>
+            <w:left w:type="dxa" w:w="90"/>
+            <w:bottom w:type="dxa" w:w="50"/>
+            <w:right w:type="dxa" w:w="90"/>
+          </w:tcMar>
+          <w:vAlign w:val="top"/>
+        </w:tcPr>
+        <w:p>
+          <w:pPr>
+            <w:spacing w:after="40" w:before="40"/>
+            <w:jc w:val="right"/>
+          </w:pPr>
+          <w:r>
+            <w:rPr>
+              <w:sz w:val="14"/>
+              <w:szCs w:val="14"/>
+            </w:rPr>
+            <w:t xml:space="preserve">CÓDIGO</w:t>
+          </w:r>
+        </w:p>
+        <w:p>
+          <w:pPr>
+            <w:spacing w:after="20"/>
+            <w:jc w:val="right"/>
+          </w:pPr>
+          <w:r>
+            <w:rPr>
+              <w:rFonts w:ascii="Calibri" w:cs="Calibri" w:eastAsia="Calibri" w:hAnsi="Calibri"/>
+              <w:sz w:val="14"/>
+              <w:szCs w:val="14"/>
+            </w:rPr>
+            <w:t xml:space="preserve">VERSIÓN</w:t>
+          </w:r>
+        </w:p>
+        <w:p>
+          <w:pPr>
+            <w:spacing w:after="20"/>
+            <w:jc w:val="right"/>
+          </w:pPr>
+          <w:r>
+            <w:rPr>
+              <w:rFonts w:ascii="Calibri" w:cs="Calibri" w:eastAsia="Calibri" w:hAnsi="Calibri"/>
+              <w:sz w:val="14"/>
+              <w:szCs w:val="14"/>
+            </w:rPr>
+            <w:t xml:space="preserve">FECHA DE REVISIÓN</w:t>
+          </w:r>
+        </w:p>
+      </w:tc>
+      <w:tc>
+        <w:tcPr>
+          <w:tcW w:type="dxa" w:w="2088"/>
+          <w:tcBorders>
+            <w:top w:val="none" w:color="FFFFFF" w:sz="0"/>
+            <w:left w:val="none" w:color="FFFFFF" w:sz="0"/>
+            <w:bottom w:val="none" w:color="FFFFFF" w:sz="0"/>
+            <w:right w:val="single" w:color="E36C0A" w:sz="12"/>
+          </w:tcBorders>
+          <w:tcMar>
+            <w:top w:type="dxa" w:w="50"/>
+            <w:left w:type="dxa" w:w="90"/>
+            <w:bottom w:type="dxa" w:w="50"/>
+            <w:right w:type="dxa" w:w="90"/>
+          </w:tcMar>
+          <w:vAlign w:val="top"/>
+        </w:tcPr>
+        <w:p>
+          <w:pPr>
+            <w:spacing w:after="0"/>
+            <w:jc w:val="right"/>
+          </w:pPr>
+          <w:r>
+            <w:rPr>
+              <w:rFonts w:ascii="Calibri" w:cs="Calibri" w:eastAsia="Calibri" w:hAnsi="Calibri"/>
+              <w:b/>
+              <w:bCs/>
+              <w:color w:val="E36C0A"/>
+              <w:sz w:val="22"/>
+              <w:szCs w:val="22"/>
+            </w:rPr>
+            <w:t xml:space="preserve">00503-00-EPG001</w:t>
+          </w:r>
+        </w:p>
+        <w:p>
+          <w:pPr>
+            <w:spacing w:after="0"/>
+            <w:jc w:val="right"/>
+          </w:pPr>
+          <w:r>
+            <w:rPr>
+              <w:rFonts w:ascii="Calibri" w:cs="Calibri" w:eastAsia="Calibri" w:hAnsi="Calibri"/>
+              <w:b/>
+              <w:bCs/>
+              <w:color w:val="E36C0A"/>
+              <w:sz w:val="16"/>
+              <w:szCs w:val="16"/>
+            </w:rPr>
+            <w:t xml:space="preserve">00</w:t>
+          </w:r>
+        </w:p>
+        <w:p>
+          <w:pPr>
+            <w:spacing w:after="0"/>
+            <w:jc w:val="right"/>
+          </w:pPr>
+          <w:r>
+            <w:rPr>
+              <w:rFonts w:ascii="Calibri" w:cs="Calibri" w:eastAsia="Calibri" w:hAnsi="Calibri"/>
+              <w:b/>
+              <w:bCs/>
+              <w:color w:val="E36C0A"/>
+              <w:sz w:val="16"/>
+              <w:szCs w:val="16"/>
+            </w:rPr>
+            <w:t xml:space="preserve">28/10/2026</w:t>
+          </w:r>
+        </w:p>
+      </w:tc>
+    </w:tr>
+  </w:tbl>
+  <w:p>
+    <w:pPr>
+      <w:spacing w:after="0" w:before="60"/>
+      <w:jc w:val="right"/>
+    </w:pPr>
+    <w:r>
+      <w:rPr>
+        <w:color w:val="6D8289"/>
+        <w:sz w:val="28"/>
+        <w:szCs w:val="28"/>
+      </w:rPr>
+      <w:fldChar w:fldCharType="begin"/>
+      <w:instrText xml:space="preserve">PAGE</w:instrText>
+      <w:fldChar w:fldCharType="separate"/>
+      <w:fldChar w:fldCharType="end"/>
+    </w:r>
+    <w:r>
+      <w:rPr>
+        <w:color w:val="6D8289"/>
+        <w:sz w:val="28"/>
+        <w:szCs w:val="28"/>
+      </w:rPr>
+      <w:t xml:space="preserve">/</w:t>
+    </w:r>
+    <w:r>
+      <w:rPr>
+        <w:color w:val="6D8289"/>
+        <w:sz w:val="28"/>
+        <w:szCs w:val="28"/>
+      </w:rPr>
+      <w:fldChar w:fldCharType="begin"/>
+      <w:instrText xml:space="preserve">NUMPAGES</w:instrText>
+      <w:fldChar w:fldCharType="separate"/>
+      <w:fldChar w:fldCharType="end"/>
+    </w:r>
+  </w:p>
+</w:hdr>
+</file>
+
+<file path=word/header3.xml><?xml version="1.0" encoding="utf-8"?>
 <w:hdr xmlns:wpc="http://schemas.microsoft.com/office/word/2010/wordprocessingCanvas" xmlns:mc="http://schemas.openxmlformats.org/markup-compatibility/2006" xmlns:o="urn:schemas-microsoft-com:office:office" xmlns:r="http://schemas.openxmlformats.org/officeDocument/2006/relationships" xmlns:m="http://schemas.openxmlformats.org/officeDocument/2006/math" xmlns:v="urn:schemas-microsoft-com:vml" xmlns:wp14="http://schemas.microsoft.com/office/word/2010/wordprocessingDrawing" xmlns:wp="http://schemas.openxmlformats.org/drawingml/2006/wordprocessingDrawing" xmlns:w10="urn:schemas-microsoft-com:office:word" xmlns:w="http://schemas.openxmlformats.org/wordprocessingml/2006/main" xmlns:w14="http://schemas.microsoft.com/office/word/2010/wordml" xmlns:w15="http://schemas.microsoft.com/office/word/2012/wordml" xmlns:wpg="http://schemas.microsoft.com/office/word/2010/wordprocessingGroup" xmlns:wpi="http://schemas.microsoft.com/office/word/2010/wordprocessingInk" xmlns:wne="http://schemas.microsoft.com/office/word/2006/wordml" xmlns:wps="http://schemas.microsoft.com/office/word/2010/wordprocessingShape" xmlns:cx="http://schemas.microsoft.com/office/drawing/2014/chartex" xmlns:cx1="http://schemas.microsoft.com/office/drawing/2015/9/8/chartex" xmlns:cx2="http://schemas.microsoft.com/office/drawing/2015/10/21/chartex" xmlns:cx3="http://schemas.microsoft.com/office/drawing/2016/5/9/chartex" xmlns:cx4="http://schemas.microsoft.com/office/drawing/2016/5/10/chartex" xmlns:cx5="http://schemas.microsoft.com/office/drawing/2016/5/11/chartex" xmlns:cx6="http://schemas.microsoft.com/office/drawing/2016/5/12/chartex" xmlns:cx7="http://schemas.microsoft.com/office/drawing/2016/5/13/chartex" xmlns:cx8="http://schemas.microsoft.com/office/drawing/2016/5/14/chartex" xmlns:w16cid="http://schemas.microsoft.com/office/word/2016/wordml/cid" xmlns:w16se="http://schemas.microsoft.com/office/word/2015/wordml/symex">
   <w:tbl>
     <w:tblPr>

</xml_diff>

<commit_message>
Figura 1 en una sola hoja A3 apaisada dentro del procedimiento
Reemplaza el pliego de dos páginas por una sección A3 apaisada con su propio
encabezado y pie, legible también en digital.

Co-Authored-By: Claude Opus 5.5 <noreply@anthropic.com>
Claude-Session: https://claude.ai/code/session_01Nz5qZw2jp5HghH6VEfj4aK
</commit_message>
<xml_diff>
--- a/procedimientos_gris/00503-00-EPG001 Procedimiento Inspeccion Robotizada GRIS.docx
+++ b/procedimientos_gris/00503-00-EPG001 Procedimiento Inspeccion Robotizada GRIS.docx
@@ -469,7 +469,7 @@
           <w:sz w:val="19"/>
         </w:rPr>
         <w:tab/>
-        <w:t>12</w:t>
+        <w:t>10</w:t>
       </w:r>
     </w:p>
     <w:p>
@@ -491,7 +491,7 @@
           <w:sz w:val="19"/>
         </w:rPr>
         <w:tab/>
-        <w:t>13</w:t>
+        <w:t>11</w:t>
       </w:r>
     </w:p>
     <w:p>
@@ -513,7 +513,7 @@
           <w:sz w:val="19"/>
         </w:rPr>
         <w:tab/>
-        <w:t>14</w:t>
+        <w:t>12</w:t>
       </w:r>
     </w:p>
     <w:p>
@@ -536,7 +536,7 @@
           <w:sz w:val="19"/>
         </w:rPr>
         <w:tab/>
-        <w:t>15</w:t>
+        <w:t>13</w:t>
       </w:r>
       <w:r>
         <w:fldChar w:fldCharType="end"/>
@@ -9941,15 +9941,14 @@
       <w:pPr>
         <w:keepNext/>
         <w:spacing w:after="60" w:before="0"/>
-        <w:ind w:left="1838" w:right="-800"/>
-        <w:jc w:val="left"/>
+        <w:jc w:val="center"/>
       </w:pPr>
       <w:r>
         <w:drawing>
           <wp:inline distT="0" distB="0" distL="0" distR="0">
-            <wp:extent cx="5448300" cy="7629525"/>
+            <wp:extent cx="11096625" cy="7772400"/>
             <wp:effectExtent t="0" r="0" b="0" l="0"/>
-            <wp:docPr id="1" name="esquema_general_izq.png" descr="Figura 1: Esquema general de conexiones del sistema GRIS" title="Figura 1: Esquema general de conexiones del sistema GRIS"/>
+            <wp:docPr id="1" name="esquema_general.png" descr="Figura 1: Esquema general de conexiones del sistema GRIS" title="Figura 1: Esquema general de conexiones del sistema GRIS"/>
             <wp:cNvGraphicFramePr>
               <a:graphicFrameLocks xmlns:a="http://schemas.openxmlformats.org/drawingml/2006/main" noChangeAspect="1"/>
             </wp:cNvGraphicFramePr>
@@ -9972,7 +9971,7 @@
                   <pic:spPr bwMode="auto">
                     <a:xfrm>
                       <a:off x="0" y="0"/>
-                      <a:ext cx="5448300" cy="7629525"/>
+                      <a:ext cx="11096625" cy="7772400"/>
                     </a:xfrm>
                     <a:prstGeom prst="rect">
                       <a:avLst/>
@@ -9997,75 +9996,7 @@
           <w:sz w:val="18"/>
           <w:szCs w:val="18"/>
         </w:rPr>
-        <w:t xml:space="preserve">Figura 1: Esquema general de conexiones del sistema GRIS (pliego de dos páginas; continúa en la página siguiente)</w:t>
-      </w:r>
-    </w:p>
-    <w:p>
-      <w:r>
-        <w:br w:type="page"/>
-      </w:r>
-    </w:p>
-    <w:p>
-      <w:pPr>
-        <w:keepNext/>
-        <w:spacing w:after="60" w:before="0"/>
-        <w:ind w:left="-800"/>
-        <w:jc w:val="left"/>
-      </w:pPr>
-      <w:r>
-        <w:drawing>
-          <wp:inline distT="0" distB="0" distL="0" distR="0">
-            <wp:extent cx="5448300" cy="7629525"/>
-            <wp:effectExtent t="0" r="0" b="0" l="0"/>
-            <wp:docPr id="1" name="esquema_general_der.png" descr="Figura 1: Esquema general de conexiones del sistema GRIS" title="Figura 1: Esquema general de conexiones del sistema GRIS"/>
-            <wp:cNvGraphicFramePr>
-              <a:graphicFrameLocks xmlns:a="http://schemas.openxmlformats.org/drawingml/2006/main" noChangeAspect="1"/>
-            </wp:cNvGraphicFramePr>
-            <a:graphic xmlns:a="http://schemas.openxmlformats.org/drawingml/2006/main">
-              <a:graphicData uri="http://schemas.openxmlformats.org/drawingml/2006/picture">
-                <pic:pic xmlns:pic="http://schemas.openxmlformats.org/drawingml/2006/picture">
-                  <pic:nvPicPr>
-                    <pic:cNvPr id="0" name="" descr=""/>
-                    <pic:cNvPicPr>
-                      <a:picLocks noChangeAspect="1" noChangeArrowheads="1"/>
-                    </pic:cNvPicPr>
-                  </pic:nvPicPr>
-                  <pic:blipFill>
-                    <a:blip r:embed="rId14" cstate="none"/>
-                    <a:srcRect/>
-                    <a:stretch>
-                      <a:fillRect/>
-                    </a:stretch>
-                  </pic:blipFill>
-                  <pic:spPr bwMode="auto">
-                    <a:xfrm>
-                      <a:off x="0" y="0"/>
-                      <a:ext cx="5448300" cy="7629525"/>
-                    </a:xfrm>
-                    <a:prstGeom prst="rect">
-                      <a:avLst/>
-                    </a:prstGeom>
-                  </pic:spPr>
-                </pic:pic>
-              </a:graphicData>
-            </a:graphic>
-          </wp:inline>
-        </w:drawing>
-      </w:r>
-    </w:p>
-    <w:p>
-      <w:pPr>
-        <w:jc w:val="center"/>
-      </w:pPr>
-      <w:r>
-        <w:rPr>
-          <w:i/>
-          <w:iCs/>
-          <w:color w:val="6D8289"/>
-          <w:sz w:val="18"/>
-          <w:szCs w:val="18"/>
-        </w:rPr>
-        <w:t xml:space="preserve">Figura 1: Esquema general de conexiones del sistema GRIS (continuación)</w:t>
+        <w:t xml:space="preserve">Figura 1: Esquema general de conexiones del sistema GRIS</w:t>
       </w:r>
     </w:p>
     <w:p>
@@ -10073,8 +10004,8 @@
         <w:sectPr>
           <w:headerReference w:type="default" r:id="rId9"/>
           <w:footerReference w:type="default" r:id="rId10"/>
-          <w:type w:val="evenPage"/>
-          <w:pgSz w:w="11906" w:h="16838" w:orient="portrait"/>
+          <w:type w:val="nextPage"/>
+          <w:pgSz w:w="23811" w:h="16838" w:orient="landscape"/>
           <w:pgMar w:top="2100" w:right="1134" w:bottom="1700" w:left="1134" w:header="500" w:footer="400" w:gutter="0"/>
           <w:pgNumType/>
           <w:docGrid w:linePitch="360"/>
@@ -10106,7 +10037,7 @@
                     </pic:cNvPicPr>
                   </pic:nvPicPr>
                   <pic:blipFill>
-                    <a:blip r:embed="rId15" cstate="none"/>
+                    <a:blip r:embed="rId14" cstate="none"/>
                     <a:srcRect/>
                     <a:stretch>
                       <a:fillRect/>
@@ -10169,7 +10100,7 @@
                     </pic:cNvPicPr>
                   </pic:nvPicPr>
                   <pic:blipFill>
-                    <a:blip r:embed="rId16" cstate="none"/>
+                    <a:blip r:embed="rId15" cstate="none"/>
                     <a:srcRect/>
                     <a:stretch>
                       <a:fillRect/>
@@ -14219,7 +14150,6 @@
     <w:sectPr>
       <w:headerReference w:type="default" r:id="rId11"/>
       <w:footerReference w:type="default" r:id="rId12"/>
-      <w:type w:val="nextPage"/>
       <w:pgSz w:w="11906" w:h="16838" w:orient="portrait"/>
       <w:pgMar w:top="2100" w:right="1134" w:bottom="1700" w:left="1134" w:header="500" w:footer="400" w:gutter="0"/>
       <w:pgNumType/>
@@ -14439,7 +14369,7 @@
   </w:p>
   <w:tbl>
     <w:tblPr>
-      <w:tblW w:type="dxa" w:w="9638"/>
+      <w:tblW w:type="dxa" w:w="21543"/>
       <w:tblBorders>
         <w:top w:val="single" w:color="auto" w:sz="4"/>
         <w:left w:val="single" w:color="auto" w:sz="4"/>
@@ -14450,13 +14380,13 @@
       </w:tblBorders>
     </w:tblPr>
     <w:tblGrid>
-      <w:gridCol w:w="6638"/>
+      <w:gridCol w:w="18543"/>
       <w:gridCol w:w="3000"/>
     </w:tblGrid>
     <w:tr>
       <w:tc>
         <w:tcPr>
-          <w:tcW w:type="dxa" w:w="6638"/>
+          <w:tcW w:type="dxa" w:w="18543"/>
           <w:tcBorders>
             <w:top w:val="none" w:color="FFFFFF" w:sz="0"/>
             <w:left w:val="none" w:color="FFFFFF" w:sz="0"/>
@@ -15060,7 +14990,7 @@
 <w:hdr xmlns:wpc="http://schemas.microsoft.com/office/word/2010/wordprocessingCanvas" xmlns:mc="http://schemas.openxmlformats.org/markup-compatibility/2006" xmlns:o="urn:schemas-microsoft-com:office:office" xmlns:r="http://schemas.openxmlformats.org/officeDocument/2006/relationships" xmlns:m="http://schemas.openxmlformats.org/officeDocument/2006/math" xmlns:v="urn:schemas-microsoft-com:vml" xmlns:wp14="http://schemas.microsoft.com/office/word/2010/wordprocessingDrawing" xmlns:wp="http://schemas.openxmlformats.org/drawingml/2006/wordprocessingDrawing" xmlns:w10="urn:schemas-microsoft-com:office:word" xmlns:w="http://schemas.openxmlformats.org/wordprocessingml/2006/main" xmlns:w14="http://schemas.microsoft.com/office/word/2010/wordml" xmlns:w15="http://schemas.microsoft.com/office/word/2012/wordml" xmlns:wpg="http://schemas.microsoft.com/office/word/2010/wordprocessingGroup" xmlns:wpi="http://schemas.microsoft.com/office/word/2010/wordprocessingInk" xmlns:wne="http://schemas.microsoft.com/office/word/2006/wordml" xmlns:wps="http://schemas.microsoft.com/office/word/2010/wordprocessingShape" xmlns:cx="http://schemas.microsoft.com/office/drawing/2014/chartex" xmlns:cx1="http://schemas.microsoft.com/office/drawing/2015/9/8/chartex" xmlns:cx2="http://schemas.microsoft.com/office/drawing/2015/10/21/chartex" xmlns:cx3="http://schemas.microsoft.com/office/drawing/2016/5/9/chartex" xmlns:cx4="http://schemas.microsoft.com/office/drawing/2016/5/10/chartex" xmlns:cx5="http://schemas.microsoft.com/office/drawing/2016/5/11/chartex" xmlns:cx6="http://schemas.microsoft.com/office/drawing/2016/5/12/chartex" xmlns:cx7="http://schemas.microsoft.com/office/drawing/2016/5/13/chartex" xmlns:cx8="http://schemas.microsoft.com/office/drawing/2016/5/14/chartex" xmlns:w16cid="http://schemas.microsoft.com/office/word/2016/wordml/cid" xmlns:w16se="http://schemas.microsoft.com/office/word/2015/wordml/symex">
   <w:tbl>
     <w:tblPr>
-      <w:tblW w:type="dxa" w:w="9638"/>
+      <w:tblW w:type="dxa" w:w="21543"/>
       <w:tblBorders>
         <w:top w:val="single" w:color="auto" w:sz="4"/>
         <w:left w:val="single" w:color="auto" w:sz="4"/>
@@ -15072,7 +15002,7 @@
     </w:tblPr>
     <w:tblGrid>
       <w:gridCol w:w="1750"/>
-      <w:gridCol w:w="3900"/>
+      <w:gridCol w:w="15805"/>
       <w:gridCol w:w="1900"/>
       <w:gridCol w:w="2088"/>
     </w:tblGrid>
@@ -15125,7 +15055,7 @@
       </w:tc>
       <w:tc>
         <w:tcPr>
-          <w:tcW w:type="dxa" w:w="3900"/>
+          <w:tcW w:type="dxa" w:w="15805"/>
           <w:tcBorders>
             <w:top w:val="none" w:color="FFFFFF" w:sz="0"/>
             <w:left w:val="none" w:color="FFFFFF" w:sz="0"/>

</xml_diff>

<commit_message>
Figura 1 reorganizada en A3 con rótulos sobre cada línea; riesgos de EPRI 3002013612
- Esquema general redistribuido en toda la hoja A3 (columnas PC · control box y
  tablero EL CID · tablero de excitación y Variac · estator), con rótulos sobre la
  línea a la que corresponden.
- Apartado 2.1: riesgos de la Tabla 4-4 del informe EPRI 3002013612 aplicables al
  GRIS (robot atascado, falla del robot, fatiga del operador, resultados erróneos,
  hallazgo grave) y pasos que los controlan.

Co-Authored-By: Claude Opus 5.5 <noreply@anthropic.com>
Claude-Session: https://claude.ai/code/session_01Nz5qZw2jp5HghH6VEfj4aK
</commit_message>
<xml_diff>
--- a/procedimientos_gris/00503-00-EPG001 Procedimiento Inspeccion Robotizada GRIS.docx
+++ b/procedimientos_gris/00503-00-EPG001 Procedimiento Inspeccion Robotizada GRIS.docx
@@ -337,7 +337,7 @@
           <w:sz w:val="19"/>
         </w:rPr>
         <w:tab/>
-        <w:t>4</w:t>
+        <w:t>5</w:t>
       </w:r>
     </w:p>
     <w:p>
@@ -403,7 +403,7 @@
           <w:sz w:val="19"/>
         </w:rPr>
         <w:tab/>
-        <w:t>6</w:t>
+        <w:t>7</w:t>
       </w:r>
     </w:p>
     <w:p>
@@ -425,7 +425,7 @@
           <w:sz w:val="19"/>
         </w:rPr>
         <w:tab/>
-        <w:t>7</w:t>
+        <w:t>8</w:t>
       </w:r>
     </w:p>
     <w:p>
@@ -469,7 +469,7 @@
           <w:sz w:val="19"/>
         </w:rPr>
         <w:tab/>
-        <w:t>10</w:t>
+        <w:t>11</w:t>
       </w:r>
     </w:p>
     <w:p>
@@ -491,7 +491,7 @@
           <w:sz w:val="19"/>
         </w:rPr>
         <w:tab/>
-        <w:t>11</w:t>
+        <w:t>12</w:t>
       </w:r>
     </w:p>
     <w:p>
@@ -513,7 +513,7 @@
           <w:sz w:val="19"/>
         </w:rPr>
         <w:tab/>
-        <w:t>12</w:t>
+        <w:t>13</w:t>
       </w:r>
     </w:p>
     <w:p>
@@ -536,7 +536,7 @@
           <w:sz w:val="19"/>
         </w:rPr>
         <w:tab/>
-        <w:t>13</w:t>
+        <w:t>14</w:t>
       </w:r>
       <w:r>
         <w:fldChar w:fldCharType="end"/>
@@ -1739,7 +1739,7 @@
         <w:jc w:val="both"/>
       </w:pPr>
       <w:r>
-        <w:t xml:space="preserve">Antes de iniciar el trabajo, todo el personal debe conocer los siguientes riesgos, que pueden ocasionar accidentes o incidentes, y las medidas de este procedimiento que los controlan:</w:t>
+        <w:t xml:space="preserve">Antes de iniciar el trabajo, todo el personal debe conocer los siguientes riesgos, que pueden ocasionar accidentes o incidentes, y las medidas de este procedimiento que los controlan. Los riesgos propios de la inspección robotizada se toman de la Tabla 4-4 del informe EPRI 3002013612 (2018), «Generator Robotic Inspection and Test Guidelines», en lo que aplica al sistema GRIS:</w:t>
       </w:r>
     </w:p>
     <w:tbl>
@@ -1966,7 +1966,7 @@
                 <w:sz w:val="19"/>
                 <w:szCs w:val="19"/>
               </w:rPr>
-              <w:t xml:space="preserve">Pasada de reconocimiento (paso 29); cuerdas de seguridad con tensión constante.</w:t>
+              <w:t xml:space="preserve">Pasada de reconocimiento (paso 31); cuerdas de seguridad con tensión constante.</w:t>
             </w:r>
           </w:p>
         </w:tc>
@@ -2070,7 +2070,7 @@
                 <w:sz w:val="19"/>
                 <w:szCs w:val="19"/>
               </w:rPr>
-              <w:t xml:space="preserve">Límite de avance axial seguro (paso 31); cuerdas de seguridad.</w:t>
+              <w:t xml:space="preserve">Límite de avance axial seguro (paso 33); cuerdas de seguridad.</w:t>
             </w:r>
           </w:p>
         </w:tc>
@@ -2108,7 +2108,7 @@
                 <w:sz w:val="19"/>
                 <w:szCs w:val="19"/>
               </w:rPr>
-              <w:t xml:space="preserve">Desprendimiento de piezas del robot dentro del generador.</w:t>
+              <w:t xml:space="preserve">Robot atascado en el entrehierro (gota de resina, pérdida de energía o falla del robot).</w:t>
             </w:r>
           </w:p>
         </w:tc>
@@ -2141,7 +2141,7 @@
                 <w:sz w:val="19"/>
                 <w:szCs w:val="19"/>
               </w:rPr>
-              <w:t xml:space="preserve">Pieza suelta dentro de la máquina; daño a sus componentes si se pone en servicio.</w:t>
+              <w:t xml:space="preserve">Demora de la parada; en el peor caso, abrir el otro extremo del generador.</w:t>
             </w:r>
           </w:p>
         </w:tc>
@@ -2174,7 +2174,7 @@
                 <w:sz w:val="19"/>
                 <w:szCs w:val="19"/>
               </w:rPr>
-              <w:t xml:space="preserve">Riesgo residual evaluado en 00503-00-ZIT003 (todas las posiciones: bajo o muy bajo). Verificación pre y post-ensayo con 00503-00-ZRQ001 (pasos 27 y 46).</w:t>
+              <w:t xml:space="preserve">Recuperación con las cuerdas de seguridad (paso 27) y el cable del robot.</w:t>
             </w:r>
           </w:p>
         </w:tc>
@@ -2212,6 +2212,526 @@
                 <w:sz w:val="19"/>
                 <w:szCs w:val="19"/>
               </w:rPr>
+              <w:t xml:space="preserve">Desprendimiento de piezas del robot dentro del generador.</w:t>
+            </w:r>
+          </w:p>
+        </w:tc>
+        <w:tc>
+          <w:tcPr>
+            <w:tcW w:type="dxa" w:w="2900"/>
+            <w:tcBorders>
+              <w:top w:val="single" w:color="A6B4B8" w:sz="4"/>
+              <w:left w:val="single" w:color="A6B4B8" w:sz="4"/>
+              <w:bottom w:val="single" w:color="A6B4B8" w:sz="4"/>
+              <w:right w:val="single" w:color="A6B4B8" w:sz="4"/>
+            </w:tcBorders>
+            <w:tcMar>
+              <w:top w:type="dxa" w:w="50"/>
+              <w:left w:type="dxa" w:w="90"/>
+              <w:bottom w:type="dxa" w:w="50"/>
+              <w:right w:type="dxa" w:w="90"/>
+            </w:tcMar>
+            <w:vAlign w:val="top"/>
+          </w:tcPr>
+          <w:p>
+            <w:pPr>
+              <w:spacing w:after="0" w:line="252"/>
+              <w:jc w:val="left"/>
+            </w:pPr>
+            <w:r>
+              <w:rPr>
+                <w:b w:val="false"/>
+                <w:bCs w:val="false"/>
+                <w:sz w:val="19"/>
+                <w:szCs w:val="19"/>
+              </w:rPr>
+              <w:t xml:space="preserve">Pieza suelta dentro de la máquina; daño a sus componentes si se pone en servicio.</w:t>
+            </w:r>
+          </w:p>
+        </w:tc>
+        <w:tc>
+          <w:tcPr>
+            <w:tcW w:type="dxa" w:w="3238"/>
+            <w:tcBorders>
+              <w:top w:val="single" w:color="A6B4B8" w:sz="4"/>
+              <w:left w:val="single" w:color="A6B4B8" w:sz="4"/>
+              <w:bottom w:val="single" w:color="A6B4B8" w:sz="4"/>
+              <w:right w:val="single" w:color="A6B4B8" w:sz="4"/>
+            </w:tcBorders>
+            <w:tcMar>
+              <w:top w:type="dxa" w:w="50"/>
+              <w:left w:type="dxa" w:w="90"/>
+              <w:bottom w:type="dxa" w:w="50"/>
+              <w:right w:type="dxa" w:w="90"/>
+            </w:tcMar>
+            <w:vAlign w:val="top"/>
+          </w:tcPr>
+          <w:p>
+            <w:pPr>
+              <w:spacing w:after="0" w:line="252"/>
+              <w:jc w:val="left"/>
+            </w:pPr>
+            <w:r>
+              <w:rPr>
+                <w:b w:val="false"/>
+                <w:bCs w:val="false"/>
+                <w:sz w:val="19"/>
+                <w:szCs w:val="19"/>
+              </w:rPr>
+              <w:t xml:space="preserve">Riesgo residual evaluado en 00503-00-ZIT003 (todas las posiciones: bajo o muy bajo). Verificación pre y post-ensayo con 00503-00-ZRQ001 (pasos 29 y 48).</w:t>
+            </w:r>
+          </w:p>
+        </w:tc>
+      </w:tr>
+      <w:tr>
+        <w:trPr>
+          <w:cantSplit/>
+        </w:trPr>
+        <w:tc>
+          <w:tcPr>
+            <w:tcW w:type="dxa" w:w="3500"/>
+            <w:tcBorders>
+              <w:top w:val="single" w:color="A6B4B8" w:sz="4"/>
+              <w:left w:val="single" w:color="A6B4B8" w:sz="4"/>
+              <w:bottom w:val="single" w:color="A6B4B8" w:sz="4"/>
+              <w:right w:val="single" w:color="A6B4B8" w:sz="4"/>
+            </w:tcBorders>
+            <w:tcMar>
+              <w:top w:type="dxa" w:w="50"/>
+              <w:left w:type="dxa" w:w="90"/>
+              <w:bottom w:type="dxa" w:w="50"/>
+              <w:right w:type="dxa" w:w="90"/>
+            </w:tcMar>
+            <w:vAlign w:val="top"/>
+          </w:tcPr>
+          <w:p>
+            <w:pPr>
+              <w:spacing w:after="0" w:line="252"/>
+              <w:jc w:val="left"/>
+            </w:pPr>
+            <w:r>
+              <w:rPr>
+                <w:b w:val="false"/>
+                <w:bCs w:val="false"/>
+                <w:sz w:val="19"/>
+                <w:szCs w:val="19"/>
+              </w:rPr>
+              <w:t xml:space="preserve">Falla del robot durante el ensayo.</w:t>
+            </w:r>
+          </w:p>
+        </w:tc>
+        <w:tc>
+          <w:tcPr>
+            <w:tcW w:type="dxa" w:w="2900"/>
+            <w:tcBorders>
+              <w:top w:val="single" w:color="A6B4B8" w:sz="4"/>
+              <w:left w:val="single" w:color="A6B4B8" w:sz="4"/>
+              <w:bottom w:val="single" w:color="A6B4B8" w:sz="4"/>
+              <w:right w:val="single" w:color="A6B4B8" w:sz="4"/>
+            </w:tcBorders>
+            <w:tcMar>
+              <w:top w:type="dxa" w:w="50"/>
+              <w:left w:type="dxa" w:w="90"/>
+              <w:bottom w:type="dxa" w:w="50"/>
+              <w:right w:type="dxa" w:w="90"/>
+            </w:tcMar>
+            <w:vAlign w:val="top"/>
+          </w:tcPr>
+          <w:p>
+            <w:pPr>
+              <w:spacing w:after="0" w:line="252"/>
+              <w:jc w:val="left"/>
+            </w:pPr>
+            <w:r>
+              <w:rPr>
+                <w:b w:val="false"/>
+                <w:bCs w:val="false"/>
+                <w:sz w:val="19"/>
+                <w:szCs w:val="19"/>
+              </w:rPr>
+              <w:t xml:space="preserve">Demora de la inspección.</w:t>
+            </w:r>
+          </w:p>
+        </w:tc>
+        <w:tc>
+          <w:tcPr>
+            <w:tcW w:type="dxa" w:w="3238"/>
+            <w:tcBorders>
+              <w:top w:val="single" w:color="A6B4B8" w:sz="4"/>
+              <w:left w:val="single" w:color="A6B4B8" w:sz="4"/>
+              <w:bottom w:val="single" w:color="A6B4B8" w:sz="4"/>
+              <w:right w:val="single" w:color="A6B4B8" w:sz="4"/>
+            </w:tcBorders>
+            <w:tcMar>
+              <w:top w:type="dxa" w:w="50"/>
+              <w:left w:type="dxa" w:w="90"/>
+              <w:bottom w:type="dxa" w:w="50"/>
+              <w:right w:type="dxa" w:w="90"/>
+            </w:tcMar>
+            <w:vAlign w:val="top"/>
+          </w:tcPr>
+          <w:p>
+            <w:pPr>
+              <w:spacing w:after="0" w:line="252"/>
+              <w:jc w:val="left"/>
+            </w:pPr>
+            <w:r>
+              <w:rPr>
+                <w:b w:val="false"/>
+                <w:bCs w:val="false"/>
+                <w:sz w:val="19"/>
+                <w:szCs w:val="19"/>
+              </w:rPr>
+              <w:t xml:space="preserve">Kit de repuestos GRIS completo (Tabla 1).</w:t>
+            </w:r>
+          </w:p>
+        </w:tc>
+      </w:tr>
+      <w:tr>
+        <w:trPr>
+          <w:cantSplit/>
+        </w:trPr>
+        <w:tc>
+          <w:tcPr>
+            <w:tcW w:type="dxa" w:w="3500"/>
+            <w:tcBorders>
+              <w:top w:val="single" w:color="A6B4B8" w:sz="4"/>
+              <w:left w:val="single" w:color="A6B4B8" w:sz="4"/>
+              <w:bottom w:val="single" w:color="A6B4B8" w:sz="4"/>
+              <w:right w:val="single" w:color="A6B4B8" w:sz="4"/>
+            </w:tcBorders>
+            <w:tcMar>
+              <w:top w:type="dxa" w:w="50"/>
+              <w:left w:type="dxa" w:w="90"/>
+              <w:bottom w:type="dxa" w:w="50"/>
+              <w:right w:type="dxa" w:w="90"/>
+            </w:tcMar>
+            <w:vAlign w:val="top"/>
+          </w:tcPr>
+          <w:p>
+            <w:pPr>
+              <w:spacing w:after="0" w:line="252"/>
+              <w:jc w:val="left"/>
+            </w:pPr>
+            <w:r>
+              <w:rPr>
+                <w:b w:val="false"/>
+                <w:bCs w:val="false"/>
+                <w:sz w:val="19"/>
+                <w:szCs w:val="19"/>
+              </w:rPr>
+              <w:t xml:space="preserve">Fatiga del operador.</w:t>
+            </w:r>
+          </w:p>
+        </w:tc>
+        <w:tc>
+          <w:tcPr>
+            <w:tcW w:type="dxa" w:w="2900"/>
+            <w:tcBorders>
+              <w:top w:val="single" w:color="A6B4B8" w:sz="4"/>
+              <w:left w:val="single" w:color="A6B4B8" w:sz="4"/>
+              <w:bottom w:val="single" w:color="A6B4B8" w:sz="4"/>
+              <w:right w:val="single" w:color="A6B4B8" w:sz="4"/>
+            </w:tcBorders>
+            <w:tcMar>
+              <w:top w:type="dxa" w:w="50"/>
+              <w:left w:type="dxa" w:w="90"/>
+              <w:bottom w:type="dxa" w:w="50"/>
+              <w:right w:type="dxa" w:w="90"/>
+            </w:tcMar>
+            <w:vAlign w:val="top"/>
+          </w:tcPr>
+          <w:p>
+            <w:pPr>
+              <w:spacing w:after="0" w:line="252"/>
+              <w:jc w:val="left"/>
+            </w:pPr>
+            <w:r>
+              <w:rPr>
+                <w:b w:val="false"/>
+                <w:bCs w:val="false"/>
+                <w:sz w:val="19"/>
+                <w:szCs w:val="19"/>
+              </w:rPr>
+              <w:t xml:space="preserve">Error de operación: caída del robot, salida por el extremo o datos erróneos.</w:t>
+            </w:r>
+          </w:p>
+        </w:tc>
+        <w:tc>
+          <w:tcPr>
+            <w:tcW w:type="dxa" w:w="3238"/>
+            <w:tcBorders>
+              <w:top w:val="single" w:color="A6B4B8" w:sz="4"/>
+              <w:left w:val="single" w:color="A6B4B8" w:sz="4"/>
+              <w:bottom w:val="single" w:color="A6B4B8" w:sz="4"/>
+              <w:right w:val="single" w:color="A6B4B8" w:sz="4"/>
+            </w:tcBorders>
+            <w:tcMar>
+              <w:top w:type="dxa" w:w="50"/>
+              <w:left w:type="dxa" w:w="90"/>
+              <w:bottom w:type="dxa" w:w="50"/>
+              <w:right w:type="dxa" w:w="90"/>
+            </w:tcMar>
+            <w:vAlign w:val="top"/>
+          </w:tcPr>
+          <w:p>
+            <w:pPr>
+              <w:spacing w:after="0" w:line="252"/>
+              <w:jc w:val="left"/>
+            </w:pPr>
+            <w:r>
+              <w:rPr>
+                <w:b w:val="false"/>
+                <w:bCs w:val="false"/>
+                <w:sz w:val="19"/>
+                <w:szCs w:val="19"/>
+              </w:rPr>
+              <w:t xml:space="preserve">Al menos dos operadores calificados y pausas regulares (paso 8).</w:t>
+            </w:r>
+          </w:p>
+        </w:tc>
+      </w:tr>
+      <w:tr>
+        <w:trPr>
+          <w:cantSplit/>
+        </w:trPr>
+        <w:tc>
+          <w:tcPr>
+            <w:tcW w:type="dxa" w:w="3500"/>
+            <w:tcBorders>
+              <w:top w:val="single" w:color="A6B4B8" w:sz="4"/>
+              <w:left w:val="single" w:color="A6B4B8" w:sz="4"/>
+              <w:bottom w:val="single" w:color="A6B4B8" w:sz="4"/>
+              <w:right w:val="single" w:color="A6B4B8" w:sz="4"/>
+            </w:tcBorders>
+            <w:tcMar>
+              <w:top w:type="dxa" w:w="50"/>
+              <w:left w:type="dxa" w:w="90"/>
+              <w:bottom w:type="dxa" w:w="50"/>
+              <w:right w:type="dxa" w:w="90"/>
+            </w:tcMar>
+            <w:vAlign w:val="top"/>
+          </w:tcPr>
+          <w:p>
+            <w:pPr>
+              <w:spacing w:after="0" w:line="252"/>
+              <w:jc w:val="left"/>
+            </w:pPr>
+            <w:r>
+              <w:rPr>
+                <w:b w:val="false"/>
+                <w:bCs w:val="false"/>
+                <w:sz w:val="19"/>
+                <w:szCs w:val="19"/>
+              </w:rPr>
+              <w:t xml:space="preserve">Resultados de ensayo erróneos por error del operador, del equipo o de la calibración.</w:t>
+            </w:r>
+          </w:p>
+        </w:tc>
+        <w:tc>
+          <w:tcPr>
+            <w:tcW w:type="dxa" w:w="2900"/>
+            <w:tcBorders>
+              <w:top w:val="single" w:color="A6B4B8" w:sz="4"/>
+              <w:left w:val="single" w:color="A6B4B8" w:sz="4"/>
+              <w:bottom w:val="single" w:color="A6B4B8" w:sz="4"/>
+              <w:right w:val="single" w:color="A6B4B8" w:sz="4"/>
+            </w:tcBorders>
+            <w:tcMar>
+              <w:top w:type="dxa" w:w="50"/>
+              <w:left w:type="dxa" w:w="90"/>
+              <w:bottom w:type="dxa" w:w="50"/>
+              <w:right w:type="dxa" w:w="90"/>
+            </w:tcMar>
+            <w:vAlign w:val="top"/>
+          </w:tcPr>
+          <w:p>
+            <w:pPr>
+              <w:spacing w:after="0" w:line="252"/>
+              <w:jc w:val="left"/>
+            </w:pPr>
+            <w:r>
+              <w:rPr>
+                <w:b w:val="false"/>
+                <w:bCs w:val="false"/>
+                <w:sz w:val="19"/>
+                <w:szCs w:val="19"/>
+              </w:rPr>
+              <w:t xml:space="preserve">Extracción innecesaria del rotor o falla no detectada.</w:t>
+            </w:r>
+          </w:p>
+        </w:tc>
+        <w:tc>
+          <w:tcPr>
+            <w:tcW w:type="dxa" w:w="3238"/>
+            <w:tcBorders>
+              <w:top w:val="single" w:color="A6B4B8" w:sz="4"/>
+              <w:left w:val="single" w:color="A6B4B8" w:sz="4"/>
+              <w:bottom w:val="single" w:color="A6B4B8" w:sz="4"/>
+              <w:right w:val="single" w:color="A6B4B8" w:sz="4"/>
+            </w:tcBorders>
+            <w:tcMar>
+              <w:top w:type="dxa" w:w="50"/>
+              <w:left w:type="dxa" w:w="90"/>
+              <w:bottom w:type="dxa" w:w="50"/>
+              <w:right w:type="dxa" w:w="90"/>
+            </w:tcMar>
+            <w:vAlign w:val="top"/>
+          </w:tcPr>
+          <w:p>
+            <w:pPr>
+              <w:spacing w:after="0" w:line="252"/>
+              <w:jc w:val="left"/>
+            </w:pPr>
+            <w:r>
+              <w:rPr>
+                <w:b w:val="false"/>
+                <w:bCs w:val="false"/>
+                <w:sz w:val="19"/>
+                <w:szCs w:val="19"/>
+              </w:rPr>
+              <w:t xml:space="preserve">Calibración según 00503-00-EPG002 – Protocolo 2; revisión de datos y repetición de zonas dudosas (paso 47); análisis por un ingeniero con experiencia.</w:t>
+            </w:r>
+          </w:p>
+        </w:tc>
+      </w:tr>
+      <w:tr>
+        <w:trPr>
+          <w:cantSplit/>
+        </w:trPr>
+        <w:tc>
+          <w:tcPr>
+            <w:tcW w:type="dxa" w:w="3500"/>
+            <w:tcBorders>
+              <w:top w:val="single" w:color="A6B4B8" w:sz="4"/>
+              <w:left w:val="single" w:color="A6B4B8" w:sz="4"/>
+              <w:bottom w:val="single" w:color="A6B4B8" w:sz="4"/>
+              <w:right w:val="single" w:color="A6B4B8" w:sz="4"/>
+            </w:tcBorders>
+            <w:tcMar>
+              <w:top w:type="dxa" w:w="50"/>
+              <w:left w:type="dxa" w:w="90"/>
+              <w:bottom w:type="dxa" w:w="50"/>
+              <w:right w:type="dxa" w:w="90"/>
+            </w:tcMar>
+            <w:vAlign w:val="top"/>
+          </w:tcPr>
+          <w:p>
+            <w:pPr>
+              <w:spacing w:after="0" w:line="252"/>
+              <w:jc w:val="left"/>
+            </w:pPr>
+            <w:r>
+              <w:rPr>
+                <w:b w:val="false"/>
+                <w:bCs w:val="false"/>
+                <w:sz w:val="19"/>
+                <w:szCs w:val="19"/>
+              </w:rPr>
+              <w:t xml:space="preserve">Hallazgo de una falla grave (por ejemplo, cuñas flojas o punto caliente en el núcleo).</w:t>
+            </w:r>
+          </w:p>
+        </w:tc>
+        <w:tc>
+          <w:tcPr>
+            <w:tcW w:type="dxa" w:w="2900"/>
+            <w:tcBorders>
+              <w:top w:val="single" w:color="A6B4B8" w:sz="4"/>
+              <w:left w:val="single" w:color="A6B4B8" w:sz="4"/>
+              <w:bottom w:val="single" w:color="A6B4B8" w:sz="4"/>
+              <w:right w:val="single" w:color="A6B4B8" w:sz="4"/>
+            </w:tcBorders>
+            <w:tcMar>
+              <w:top w:type="dxa" w:w="50"/>
+              <w:left w:type="dxa" w:w="90"/>
+              <w:bottom w:type="dxa" w:w="50"/>
+              <w:right w:type="dxa" w:w="90"/>
+            </w:tcMar>
+            <w:vAlign w:val="top"/>
+          </w:tcPr>
+          <w:p>
+            <w:pPr>
+              <w:spacing w:after="0" w:line="252"/>
+              <w:jc w:val="left"/>
+            </w:pPr>
+            <w:r>
+              <w:rPr>
+                <w:b w:val="false"/>
+                <w:bCs w:val="false"/>
+                <w:sz w:val="19"/>
+                <w:szCs w:val="19"/>
+              </w:rPr>
+              <w:t xml:space="preserve">Necesidad de extraer el rotor y extensión de la parada.</w:t>
+            </w:r>
+          </w:p>
+        </w:tc>
+        <w:tc>
+          <w:tcPr>
+            <w:tcW w:type="dxa" w:w="3238"/>
+            <w:tcBorders>
+              <w:top w:val="single" w:color="A6B4B8" w:sz="4"/>
+              <w:left w:val="single" w:color="A6B4B8" w:sz="4"/>
+              <w:bottom w:val="single" w:color="A6B4B8" w:sz="4"/>
+              <w:right w:val="single" w:color="A6B4B8" w:sz="4"/>
+            </w:tcBorders>
+            <w:tcMar>
+              <w:top w:type="dxa" w:w="50"/>
+              <w:left w:type="dxa" w:w="90"/>
+              <w:bottom w:type="dxa" w:w="50"/>
+              <w:right w:type="dxa" w:w="90"/>
+            </w:tcMar>
+            <w:vAlign w:val="top"/>
+          </w:tcPr>
+          <w:p>
+            <w:pPr>
+              <w:spacing w:after="0" w:line="252"/>
+              <w:jc w:val="left"/>
+            </w:pPr>
+            <w:r>
+              <w:rPr>
+                <w:b w:val="false"/>
+                <w:bCs w:val="false"/>
+                <w:sz w:val="19"/>
+                <w:szCs w:val="19"/>
+              </w:rPr>
+              <w:t xml:space="preserve">Comunicación inmediata al Cliente (paso 43); realizar la inspección lo antes posible dentro de la parada.</w:t>
+            </w:r>
+          </w:p>
+        </w:tc>
+      </w:tr>
+      <w:tr>
+        <w:trPr>
+          <w:cantSplit/>
+        </w:trPr>
+        <w:tc>
+          <w:tcPr>
+            <w:tcW w:type="dxa" w:w="3500"/>
+            <w:tcBorders>
+              <w:top w:val="single" w:color="A6B4B8" w:sz="4"/>
+              <w:left w:val="single" w:color="A6B4B8" w:sz="4"/>
+              <w:bottom w:val="single" w:color="A6B4B8" w:sz="4"/>
+              <w:right w:val="single" w:color="A6B4B8" w:sz="4"/>
+            </w:tcBorders>
+            <w:tcMar>
+              <w:top w:type="dxa" w:w="50"/>
+              <w:left w:type="dxa" w:w="90"/>
+              <w:bottom w:type="dxa" w:w="50"/>
+              <w:right w:type="dxa" w:w="90"/>
+            </w:tcMar>
+            <w:vAlign w:val="top"/>
+          </w:tcPr>
+          <w:p>
+            <w:pPr>
+              <w:spacing w:after="0" w:line="252"/>
+              <w:jc w:val="left"/>
+            </w:pPr>
+            <w:r>
+              <w:rPr>
+                <w:b w:val="false"/>
+                <w:bCs w:val="false"/>
+                <w:sz w:val="19"/>
+                <w:szCs w:val="19"/>
+              </w:rPr>
               <w:t xml:space="preserve">Tablero de excitación en desarrollo; ficha del Variac con contactos macho expuestos.</w:t>
             </w:r>
           </w:p>
@@ -2278,7 +2798,7 @@
                 <w:sz w:val="19"/>
                 <w:szCs w:val="19"/>
               </w:rPr>
-              <w:t xml:space="preserve">No operar ni manipular el tablero con tensión; conectar el Variac a la red solo con la ficha ya conectada (paso 15).</w:t>
+              <w:t xml:space="preserve">No operar ni manipular el tablero con tensión; conectar el Variac a la red solo con la ficha ya conectada (paso 17).</w:t>
             </w:r>
           </w:p>
         </w:tc>
@@ -3200,7 +3720,7 @@
                 <w:sz w:val="19"/>
                 <w:szCs w:val="19"/>
               </w:rPr>
-              <w:t xml:space="preserve">5 – 8</w:t>
+              <w:t xml:space="preserve">5 – 10</w:t>
             </w:r>
           </w:p>
         </w:tc>
@@ -3304,7 +3824,7 @@
                 <w:sz w:val="19"/>
                 <w:szCs w:val="19"/>
               </w:rPr>
-              <w:t xml:space="preserve">9 – 13</w:t>
+              <w:t xml:space="preserve">11 – 15</w:t>
             </w:r>
           </w:p>
         </w:tc>
@@ -3408,7 +3928,7 @@
                 <w:sz w:val="19"/>
                 <w:szCs w:val="19"/>
               </w:rPr>
-              <w:t xml:space="preserve">14 – 18</w:t>
+              <w:t xml:space="preserve">16 – 20</w:t>
             </w:r>
           </w:p>
         </w:tc>
@@ -3512,7 +4032,7 @@
                 <w:sz w:val="19"/>
                 <w:szCs w:val="19"/>
               </w:rPr>
-              <w:t xml:space="preserve">19 – 28</w:t>
+              <w:t xml:space="preserve">21 – 30</w:t>
             </w:r>
           </w:p>
         </w:tc>
@@ -3616,7 +4136,7 @@
                 <w:sz w:val="19"/>
                 <w:szCs w:val="19"/>
               </w:rPr>
-              <w:t xml:space="preserve">29 – 34</w:t>
+              <w:t xml:space="preserve">31 – 36</w:t>
             </w:r>
           </w:p>
         </w:tc>
@@ -3720,7 +4240,7 @@
                 <w:sz w:val="19"/>
                 <w:szCs w:val="19"/>
               </w:rPr>
-              <w:t xml:space="preserve">35 – 43</w:t>
+              <w:t xml:space="preserve">37 – 45</w:t>
             </w:r>
           </w:p>
         </w:tc>
@@ -3824,7 +4344,7 @@
                 <w:sz w:val="19"/>
                 <w:szCs w:val="19"/>
               </w:rPr>
-              <w:t xml:space="preserve">44 – 48</w:t>
+              <w:t xml:space="preserve">46 – 50</w:t>
             </w:r>
           </w:p>
         </w:tc>
@@ -6863,6 +7383,214 @@
                 <w:sz w:val="19"/>
                 <w:szCs w:val="19"/>
               </w:rPr>
+              <w:t xml:space="preserve">Asignar al menos dos operadores calificados para el ensayo y planificar pausas regulares.</w:t>
+            </w:r>
+          </w:p>
+        </w:tc>
+        <w:tc>
+          <w:tcPr>
+            <w:tcW w:type="dxa" w:w="2200"/>
+            <w:tcBorders>
+              <w:top w:val="single" w:color="A6B4B8" w:sz="4"/>
+              <w:left w:val="single" w:color="A6B4B8" w:sz="4"/>
+              <w:bottom w:val="single" w:color="A6B4B8" w:sz="4"/>
+              <w:right w:val="single" w:color="A6B4B8" w:sz="4"/>
+            </w:tcBorders>
+            <w:tcMar>
+              <w:top w:type="dxa" w:w="50"/>
+              <w:left w:type="dxa" w:w="90"/>
+              <w:bottom w:type="dxa" w:w="50"/>
+              <w:right w:type="dxa" w:w="90"/>
+            </w:tcMar>
+            <w:vAlign w:val="top"/>
+          </w:tcPr>
+          <w:p>
+            <w:pPr>
+              <w:spacing w:after="0" w:line="252"/>
+              <w:jc w:val="left"/>
+            </w:pPr>
+            <w:r>
+              <w:rPr>
+                <w:b w:val="false"/>
+                <w:bCs w:val="false"/>
+                <w:sz w:val="19"/>
+                <w:szCs w:val="19"/>
+              </w:rPr>
+              <w:t xml:space="preserve">—</w:t>
+            </w:r>
+          </w:p>
+        </w:tc>
+      </w:tr>
+      <w:tr>
+        <w:trPr>
+          <w:cantSplit/>
+        </w:trPr>
+        <w:tc>
+          <w:tcPr>
+            <w:tcW w:type="dxa" w:w="560"/>
+            <w:tcBorders>
+              <w:top w:val="single" w:color="A6B4B8" w:sz="4"/>
+              <w:left w:val="single" w:color="A6B4B8" w:sz="4"/>
+              <w:bottom w:val="single" w:color="A6B4B8" w:sz="4"/>
+              <w:right w:val="single" w:color="A6B4B8" w:sz="4"/>
+            </w:tcBorders>
+            <w:tcMar>
+              <w:top w:type="dxa" w:w="50"/>
+              <w:left w:type="dxa" w:w="90"/>
+              <w:bottom w:type="dxa" w:w="50"/>
+              <w:right w:type="dxa" w:w="90"/>
+            </w:tcMar>
+            <w:vAlign w:val="top"/>
+          </w:tcPr>
+          <w:p>
+            <w:pPr>
+              <w:spacing w:after="0" w:line="252"/>
+              <w:jc w:val="center"/>
+            </w:pPr>
+            <w:r>
+              <w:rPr>
+                <w:b/>
+                <w:bCs/>
+                <w:sz w:val="19"/>
+                <w:szCs w:val="19"/>
+              </w:rPr>
+              <w:t xml:space="preserve">9</w:t>
+            </w:r>
+          </w:p>
+        </w:tc>
+        <w:tc>
+          <w:tcPr>
+            <w:tcW w:type="dxa" w:w="6878"/>
+            <w:tcBorders>
+              <w:top w:val="single" w:color="A6B4B8" w:sz="4"/>
+              <w:left w:val="single" w:color="A6B4B8" w:sz="4"/>
+              <w:bottom w:val="single" w:color="A6B4B8" w:sz="4"/>
+              <w:right w:val="single" w:color="A6B4B8" w:sz="4"/>
+            </w:tcBorders>
+            <w:tcMar>
+              <w:top w:type="dxa" w:w="50"/>
+              <w:left w:type="dxa" w:w="90"/>
+              <w:bottom w:type="dxa" w:w="50"/>
+              <w:right w:type="dxa" w:w="90"/>
+            </w:tcMar>
+            <w:vAlign w:val="top"/>
+          </w:tcPr>
+          <w:p>
+            <w:pPr>
+              <w:spacing w:after="0" w:line="252"/>
+              <w:jc w:val="left"/>
+            </w:pPr>
+            <w:r>
+              <w:rPr>
+                <w:b w:val="false"/>
+                <w:bCs w:val="false"/>
+                <w:sz w:val="19"/>
+                <w:szCs w:val="19"/>
+              </w:rPr>
+              <w:t xml:space="preserve">Verificar que el kit de repuestos GRIS esté completo.</w:t>
+            </w:r>
+          </w:p>
+        </w:tc>
+        <w:tc>
+          <w:tcPr>
+            <w:tcW w:type="dxa" w:w="2200"/>
+            <w:tcBorders>
+              <w:top w:val="single" w:color="A6B4B8" w:sz="4"/>
+              <w:left w:val="single" w:color="A6B4B8" w:sz="4"/>
+              <w:bottom w:val="single" w:color="A6B4B8" w:sz="4"/>
+              <w:right w:val="single" w:color="A6B4B8" w:sz="4"/>
+            </w:tcBorders>
+            <w:tcMar>
+              <w:top w:type="dxa" w:w="50"/>
+              <w:left w:type="dxa" w:w="90"/>
+              <w:bottom w:type="dxa" w:w="50"/>
+              <w:right w:type="dxa" w:w="90"/>
+            </w:tcMar>
+            <w:vAlign w:val="top"/>
+          </w:tcPr>
+          <w:p>
+            <w:pPr>
+              <w:spacing w:after="0" w:line="252"/>
+              <w:jc w:val="left"/>
+            </w:pPr>
+            <w:r>
+              <w:rPr>
+                <w:b w:val="false"/>
+                <w:bCs w:val="false"/>
+                <w:sz w:val="19"/>
+                <w:szCs w:val="19"/>
+              </w:rPr>
+              <w:t xml:space="preserve">Tabla 1</w:t>
+            </w:r>
+          </w:p>
+        </w:tc>
+      </w:tr>
+      <w:tr>
+        <w:trPr>
+          <w:cantSplit/>
+        </w:trPr>
+        <w:tc>
+          <w:tcPr>
+            <w:tcW w:type="dxa" w:w="560"/>
+            <w:tcBorders>
+              <w:top w:val="single" w:color="A6B4B8" w:sz="4"/>
+              <w:left w:val="single" w:color="A6B4B8" w:sz="4"/>
+              <w:bottom w:val="single" w:color="A6B4B8" w:sz="4"/>
+              <w:right w:val="single" w:color="A6B4B8" w:sz="4"/>
+            </w:tcBorders>
+            <w:tcMar>
+              <w:top w:type="dxa" w:w="50"/>
+              <w:left w:type="dxa" w:w="90"/>
+              <w:bottom w:type="dxa" w:w="50"/>
+              <w:right w:type="dxa" w:w="90"/>
+            </w:tcMar>
+            <w:vAlign w:val="top"/>
+          </w:tcPr>
+          <w:p>
+            <w:pPr>
+              <w:spacing w:after="0" w:line="252"/>
+              <w:jc w:val="center"/>
+            </w:pPr>
+            <w:r>
+              <w:rPr>
+                <w:b/>
+                <w:bCs/>
+                <w:sz w:val="19"/>
+                <w:szCs w:val="19"/>
+              </w:rPr>
+              <w:t xml:space="preserve">10</w:t>
+            </w:r>
+          </w:p>
+        </w:tc>
+        <w:tc>
+          <w:tcPr>
+            <w:tcW w:type="dxa" w:w="6878"/>
+            <w:tcBorders>
+              <w:top w:val="single" w:color="A6B4B8" w:sz="4"/>
+              <w:left w:val="single" w:color="A6B4B8" w:sz="4"/>
+              <w:bottom w:val="single" w:color="A6B4B8" w:sz="4"/>
+              <w:right w:val="single" w:color="A6B4B8" w:sz="4"/>
+            </w:tcBorders>
+            <w:tcMar>
+              <w:top w:type="dxa" w:w="50"/>
+              <w:left w:type="dxa" w:w="90"/>
+              <w:bottom w:type="dxa" w:w="50"/>
+              <w:right w:type="dxa" w:w="90"/>
+            </w:tcMar>
+            <w:vAlign w:val="top"/>
+          </w:tcPr>
+          <w:p>
+            <w:pPr>
+              <w:spacing w:after="0" w:line="252"/>
+              <w:jc w:val="left"/>
+            </w:pPr>
+            <w:r>
+              <w:rPr>
+                <w:b w:val="false"/>
+                <w:bCs w:val="false"/>
+                <w:sz w:val="19"/>
+                <w:szCs w:val="19"/>
+              </w:rPr>
               <w:t xml:space="preserve">Confirmar la disponibilidad de alimentación para la PC GRIS, la PC EL CID, el control box, el tablero EL CID y el Variac. Verificar la protección diferencial.</w:t>
             </w:r>
           </w:p>
@@ -7070,7 +7798,7 @@
                 <w:sz w:val="19"/>
                 <w:szCs w:val="19"/>
               </w:rPr>
-              <w:t xml:space="preserve">9</w:t>
+              <w:t xml:space="preserve">11</w:t>
             </w:r>
           </w:p>
         </w:tc>
@@ -7174,7 +7902,7 @@
                 <w:sz w:val="19"/>
                 <w:szCs w:val="19"/>
               </w:rPr>
-              <w:t xml:space="preserve">10</w:t>
+              <w:t xml:space="preserve">12</w:t>
             </w:r>
           </w:p>
         </w:tc>
@@ -7278,7 +8006,7 @@
                 <w:sz w:val="19"/>
                 <w:szCs w:val="19"/>
               </w:rPr>
-              <w:t xml:space="preserve">11</w:t>
+              <w:t xml:space="preserve">13</w:t>
             </w:r>
           </w:p>
         </w:tc>
@@ -7382,7 +8110,7 @@
                 <w:sz w:val="19"/>
                 <w:szCs w:val="19"/>
               </w:rPr>
-              <w:t xml:space="preserve">12</w:t>
+              <w:t xml:space="preserve">14</w:t>
             </w:r>
           </w:p>
         </w:tc>
@@ -7486,7 +8214,7 @@
                 <w:sz w:val="19"/>
                 <w:szCs w:val="19"/>
               </w:rPr>
-              <w:t xml:space="preserve">13</w:t>
+              <w:t xml:space="preserve">15</w:t>
             </w:r>
           </w:p>
         </w:tc>
@@ -8194,7 +8922,7 @@
                 <w:sz w:val="19"/>
                 <w:szCs w:val="19"/>
               </w:rPr>
-              <w:t xml:space="preserve">14</w:t>
+              <w:t xml:space="preserve">16</w:t>
             </w:r>
           </w:p>
         </w:tc>
@@ -8298,7 +9026,7 @@
                 <w:sz w:val="19"/>
                 <w:szCs w:val="19"/>
               </w:rPr>
-              <w:t xml:space="preserve">15</w:t>
+              <w:t xml:space="preserve">17</w:t>
             </w:r>
           </w:p>
         </w:tc>
@@ -8402,7 +9130,7 @@
                 <w:sz w:val="19"/>
                 <w:szCs w:val="19"/>
               </w:rPr>
-              <w:t xml:space="preserve">16</w:t>
+              <w:t xml:space="preserve">18</w:t>
             </w:r>
           </w:p>
         </w:tc>
@@ -8506,7 +9234,7 @@
                 <w:sz w:val="19"/>
                 <w:szCs w:val="19"/>
               </w:rPr>
-              <w:t xml:space="preserve">17</w:t>
+              <w:t xml:space="preserve">19</w:t>
             </w:r>
           </w:p>
         </w:tc>
@@ -8572,7 +9300,7 @@
                 <w:sz w:val="19"/>
                 <w:szCs w:val="19"/>
               </w:rPr>
-              <w:t xml:space="preserve">Paso 43</w:t>
+              <w:t xml:space="preserve">Paso 45</w:t>
             </w:r>
           </w:p>
         </w:tc>
@@ -8610,7 +9338,7 @@
                 <w:sz w:val="19"/>
                 <w:szCs w:val="19"/>
               </w:rPr>
-              <w:t xml:space="preserve">18</w:t>
+              <w:t xml:space="preserve">20</w:t>
             </w:r>
           </w:p>
         </w:tc>
@@ -8734,7 +9462,7 @@
               <w:t xml:space="preserve">Precaución: </w:t>
             </w:r>
             <w:r>
-              <w:t xml:space="preserve">el tablero de excitación se encuentra en desarrollo. No operarlo ni manipularlo con tensión. La ficha que viene del Variac queda con los contactos macho expuestos: nunca manipularla con el Variac conectado a la red (paso 15).</w:t>
+              <w:t xml:space="preserve">el tablero de excitación se encuentra en desarrollo. No operarlo ni manipularlo con tensión. La ficha que viene del Variac queda con los contactos macho expuestos: nunca manipularla con el Variac conectado a la red (paso 17).</w:t>
             </w:r>
           </w:p>
         </w:tc>
@@ -8917,7 +9645,7 @@
                 <w:sz w:val="19"/>
                 <w:szCs w:val="19"/>
               </w:rPr>
-              <w:t xml:space="preserve">19</w:t>
+              <w:t xml:space="preserve">21</w:t>
             </w:r>
           </w:p>
         </w:tc>
@@ -9021,7 +9749,7 @@
                 <w:sz w:val="19"/>
                 <w:szCs w:val="19"/>
               </w:rPr>
-              <w:t xml:space="preserve">20</w:t>
+              <w:t xml:space="preserve">22</w:t>
             </w:r>
           </w:p>
         </w:tc>
@@ -9125,7 +9853,7 @@
                 <w:sz w:val="19"/>
                 <w:szCs w:val="19"/>
               </w:rPr>
-              <w:t xml:space="preserve">21</w:t>
+              <w:t xml:space="preserve">23</w:t>
             </w:r>
           </w:p>
         </w:tc>
@@ -9229,7 +9957,7 @@
                 <w:sz w:val="19"/>
                 <w:szCs w:val="19"/>
               </w:rPr>
-              <w:t xml:space="preserve">22</w:t>
+              <w:t xml:space="preserve">24</w:t>
             </w:r>
           </w:p>
         </w:tc>
@@ -9333,7 +10061,7 @@
                 <w:sz w:val="19"/>
                 <w:szCs w:val="19"/>
               </w:rPr>
-              <w:t xml:space="preserve">23</w:t>
+              <w:t xml:space="preserve">25</w:t>
             </w:r>
           </w:p>
         </w:tc>
@@ -9437,7 +10165,7 @@
                 <w:sz w:val="19"/>
                 <w:szCs w:val="19"/>
               </w:rPr>
-              <w:t xml:space="preserve">24</w:t>
+              <w:t xml:space="preserve">26</w:t>
             </w:r>
           </w:p>
         </w:tc>
@@ -9541,7 +10269,7 @@
                 <w:sz w:val="19"/>
                 <w:szCs w:val="19"/>
               </w:rPr>
-              <w:t xml:space="preserve">25</w:t>
+              <w:t xml:space="preserve">27</w:t>
             </w:r>
           </w:p>
         </w:tc>
@@ -9645,7 +10373,7 @@
                 <w:sz w:val="19"/>
                 <w:szCs w:val="19"/>
               </w:rPr>
-              <w:t xml:space="preserve">26</w:t>
+              <w:t xml:space="preserve">28</w:t>
             </w:r>
           </w:p>
         </w:tc>
@@ -9749,7 +10477,7 @@
                 <w:sz w:val="19"/>
                 <w:szCs w:val="19"/>
               </w:rPr>
-              <w:t xml:space="preserve">27</w:t>
+              <w:t xml:space="preserve">29</w:t>
             </w:r>
           </w:p>
         </w:tc>
@@ -9853,7 +10581,7 @@
                 <w:sz w:val="19"/>
                 <w:szCs w:val="19"/>
               </w:rPr>
-              <w:t xml:space="preserve">28</w:t>
+              <w:t xml:space="preserve">30</w:t>
             </w:r>
           </w:p>
         </w:tc>
@@ -9946,7 +10674,7 @@
       <w:r>
         <w:drawing>
           <wp:inline distT="0" distB="0" distL="0" distR="0">
-            <wp:extent cx="11096625" cy="7772400"/>
+            <wp:extent cx="13468350" cy="7772400"/>
             <wp:effectExtent t="0" r="0" b="0" l="0"/>
             <wp:docPr id="1" name="esquema_general.png" descr="Figura 1: Esquema general de conexiones del sistema GRIS" title="Figura 1: Esquema general de conexiones del sistema GRIS"/>
             <wp:cNvGraphicFramePr>
@@ -9971,7 +10699,7 @@
                   <pic:spPr bwMode="auto">
                     <a:xfrm>
                       <a:off x="0" y="0"/>
-                      <a:ext cx="11096625" cy="7772400"/>
+                      <a:ext cx="13468350" cy="7772400"/>
                     </a:xfrm>
                     <a:prstGeom prst="rect">
                       <a:avLst/>
@@ -10315,7 +11043,7 @@
                 <w:sz w:val="19"/>
                 <w:szCs w:val="19"/>
               </w:rPr>
-              <w:t xml:space="preserve">29</w:t>
+              <w:t xml:space="preserve">31</w:t>
             </w:r>
           </w:p>
         </w:tc>
@@ -10419,7 +11147,7 @@
                 <w:sz w:val="19"/>
                 <w:szCs w:val="19"/>
               </w:rPr>
-              <w:t xml:space="preserve">30</w:t>
+              <w:t xml:space="preserve">32</w:t>
             </w:r>
           </w:p>
         </w:tc>
@@ -10523,7 +11251,7 @@
                 <w:sz w:val="19"/>
                 <w:szCs w:val="19"/>
               </w:rPr>
-              <w:t xml:space="preserve">31</w:t>
+              <w:t xml:space="preserve">33</w:t>
             </w:r>
           </w:p>
         </w:tc>
@@ -10627,7 +11355,7 @@
                 <w:sz w:val="19"/>
                 <w:szCs w:val="19"/>
               </w:rPr>
-              <w:t xml:space="preserve">32</w:t>
+              <w:t xml:space="preserve">34</w:t>
             </w:r>
           </w:p>
         </w:tc>
@@ -10731,7 +11459,7 @@
                 <w:sz w:val="19"/>
                 <w:szCs w:val="19"/>
               </w:rPr>
-              <w:t xml:space="preserve">33</w:t>
+              <w:t xml:space="preserve">35</w:t>
             </w:r>
           </w:p>
         </w:tc>
@@ -10835,7 +11563,7 @@
                 <w:sz w:val="19"/>
                 <w:szCs w:val="19"/>
               </w:rPr>
-              <w:t xml:space="preserve">34</w:t>
+              <w:t xml:space="preserve">36</w:t>
             </w:r>
           </w:p>
         </w:tc>
@@ -10964,7 +11692,7 @@
               <w:t xml:space="preserve">Ciclo repetitivo: </w:t>
             </w:r>
             <w:r>
-              <w:t xml:space="preserve">los pasos 35 a 42 se repiten para cada ranura a inspeccionar. El paso 43 se ejecuta cuando se alcanza la condición indicada.</w:t>
+              <w:t xml:space="preserve">los pasos 37 a 44 se repiten para cada ranura a inspeccionar. El paso 45 se ejecuta cuando se alcanza la condición indicada.</w:t>
             </w:r>
           </w:p>
         </w:tc>
@@ -11174,7 +11902,7 @@
                 <w:sz w:val="19"/>
                 <w:szCs w:val="19"/>
               </w:rPr>
-              <w:t xml:space="preserve">35</w:t>
+              <w:t xml:space="preserve">37</w:t>
             </w:r>
           </w:p>
         </w:tc>
@@ -11278,7 +12006,7 @@
                 <w:sz w:val="19"/>
                 <w:szCs w:val="19"/>
               </w:rPr>
-              <w:t xml:space="preserve">36</w:t>
+              <w:t xml:space="preserve">38</w:t>
             </w:r>
           </w:p>
         </w:tc>
@@ -11382,7 +12110,7 @@
                 <w:sz w:val="19"/>
                 <w:szCs w:val="19"/>
               </w:rPr>
-              <w:t xml:space="preserve">37</w:t>
+              <w:t xml:space="preserve">39</w:t>
             </w:r>
           </w:p>
         </w:tc>
@@ -11527,7 +12255,7 @@
                 <w:sz w:val="19"/>
                 <w:szCs w:val="19"/>
               </w:rPr>
-              <w:t xml:space="preserve">38</w:t>
+              <w:t xml:space="preserve">40</w:t>
             </w:r>
           </w:p>
         </w:tc>
@@ -11560,7 +12288,7 @@
                 <w:sz w:val="19"/>
                 <w:szCs w:val="19"/>
               </w:rPr>
-              <w:t xml:space="preserve">Avanzar axialmente a velocidad constante (recomendada: 50 mm/s) registrando el EL CID, sin superar el límite de avance seguro definido en el paso 31. Activar las cámaras laterales y monitorearlas junto con las demás para detectar anomalías.</w:t>
+              <w:t xml:space="preserve">Avanzar axialmente a velocidad constante (recomendada: 50 mm/s) registrando el EL CID, sin superar el límite de avance seguro definido en el paso 33. Activar las cámaras laterales y monitorearlas junto con las demás para detectar anomalías.</w:t>
             </w:r>
           </w:p>
         </w:tc>
@@ -11631,7 +12359,7 @@
                 <w:sz w:val="19"/>
                 <w:szCs w:val="19"/>
               </w:rPr>
-              <w:t xml:space="preserve">39</w:t>
+              <w:t xml:space="preserve">41</w:t>
             </w:r>
           </w:p>
         </w:tc>
@@ -11776,7 +12504,7 @@
                 <w:sz w:val="19"/>
                 <w:szCs w:val="19"/>
               </w:rPr>
-              <w:t xml:space="preserve">40</w:t>
+              <w:t xml:space="preserve">42</w:t>
             </w:r>
           </w:p>
         </w:tc>
@@ -11880,7 +12608,7 @@
                 <w:sz w:val="19"/>
                 <w:szCs w:val="19"/>
               </w:rPr>
-              <w:t xml:space="preserve">41</w:t>
+              <w:t xml:space="preserve">43</w:t>
             </w:r>
           </w:p>
         </w:tc>
@@ -11913,7 +12641,7 @@
                 <w:sz w:val="19"/>
                 <w:szCs w:val="19"/>
               </w:rPr>
-              <w:t xml:space="preserve">Comunicar toda indicación de falla (EL CID, WTT o visual) al ingeniero de generadores a cargo.</w:t>
+              <w:t xml:space="preserve">Comunicar en forma inmediata toda indicación de falla (EL CID, WTT o visual) al ingeniero de generadores a cargo y al Cliente, para que pueda planificar, si corresponde, la extracción del rotor.</w:t>
             </w:r>
           </w:p>
         </w:tc>
@@ -12025,7 +12753,7 @@
                 <w:sz w:val="19"/>
                 <w:szCs w:val="19"/>
               </w:rPr>
-              <w:t xml:space="preserve">42</w:t>
+              <w:t xml:space="preserve">44</w:t>
             </w:r>
           </w:p>
         </w:tc>
@@ -12058,7 +12786,7 @@
                 <w:sz w:val="19"/>
                 <w:szCs w:val="19"/>
               </w:rPr>
-              <w:t xml:space="preserve">Desplazar la rampa a la ranura siguiente, verificar la alineación y repetir desde el paso 35.</w:t>
+              <w:t xml:space="preserve">Desplazar la rampa a la ranura siguiente, verificar la alineación y repetir desde el paso 37.</w:t>
             </w:r>
           </w:p>
         </w:tc>
@@ -12129,7 +12857,7 @@
                 <w:sz w:val="19"/>
                 <w:szCs w:val="19"/>
               </w:rPr>
-              <w:t xml:space="preserve">43</w:t>
+              <w:t xml:space="preserve">45</w:t>
             </w:r>
           </w:p>
         </w:tc>
@@ -12837,7 +13565,7 @@
                 <w:sz w:val="19"/>
                 <w:szCs w:val="19"/>
               </w:rPr>
-              <w:t xml:space="preserve">44</w:t>
+              <w:t xml:space="preserve">46</w:t>
             </w:r>
           </w:p>
         </w:tc>
@@ -12941,7 +13669,7 @@
                 <w:sz w:val="19"/>
                 <w:szCs w:val="19"/>
               </w:rPr>
-              <w:t xml:space="preserve">45</w:t>
+              <w:t xml:space="preserve">47</w:t>
             </w:r>
           </w:p>
         </w:tc>
@@ -13045,7 +13773,7 @@
                 <w:sz w:val="19"/>
                 <w:szCs w:val="19"/>
               </w:rPr>
-              <w:t xml:space="preserve">46</w:t>
+              <w:t xml:space="preserve">48</w:t>
             </w:r>
           </w:p>
         </w:tc>
@@ -13149,7 +13877,7 @@
                 <w:sz w:val="19"/>
                 <w:szCs w:val="19"/>
               </w:rPr>
-              <w:t xml:space="preserve">47</w:t>
+              <w:t xml:space="preserve">49</w:t>
             </w:r>
           </w:p>
         </w:tc>
@@ -13253,7 +13981,7 @@
                 <w:sz w:val="19"/>
                 <w:szCs w:val="19"/>
               </w:rPr>
-              <w:t xml:space="preserve">48</w:t>
+              <w:t xml:space="preserve">50</w:t>
             </w:r>
           </w:p>
         </w:tc>

</xml_diff>

<commit_message>
EPG002: apéndice de cálculo de la excitación (tensión y corriente) según Ridley
- Apéndice 2.4 reescrito: criterio del 4 % del flujo, tabla de parámetros con
  unidad y origen, tres métodos de tensión por espira, tensión, corriente y
  potencia del Variac y elección del número de espiras, con ejemplo resuelto.
- Ecuaciones tipográficas generadas con mathtext (ecuaciones.py) e insertadas
  como imagen; se elimina la versión anterior para no repetir contenido.
- Registro RME-ELC-01 y referencia a Ridley (2000) en el anexo; EPG001 remite al
  apartado 2.4 y a RME-ELC-01.

Co-Authored-By: Claude Opus 5.5 <noreply@anthropic.com>
Claude-Session: https://claude.ai/code/session_01Nz5qZw2jp5HghH6VEfj4aK
</commit_message>
<xml_diff>
--- a/procedimientos_gris/00503-00-EPG001 Procedimiento Inspeccion Robotizada GRIS.docx
+++ b/procedimientos_gris/00503-00-EPG001 Procedimiento Inspeccion Robotizada GRIS.docx
@@ -7208,7 +7208,7 @@
                 <w:sz w:val="19"/>
                 <w:szCs w:val="19"/>
               </w:rPr>
-              <w:t xml:space="preserve">00503-00-EPG002 – Protocolo 1, Apéndice</w:t>
+              <w:t xml:space="preserve">00503-00-EPG002, apartado 2.4</w:t>
             </w:r>
           </w:p>
         </w:tc>
@@ -7279,7 +7279,7 @@
                 <w:sz w:val="19"/>
                 <w:szCs w:val="19"/>
               </w:rPr>
-              <w:t xml:space="preserve">Calcular la excitación del núcleo (tensión por espira, número de espiras, corriente y sección del conductor) o solicitarla a Ingeniería.</w:t>
+              <w:t xml:space="preserve">Calcular la excitación del núcleo (tensión por espira, número de espiras, tensión y corriente del Variac y sección del conductor) y registrarla en RME-ELC-01, o solicitarla a Ingeniería.</w:t>
             </w:r>
           </w:p>
         </w:tc>
@@ -7312,7 +7312,7 @@
                 <w:sz w:val="19"/>
                 <w:szCs w:val="19"/>
               </w:rPr>
-              <w:t xml:space="preserve">00503-00-EPG002 – Protocolo 1</w:t>
+              <w:t xml:space="preserve">00503-00-EPG002, apartado 2.4 / RME-ELC-01</w:t>
             </w:r>
           </w:p>
         </w:tc>

</xml_diff>

<commit_message>
Referencias cruzadas EPG001 ↔ EPG003 y paquete documental de entrega
- EPG001 remite a 00503-00-EPG003 (apartado por paso) en lugar de «Manual de
  software GRIS».
- epg003_referencias.py actualiza en el manual los números de paso de EPG001
  a partir de la numeración vigente; build.js lo ejecuta y exporta el PDF.
- empaquetar.py arma entrega/Paquete documental GRIS 00503.zip con EPG001,
  EPG002, EPG003, figuras, RME-ELC-01, ZIT003 y ZRQ001.

Co-Authored-By: Claude Opus 5.5 <noreply@anthropic.com>
Claude-Session: https://claude.ai/code/session_01Nz5qZw2jp5HghH6VEfj4aK
</commit_message>
<xml_diff>
--- a/procedimientos_gris/00503-00-EPG001 Procedimiento Inspeccion Robotizada GRIS.docx
+++ b/procedimientos_gris/00503-00-EPG001 Procedimiento Inspeccion Robotizada GRIS.docx
@@ -3225,7 +3225,7 @@
                 <w:sz w:val="19"/>
                 <w:szCs w:val="19"/>
               </w:rPr>
-              <w:t xml:space="preserve">Manual de software GRIS</w:t>
+              <w:t xml:space="preserve">00503-00-EPG003 – Manual de uso del software GRIS</w:t>
             </w:r>
           </w:p>
         </w:tc>
@@ -3258,7 +3258,7 @@
                 <w:sz w:val="19"/>
                 <w:szCs w:val="19"/>
               </w:rPr>
-              <w:t xml:space="preserve">Operación del software de control del robot.</w:t>
+              <w:t xml:space="preserve">Operación del software GRIS: configuración del robot y de la rampa, movimiento, cámaras, ensayo de ajuste de cuñas (WTT) y almacenamiento de los datos.</w:t>
             </w:r>
           </w:p>
         </w:tc>
@@ -4065,7 +4065,7 @@
                 <w:sz w:val="19"/>
                 <w:szCs w:val="19"/>
               </w:rPr>
-              <w:t xml:space="preserve">00503-00-EPG002 – Protocolo 3 / Manual de software GRIS / Figura 1</w:t>
+              <w:t xml:space="preserve">00503-00-EPG002 – Protocolo 3 / 00503-00-EPG003 / Figura 1</w:t>
             </w:r>
           </w:p>
         </w:tc>
@@ -9711,7 +9711,7 @@
                 <w:sz w:val="19"/>
                 <w:szCs w:val="19"/>
               </w:rPr>
-              <w:t xml:space="preserve">Manual de software GRIS</w:t>
+              <w:t xml:space="preserve">00503-00-EPG003, apartado 4.2</w:t>
             </w:r>
           </w:p>
         </w:tc>
@@ -9919,7 +9919,7 @@
                 <w:sz w:val="19"/>
                 <w:szCs w:val="19"/>
               </w:rPr>
-              <w:t xml:space="preserve">—</w:t>
+              <w:t xml:space="preserve">00503-00-EPG003, apartado 4.2</w:t>
             </w:r>
           </w:p>
         </w:tc>
@@ -10231,7 +10231,7 @@
                 <w:sz w:val="19"/>
                 <w:szCs w:val="19"/>
               </w:rPr>
-              <w:t xml:space="preserve">Figura 1 / 00503-00-EPG002 – Protocolo 1</w:t>
+              <w:t xml:space="preserve">Figura 1 / 00503-00-EPG002 – Protocolo 1 / 00503-00-EPG003, apartado 3.1</w:t>
             </w:r>
           </w:p>
         </w:tc>
@@ -10439,7 +10439,7 @@
                 <w:sz w:val="19"/>
                 <w:szCs w:val="19"/>
               </w:rPr>
-              <w:t xml:space="preserve">00503-00-EPG002 – Protocolo 3 / Manual de software GRIS</w:t>
+              <w:t xml:space="preserve">00503-00-EPG002 – Protocolo 3 / 00503-00-EPG003, apartados 4.4 y 5.3</w:t>
             </w:r>
           </w:p>
         </w:tc>
@@ -10647,7 +10647,7 @@
                 <w:sz w:val="19"/>
                 <w:szCs w:val="19"/>
               </w:rPr>
-              <w:t xml:space="preserve">—</w:t>
+              <w:t xml:space="preserve">00503-00-EPG003, apartado 4.3</w:t>
             </w:r>
           </w:p>
         </w:tc>
@@ -11109,7 +11109,7 @@
                 <w:sz w:val="19"/>
                 <w:szCs w:val="19"/>
               </w:rPr>
-              <w:t xml:space="preserve">Apartado 2.1</w:t>
+              <w:t xml:space="preserve">Apartado 2.1 / 00503-00-EPG003, apartado 4.3</w:t>
             </w:r>
           </w:p>
         </w:tc>
@@ -11317,7 +11317,7 @@
                 <w:sz w:val="19"/>
                 <w:szCs w:val="19"/>
               </w:rPr>
-              <w:t xml:space="preserve">Apartado 2.1</w:t>
+              <w:t xml:space="preserve">Apartado 2.1 / 00503-00-EPG003, apartado 4.3</w:t>
             </w:r>
           </w:p>
         </w:tc>
@@ -11421,7 +11421,7 @@
                 <w:sz w:val="19"/>
                 <w:szCs w:val="19"/>
               </w:rPr>
-              <w:t xml:space="preserve">—</w:t>
+              <w:t xml:space="preserve">00503-00-EPG003, apartado 5.2</w:t>
             </w:r>
           </w:p>
         </w:tc>
@@ -11629,7 +11629,7 @@
                 <w:sz w:val="19"/>
                 <w:szCs w:val="19"/>
               </w:rPr>
-              <w:t xml:space="preserve">—</w:t>
+              <w:t xml:space="preserve">00503-00-EPG003, apartado 4.4</w:t>
             </w:r>
           </w:p>
         </w:tc>
@@ -11968,7 +11968,7 @@
                 <w:sz w:val="19"/>
                 <w:szCs w:val="19"/>
               </w:rPr>
-              <w:t xml:space="preserve">—</w:t>
+              <w:t xml:space="preserve">00503-00-EPG003, apartado 4.3</w:t>
             </w:r>
           </w:p>
         </w:tc>
@@ -12072,7 +12072,7 @@
                 <w:sz w:val="19"/>
                 <w:szCs w:val="19"/>
               </w:rPr>
-              <w:t xml:space="preserve">Tabla 2 / 00503-00-EPG002 – Protocolo 3</w:t>
+              <w:t xml:space="preserve">Tabla 2 / 00503-00-EPG002 – Protocolo 3 / 00503-00-EPG003, apartado 4.3</w:t>
             </w:r>
           </w:p>
         </w:tc>
@@ -12321,7 +12321,7 @@
                 <w:sz w:val="19"/>
                 <w:szCs w:val="19"/>
               </w:rPr>
-              <w:t xml:space="preserve">00503-00-EPG002 – Protocolo 3</w:t>
+              <w:t xml:space="preserve">00503-00-EPG002 – Protocolo 3 / 00503-00-EPG003, apartado 4.3</w:t>
             </w:r>
           </w:p>
         </w:tc>
@@ -12570,7 +12570,7 @@
                 <w:sz w:val="19"/>
                 <w:szCs w:val="19"/>
               </w:rPr>
-              <w:t xml:space="preserve">—</w:t>
+              <w:t xml:space="preserve">00503-00-EPG003, apartados 5.3 y 5.4</w:t>
             </w:r>
           </w:p>
         </w:tc>
@@ -12819,7 +12819,7 @@
                 <w:sz w:val="19"/>
                 <w:szCs w:val="19"/>
               </w:rPr>
-              <w:t xml:space="preserve">—</w:t>
+              <w:t xml:space="preserve">00503-00-EPG003, apartado 4.3</w:t>
             </w:r>
           </w:p>
         </w:tc>
@@ -13631,7 +13631,7 @@
                 <w:sz w:val="19"/>
                 <w:szCs w:val="19"/>
               </w:rPr>
-              <w:t xml:space="preserve">—</w:t>
+              <w:t xml:space="preserve">00503-00-EPG003, apartado 7</w:t>
             </w:r>
           </w:p>
         </w:tc>

</xml_diff>

<commit_message>
EPG001: se quitan las figuras de detalle del tablero de excitación
Quedan solo la Figura 1 (esquema general en A3); los pasos que citaban las
Figuras 2 y 3 remiten a la Figura 1. Se elimina su generación y su PDF suelto.

Co-Authored-By: Claude Opus 5.5 <noreply@anthropic.com>
Claude-Session: https://claude.ai/code/session_01Nz5qZw2jp5HghH6VEfj4aK
</commit_message>
<xml_diff>
--- a/procedimientos_gris/00503-00-EPG001 Procedimiento Inspeccion Robotizada GRIS.docx
+++ b/procedimientos_gris/00503-00-EPG001 Procedimiento Inspeccion Robotizada GRIS.docx
@@ -491,7 +491,7 @@
           <w:sz w:val="19"/>
         </w:rPr>
         <w:tab/>
-        <w:t>12</w:t>
+        <w:t>11</w:t>
       </w:r>
     </w:p>
     <w:p>
@@ -513,7 +513,7 @@
           <w:sz w:val="19"/>
         </w:rPr>
         <w:tab/>
-        <w:t>13</w:t>
+        <w:t>12</w:t>
       </w:r>
     </w:p>
     <w:p>
@@ -536,7 +536,7 @@
           <w:sz w:val="19"/>
         </w:rPr>
         <w:tab/>
-        <w:t>14</w:t>
+        <w:t>13</w:t>
       </w:r>
       <w:r>
         <w:fldChar w:fldCharType="end"/>
@@ -8988,7 +8988,7 @@
                 <w:sz w:val="19"/>
                 <w:szCs w:val="19"/>
               </w:rPr>
-              <w:t xml:space="preserve">00503-00-EPG002 – Protocolo 1 / Figuras 2 y 3</w:t>
+              <w:t xml:space="preserve">00503-00-EPG002 – Protocolo 1 / Figura 1</w:t>
             </w:r>
           </w:p>
         </w:tc>
@@ -9092,7 +9092,7 @@
                 <w:sz w:val="19"/>
                 <w:szCs w:val="19"/>
               </w:rPr>
-              <w:t xml:space="preserve">Apartado 2.1 / Figura 2</w:t>
+              <w:t xml:space="preserve">Apartado 2.1 / Figura 1</w:t>
             </w:r>
           </w:p>
         </w:tc>
@@ -10739,132 +10739,6 @@
           <w:docGrid w:linePitch="360"/>
         </w:sectPr>
       </w:pPr>
-    </w:p>
-    <w:p>
-      <w:pPr>
-        <w:keepNext/>
-        <w:spacing w:after="60" w:before="120"/>
-        <w:jc w:val="center"/>
-      </w:pPr>
-      <w:r>
-        <w:drawing>
-          <wp:inline distT="0" distB="0" distL="0" distR="0">
-            <wp:extent cx="6124575" cy="2895600"/>
-            <wp:effectExtent t="0" r="0" b="0" l="0"/>
-            <wp:docPr id="1" name="detalle_tablero_excitacion.png" descr="Figura 2: Detalle del tablero de excitación (conexiones internas)" title="Figura 2: Detalle del tablero de excitación (conexiones internas)"/>
-            <wp:cNvGraphicFramePr>
-              <a:graphicFrameLocks xmlns:a="http://schemas.openxmlformats.org/drawingml/2006/main" noChangeAspect="1"/>
-            </wp:cNvGraphicFramePr>
-            <a:graphic xmlns:a="http://schemas.openxmlformats.org/drawingml/2006/main">
-              <a:graphicData uri="http://schemas.openxmlformats.org/drawingml/2006/picture">
-                <pic:pic xmlns:pic="http://schemas.openxmlformats.org/drawingml/2006/picture">
-                  <pic:nvPicPr>
-                    <pic:cNvPr id="0" name="" descr=""/>
-                    <pic:cNvPicPr>
-                      <a:picLocks noChangeAspect="1" noChangeArrowheads="1"/>
-                    </pic:cNvPicPr>
-                  </pic:nvPicPr>
-                  <pic:blipFill>
-                    <a:blip r:embed="rId14" cstate="none"/>
-                    <a:srcRect/>
-                    <a:stretch>
-                      <a:fillRect/>
-                    </a:stretch>
-                  </pic:blipFill>
-                  <pic:spPr bwMode="auto">
-                    <a:xfrm>
-                      <a:off x="0" y="0"/>
-                      <a:ext cx="6124575" cy="2895600"/>
-                    </a:xfrm>
-                    <a:prstGeom prst="rect">
-                      <a:avLst/>
-                    </a:prstGeom>
-                  </pic:spPr>
-                </pic:pic>
-              </a:graphicData>
-            </a:graphic>
-          </wp:inline>
-        </w:drawing>
-      </w:r>
-    </w:p>
-    <w:p>
-      <w:pPr>
-        <w:spacing w:after="200"/>
-        <w:jc w:val="center"/>
-      </w:pPr>
-      <w:r>
-        <w:rPr>
-          <w:i/>
-          <w:iCs/>
-          <w:color w:val="6D8289"/>
-          <w:sz w:val="18"/>
-          <w:szCs w:val="18"/>
-        </w:rPr>
-        <w:t xml:space="preserve">Figura 2: Detalle del tablero de excitación (conexiones internas)</w:t>
-      </w:r>
-    </w:p>
-    <w:p>
-      <w:pPr>
-        <w:keepNext/>
-        <w:spacing w:after="60" w:before="120"/>
-        <w:jc w:val="center"/>
-      </w:pPr>
-      <w:r>
-        <w:drawing>
-          <wp:inline distT="0" distB="0" distL="0" distR="0">
-            <wp:extent cx="6124575" cy="3676650"/>
-            <wp:effectExtent t="0" r="0" b="0" l="0"/>
-            <wp:docPr id="1" name="detalle_borneras.png" descr="Figura 3: Ampliación de las borneras EXCITATION y AUX (numeración de bornes)" title="Figura 3: Ampliación de las borneras EXCITATION y AUX (numeración de bornes)"/>
-            <wp:cNvGraphicFramePr>
-              <a:graphicFrameLocks xmlns:a="http://schemas.openxmlformats.org/drawingml/2006/main" noChangeAspect="1"/>
-            </wp:cNvGraphicFramePr>
-            <a:graphic xmlns:a="http://schemas.openxmlformats.org/drawingml/2006/main">
-              <a:graphicData uri="http://schemas.openxmlformats.org/drawingml/2006/picture">
-                <pic:pic xmlns:pic="http://schemas.openxmlformats.org/drawingml/2006/picture">
-                  <pic:nvPicPr>
-                    <pic:cNvPr id="0" name="" descr=""/>
-                    <pic:cNvPicPr>
-                      <a:picLocks noChangeAspect="1" noChangeArrowheads="1"/>
-                    </pic:cNvPicPr>
-                  </pic:nvPicPr>
-                  <pic:blipFill>
-                    <a:blip r:embed="rId15" cstate="none"/>
-                    <a:srcRect/>
-                    <a:stretch>
-                      <a:fillRect/>
-                    </a:stretch>
-                  </pic:blipFill>
-                  <pic:spPr bwMode="auto">
-                    <a:xfrm>
-                      <a:off x="0" y="0"/>
-                      <a:ext cx="6124575" cy="3676650"/>
-                    </a:xfrm>
-                    <a:prstGeom prst="rect">
-                      <a:avLst/>
-                    </a:prstGeom>
-                  </pic:spPr>
-                </pic:pic>
-              </a:graphicData>
-            </a:graphic>
-          </wp:inline>
-        </w:drawing>
-      </w:r>
-    </w:p>
-    <w:p>
-      <w:pPr>
-        <w:spacing w:after="200"/>
-        <w:jc w:val="center"/>
-      </w:pPr>
-      <w:r>
-        <w:rPr>
-          <w:i/>
-          <w:iCs/>
-          <w:color w:val="6D8289"/>
-          <w:sz w:val="18"/>
-          <w:szCs w:val="18"/>
-        </w:rPr>
-        <w:t xml:space="preserve">Figura 3: Ampliación de las borneras EXCITATION y AUX (numeración de bornes)</w:t>
-      </w:r>
     </w:p>
     <w:p>
       <w:pPr>

</xml_diff>

<commit_message>
Figura 1: advertencia en recuadro, arnés continuo y ajustes de rótulos
- Advertencia de la ficha del Variac en recuadro con flecha a la ficha.
- Arnés del robot grueso hasta el conector del control box.
- Rótulos de señal de posición y del captor sobre la línea, con flecha de
  sentido; sin rótulos «Cable de 5 hilos» ni «Zapatilla».
- Tierra del núcleo separada del cable de excitación; control box en un tono
  más claro para distinguir conectores y líneas.
- Texto: «zapatilla» reemplazado por «regleta de enchufes».

Co-Authored-By: Claude Opus 5.5 <noreply@anthropic.com>
Claude-Session: https://claude.ai/code/session_01Nz5qZw2jp5HghH6VEfj4aK
</commit_message>
<xml_diff>
--- a/procedimientos_gris/00503-00-EPG001 Procedimiento Inspeccion Robotizada GRIS.docx
+++ b/procedimientos_gris/00503-00-EPG001 Procedimiento Inspeccion Robotizada GRIS.docx
@@ -5967,7 +5967,7 @@
                 <w:sz w:val="19"/>
                 <w:szCs w:val="19"/>
               </w:rPr>
-              <w:t xml:space="preserve">Cables USB, Ethernet, BNC y de alimentación; zapatillas y adaptadores de enchufe</w:t>
+              <w:t xml:space="preserve">Cables USB, Ethernet, BNC y de alimentación; regletas de enchufes y adaptadores</w:t>
             </w:r>
           </w:p>
         </w:tc>
@@ -10198,7 +10198,7 @@
                 <w:sz w:val="19"/>
                 <w:szCs w:val="19"/>
               </w:rPr>
-              <w:t xml:space="preserve">Realizar las conexiones de la Figura 1: arnés del robot al control box (cable principal) y al tablero EL CID (señal del captor); control box al tablero EL CID (señal de posición); PC GRIS al control box (USB y Ethernet); PC EL CID al tablero EL CID (USB); tablero de excitación (Variac, cable de 5 hilos, espira auxiliar y salida al tablero EL CID) y alimentaciones desde la zapatilla, respetando el esquema de puesta a tierra.</w:t>
+              <w:t xml:space="preserve">Realizar las conexiones de la Figura 1: arnés del robot al control box (cable principal) y al tablero EL CID (señal del captor); control box al tablero EL CID (señal de posición); PC GRIS al control box (USB y Ethernet); PC EL CID al tablero EL CID (USB); tablero de excitación (Variac, cable de 5 hilos, espira auxiliar y salida al tablero EL CID) y alimentaciones desde la red (regleta de enchufes), respetando el esquema de puesta a tierra.</w:t>
             </w:r>
           </w:p>
         </w:tc>

</xml_diff>

<commit_message>
EPG001: amarre con nudo ocho reconstruido y ajustes de riesgos
- Paso 27: atar las cuerdas de seguridad con nudo ocho reconstruido; apartado
  con la secuencia de atado y Tabla 3 de verificación (chicote de 3 a 5 cm).
- Riesgos: se quitan «resultados erróneos» y «hallazgo de falla grave»; la
  recuperación del robot atascado remite solo a las cuerdas de seguridad.
- Cable de excitación sin indicar la cantidad de hilos.

Co-Authored-By: Claude Opus 5.5 <noreply@anthropic.com>
Claude-Session: https://claude.ai/code/session_01Nz5qZw2jp5HghH6VEfj4aK
</commit_message>
<xml_diff>
--- a/procedimientos_gris/00503-00-EPG001 Procedimiento Inspeccion Robotizada GRIS.docx
+++ b/procedimientos_gris/00503-00-EPG001 Procedimiento Inspeccion Robotizada GRIS.docx
@@ -337,7 +337,7 @@
           <w:sz w:val="19"/>
         </w:rPr>
         <w:tab/>
-        <w:t>5</w:t>
+        <w:t>4</w:t>
       </w:r>
     </w:p>
     <w:p>
@@ -425,7 +425,7 @@
           <w:sz w:val="19"/>
         </w:rPr>
         <w:tab/>
-        <w:t>8</w:t>
+        <w:t>7</w:t>
       </w:r>
     </w:p>
     <w:p>
@@ -491,7 +491,7 @@
           <w:sz w:val="19"/>
         </w:rPr>
         <w:tab/>
-        <w:t>11</w:t>
+        <w:t>12</w:t>
       </w:r>
     </w:p>
     <w:p>
@@ -513,7 +513,7 @@
           <w:sz w:val="19"/>
         </w:rPr>
         <w:tab/>
-        <w:t>12</w:t>
+        <w:t>13</w:t>
       </w:r>
     </w:p>
     <w:p>
@@ -536,7 +536,7 @@
           <w:sz w:val="19"/>
         </w:rPr>
         <w:tab/>
-        <w:t>13</w:t>
+        <w:t>14</w:t>
       </w:r>
       <w:r>
         <w:fldChar w:fldCharType="end"/>
@@ -2174,7 +2174,7 @@
                 <w:sz w:val="19"/>
                 <w:szCs w:val="19"/>
               </w:rPr>
-              <w:t xml:space="preserve">Recuperación con las cuerdas de seguridad (paso 27) y el cable del robot.</w:t>
+              <w:t xml:space="preserve">Recuperación con las cuerdas de seguridad (paso 27).</w:t>
             </w:r>
           </w:p>
         </w:tc>
@@ -2487,214 +2487,6 @@
                 <w:szCs w:val="19"/>
               </w:rPr>
               <w:t xml:space="preserve">Al menos dos operadores calificados y pausas regulares (paso 8).</w:t>
-            </w:r>
-          </w:p>
-        </w:tc>
-      </w:tr>
-      <w:tr>
-        <w:trPr>
-          <w:cantSplit/>
-        </w:trPr>
-        <w:tc>
-          <w:tcPr>
-            <w:tcW w:type="dxa" w:w="3500"/>
-            <w:tcBorders>
-              <w:top w:val="single" w:color="A6B4B8" w:sz="4"/>
-              <w:left w:val="single" w:color="A6B4B8" w:sz="4"/>
-              <w:bottom w:val="single" w:color="A6B4B8" w:sz="4"/>
-              <w:right w:val="single" w:color="A6B4B8" w:sz="4"/>
-            </w:tcBorders>
-            <w:tcMar>
-              <w:top w:type="dxa" w:w="50"/>
-              <w:left w:type="dxa" w:w="90"/>
-              <w:bottom w:type="dxa" w:w="50"/>
-              <w:right w:type="dxa" w:w="90"/>
-            </w:tcMar>
-            <w:vAlign w:val="top"/>
-          </w:tcPr>
-          <w:p>
-            <w:pPr>
-              <w:spacing w:after="0" w:line="252"/>
-              <w:jc w:val="left"/>
-            </w:pPr>
-            <w:r>
-              <w:rPr>
-                <w:b w:val="false"/>
-                <w:bCs w:val="false"/>
-                <w:sz w:val="19"/>
-                <w:szCs w:val="19"/>
-              </w:rPr>
-              <w:t xml:space="preserve">Resultados de ensayo erróneos por error del operador, del equipo o de la calibración.</w:t>
-            </w:r>
-          </w:p>
-        </w:tc>
-        <w:tc>
-          <w:tcPr>
-            <w:tcW w:type="dxa" w:w="2900"/>
-            <w:tcBorders>
-              <w:top w:val="single" w:color="A6B4B8" w:sz="4"/>
-              <w:left w:val="single" w:color="A6B4B8" w:sz="4"/>
-              <w:bottom w:val="single" w:color="A6B4B8" w:sz="4"/>
-              <w:right w:val="single" w:color="A6B4B8" w:sz="4"/>
-            </w:tcBorders>
-            <w:tcMar>
-              <w:top w:type="dxa" w:w="50"/>
-              <w:left w:type="dxa" w:w="90"/>
-              <w:bottom w:type="dxa" w:w="50"/>
-              <w:right w:type="dxa" w:w="90"/>
-            </w:tcMar>
-            <w:vAlign w:val="top"/>
-          </w:tcPr>
-          <w:p>
-            <w:pPr>
-              <w:spacing w:after="0" w:line="252"/>
-              <w:jc w:val="left"/>
-            </w:pPr>
-            <w:r>
-              <w:rPr>
-                <w:b w:val="false"/>
-                <w:bCs w:val="false"/>
-                <w:sz w:val="19"/>
-                <w:szCs w:val="19"/>
-              </w:rPr>
-              <w:t xml:space="preserve">Extracción innecesaria del rotor o falla no detectada.</w:t>
-            </w:r>
-          </w:p>
-        </w:tc>
-        <w:tc>
-          <w:tcPr>
-            <w:tcW w:type="dxa" w:w="3238"/>
-            <w:tcBorders>
-              <w:top w:val="single" w:color="A6B4B8" w:sz="4"/>
-              <w:left w:val="single" w:color="A6B4B8" w:sz="4"/>
-              <w:bottom w:val="single" w:color="A6B4B8" w:sz="4"/>
-              <w:right w:val="single" w:color="A6B4B8" w:sz="4"/>
-            </w:tcBorders>
-            <w:tcMar>
-              <w:top w:type="dxa" w:w="50"/>
-              <w:left w:type="dxa" w:w="90"/>
-              <w:bottom w:type="dxa" w:w="50"/>
-              <w:right w:type="dxa" w:w="90"/>
-            </w:tcMar>
-            <w:vAlign w:val="top"/>
-          </w:tcPr>
-          <w:p>
-            <w:pPr>
-              <w:spacing w:after="0" w:line="252"/>
-              <w:jc w:val="left"/>
-            </w:pPr>
-            <w:r>
-              <w:rPr>
-                <w:b w:val="false"/>
-                <w:bCs w:val="false"/>
-                <w:sz w:val="19"/>
-                <w:szCs w:val="19"/>
-              </w:rPr>
-              <w:t xml:space="preserve">Calibración según 00503-00-EPG002 – Protocolo 2; revisión de datos y repetición de zonas dudosas (paso 47); análisis por un ingeniero con experiencia.</w:t>
-            </w:r>
-          </w:p>
-        </w:tc>
-      </w:tr>
-      <w:tr>
-        <w:trPr>
-          <w:cantSplit/>
-        </w:trPr>
-        <w:tc>
-          <w:tcPr>
-            <w:tcW w:type="dxa" w:w="3500"/>
-            <w:tcBorders>
-              <w:top w:val="single" w:color="A6B4B8" w:sz="4"/>
-              <w:left w:val="single" w:color="A6B4B8" w:sz="4"/>
-              <w:bottom w:val="single" w:color="A6B4B8" w:sz="4"/>
-              <w:right w:val="single" w:color="A6B4B8" w:sz="4"/>
-            </w:tcBorders>
-            <w:tcMar>
-              <w:top w:type="dxa" w:w="50"/>
-              <w:left w:type="dxa" w:w="90"/>
-              <w:bottom w:type="dxa" w:w="50"/>
-              <w:right w:type="dxa" w:w="90"/>
-            </w:tcMar>
-            <w:vAlign w:val="top"/>
-          </w:tcPr>
-          <w:p>
-            <w:pPr>
-              <w:spacing w:after="0" w:line="252"/>
-              <w:jc w:val="left"/>
-            </w:pPr>
-            <w:r>
-              <w:rPr>
-                <w:b w:val="false"/>
-                <w:bCs w:val="false"/>
-                <w:sz w:val="19"/>
-                <w:szCs w:val="19"/>
-              </w:rPr>
-              <w:t xml:space="preserve">Hallazgo de una falla grave (por ejemplo, cuñas flojas o punto caliente en el núcleo).</w:t>
-            </w:r>
-          </w:p>
-        </w:tc>
-        <w:tc>
-          <w:tcPr>
-            <w:tcW w:type="dxa" w:w="2900"/>
-            <w:tcBorders>
-              <w:top w:val="single" w:color="A6B4B8" w:sz="4"/>
-              <w:left w:val="single" w:color="A6B4B8" w:sz="4"/>
-              <w:bottom w:val="single" w:color="A6B4B8" w:sz="4"/>
-              <w:right w:val="single" w:color="A6B4B8" w:sz="4"/>
-            </w:tcBorders>
-            <w:tcMar>
-              <w:top w:type="dxa" w:w="50"/>
-              <w:left w:type="dxa" w:w="90"/>
-              <w:bottom w:type="dxa" w:w="50"/>
-              <w:right w:type="dxa" w:w="90"/>
-            </w:tcMar>
-            <w:vAlign w:val="top"/>
-          </w:tcPr>
-          <w:p>
-            <w:pPr>
-              <w:spacing w:after="0" w:line="252"/>
-              <w:jc w:val="left"/>
-            </w:pPr>
-            <w:r>
-              <w:rPr>
-                <w:b w:val="false"/>
-                <w:bCs w:val="false"/>
-                <w:sz w:val="19"/>
-                <w:szCs w:val="19"/>
-              </w:rPr>
-              <w:t xml:space="preserve">Necesidad de extraer el rotor y extensión de la parada.</w:t>
-            </w:r>
-          </w:p>
-        </w:tc>
-        <w:tc>
-          <w:tcPr>
-            <w:tcW w:type="dxa" w:w="3238"/>
-            <w:tcBorders>
-              <w:top w:val="single" w:color="A6B4B8" w:sz="4"/>
-              <w:left w:val="single" w:color="A6B4B8" w:sz="4"/>
-              <w:bottom w:val="single" w:color="A6B4B8" w:sz="4"/>
-              <w:right w:val="single" w:color="A6B4B8" w:sz="4"/>
-            </w:tcBorders>
-            <w:tcMar>
-              <w:top w:type="dxa" w:w="50"/>
-              <w:left w:type="dxa" w:w="90"/>
-              <w:bottom w:type="dxa" w:w="50"/>
-              <w:right w:type="dxa" w:w="90"/>
-            </w:tcMar>
-            <w:vAlign w:val="top"/>
-          </w:tcPr>
-          <w:p>
-            <w:pPr>
-              <w:spacing w:after="0" w:line="252"/>
-              <w:jc w:val="left"/>
-            </w:pPr>
-            <w:r>
-              <w:rPr>
-                <w:b w:val="false"/>
-                <w:bCs w:val="false"/>
-                <w:sz w:val="19"/>
-                <w:szCs w:val="19"/>
-              </w:rPr>
-              <w:t xml:space="preserve">Comunicación inmediata al Cliente (paso 43); realizar la inspección lo antes posible dentro de la parada.</w:t>
             </w:r>
           </w:p>
         </w:tc>
@@ -5246,7 +5038,7 @@
                 <w:sz w:val="19"/>
                 <w:szCs w:val="19"/>
               </w:rPr>
-              <w:t xml:space="preserve">Cable de excitación de 5 hilos</w:t>
+              <w:t xml:space="preserve">Cable de excitación</w:t>
             </w:r>
           </w:p>
         </w:tc>
@@ -8955,7 +8747,7 @@
                 <w:sz w:val="19"/>
                 <w:szCs w:val="19"/>
               </w:rPr>
-              <w:t xml:space="preserve">Montar el cable de excitación de 5 hilos a través del entrehierro y conectar sus extremos a la bornera EXCITATION del tablero de excitación, haciendo coincidir números y colores, de modo que las espiras queden en serie.</w:t>
+              <w:t xml:space="preserve">Montar el cable de excitación a través del entrehierro y conectar sus extremos a la bornera EXCITATION del tablero de excitación, haciendo coincidir números y colores, de modo que las espiras queden en serie.</w:t>
             </w:r>
           </w:p>
         </w:tc>
@@ -10198,7 +9990,7 @@
                 <w:sz w:val="19"/>
                 <w:szCs w:val="19"/>
               </w:rPr>
-              <w:t xml:space="preserve">Realizar las conexiones de la Figura 1: arnés del robot al control box (cable principal) y al tablero EL CID (señal del captor); control box al tablero EL CID (señal de posición); PC GRIS al control box (USB y Ethernet); PC EL CID al tablero EL CID (USB); tablero de excitación (Variac, cable de 5 hilos, espira auxiliar y salida al tablero EL CID) y alimentaciones desde la red (regleta de enchufes), respetando el esquema de puesta a tierra.</w:t>
+              <w:t xml:space="preserve">Realizar las conexiones de la Figura 1: arnés del robot al control box (cable principal) y al tablero EL CID (señal del captor); control box al tablero EL CID (señal de posición); PC GRIS al control box (USB y Ethernet); PC EL CID al tablero EL CID (USB); tablero de excitación (Variac, cable de excitación, espira auxiliar y salida al tablero EL CID) y alimentaciones desde la red (regleta de enchufes), respetando el esquema de puesta a tierra.</w:t>
             </w:r>
           </w:p>
         </w:tc>
@@ -10302,7 +10094,7 @@
                 <w:sz w:val="19"/>
                 <w:szCs w:val="19"/>
               </w:rPr>
-              <w:t xml:space="preserve">Instalar las cuerdas de seguridad del robot.</w:t>
+              <w:t xml:space="preserve">Instalar las cuerdas de seguridad del robot y atarlas al punto de amarre con un nudo ocho reconstruido. Verificar el nudo según la Tabla 3.</w:t>
             </w:r>
           </w:p>
         </w:tc>
@@ -10335,7 +10127,7 @@
                 <w:sz w:val="19"/>
                 <w:szCs w:val="19"/>
               </w:rPr>
-              <w:t xml:space="preserve">—</w:t>
+              <w:t xml:space="preserve">Tabla 3</w:t>
             </w:r>
           </w:p>
         </w:tc>
@@ -10740,6 +10532,1002 @@
         </w:sectPr>
       </w:pPr>
     </w:p>
+    <w:p>
+      <w:pPr>
+        <w:keepNext/>
+        <w:spacing w:after="100" w:line="264"/>
+        <w:jc w:val="both"/>
+      </w:pPr>
+      <w:r>
+        <w:rPr>
+          <w:b/>
+          <w:bCs/>
+        </w:rPr>
+        <w:t xml:space="preserve">Amarre de las cuerdas de seguridad: nudo ocho reconstruido (paso 27).</w:t>
+      </w:r>
+      <w:r>
+        <w:t xml:space="preserve"> Las cuerdas de seguridad (3 mm) se atan al punto de amarre del robot con un nudo ocho reconstruido, también llamado ocho por seno reconstituido. Se usa este nudo porque, bien hecho y apretado, no se corre ni se desata con los tirones y las vibraciones del ensayo: al tensarse, los ramales paralelos se aprietan entre sí y el nudo se bloquea. Además es fácil de controlar a simple vista, porque bien hecho siempre muestra la misma figura.</w:t>
+      </w:r>
+    </w:p>
+    <w:tbl>
+      <w:tblPr>
+        <w:tblW w:type="dxa" w:w="9638"/>
+        <w:tblBorders>
+          <w:top w:val="single" w:color="auto" w:sz="4"/>
+          <w:left w:val="single" w:color="auto" w:sz="4"/>
+          <w:bottom w:val="single" w:color="auto" w:sz="4"/>
+          <w:right w:val="single" w:color="auto" w:sz="4"/>
+          <w:insideH w:val="single" w:color="auto" w:sz="4"/>
+          <w:insideV w:val="single" w:color="auto" w:sz="4"/>
+        </w:tblBorders>
+      </w:tblPr>
+      <w:tblGrid>
+        <w:gridCol w:w="900"/>
+        <w:gridCol w:w="8738"/>
+      </w:tblGrid>
+      <w:tr>
+        <w:trPr>
+          <w:cantSplit/>
+          <w:tblHeader/>
+        </w:trPr>
+        <w:tc>
+          <w:tcPr>
+            <w:tcW w:type="dxa" w:w="900"/>
+            <w:tcBorders>
+              <w:top w:val="single" w:color="A6B4B8" w:sz="4"/>
+              <w:left w:val="single" w:color="A6B4B8" w:sz="4"/>
+              <w:bottom w:val="single" w:color="A6B4B8" w:sz="4"/>
+              <w:right w:val="single" w:color="A6B4B8" w:sz="4"/>
+            </w:tcBorders>
+            <w:shd w:fill="DAE0E2" w:val="clear"/>
+            <w:tcMar>
+              <w:top w:type="dxa" w:w="50"/>
+              <w:left w:type="dxa" w:w="90"/>
+              <w:bottom w:type="dxa" w:w="50"/>
+              <w:right w:type="dxa" w:w="90"/>
+            </w:tcMar>
+            <w:vAlign w:val="center"/>
+          </w:tcPr>
+          <w:p>
+            <w:pPr>
+              <w:keepNext/>
+              <w:spacing w:after="0" w:line="252"/>
+              <w:jc w:val="left"/>
+            </w:pPr>
+            <w:r>
+              <w:rPr>
+                <w:b/>
+                <w:bCs/>
+                <w:sz w:val="19"/>
+                <w:szCs w:val="19"/>
+              </w:rPr>
+              <w:t xml:space="preserve">Paso</w:t>
+            </w:r>
+          </w:p>
+        </w:tc>
+        <w:tc>
+          <w:tcPr>
+            <w:tcW w:type="dxa" w:w="8738"/>
+            <w:tcBorders>
+              <w:top w:val="single" w:color="A6B4B8" w:sz="4"/>
+              <w:left w:val="single" w:color="A6B4B8" w:sz="4"/>
+              <w:bottom w:val="single" w:color="A6B4B8" w:sz="4"/>
+              <w:right w:val="single" w:color="A6B4B8" w:sz="4"/>
+            </w:tcBorders>
+            <w:shd w:fill="DAE0E2" w:val="clear"/>
+            <w:tcMar>
+              <w:top w:type="dxa" w:w="50"/>
+              <w:left w:type="dxa" w:w="90"/>
+              <w:bottom w:type="dxa" w:w="50"/>
+              <w:right w:type="dxa" w:w="90"/>
+            </w:tcMar>
+            <w:vAlign w:val="center"/>
+          </w:tcPr>
+          <w:p>
+            <w:pPr>
+              <w:keepNext/>
+              <w:spacing w:after="0" w:line="252"/>
+              <w:jc w:val="left"/>
+            </w:pPr>
+            <w:r>
+              <w:rPr>
+                <w:b/>
+                <w:bCs/>
+                <w:sz w:val="19"/>
+                <w:szCs w:val="19"/>
+              </w:rPr>
+              <w:t xml:space="preserve">Acción</w:t>
+            </w:r>
+          </w:p>
+        </w:tc>
+      </w:tr>
+      <w:tr>
+        <w:trPr>
+          <w:cantSplit/>
+        </w:trPr>
+        <w:tc>
+          <w:tcPr>
+            <w:tcW w:type="dxa" w:w="900"/>
+            <w:tcBorders>
+              <w:top w:val="single" w:color="A6B4B8" w:sz="4"/>
+              <w:left w:val="single" w:color="A6B4B8" w:sz="4"/>
+              <w:bottom w:val="single" w:color="A6B4B8" w:sz="4"/>
+              <w:right w:val="single" w:color="A6B4B8" w:sz="4"/>
+            </w:tcBorders>
+            <w:tcMar>
+              <w:top w:type="dxa" w:w="50"/>
+              <w:left w:type="dxa" w:w="90"/>
+              <w:bottom w:type="dxa" w:w="50"/>
+              <w:right w:type="dxa" w:w="90"/>
+            </w:tcMar>
+            <w:vAlign w:val="top"/>
+          </w:tcPr>
+          <w:p>
+            <w:pPr>
+              <w:keepNext/>
+              <w:spacing w:after="0" w:line="252"/>
+              <w:jc w:val="center"/>
+            </w:pPr>
+            <w:r>
+              <w:rPr>
+                <w:b w:val="false"/>
+                <w:bCs w:val="false"/>
+                <w:sz w:val="19"/>
+                <w:szCs w:val="19"/>
+              </w:rPr>
+              <w:t xml:space="preserve">1</w:t>
+            </w:r>
+          </w:p>
+        </w:tc>
+        <w:tc>
+          <w:tcPr>
+            <w:tcW w:type="dxa" w:w="8738"/>
+            <w:tcBorders>
+              <w:top w:val="single" w:color="A6B4B8" w:sz="4"/>
+              <w:left w:val="single" w:color="A6B4B8" w:sz="4"/>
+              <w:bottom w:val="single" w:color="A6B4B8" w:sz="4"/>
+              <w:right w:val="single" w:color="A6B4B8" w:sz="4"/>
+            </w:tcBorders>
+            <w:tcMar>
+              <w:top w:type="dxa" w:w="50"/>
+              <w:left w:type="dxa" w:w="90"/>
+              <w:bottom w:type="dxa" w:w="50"/>
+              <w:right w:type="dxa" w:w="90"/>
+            </w:tcMar>
+            <w:vAlign w:val="top"/>
+          </w:tcPr>
+          <w:p>
+            <w:pPr>
+              <w:keepNext/>
+              <w:spacing w:after="0" w:line="252"/>
+              <w:jc w:val="left"/>
+            </w:pPr>
+            <w:r>
+              <w:rPr>
+                <w:b w:val="false"/>
+                <w:bCs w:val="false"/>
+                <w:sz w:val="19"/>
+                <w:szCs w:val="19"/>
+              </w:rPr>
+              <w:t xml:space="preserve">A unos 30 cm del extremo de la cuerda, hacer un ocho simple flojo, con el chicote (extremo libre) hacia el robot.</w:t>
+            </w:r>
+          </w:p>
+        </w:tc>
+      </w:tr>
+      <w:tr>
+        <w:trPr>
+          <w:cantSplit/>
+        </w:trPr>
+        <w:tc>
+          <w:tcPr>
+            <w:tcW w:type="dxa" w:w="900"/>
+            <w:tcBorders>
+              <w:top w:val="single" w:color="A6B4B8" w:sz="4"/>
+              <w:left w:val="single" w:color="A6B4B8" w:sz="4"/>
+              <w:bottom w:val="single" w:color="A6B4B8" w:sz="4"/>
+              <w:right w:val="single" w:color="A6B4B8" w:sz="4"/>
+            </w:tcBorders>
+            <w:tcMar>
+              <w:top w:type="dxa" w:w="50"/>
+              <w:left w:type="dxa" w:w="90"/>
+              <w:bottom w:type="dxa" w:w="50"/>
+              <w:right w:type="dxa" w:w="90"/>
+            </w:tcMar>
+            <w:vAlign w:val="top"/>
+          </w:tcPr>
+          <w:p>
+            <w:pPr>
+              <w:keepNext/>
+              <w:spacing w:after="0" w:line="252"/>
+              <w:jc w:val="center"/>
+            </w:pPr>
+            <w:r>
+              <w:rPr>
+                <w:b w:val="false"/>
+                <w:bCs w:val="false"/>
+                <w:sz w:val="19"/>
+                <w:szCs w:val="19"/>
+              </w:rPr>
+              <w:t xml:space="preserve">2</w:t>
+            </w:r>
+          </w:p>
+        </w:tc>
+        <w:tc>
+          <w:tcPr>
+            <w:tcW w:type="dxa" w:w="8738"/>
+            <w:tcBorders>
+              <w:top w:val="single" w:color="A6B4B8" w:sz="4"/>
+              <w:left w:val="single" w:color="A6B4B8" w:sz="4"/>
+              <w:bottom w:val="single" w:color="A6B4B8" w:sz="4"/>
+              <w:right w:val="single" w:color="A6B4B8" w:sz="4"/>
+            </w:tcBorders>
+            <w:tcMar>
+              <w:top w:type="dxa" w:w="50"/>
+              <w:left w:type="dxa" w:w="90"/>
+              <w:bottom w:type="dxa" w:w="50"/>
+              <w:right w:type="dxa" w:w="90"/>
+            </w:tcMar>
+            <w:vAlign w:val="top"/>
+          </w:tcPr>
+          <w:p>
+            <w:pPr>
+              <w:keepNext/>
+              <w:spacing w:after="0" w:line="252"/>
+              <w:jc w:val="left"/>
+            </w:pPr>
+            <w:r>
+              <w:rPr>
+                <w:b w:val="false"/>
+                <w:bCs w:val="false"/>
+                <w:sz w:val="19"/>
+                <w:szCs w:val="19"/>
+              </w:rPr>
+              <w:t xml:space="preserve">Pasar el chicote por el ojal de amarre del robot.</w:t>
+            </w:r>
+          </w:p>
+        </w:tc>
+      </w:tr>
+      <w:tr>
+        <w:trPr>
+          <w:cantSplit/>
+        </w:trPr>
+        <w:tc>
+          <w:tcPr>
+            <w:tcW w:type="dxa" w:w="900"/>
+            <w:tcBorders>
+              <w:top w:val="single" w:color="A6B4B8" w:sz="4"/>
+              <w:left w:val="single" w:color="A6B4B8" w:sz="4"/>
+              <w:bottom w:val="single" w:color="A6B4B8" w:sz="4"/>
+              <w:right w:val="single" w:color="A6B4B8" w:sz="4"/>
+            </w:tcBorders>
+            <w:tcMar>
+              <w:top w:type="dxa" w:w="50"/>
+              <w:left w:type="dxa" w:w="90"/>
+              <w:bottom w:type="dxa" w:w="50"/>
+              <w:right w:type="dxa" w:w="90"/>
+            </w:tcMar>
+            <w:vAlign w:val="top"/>
+          </w:tcPr>
+          <w:p>
+            <w:pPr>
+              <w:keepNext/>
+              <w:spacing w:after="0" w:line="252"/>
+              <w:jc w:val="center"/>
+            </w:pPr>
+            <w:r>
+              <w:rPr>
+                <w:b w:val="false"/>
+                <w:bCs w:val="false"/>
+                <w:sz w:val="19"/>
+                <w:szCs w:val="19"/>
+              </w:rPr>
+              <w:t xml:space="preserve">3</w:t>
+            </w:r>
+          </w:p>
+        </w:tc>
+        <w:tc>
+          <w:tcPr>
+            <w:tcW w:type="dxa" w:w="8738"/>
+            <w:tcBorders>
+              <w:top w:val="single" w:color="A6B4B8" w:sz="4"/>
+              <w:left w:val="single" w:color="A6B4B8" w:sz="4"/>
+              <w:bottom w:val="single" w:color="A6B4B8" w:sz="4"/>
+              <w:right w:val="single" w:color="A6B4B8" w:sz="4"/>
+            </w:tcBorders>
+            <w:tcMar>
+              <w:top w:type="dxa" w:w="50"/>
+              <w:left w:type="dxa" w:w="90"/>
+              <w:bottom w:type="dxa" w:w="50"/>
+              <w:right w:type="dxa" w:w="90"/>
+            </w:tcMar>
+            <w:vAlign w:val="top"/>
+          </w:tcPr>
+          <w:p>
+            <w:pPr>
+              <w:keepNext/>
+              <w:spacing w:after="0" w:line="252"/>
+              <w:jc w:val="left"/>
+            </w:pPr>
+            <w:r>
+              <w:rPr>
+                <w:b w:val="false"/>
+                <w:bCs w:val="false"/>
+                <w:sz w:val="19"/>
+                <w:szCs w:val="19"/>
+              </w:rPr>
+              <w:t xml:space="preserve">Repasar el ocho con el chicote: seguir el mismo recorrido de la cuerda, en sentido inverso y siempre paralelo a ella, hasta salir junto al firme (la parte de la cuerda que va al operador).</w:t>
+            </w:r>
+          </w:p>
+        </w:tc>
+      </w:tr>
+      <w:tr>
+        <w:trPr>
+          <w:cantSplit/>
+        </w:trPr>
+        <w:tc>
+          <w:tcPr>
+            <w:tcW w:type="dxa" w:w="900"/>
+            <w:tcBorders>
+              <w:top w:val="single" w:color="A6B4B8" w:sz="4"/>
+              <w:left w:val="single" w:color="A6B4B8" w:sz="4"/>
+              <w:bottom w:val="single" w:color="A6B4B8" w:sz="4"/>
+              <w:right w:val="single" w:color="A6B4B8" w:sz="4"/>
+            </w:tcBorders>
+            <w:tcMar>
+              <w:top w:type="dxa" w:w="50"/>
+              <w:left w:type="dxa" w:w="90"/>
+              <w:bottom w:type="dxa" w:w="50"/>
+              <w:right w:type="dxa" w:w="90"/>
+            </w:tcMar>
+            <w:vAlign w:val="top"/>
+          </w:tcPr>
+          <w:p>
+            <w:pPr>
+              <w:keepNext/>
+              <w:spacing w:after="0" w:line="252"/>
+              <w:jc w:val="center"/>
+            </w:pPr>
+            <w:r>
+              <w:rPr>
+                <w:b w:val="false"/>
+                <w:bCs w:val="false"/>
+                <w:sz w:val="19"/>
+                <w:szCs w:val="19"/>
+              </w:rPr>
+              <w:t xml:space="preserve">4</w:t>
+            </w:r>
+          </w:p>
+        </w:tc>
+        <w:tc>
+          <w:tcPr>
+            <w:tcW w:type="dxa" w:w="8738"/>
+            <w:tcBorders>
+              <w:top w:val="single" w:color="A6B4B8" w:sz="4"/>
+              <w:left w:val="single" w:color="A6B4B8" w:sz="4"/>
+              <w:bottom w:val="single" w:color="A6B4B8" w:sz="4"/>
+              <w:right w:val="single" w:color="A6B4B8" w:sz="4"/>
+            </w:tcBorders>
+            <w:tcMar>
+              <w:top w:type="dxa" w:w="50"/>
+              <w:left w:type="dxa" w:w="90"/>
+              <w:bottom w:type="dxa" w:w="50"/>
+              <w:right w:type="dxa" w:w="90"/>
+            </w:tcMar>
+            <w:vAlign w:val="top"/>
+          </w:tcPr>
+          <w:p>
+            <w:pPr>
+              <w:keepNext/>
+              <w:spacing w:after="0" w:line="252"/>
+              <w:jc w:val="left"/>
+            </w:pPr>
+            <w:r>
+              <w:rPr>
+                <w:b w:val="false"/>
+                <w:bCs w:val="false"/>
+                <w:sz w:val="19"/>
+                <w:szCs w:val="19"/>
+              </w:rPr>
+              <w:t xml:space="preserve">Peinar el nudo: acomodar los ramales de modo que queden de a pares, paralelos y sin cruzarse. Correr el repaso hasta dejar un chicote de 3 cm a 5 cm.</w:t>
+            </w:r>
+          </w:p>
+        </w:tc>
+      </w:tr>
+      <w:tr>
+        <w:trPr>
+          <w:cantSplit/>
+        </w:trPr>
+        <w:tc>
+          <w:tcPr>
+            <w:tcW w:type="dxa" w:w="900"/>
+            <w:tcBorders>
+              <w:top w:val="single" w:color="A6B4B8" w:sz="4"/>
+              <w:left w:val="single" w:color="A6B4B8" w:sz="4"/>
+              <w:bottom w:val="single" w:color="A6B4B8" w:sz="4"/>
+              <w:right w:val="single" w:color="A6B4B8" w:sz="4"/>
+            </w:tcBorders>
+            <w:tcMar>
+              <w:top w:type="dxa" w:w="50"/>
+              <w:left w:type="dxa" w:w="90"/>
+              <w:bottom w:type="dxa" w:w="50"/>
+              <w:right w:type="dxa" w:w="90"/>
+            </w:tcMar>
+            <w:vAlign w:val="top"/>
+          </w:tcPr>
+          <w:p>
+            <w:pPr>
+              <w:keepNext/>
+              <w:spacing w:after="0" w:line="252"/>
+              <w:jc w:val="center"/>
+            </w:pPr>
+            <w:r>
+              <w:rPr>
+                <w:b w:val="false"/>
+                <w:bCs w:val="false"/>
+                <w:sz w:val="19"/>
+                <w:szCs w:val="19"/>
+              </w:rPr>
+              <w:t xml:space="preserve">5</w:t>
+            </w:r>
+          </w:p>
+        </w:tc>
+        <w:tc>
+          <w:tcPr>
+            <w:tcW w:type="dxa" w:w="8738"/>
+            <w:tcBorders>
+              <w:top w:val="single" w:color="A6B4B8" w:sz="4"/>
+              <w:left w:val="single" w:color="A6B4B8" w:sz="4"/>
+              <w:bottom w:val="single" w:color="A6B4B8" w:sz="4"/>
+              <w:right w:val="single" w:color="A6B4B8" w:sz="4"/>
+            </w:tcBorders>
+            <w:tcMar>
+              <w:top w:type="dxa" w:w="50"/>
+              <w:left w:type="dxa" w:w="90"/>
+              <w:bottom w:type="dxa" w:w="50"/>
+              <w:right w:type="dxa" w:w="90"/>
+            </w:tcMar>
+            <w:vAlign w:val="top"/>
+          </w:tcPr>
+          <w:p>
+            <w:pPr>
+              <w:keepNext/>
+              <w:spacing w:after="0" w:line="252"/>
+              <w:jc w:val="left"/>
+            </w:pPr>
+            <w:r>
+              <w:rPr>
+                <w:b w:val="false"/>
+                <w:bCs w:val="false"/>
+                <w:sz w:val="19"/>
+                <w:szCs w:val="19"/>
+              </w:rPr>
+              <w:t xml:space="preserve">Apretar tirando por separado de los cuatro ramales: los dos del lazo y los dos que salen del lado del firme.</w:t>
+            </w:r>
+          </w:p>
+        </w:tc>
+      </w:tr>
+    </w:tbl>
+    <w:p>
+      <w:pPr>
+        <w:spacing w:after="120" w:before="0"/>
+      </w:pPr>
+    </w:p>
+    <w:p>
+      <w:pPr>
+        <w:keepNext/>
+        <w:spacing w:after="100" w:line="264"/>
+        <w:jc w:val="both"/>
+      </w:pPr>
+      <w:r>
+        <w:rPr>
+          <w:b/>
+          <w:bCs/>
+        </w:rPr>
+        <w:t xml:space="preserve">Tabla 3: Verificación del nudo ocho reconstruido.</w:t>
+      </w:r>
+      <w:r>
+        <w:t xml:space="preserve"> La realiza el operador que lo ató y la repite un segundo operador antes de introducir el robot en el entrehierro:</w:t>
+      </w:r>
+    </w:p>
+    <w:tbl>
+      <w:tblPr>
+        <w:tblW w:type="dxa" w:w="9638"/>
+        <w:tblBorders>
+          <w:top w:val="single" w:color="auto" w:sz="4"/>
+          <w:left w:val="single" w:color="auto" w:sz="4"/>
+          <w:bottom w:val="single" w:color="auto" w:sz="4"/>
+          <w:right w:val="single" w:color="auto" w:sz="4"/>
+          <w:insideH w:val="single" w:color="auto" w:sz="4"/>
+          <w:insideV w:val="single" w:color="auto" w:sz="4"/>
+        </w:tblBorders>
+      </w:tblPr>
+      <w:tblGrid>
+        <w:gridCol w:w="2400"/>
+        <w:gridCol w:w="7238"/>
+      </w:tblGrid>
+      <w:tr>
+        <w:trPr>
+          <w:cantSplit/>
+          <w:tblHeader/>
+        </w:trPr>
+        <w:tc>
+          <w:tcPr>
+            <w:tcW w:type="dxa" w:w="2400"/>
+            <w:tcBorders>
+              <w:top w:val="single" w:color="A6B4B8" w:sz="4"/>
+              <w:left w:val="single" w:color="A6B4B8" w:sz="4"/>
+              <w:bottom w:val="single" w:color="A6B4B8" w:sz="4"/>
+              <w:right w:val="single" w:color="A6B4B8" w:sz="4"/>
+            </w:tcBorders>
+            <w:shd w:fill="DAE0E2" w:val="clear"/>
+            <w:tcMar>
+              <w:top w:type="dxa" w:w="50"/>
+              <w:left w:type="dxa" w:w="90"/>
+              <w:bottom w:type="dxa" w:w="50"/>
+              <w:right w:type="dxa" w:w="90"/>
+            </w:tcMar>
+            <w:vAlign w:val="center"/>
+          </w:tcPr>
+          <w:p>
+            <w:pPr>
+              <w:spacing w:after="0" w:line="252"/>
+              <w:jc w:val="left"/>
+            </w:pPr>
+            <w:r>
+              <w:rPr>
+                <w:b/>
+                <w:bCs/>
+                <w:sz w:val="19"/>
+                <w:szCs w:val="19"/>
+              </w:rPr>
+              <w:t xml:space="preserve">Control</w:t>
+            </w:r>
+          </w:p>
+        </w:tc>
+        <w:tc>
+          <w:tcPr>
+            <w:tcW w:type="dxa" w:w="7238"/>
+            <w:tcBorders>
+              <w:top w:val="single" w:color="A6B4B8" w:sz="4"/>
+              <w:left w:val="single" w:color="A6B4B8" w:sz="4"/>
+              <w:bottom w:val="single" w:color="A6B4B8" w:sz="4"/>
+              <w:right w:val="single" w:color="A6B4B8" w:sz="4"/>
+            </w:tcBorders>
+            <w:shd w:fill="DAE0E2" w:val="clear"/>
+            <w:tcMar>
+              <w:top w:type="dxa" w:w="50"/>
+              <w:left w:type="dxa" w:w="90"/>
+              <w:bottom w:type="dxa" w:w="50"/>
+              <w:right w:type="dxa" w:w="90"/>
+            </w:tcMar>
+            <w:vAlign w:val="center"/>
+          </w:tcPr>
+          <w:p>
+            <w:pPr>
+              <w:spacing w:after="0" w:line="252"/>
+              <w:jc w:val="left"/>
+            </w:pPr>
+            <w:r>
+              <w:rPr>
+                <w:b/>
+                <w:bCs/>
+                <w:sz w:val="19"/>
+                <w:szCs w:val="19"/>
+              </w:rPr>
+              <w:t xml:space="preserve">Criterio de aceptación</w:t>
+            </w:r>
+          </w:p>
+        </w:tc>
+      </w:tr>
+      <w:tr>
+        <w:trPr>
+          <w:cantSplit/>
+        </w:trPr>
+        <w:tc>
+          <w:tcPr>
+            <w:tcW w:type="dxa" w:w="2400"/>
+            <w:tcBorders>
+              <w:top w:val="single" w:color="A6B4B8" w:sz="4"/>
+              <w:left w:val="single" w:color="A6B4B8" w:sz="4"/>
+              <w:bottom w:val="single" w:color="A6B4B8" w:sz="4"/>
+              <w:right w:val="single" w:color="A6B4B8" w:sz="4"/>
+            </w:tcBorders>
+            <w:tcMar>
+              <w:top w:type="dxa" w:w="50"/>
+              <w:left w:type="dxa" w:w="90"/>
+              <w:bottom w:type="dxa" w:w="50"/>
+              <w:right w:type="dxa" w:w="90"/>
+            </w:tcMar>
+            <w:vAlign w:val="top"/>
+          </w:tcPr>
+          <w:p>
+            <w:pPr>
+              <w:spacing w:after="0" w:line="252"/>
+              <w:jc w:val="left"/>
+            </w:pPr>
+            <w:r>
+              <w:rPr>
+                <w:b w:val="false"/>
+                <w:bCs w:val="false"/>
+                <w:sz w:val="19"/>
+                <w:szCs w:val="19"/>
+              </w:rPr>
+              <w:t xml:space="preserve">Figura</w:t>
+            </w:r>
+          </w:p>
+        </w:tc>
+        <w:tc>
+          <w:tcPr>
+            <w:tcW w:type="dxa" w:w="7238"/>
+            <w:tcBorders>
+              <w:top w:val="single" w:color="A6B4B8" w:sz="4"/>
+              <w:left w:val="single" w:color="A6B4B8" w:sz="4"/>
+              <w:bottom w:val="single" w:color="A6B4B8" w:sz="4"/>
+              <w:right w:val="single" w:color="A6B4B8" w:sz="4"/>
+            </w:tcBorders>
+            <w:tcMar>
+              <w:top w:type="dxa" w:w="50"/>
+              <w:left w:type="dxa" w:w="90"/>
+              <w:bottom w:type="dxa" w:w="50"/>
+              <w:right w:type="dxa" w:w="90"/>
+            </w:tcMar>
+            <w:vAlign w:val="top"/>
+          </w:tcPr>
+          <w:p>
+            <w:pPr>
+              <w:spacing w:after="0" w:line="252"/>
+              <w:jc w:val="left"/>
+            </w:pPr>
+            <w:r>
+              <w:rPr>
+                <w:b w:val="false"/>
+                <w:bCs w:val="false"/>
+                <w:sz w:val="19"/>
+                <w:szCs w:val="19"/>
+              </w:rPr>
+              <w:t xml:space="preserve">Se ve un ocho completo, formado en todo su recorrido por pares de cuerdas paralelas.</w:t>
+            </w:r>
+          </w:p>
+        </w:tc>
+      </w:tr>
+      <w:tr>
+        <w:trPr>
+          <w:cantSplit/>
+        </w:trPr>
+        <w:tc>
+          <w:tcPr>
+            <w:tcW w:type="dxa" w:w="2400"/>
+            <w:tcBorders>
+              <w:top w:val="single" w:color="A6B4B8" w:sz="4"/>
+              <w:left w:val="single" w:color="A6B4B8" w:sz="4"/>
+              <w:bottom w:val="single" w:color="A6B4B8" w:sz="4"/>
+              <w:right w:val="single" w:color="A6B4B8" w:sz="4"/>
+            </w:tcBorders>
+            <w:tcMar>
+              <w:top w:type="dxa" w:w="50"/>
+              <w:left w:type="dxa" w:w="90"/>
+              <w:bottom w:type="dxa" w:w="50"/>
+              <w:right w:type="dxa" w:w="90"/>
+            </w:tcMar>
+            <w:vAlign w:val="top"/>
+          </w:tcPr>
+          <w:p>
+            <w:pPr>
+              <w:spacing w:after="0" w:line="252"/>
+              <w:jc w:val="left"/>
+            </w:pPr>
+            <w:r>
+              <w:rPr>
+                <w:b w:val="false"/>
+                <w:bCs w:val="false"/>
+                <w:sz w:val="19"/>
+                <w:szCs w:val="19"/>
+              </w:rPr>
+              <w:t xml:space="preserve">Ramales</w:t>
+            </w:r>
+          </w:p>
+        </w:tc>
+        <w:tc>
+          <w:tcPr>
+            <w:tcW w:type="dxa" w:w="7238"/>
+            <w:tcBorders>
+              <w:top w:val="single" w:color="A6B4B8" w:sz="4"/>
+              <w:left w:val="single" w:color="A6B4B8" w:sz="4"/>
+              <w:bottom w:val="single" w:color="A6B4B8" w:sz="4"/>
+              <w:right w:val="single" w:color="A6B4B8" w:sz="4"/>
+            </w:tcBorders>
+            <w:tcMar>
+              <w:top w:type="dxa" w:w="50"/>
+              <w:left w:type="dxa" w:w="90"/>
+              <w:bottom w:type="dxa" w:w="50"/>
+              <w:right w:type="dxa" w:w="90"/>
+            </w:tcMar>
+            <w:vAlign w:val="top"/>
+          </w:tcPr>
+          <w:p>
+            <w:pPr>
+              <w:spacing w:after="0" w:line="252"/>
+              <w:jc w:val="left"/>
+            </w:pPr>
+            <w:r>
+              <w:rPr>
+                <w:b w:val="false"/>
+                <w:bCs w:val="false"/>
+                <w:sz w:val="19"/>
+                <w:szCs w:val="19"/>
+              </w:rPr>
+              <w:t xml:space="preserve">Los dos ramales de cada par van juntos, sin cruzarse ni montarse uno sobre el otro.</w:t>
+            </w:r>
+          </w:p>
+        </w:tc>
+      </w:tr>
+      <w:tr>
+        <w:trPr>
+          <w:cantSplit/>
+        </w:trPr>
+        <w:tc>
+          <w:tcPr>
+            <w:tcW w:type="dxa" w:w="2400"/>
+            <w:tcBorders>
+              <w:top w:val="single" w:color="A6B4B8" w:sz="4"/>
+              <w:left w:val="single" w:color="A6B4B8" w:sz="4"/>
+              <w:bottom w:val="single" w:color="A6B4B8" w:sz="4"/>
+              <w:right w:val="single" w:color="A6B4B8" w:sz="4"/>
+            </w:tcBorders>
+            <w:tcMar>
+              <w:top w:type="dxa" w:w="50"/>
+              <w:left w:type="dxa" w:w="90"/>
+              <w:bottom w:type="dxa" w:w="50"/>
+              <w:right w:type="dxa" w:w="90"/>
+            </w:tcMar>
+            <w:vAlign w:val="top"/>
+          </w:tcPr>
+          <w:p>
+            <w:pPr>
+              <w:spacing w:after="0" w:line="252"/>
+              <w:jc w:val="left"/>
+            </w:pPr>
+            <w:r>
+              <w:rPr>
+                <w:b w:val="false"/>
+                <w:bCs w:val="false"/>
+                <w:sz w:val="19"/>
+                <w:szCs w:val="19"/>
+              </w:rPr>
+              <w:t xml:space="preserve">Recorrido</w:t>
+            </w:r>
+          </w:p>
+        </w:tc>
+        <w:tc>
+          <w:tcPr>
+            <w:tcW w:type="dxa" w:w="7238"/>
+            <w:tcBorders>
+              <w:top w:val="single" w:color="A6B4B8" w:sz="4"/>
+              <w:left w:val="single" w:color="A6B4B8" w:sz="4"/>
+              <w:bottom w:val="single" w:color="A6B4B8" w:sz="4"/>
+              <w:right w:val="single" w:color="A6B4B8" w:sz="4"/>
+            </w:tcBorders>
+            <w:tcMar>
+              <w:top w:type="dxa" w:w="50"/>
+              <w:left w:type="dxa" w:w="90"/>
+              <w:bottom w:type="dxa" w:w="50"/>
+              <w:right w:type="dxa" w:w="90"/>
+            </w:tcMar>
+            <w:vAlign w:val="top"/>
+          </w:tcPr>
+          <w:p>
+            <w:pPr>
+              <w:spacing w:after="0" w:line="252"/>
+              <w:jc w:val="left"/>
+            </w:pPr>
+            <w:r>
+              <w:rPr>
+                <w:b w:val="false"/>
+                <w:bCs w:val="false"/>
+                <w:sz w:val="19"/>
+                <w:szCs w:val="19"/>
+              </w:rPr>
+              <w:t xml:space="preserve">El lazo pasa por el ojal de amarre del robot y el chicote sale del nudo junto al firme.</w:t>
+            </w:r>
+          </w:p>
+        </w:tc>
+      </w:tr>
+      <w:tr>
+        <w:trPr>
+          <w:cantSplit/>
+        </w:trPr>
+        <w:tc>
+          <w:tcPr>
+            <w:tcW w:type="dxa" w:w="2400"/>
+            <w:tcBorders>
+              <w:top w:val="single" w:color="A6B4B8" w:sz="4"/>
+              <w:left w:val="single" w:color="A6B4B8" w:sz="4"/>
+              <w:bottom w:val="single" w:color="A6B4B8" w:sz="4"/>
+              <w:right w:val="single" w:color="A6B4B8" w:sz="4"/>
+            </w:tcBorders>
+            <w:tcMar>
+              <w:top w:type="dxa" w:w="50"/>
+              <w:left w:type="dxa" w:w="90"/>
+              <w:bottom w:type="dxa" w:w="50"/>
+              <w:right w:type="dxa" w:w="90"/>
+            </w:tcMar>
+            <w:vAlign w:val="top"/>
+          </w:tcPr>
+          <w:p>
+            <w:pPr>
+              <w:spacing w:after="0" w:line="252"/>
+              <w:jc w:val="left"/>
+            </w:pPr>
+            <w:r>
+              <w:rPr>
+                <w:b w:val="false"/>
+                <w:bCs w:val="false"/>
+                <w:sz w:val="19"/>
+                <w:szCs w:val="19"/>
+              </w:rPr>
+              <w:t xml:space="preserve">Apriete</w:t>
+            </w:r>
+          </w:p>
+        </w:tc>
+        <w:tc>
+          <w:tcPr>
+            <w:tcW w:type="dxa" w:w="7238"/>
+            <w:tcBorders>
+              <w:top w:val="single" w:color="A6B4B8" w:sz="4"/>
+              <w:left w:val="single" w:color="A6B4B8" w:sz="4"/>
+              <w:bottom w:val="single" w:color="A6B4B8" w:sz="4"/>
+              <w:right w:val="single" w:color="A6B4B8" w:sz="4"/>
+            </w:tcBorders>
+            <w:tcMar>
+              <w:top w:type="dxa" w:w="50"/>
+              <w:left w:type="dxa" w:w="90"/>
+              <w:bottom w:type="dxa" w:w="50"/>
+              <w:right w:type="dxa" w:w="90"/>
+            </w:tcMar>
+            <w:vAlign w:val="top"/>
+          </w:tcPr>
+          <w:p>
+            <w:pPr>
+              <w:spacing w:after="0" w:line="252"/>
+              <w:jc w:val="left"/>
+            </w:pPr>
+            <w:r>
+              <w:rPr>
+                <w:b w:val="false"/>
+                <w:bCs w:val="false"/>
+                <w:sz w:val="19"/>
+                <w:szCs w:val="19"/>
+              </w:rPr>
+              <w:t xml:space="preserve">El nudo no se deforma ni se corre al tirar con fuerza del firme y del lazo.</w:t>
+            </w:r>
+          </w:p>
+        </w:tc>
+      </w:tr>
+      <w:tr>
+        <w:trPr>
+          <w:cantSplit/>
+        </w:trPr>
+        <w:tc>
+          <w:tcPr>
+            <w:tcW w:type="dxa" w:w="2400"/>
+            <w:tcBorders>
+              <w:top w:val="single" w:color="A6B4B8" w:sz="4"/>
+              <w:left w:val="single" w:color="A6B4B8" w:sz="4"/>
+              <w:bottom w:val="single" w:color="A6B4B8" w:sz="4"/>
+              <w:right w:val="single" w:color="A6B4B8" w:sz="4"/>
+            </w:tcBorders>
+            <w:tcMar>
+              <w:top w:type="dxa" w:w="50"/>
+              <w:left w:type="dxa" w:w="90"/>
+              <w:bottom w:type="dxa" w:w="50"/>
+              <w:right w:type="dxa" w:w="90"/>
+            </w:tcMar>
+            <w:vAlign w:val="top"/>
+          </w:tcPr>
+          <w:p>
+            <w:pPr>
+              <w:spacing w:after="0" w:line="252"/>
+              <w:jc w:val="left"/>
+            </w:pPr>
+            <w:r>
+              <w:rPr>
+                <w:b w:val="false"/>
+                <w:bCs w:val="false"/>
+                <w:sz w:val="19"/>
+                <w:szCs w:val="19"/>
+              </w:rPr>
+              <w:t xml:space="preserve">Chicote</w:t>
+            </w:r>
+          </w:p>
+        </w:tc>
+        <w:tc>
+          <w:tcPr>
+            <w:tcW w:type="dxa" w:w="7238"/>
+            <w:tcBorders>
+              <w:top w:val="single" w:color="A6B4B8" w:sz="4"/>
+              <w:left w:val="single" w:color="A6B4B8" w:sz="4"/>
+              <w:bottom w:val="single" w:color="A6B4B8" w:sz="4"/>
+              <w:right w:val="single" w:color="A6B4B8" w:sz="4"/>
+            </w:tcBorders>
+            <w:tcMar>
+              <w:top w:type="dxa" w:w="50"/>
+              <w:left w:type="dxa" w:w="90"/>
+              <w:bottom w:type="dxa" w:w="50"/>
+              <w:right w:type="dxa" w:w="90"/>
+            </w:tcMar>
+            <w:vAlign w:val="top"/>
+          </w:tcPr>
+          <w:p>
+            <w:pPr>
+              <w:spacing w:after="0" w:line="252"/>
+              <w:jc w:val="left"/>
+            </w:pPr>
+            <w:r>
+              <w:rPr>
+                <w:b w:val="false"/>
+                <w:bCs w:val="false"/>
+                <w:sz w:val="19"/>
+                <w:szCs w:val="19"/>
+              </w:rPr>
+              <w:t xml:space="preserve">Entre 3 cm y 5 cm (unas 10 a 15 veces el diámetro de la cuerda). Más corto puede salirse del nudo; más largo puede engancharse o quedar debajo del robot.</w:t>
+            </w:r>
+          </w:p>
+        </w:tc>
+      </w:tr>
+    </w:tbl>
+    <w:tbl>
+      <w:tblPr>
+        <w:tblW w:type="dxa" w:w="9638"/>
+        <w:tblBorders>
+          <w:top w:val="single" w:color="auto" w:sz="4"/>
+          <w:left w:val="single" w:color="auto" w:sz="4"/>
+          <w:bottom w:val="single" w:color="auto" w:sz="4"/>
+          <w:right w:val="single" w:color="auto" w:sz="4"/>
+          <w:insideH w:val="single" w:color="auto" w:sz="4"/>
+          <w:insideV w:val="single" w:color="auto" w:sz="4"/>
+        </w:tblBorders>
+      </w:tblPr>
+      <w:tblGrid>
+        <w:gridCol w:w="9638"/>
+      </w:tblGrid>
+      <w:tr>
+        <w:tc>
+          <w:tcPr>
+            <w:tcW w:type="dxa" w:w="9638"/>
+            <w:tcBorders>
+              <w:top w:val="single" w:color="6D8289" w:sz="4"/>
+              <w:left w:val="single" w:color="6D8289" w:sz="24"/>
+              <w:bottom w:val="single" w:color="6D8289" w:sz="4"/>
+              <w:right w:val="single" w:color="6D8289" w:sz="4"/>
+            </w:tcBorders>
+            <w:shd w:fill="EEF2F3" w:val="clear"/>
+            <w:tcMar>
+              <w:top w:type="dxa" w:w="80"/>
+              <w:left w:type="dxa" w:w="160"/>
+              <w:bottom w:type="dxa" w:w="80"/>
+              <w:right w:type="dxa" w:w="160"/>
+            </w:tcMar>
+          </w:tcPr>
+          <w:p>
+            <w:pPr>
+              <w:spacing w:after="0" w:line="264"/>
+              <w:jc w:val="both"/>
+            </w:pPr>
+            <w:r>
+              <w:rPr>
+                <w:b/>
+                <w:bCs/>
+                <w:color w:val="6D8289"/>
+              </w:rPr>
+              <w:t xml:space="preserve">Importante: </w:t>
+            </w:r>
+            <w:r>
+              <w:t xml:space="preserve">si algún control no se cumple, desatar el nudo y volver a hacerlo desde el paso 1. Revisar el nudo al inicio de cada jornada y cada vez que la cuerda haya quedado enganchada o haya soportado un tirón.</w:t>
+            </w:r>
+          </w:p>
+        </w:tc>
+      </w:tr>
+    </w:tbl>
     <w:p>
       <w:pPr>
         <w:pStyle w:val="Heading2"/>

</xml_diff>

<commit_message>
Nudo ocho reconstruido en 3D, apéndice EL CID como el protocolo original y firmas
- Figura 2 (EPG001): nudo ocho reconstruido paso a paso renderizado en 3D
  (nudo_ocho_3d.py). La cuerda sigue una curva suave (serie de Fourier), los
  cruces alternan como en la referencia y se verifica sobre la cuerda 3D que es
  el nudo ocho (4 cruces, determinante 5, Alexander t² − 3t + 1).
- EPG002, apartado 2.4: vuelve al desarrollo del protocolo original
  (determinación de la tensión por espira), con ecuaciones tipográficas.
- PREPARÓ: Matias Gaviño en EPG001 y EPG002.

Co-Authored-By: Claude Opus 5.5 <noreply@anthropic.com>
Claude-Session: https://claude.ai/code/session_01Nz5qZw2jp5HghH6VEfj4aK
</commit_message>
<xml_diff>
--- a/procedimientos_gris/00503-00-EPG001 Procedimiento Inspeccion Robotizada GRIS.docx
+++ b/procedimientos_gris/00503-00-EPG001 Procedimiento Inspeccion Robotizada GRIS.docx
@@ -469,7 +469,7 @@
           <w:sz w:val="19"/>
         </w:rPr>
         <w:tab/>
-        <w:t>11</w:t>
+        <w:t>12</w:t>
       </w:r>
     </w:p>
     <w:p>
@@ -491,7 +491,7 @@
           <w:sz w:val="19"/>
         </w:rPr>
         <w:tab/>
-        <w:t>12</w:t>
+        <w:t>13</w:t>
       </w:r>
     </w:p>
     <w:p>
@@ -513,7 +513,7 @@
           <w:sz w:val="19"/>
         </w:rPr>
         <w:tab/>
-        <w:t>13</w:t>
+        <w:t>14</w:t>
       </w:r>
     </w:p>
     <w:p>
@@ -10127,7 +10127,7 @@
                 <w:sz w:val="19"/>
                 <w:szCs w:val="19"/>
               </w:rPr>
-              <w:t xml:space="preserve">Tabla 3</w:t>
+              <w:t xml:space="preserve">Figura 2 / Tabla 3</w:t>
             </w:r>
           </w:p>
         </w:tc>
@@ -10546,7 +10546,80 @@
         <w:t xml:space="preserve">Amarre de las cuerdas de seguridad: nudo ocho reconstruido (paso 27).</w:t>
       </w:r>
       <w:r>
-        <w:t xml:space="preserve"> Las cuerdas de seguridad (3 mm) se atan al punto de amarre del robot con un nudo ocho reconstruido, también llamado ocho por seno reconstituido. Se usa este nudo porque, bien hecho y apretado, no se corre ni se desata con los tirones y las vibraciones del ensayo: al tensarse, los ramales paralelos se aprietan entre sí y el nudo se bloquea. Además es fácil de controlar a simple vista, porque bien hecho siempre muestra la misma figura.</w:t>
+        <w:t xml:space="preserve"> Las cuerdas de seguridad (3 mm) se atan al punto de amarre del robot con un nudo ocho reconstruido, también llamado ocho por seno reconstituido. Se usa este nudo porque, bien hecho y apretado, no se corre ni se desata con los tirones y las vibraciones del ensayo: al tensarse, los ramales paralelos se aprietan entre sí y el nudo se bloquea. Además es fácil de controlar a simple vista, porque bien hecho siempre muestra la misma figura. La Figura 2 muestra la secuencia de atado; en ella el repaso del chicote se ve en otro color para seguir su recorrido.</w:t>
+      </w:r>
+    </w:p>
+    <w:p>
+      <w:pPr>
+        <w:keepNext/>
+        <w:spacing w:after="60" w:before="120"/>
+        <w:jc w:val="center"/>
+      </w:pPr>
+      <w:r>
+        <w:drawing>
+          <wp:inline distT="0" distB="0" distL="0" distR="0">
+            <wp:extent cx="5943600" cy="6315075"/>
+            <wp:effectExtent t="0" r="0" b="0" l="0"/>
+            <wp:docPr id="1" name="nudo_ocho_3d.png" descr="Figura 2: Nudo ocho reconstruido paso a paso (en naranja, el repaso del chicote)" title="Figura 2: Nudo ocho reconstruido paso a paso (en naranja, el repaso del chicote)"/>
+            <wp:cNvGraphicFramePr>
+              <a:graphicFrameLocks xmlns:a="http://schemas.openxmlformats.org/drawingml/2006/main" noChangeAspect="1"/>
+            </wp:cNvGraphicFramePr>
+            <a:graphic xmlns:a="http://schemas.openxmlformats.org/drawingml/2006/main">
+              <a:graphicData uri="http://schemas.openxmlformats.org/drawingml/2006/picture">
+                <pic:pic xmlns:pic="http://schemas.openxmlformats.org/drawingml/2006/picture">
+                  <pic:nvPicPr>
+                    <pic:cNvPr id="0" name="" descr=""/>
+                    <pic:cNvPicPr>
+                      <a:picLocks noChangeAspect="1" noChangeArrowheads="1"/>
+                    </pic:cNvPicPr>
+                  </pic:nvPicPr>
+                  <pic:blipFill>
+                    <a:blip r:embed="rId14" cstate="none"/>
+                    <a:srcRect/>
+                    <a:stretch>
+                      <a:fillRect/>
+                    </a:stretch>
+                  </pic:blipFill>
+                  <pic:spPr bwMode="auto">
+                    <a:xfrm>
+                      <a:off x="0" y="0"/>
+                      <a:ext cx="5943600" cy="6315075"/>
+                    </a:xfrm>
+                    <a:prstGeom prst="rect">
+                      <a:avLst/>
+                    </a:prstGeom>
+                  </pic:spPr>
+                </pic:pic>
+              </a:graphicData>
+            </a:graphic>
+          </wp:inline>
+        </w:drawing>
+      </w:r>
+    </w:p>
+    <w:p>
+      <w:pPr>
+        <w:spacing w:after="200"/>
+        <w:jc w:val="center"/>
+      </w:pPr>
+      <w:r>
+        <w:rPr>
+          <w:i/>
+          <w:iCs/>
+          <w:color w:val="6D8289"/>
+          <w:sz w:val="18"/>
+          <w:szCs w:val="18"/>
+        </w:rPr>
+        <w:t xml:space="preserve">Figura 2: Nudo ocho reconstruido paso a paso (en naranja, el repaso del chicote)</w:t>
+      </w:r>
+    </w:p>
+    <w:p>
+      <w:pPr>
+        <w:keepNext/>
+        <w:spacing w:after="100" w:line="264"/>
+        <w:jc w:val="both"/>
+      </w:pPr>
+      <w:r>
+        <w:t xml:space="preserve">Secuencia de atado:</w:t>
       </w:r>
     </w:p>
     <w:tbl>
@@ -15340,6 +15413,15 @@
               <w:spacing w:after="0" w:line="252"/>
               <w:jc w:val="left"/>
             </w:pPr>
+            <w:r>
+              <w:rPr>
+                <w:b w:val="false"/>
+                <w:bCs w:val="false"/>
+                <w:sz w:val="19"/>
+                <w:szCs w:val="19"/>
+              </w:rPr>
+              <w:t xml:space="preserve">Matias Gaviño</w:t>
+            </w:r>
           </w:p>
         </w:tc>
         <w:tc>

</xml_diff>

<commit_message>
Figura 2: nudo ocho reconstruido con fotos del atado en el robot
- Reemplaza el render 3D por 7 fotos del atado en el punto de amarre del robot,
  giradas 90° y recortadas sobre el nudo, con número de paso y leyenda
  (nudo_ocho_fotos.py; fotos en src/fuentes/fotos_nudo).
- La secuencia de atado del EPG001 pasa a 7 pasos, igual que la figura.

Co-Authored-By: Claude Opus 5.5 <noreply@anthropic.com>
Claude-Session: https://claude.ai/code/session_01Nz5qZw2jp5HghH6VEfj4aK
</commit_message>
<xml_diff>
--- a/procedimientos_gris/00503-00-EPG001 Procedimiento Inspeccion Robotizada GRIS.docx
+++ b/procedimientos_gris/00503-00-EPG001 Procedimiento Inspeccion Robotizada GRIS.docx
@@ -536,7 +536,7 @@
           <w:sz w:val="19"/>
         </w:rPr>
         <w:tab/>
-        <w:t>14</w:t>
+        <w:t>15</w:t>
       </w:r>
       <w:r>
         <w:fldChar w:fldCharType="end"/>
@@ -10546,7 +10546,7 @@
         <w:t xml:space="preserve">Amarre de las cuerdas de seguridad: nudo ocho reconstruido (paso 27).</w:t>
       </w:r>
       <w:r>
-        <w:t xml:space="preserve"> Las cuerdas de seguridad (3 mm) se atan al punto de amarre del robot con un nudo ocho reconstruido, también llamado ocho por seno reconstituido. Se usa este nudo porque, bien hecho y apretado, no se corre ni se desata con los tirones y las vibraciones del ensayo: al tensarse, los ramales paralelos se aprietan entre sí y el nudo se bloquea. Además es fácil de controlar a simple vista, porque bien hecho siempre muestra la misma figura. La Figura 2 muestra la secuencia de atado; en ella el repaso del chicote se ve en otro color para seguir su recorrido.</w:t>
+        <w:t xml:space="preserve"> Las cuerdas de seguridad (3 mm) se atan al punto de amarre del robot con un nudo ocho reconstruido, también llamado ocho por seno reconstituido. Se usa este nudo porque, bien hecho y apretado, no se corre ni se desata con los tirones y las vibraciones del ensayo: al tensarse, los ramales paralelos se aprietan entre sí y el nudo se bloquea. Además es fácil de controlar a simple vista, porque bien hecho siempre muestra la misma figura. La Figura 2 muestra la secuencia de atado en el robot.</w:t>
       </w:r>
     </w:p>
     <w:p>
@@ -10558,9 +10558,9 @@
       <w:r>
         <w:drawing>
           <wp:inline distT="0" distB="0" distL="0" distR="0">
-            <wp:extent cx="5943600" cy="6315075"/>
+            <wp:extent cx="6124575" cy="5743575"/>
             <wp:effectExtent t="0" r="0" b="0" l="0"/>
-            <wp:docPr id="1" name="nudo_ocho_3d.png" descr="Figura 2: Nudo ocho reconstruido paso a paso (en naranja, el repaso del chicote)" title="Figura 2: Nudo ocho reconstruido paso a paso (en naranja, el repaso del chicote)"/>
+            <wp:docPr id="1" name="nudo_ocho.png" descr="Figura 2: Nudo ocho reconstruido paso a paso en el punto de amarre del robot" title="Figura 2: Nudo ocho reconstruido paso a paso en el punto de amarre del robot"/>
             <wp:cNvGraphicFramePr>
               <a:graphicFrameLocks xmlns:a="http://schemas.openxmlformats.org/drawingml/2006/main" noChangeAspect="1"/>
             </wp:cNvGraphicFramePr>
@@ -10583,7 +10583,7 @@
                   <pic:spPr bwMode="auto">
                     <a:xfrm>
                       <a:off x="0" y="0"/>
-                      <a:ext cx="5943600" cy="6315075"/>
+                      <a:ext cx="6124575" cy="5743575"/>
                     </a:xfrm>
                     <a:prstGeom prst="rect">
                       <a:avLst/>
@@ -10609,7 +10609,7 @@
           <w:sz w:val="18"/>
           <w:szCs w:val="18"/>
         </w:rPr>
-        <w:t xml:space="preserve">Figura 2: Nudo ocho reconstruido paso a paso (en naranja, el repaso del chicote)</w:t>
+        <w:t xml:space="preserve">Figura 2: Nudo ocho reconstruido paso a paso en el punto de amarre del robot</w:t>
       </w:r>
     </w:p>
     <w:p>
@@ -10782,7 +10782,7 @@
                 <w:sz w:val="19"/>
                 <w:szCs w:val="19"/>
               </w:rPr>
-              <w:t xml:space="preserve">A unos 30 cm del extremo de la cuerda, hacer un ocho simple flojo, con el chicote (extremo libre) hacia el robot.</w:t>
+              <w:t xml:space="preserve">A unos 30 cm del extremo de la cuerda, formar un seno (bucle) con el chicote (extremo libre).</w:t>
             </w:r>
           </w:p>
         </w:tc>
@@ -10855,7 +10855,7 @@
                 <w:sz w:val="19"/>
                 <w:szCs w:val="19"/>
               </w:rPr>
-              <w:t xml:space="preserve">Pasar el chicote por el ojal de amarre del robot.</w:t>
+              <w:t xml:space="preserve">Rodear el firme (la parte de la cuerda que va al operador) con el chicote.</w:t>
             </w:r>
           </w:p>
         </w:tc>
@@ -10928,7 +10928,7 @@
                 <w:sz w:val="19"/>
                 <w:szCs w:val="19"/>
               </w:rPr>
-              <w:t xml:space="preserve">Repasar el ocho con el chicote: seguir el mismo recorrido de la cuerda, en sentido inverso y siempre paralelo a ella, hasta salir junto al firme (la parte de la cuerda que va al operador).</w:t>
+              <w:t xml:space="preserve">Pasar el chicote por el seno: queda un ocho simple flojo.</w:t>
             </w:r>
           </w:p>
         </w:tc>
@@ -11001,7 +11001,7 @@
                 <w:sz w:val="19"/>
                 <w:szCs w:val="19"/>
               </w:rPr>
-              <w:t xml:space="preserve">Peinar el nudo: acomodar los ramales de modo que queden de a pares, paralelos y sin cruzarse. Correr el repaso hasta dejar un chicote de 3 cm a 5 cm.</w:t>
+              <w:t xml:space="preserve">Pasar el chicote por el ojal de amarre del robot.</w:t>
             </w:r>
           </w:p>
         </w:tc>
@@ -11074,7 +11074,153 @@
                 <w:sz w:val="19"/>
                 <w:szCs w:val="19"/>
               </w:rPr>
-              <w:t xml:space="preserve">Apretar tirando por separado de los cuatro ramales: los dos del lazo y los dos que salen del lado del firme.</w:t>
+              <w:t xml:space="preserve">Repasar el ocho con el chicote: seguir el mismo recorrido de la cuerda, en sentido inverso y siempre paralelo a ella.</w:t>
+            </w:r>
+          </w:p>
+        </w:tc>
+      </w:tr>
+      <w:tr>
+        <w:trPr>
+          <w:cantSplit/>
+        </w:trPr>
+        <w:tc>
+          <w:tcPr>
+            <w:tcW w:type="dxa" w:w="900"/>
+            <w:tcBorders>
+              <w:top w:val="single" w:color="A6B4B8" w:sz="4"/>
+              <w:left w:val="single" w:color="A6B4B8" w:sz="4"/>
+              <w:bottom w:val="single" w:color="A6B4B8" w:sz="4"/>
+              <w:right w:val="single" w:color="A6B4B8" w:sz="4"/>
+            </w:tcBorders>
+            <w:tcMar>
+              <w:top w:type="dxa" w:w="50"/>
+              <w:left w:type="dxa" w:w="90"/>
+              <w:bottom w:type="dxa" w:w="50"/>
+              <w:right w:type="dxa" w:w="90"/>
+            </w:tcMar>
+            <w:vAlign w:val="top"/>
+          </w:tcPr>
+          <w:p>
+            <w:pPr>
+              <w:keepNext/>
+              <w:spacing w:after="0" w:line="252"/>
+              <w:jc w:val="center"/>
+            </w:pPr>
+            <w:r>
+              <w:rPr>
+                <w:b w:val="false"/>
+                <w:bCs w:val="false"/>
+                <w:sz w:val="19"/>
+                <w:szCs w:val="19"/>
+              </w:rPr>
+              <w:t xml:space="preserve">6</w:t>
+            </w:r>
+          </w:p>
+        </w:tc>
+        <w:tc>
+          <w:tcPr>
+            <w:tcW w:type="dxa" w:w="8738"/>
+            <w:tcBorders>
+              <w:top w:val="single" w:color="A6B4B8" w:sz="4"/>
+              <w:left w:val="single" w:color="A6B4B8" w:sz="4"/>
+              <w:bottom w:val="single" w:color="A6B4B8" w:sz="4"/>
+              <w:right w:val="single" w:color="A6B4B8" w:sz="4"/>
+            </w:tcBorders>
+            <w:tcMar>
+              <w:top w:type="dxa" w:w="50"/>
+              <w:left w:type="dxa" w:w="90"/>
+              <w:bottom w:type="dxa" w:w="50"/>
+              <w:right w:type="dxa" w:w="90"/>
+            </w:tcMar>
+            <w:vAlign w:val="top"/>
+          </w:tcPr>
+          <w:p>
+            <w:pPr>
+              <w:keepNext/>
+              <w:spacing w:after="0" w:line="252"/>
+              <w:jc w:val="left"/>
+            </w:pPr>
+            <w:r>
+              <w:rPr>
+                <w:b w:val="false"/>
+                <w:bCs w:val="false"/>
+                <w:sz w:val="19"/>
+                <w:szCs w:val="19"/>
+              </w:rPr>
+              <w:t xml:space="preserve">Completar el repaso hasta que el chicote salga del nudo junto al firme.</w:t>
+            </w:r>
+          </w:p>
+        </w:tc>
+      </w:tr>
+      <w:tr>
+        <w:trPr>
+          <w:cantSplit/>
+        </w:trPr>
+        <w:tc>
+          <w:tcPr>
+            <w:tcW w:type="dxa" w:w="900"/>
+            <w:tcBorders>
+              <w:top w:val="single" w:color="A6B4B8" w:sz="4"/>
+              <w:left w:val="single" w:color="A6B4B8" w:sz="4"/>
+              <w:bottom w:val="single" w:color="A6B4B8" w:sz="4"/>
+              <w:right w:val="single" w:color="A6B4B8" w:sz="4"/>
+            </w:tcBorders>
+            <w:tcMar>
+              <w:top w:type="dxa" w:w="50"/>
+              <w:left w:type="dxa" w:w="90"/>
+              <w:bottom w:type="dxa" w:w="50"/>
+              <w:right w:type="dxa" w:w="90"/>
+            </w:tcMar>
+            <w:vAlign w:val="top"/>
+          </w:tcPr>
+          <w:p>
+            <w:pPr>
+              <w:keepNext/>
+              <w:spacing w:after="0" w:line="252"/>
+              <w:jc w:val="center"/>
+            </w:pPr>
+            <w:r>
+              <w:rPr>
+                <w:b w:val="false"/>
+                <w:bCs w:val="false"/>
+                <w:sz w:val="19"/>
+                <w:szCs w:val="19"/>
+              </w:rPr>
+              <w:t xml:space="preserve">7</w:t>
+            </w:r>
+          </w:p>
+        </w:tc>
+        <w:tc>
+          <w:tcPr>
+            <w:tcW w:type="dxa" w:w="8738"/>
+            <w:tcBorders>
+              <w:top w:val="single" w:color="A6B4B8" w:sz="4"/>
+              <w:left w:val="single" w:color="A6B4B8" w:sz="4"/>
+              <w:bottom w:val="single" w:color="A6B4B8" w:sz="4"/>
+              <w:right w:val="single" w:color="A6B4B8" w:sz="4"/>
+            </w:tcBorders>
+            <w:tcMar>
+              <w:top w:type="dxa" w:w="50"/>
+              <w:left w:type="dxa" w:w="90"/>
+              <w:bottom w:type="dxa" w:w="50"/>
+              <w:right w:type="dxa" w:w="90"/>
+            </w:tcMar>
+            <w:vAlign w:val="top"/>
+          </w:tcPr>
+          <w:p>
+            <w:pPr>
+              <w:keepNext/>
+              <w:spacing w:after="0" w:line="252"/>
+              <w:jc w:val="left"/>
+            </w:pPr>
+            <w:r>
+              <w:rPr>
+                <w:b w:val="false"/>
+                <w:bCs w:val="false"/>
+                <w:sz w:val="19"/>
+                <w:szCs w:val="19"/>
+              </w:rPr>
+              <w:t xml:space="preserve">Peinar el nudo (ramales de a pares, paralelos y sin cruzarse) y apretarlo tirando por separado de los cuatro ramales. Correr el repaso hasta dejar un chicote de 3 cm a 5 cm.</w:t>
             </w:r>
           </w:p>
         </w:tc>

</xml_diff>

<commit_message>
Figura 2: fotos 5 y 6 en el orden correcto y leyendas en lenguaje simple
- Se invierten los pasos 5 y 6.
- Leyendas y secuencia de atado con «punta» (chicote) y «cuerda principal»
  (firme); ambos términos se explican en la figura y en Definiciones.

Co-Authored-By: Claude Opus 5.5 <noreply@anthropic.com>
Claude-Session: https://claude.ai/code/session_01Nz5qZw2jp5HghH6VEfj4aK
</commit_message>
<xml_diff>
--- a/procedimientos_gris/00503-00-EPG001 Procedimiento Inspeccion Robotizada GRIS.docx
+++ b/procedimientos_gris/00503-00-EPG001 Procedimiento Inspeccion Robotizada GRIS.docx
@@ -425,7 +425,7 @@
           <w:sz w:val="19"/>
         </w:rPr>
         <w:tab/>
-        <w:t>7</w:t>
+        <w:t>8</w:t>
       </w:r>
     </w:p>
     <w:p>
@@ -1708,6 +1708,148 @@
                 <w:szCs w:val="19"/>
               </w:rPr>
               <w:t xml:space="preserve">Drive End / Non-Drive End: lado acople / lado opuesto al acople del generador.</w:t>
+            </w:r>
+          </w:p>
+        </w:tc>
+      </w:tr>
+      <w:tr>
+        <w:trPr>
+          <w:cantSplit/>
+        </w:trPr>
+        <w:tc>
+          <w:tcPr>
+            <w:tcW w:type="dxa" w:w="1700"/>
+            <w:tcBorders>
+              <w:top w:val="single" w:color="A6B4B8" w:sz="4"/>
+              <w:left w:val="single" w:color="A6B4B8" w:sz="4"/>
+              <w:bottom w:val="single" w:color="A6B4B8" w:sz="4"/>
+              <w:right w:val="single" w:color="A6B4B8" w:sz="4"/>
+            </w:tcBorders>
+            <w:tcMar>
+              <w:top w:type="dxa" w:w="50"/>
+              <w:left w:type="dxa" w:w="90"/>
+              <w:bottom w:type="dxa" w:w="50"/>
+              <w:right w:type="dxa" w:w="90"/>
+            </w:tcMar>
+            <w:vAlign w:val="top"/>
+          </w:tcPr>
+          <w:p>
+            <w:pPr>
+              <w:spacing w:after="0" w:line="252"/>
+              <w:jc w:val="left"/>
+            </w:pPr>
+            <w:r>
+              <w:rPr>
+                <w:b w:val="false"/>
+                <w:bCs w:val="false"/>
+                <w:sz w:val="19"/>
+                <w:szCs w:val="19"/>
+              </w:rPr>
+              <w:t xml:space="preserve">Chicote (punta)</w:t>
+            </w:r>
+          </w:p>
+        </w:tc>
+        <w:tc>
+          <w:tcPr>
+            <w:tcW w:type="dxa" w:w="7938"/>
+            <w:tcBorders>
+              <w:top w:val="single" w:color="A6B4B8" w:sz="4"/>
+              <w:left w:val="single" w:color="A6B4B8" w:sz="4"/>
+              <w:bottom w:val="single" w:color="A6B4B8" w:sz="4"/>
+              <w:right w:val="single" w:color="A6B4B8" w:sz="4"/>
+            </w:tcBorders>
+            <w:tcMar>
+              <w:top w:type="dxa" w:w="50"/>
+              <w:left w:type="dxa" w:w="90"/>
+              <w:bottom w:type="dxa" w:w="50"/>
+              <w:right w:type="dxa" w:w="90"/>
+            </w:tcMar>
+            <w:vAlign w:val="top"/>
+          </w:tcPr>
+          <w:p>
+            <w:pPr>
+              <w:spacing w:after="0" w:line="252"/>
+              <w:jc w:val="left"/>
+            </w:pPr>
+            <w:r>
+              <w:rPr>
+                <w:b w:val="false"/>
+                <w:bCs w:val="false"/>
+                <w:sz w:val="19"/>
+                <w:szCs w:val="19"/>
+              </w:rPr>
+              <w:t xml:space="preserve">Extremo libre de la cuerda de seguridad, con el que se hace el nudo.</w:t>
+            </w:r>
+          </w:p>
+        </w:tc>
+      </w:tr>
+      <w:tr>
+        <w:trPr>
+          <w:cantSplit/>
+        </w:trPr>
+        <w:tc>
+          <w:tcPr>
+            <w:tcW w:type="dxa" w:w="1700"/>
+            <w:tcBorders>
+              <w:top w:val="single" w:color="A6B4B8" w:sz="4"/>
+              <w:left w:val="single" w:color="A6B4B8" w:sz="4"/>
+              <w:bottom w:val="single" w:color="A6B4B8" w:sz="4"/>
+              <w:right w:val="single" w:color="A6B4B8" w:sz="4"/>
+            </w:tcBorders>
+            <w:tcMar>
+              <w:top w:type="dxa" w:w="50"/>
+              <w:left w:type="dxa" w:w="90"/>
+              <w:bottom w:type="dxa" w:w="50"/>
+              <w:right w:type="dxa" w:w="90"/>
+            </w:tcMar>
+            <w:vAlign w:val="top"/>
+          </w:tcPr>
+          <w:p>
+            <w:pPr>
+              <w:spacing w:after="0" w:line="252"/>
+              <w:jc w:val="left"/>
+            </w:pPr>
+            <w:r>
+              <w:rPr>
+                <w:b w:val="false"/>
+                <w:bCs w:val="false"/>
+                <w:sz w:val="19"/>
+                <w:szCs w:val="19"/>
+              </w:rPr>
+              <w:t xml:space="preserve">Firme (cuerda principal)</w:t>
+            </w:r>
+          </w:p>
+        </w:tc>
+        <w:tc>
+          <w:tcPr>
+            <w:tcW w:type="dxa" w:w="7938"/>
+            <w:tcBorders>
+              <w:top w:val="single" w:color="A6B4B8" w:sz="4"/>
+              <w:left w:val="single" w:color="A6B4B8" w:sz="4"/>
+              <w:bottom w:val="single" w:color="A6B4B8" w:sz="4"/>
+              <w:right w:val="single" w:color="A6B4B8" w:sz="4"/>
+            </w:tcBorders>
+            <w:tcMar>
+              <w:top w:type="dxa" w:w="50"/>
+              <w:left w:type="dxa" w:w="90"/>
+              <w:bottom w:type="dxa" w:w="50"/>
+              <w:right w:type="dxa" w:w="90"/>
+            </w:tcMar>
+            <w:vAlign w:val="top"/>
+          </w:tcPr>
+          <w:p>
+            <w:pPr>
+              <w:spacing w:after="0" w:line="252"/>
+              <w:jc w:val="left"/>
+            </w:pPr>
+            <w:r>
+              <w:rPr>
+                <w:b w:val="false"/>
+                <w:bCs w:val="false"/>
+                <w:sz w:val="19"/>
+                <w:szCs w:val="19"/>
+              </w:rPr>
+              <w:t xml:space="preserve">Parte de la cuerda de seguridad que va desde el nudo hacia el operador.</w:t>
             </w:r>
           </w:p>
         </w:tc>
@@ -10782,7 +10924,7 @@
                 <w:sz w:val="19"/>
                 <w:szCs w:val="19"/>
               </w:rPr>
-              <w:t xml:space="preserve">A unos 30 cm del extremo de la cuerda, formar un seno (bucle) con el chicote (extremo libre).</w:t>
+              <w:t xml:space="preserve">A unos 30 cm de la punta (chicote), hacer un bucle con la cuerda.</w:t>
             </w:r>
           </w:p>
         </w:tc>
@@ -10855,7 +10997,7 @@
                 <w:sz w:val="19"/>
                 <w:szCs w:val="19"/>
               </w:rPr>
-              <w:t xml:space="preserve">Rodear el firme (la parte de la cuerda que va al operador) con el chicote.</w:t>
+              <w:t xml:space="preserve">Dar una vuelta con la punta alrededor de la cuerda principal (firme).</w:t>
             </w:r>
           </w:p>
         </w:tc>
@@ -10928,7 +11070,7 @@
                 <w:sz w:val="19"/>
                 <w:szCs w:val="19"/>
               </w:rPr>
-              <w:t xml:space="preserve">Pasar el chicote por el seno: queda un ocho simple flojo.</w:t>
+              <w:t xml:space="preserve">Pasar la punta por el bucle: queda un ocho simple, flojo.</w:t>
             </w:r>
           </w:p>
         </w:tc>
@@ -11001,7 +11143,7 @@
                 <w:sz w:val="19"/>
                 <w:szCs w:val="19"/>
               </w:rPr>
-              <w:t xml:space="preserve">Pasar el chicote por el ojal de amarre del robot.</w:t>
+              <w:t xml:space="preserve">Pasar la punta por el ojal de amarre del robot.</w:t>
             </w:r>
           </w:p>
         </w:tc>
@@ -11074,7 +11216,7 @@
                 <w:sz w:val="19"/>
                 <w:szCs w:val="19"/>
               </w:rPr>
-              <w:t xml:space="preserve">Repasar el ocho con el chicote: seguir el mismo recorrido de la cuerda, en sentido inverso y siempre paralelo a ella.</w:t>
+              <w:t xml:space="preserve">Volver con la punta por el mismo camino del ocho, en sentido inverso y siempre al lado de la cuerda, sin cruzarla.</w:t>
             </w:r>
           </w:p>
         </w:tc>
@@ -11147,7 +11289,7 @@
                 <w:sz w:val="19"/>
                 <w:szCs w:val="19"/>
               </w:rPr>
-              <w:t xml:space="preserve">Completar el repaso hasta que el chicote salga del nudo junto al firme.</w:t>
+              <w:t xml:space="preserve">Seguir hasta que la punta salga del nudo junto a la cuerda principal: queda un ocho doble.</w:t>
             </w:r>
           </w:p>
         </w:tc>
@@ -11220,7 +11362,7 @@
                 <w:sz w:val="19"/>
                 <w:szCs w:val="19"/>
               </w:rPr>
-              <w:t xml:space="preserve">Peinar el nudo (ramales de a pares, paralelos y sin cruzarse) y apretarlo tirando por separado de los cuatro ramales. Correr el repaso hasta dejar un chicote de 3 cm a 5 cm.</w:t>
+              <w:t xml:space="preserve">Acomodar el nudo (cuerdas de a pares, paralelas y sin cruzarse) y apretarlo tirando por separado de las cuatro puntas. Dejar de 3 cm a 5 cm de punta libre.</w:t>
             </w:r>
           </w:p>
         </w:tc>
@@ -11546,7 +11688,7 @@
                 <w:sz w:val="19"/>
                 <w:szCs w:val="19"/>
               </w:rPr>
-              <w:t xml:space="preserve">El lazo pasa por el ojal de amarre del robot y el chicote sale del nudo junto al firme.</w:t>
+              <w:t xml:space="preserve">El lazo pasa por el ojal de amarre del robot y la punta (chicote) sale del nudo junto a la cuerda principal (firme).</w:t>
             </w:r>
           </w:p>
         </w:tc>
@@ -11617,7 +11759,7 @@
                 <w:sz w:val="19"/>
                 <w:szCs w:val="19"/>
               </w:rPr>
-              <w:t xml:space="preserve">El nudo no se deforma ni se corre al tirar con fuerza del firme y del lazo.</w:t>
+              <w:t xml:space="preserve">El nudo no se deforma ni se corre al tirar con fuerza de la cuerda principal y del lazo.</w:t>
             </w:r>
           </w:p>
         </w:tc>
@@ -11655,7 +11797,7 @@
                 <w:sz w:val="19"/>
                 <w:szCs w:val="19"/>
               </w:rPr>
-              <w:t xml:space="preserve">Chicote</w:t>
+              <w:t xml:space="preserve">Punta libre</w:t>
             </w:r>
           </w:p>
         </w:tc>

</xml_diff>

<commit_message>
Nudo ocho: sin los términos chicote y firme
Se quitan de la figura, de Definiciones y de las tablas; el texto usa
«punta» y «cuerda».

Co-Authored-By: Claude Opus 5.5 <noreply@anthropic.com>
Claude-Session: https://claude.ai/code/session_01Nz5qZw2jp5HghH6VEfj4aK
</commit_message>
<xml_diff>
--- a/procedimientos_gris/00503-00-EPG001 Procedimiento Inspeccion Robotizada GRIS.docx
+++ b/procedimientos_gris/00503-00-EPG001 Procedimiento Inspeccion Robotizada GRIS.docx
@@ -425,7 +425,7 @@
           <w:sz w:val="19"/>
         </w:rPr>
         <w:tab/>
-        <w:t>8</w:t>
+        <w:t>7</w:t>
       </w:r>
     </w:p>
     <w:p>
@@ -1708,148 +1708,6 @@
                 <w:szCs w:val="19"/>
               </w:rPr>
               <w:t xml:space="preserve">Drive End / Non-Drive End: lado acople / lado opuesto al acople del generador.</w:t>
-            </w:r>
-          </w:p>
-        </w:tc>
-      </w:tr>
-      <w:tr>
-        <w:trPr>
-          <w:cantSplit/>
-        </w:trPr>
-        <w:tc>
-          <w:tcPr>
-            <w:tcW w:type="dxa" w:w="1700"/>
-            <w:tcBorders>
-              <w:top w:val="single" w:color="A6B4B8" w:sz="4"/>
-              <w:left w:val="single" w:color="A6B4B8" w:sz="4"/>
-              <w:bottom w:val="single" w:color="A6B4B8" w:sz="4"/>
-              <w:right w:val="single" w:color="A6B4B8" w:sz="4"/>
-            </w:tcBorders>
-            <w:tcMar>
-              <w:top w:type="dxa" w:w="50"/>
-              <w:left w:type="dxa" w:w="90"/>
-              <w:bottom w:type="dxa" w:w="50"/>
-              <w:right w:type="dxa" w:w="90"/>
-            </w:tcMar>
-            <w:vAlign w:val="top"/>
-          </w:tcPr>
-          <w:p>
-            <w:pPr>
-              <w:spacing w:after="0" w:line="252"/>
-              <w:jc w:val="left"/>
-            </w:pPr>
-            <w:r>
-              <w:rPr>
-                <w:b w:val="false"/>
-                <w:bCs w:val="false"/>
-                <w:sz w:val="19"/>
-                <w:szCs w:val="19"/>
-              </w:rPr>
-              <w:t xml:space="preserve">Chicote (punta)</w:t>
-            </w:r>
-          </w:p>
-        </w:tc>
-        <w:tc>
-          <w:tcPr>
-            <w:tcW w:type="dxa" w:w="7938"/>
-            <w:tcBorders>
-              <w:top w:val="single" w:color="A6B4B8" w:sz="4"/>
-              <w:left w:val="single" w:color="A6B4B8" w:sz="4"/>
-              <w:bottom w:val="single" w:color="A6B4B8" w:sz="4"/>
-              <w:right w:val="single" w:color="A6B4B8" w:sz="4"/>
-            </w:tcBorders>
-            <w:tcMar>
-              <w:top w:type="dxa" w:w="50"/>
-              <w:left w:type="dxa" w:w="90"/>
-              <w:bottom w:type="dxa" w:w="50"/>
-              <w:right w:type="dxa" w:w="90"/>
-            </w:tcMar>
-            <w:vAlign w:val="top"/>
-          </w:tcPr>
-          <w:p>
-            <w:pPr>
-              <w:spacing w:after="0" w:line="252"/>
-              <w:jc w:val="left"/>
-            </w:pPr>
-            <w:r>
-              <w:rPr>
-                <w:b w:val="false"/>
-                <w:bCs w:val="false"/>
-                <w:sz w:val="19"/>
-                <w:szCs w:val="19"/>
-              </w:rPr>
-              <w:t xml:space="preserve">Extremo libre de la cuerda de seguridad, con el que se hace el nudo.</w:t>
-            </w:r>
-          </w:p>
-        </w:tc>
-      </w:tr>
-      <w:tr>
-        <w:trPr>
-          <w:cantSplit/>
-        </w:trPr>
-        <w:tc>
-          <w:tcPr>
-            <w:tcW w:type="dxa" w:w="1700"/>
-            <w:tcBorders>
-              <w:top w:val="single" w:color="A6B4B8" w:sz="4"/>
-              <w:left w:val="single" w:color="A6B4B8" w:sz="4"/>
-              <w:bottom w:val="single" w:color="A6B4B8" w:sz="4"/>
-              <w:right w:val="single" w:color="A6B4B8" w:sz="4"/>
-            </w:tcBorders>
-            <w:tcMar>
-              <w:top w:type="dxa" w:w="50"/>
-              <w:left w:type="dxa" w:w="90"/>
-              <w:bottom w:type="dxa" w:w="50"/>
-              <w:right w:type="dxa" w:w="90"/>
-            </w:tcMar>
-            <w:vAlign w:val="top"/>
-          </w:tcPr>
-          <w:p>
-            <w:pPr>
-              <w:spacing w:after="0" w:line="252"/>
-              <w:jc w:val="left"/>
-            </w:pPr>
-            <w:r>
-              <w:rPr>
-                <w:b w:val="false"/>
-                <w:bCs w:val="false"/>
-                <w:sz w:val="19"/>
-                <w:szCs w:val="19"/>
-              </w:rPr>
-              <w:t xml:space="preserve">Firme (cuerda principal)</w:t>
-            </w:r>
-          </w:p>
-        </w:tc>
-        <w:tc>
-          <w:tcPr>
-            <w:tcW w:type="dxa" w:w="7938"/>
-            <w:tcBorders>
-              <w:top w:val="single" w:color="A6B4B8" w:sz="4"/>
-              <w:left w:val="single" w:color="A6B4B8" w:sz="4"/>
-              <w:bottom w:val="single" w:color="A6B4B8" w:sz="4"/>
-              <w:right w:val="single" w:color="A6B4B8" w:sz="4"/>
-            </w:tcBorders>
-            <w:tcMar>
-              <w:top w:type="dxa" w:w="50"/>
-              <w:left w:type="dxa" w:w="90"/>
-              <w:bottom w:type="dxa" w:w="50"/>
-              <w:right w:type="dxa" w:w="90"/>
-            </w:tcMar>
-            <w:vAlign w:val="top"/>
-          </w:tcPr>
-          <w:p>
-            <w:pPr>
-              <w:spacing w:after="0" w:line="252"/>
-              <w:jc w:val="left"/>
-            </w:pPr>
-            <w:r>
-              <w:rPr>
-                <w:b w:val="false"/>
-                <w:bCs w:val="false"/>
-                <w:sz w:val="19"/>
-                <w:szCs w:val="19"/>
-              </w:rPr>
-              <w:t xml:space="preserve">Parte de la cuerda de seguridad que va desde el nudo hacia el operador.</w:t>
             </w:r>
           </w:p>
         </w:tc>
@@ -10924,7 +10782,7 @@
                 <w:sz w:val="19"/>
                 <w:szCs w:val="19"/>
               </w:rPr>
-              <w:t xml:space="preserve">A unos 30 cm de la punta (chicote), hacer un bucle con la cuerda.</w:t>
+              <w:t xml:space="preserve">A unos 30 cm de la punta, hacer un bucle con la cuerda.</w:t>
             </w:r>
           </w:p>
         </w:tc>
@@ -10997,7 +10855,7 @@
                 <w:sz w:val="19"/>
                 <w:szCs w:val="19"/>
               </w:rPr>
-              <w:t xml:space="preserve">Dar una vuelta con la punta alrededor de la cuerda principal (firme).</w:t>
+              <w:t xml:space="preserve">Dar una vuelta con la punta alrededor de la cuerda.</w:t>
             </w:r>
           </w:p>
         </w:tc>
@@ -11289,7 +11147,7 @@
                 <w:sz w:val="19"/>
                 <w:szCs w:val="19"/>
               </w:rPr>
-              <w:t xml:space="preserve">Seguir hasta que la punta salga del nudo junto a la cuerda principal: queda un ocho doble.</w:t>
+              <w:t xml:space="preserve">Seguir hasta que la punta salga del nudo junto a la cuerda: queda un ocho doble.</w:t>
             </w:r>
           </w:p>
         </w:tc>
@@ -11688,7 +11546,7 @@
                 <w:sz w:val="19"/>
                 <w:szCs w:val="19"/>
               </w:rPr>
-              <w:t xml:space="preserve">El lazo pasa por el ojal de amarre del robot y la punta (chicote) sale del nudo junto a la cuerda principal (firme).</w:t>
+              <w:t xml:space="preserve">El lazo pasa por el ojal de amarre del robot y la punta sale del nudo junto a la cuerda.</w:t>
             </w:r>
           </w:p>
         </w:tc>
@@ -11759,7 +11617,7 @@
                 <w:sz w:val="19"/>
                 <w:szCs w:val="19"/>
               </w:rPr>
-              <w:t xml:space="preserve">El nudo no se deforma ni se corre al tirar con fuerza de la cuerda principal y del lazo.</w:t>
+              <w:t xml:space="preserve">El nudo no se deforma ni se corre al tirar con fuerza de la cuerda y del lazo.</w:t>
             </w:r>
           </w:p>
         </w:tc>

</xml_diff>

<commit_message>
EPG001: apartado 2.8.1 para el amarre de las cuerdas y «cable del robot»
- El nudo ocho pasa a un apartado propio (2.8.1) con texto breve; se quita la
  tabla de secuencia de atado, que repetía la Figura 2.
- Figura 1 y paso 26: «cable del robot» en lugar de «arnés del robot».

Co-Authored-By: Claude Opus 5.5 <noreply@anthropic.com>
Claude-Session: https://claude.ai/code/session_01Nz5qZw2jp5HghH6VEfj4aK
</commit_message>
<xml_diff>
--- a/procedimientos_gris/00503-00-EPG001 Procedimiento Inspeccion Robotizada GRIS.docx
+++ b/procedimientos_gris/00503-00-EPG001 Procedimiento Inspeccion Robotizada GRIS.docx
@@ -491,7 +491,7 @@
           <w:sz w:val="19"/>
         </w:rPr>
         <w:tab/>
-        <w:t>13</w:t>
+        <w:t>12</w:t>
       </w:r>
     </w:p>
     <w:p>
@@ -536,7 +536,7 @@
           <w:sz w:val="19"/>
         </w:rPr>
         <w:tab/>
-        <w:t>15</w:t>
+        <w:t>14</w:t>
       </w:r>
       <w:r>
         <w:fldChar w:fldCharType="end"/>
@@ -9990,7 +9990,7 @@
                 <w:sz w:val="19"/>
                 <w:szCs w:val="19"/>
               </w:rPr>
-              <w:t xml:space="preserve">Realizar las conexiones de la Figura 1: arnés del robot al control box (cable principal) y al tablero EL CID (señal del captor); control box al tablero EL CID (señal de posición); PC GRIS al control box (USB y Ethernet); PC EL CID al tablero EL CID (USB); tablero de excitación (Variac, cable de excitación, espira auxiliar y salida al tablero EL CID) y alimentaciones desde la red (regleta de enchufes), respetando el esquema de puesta a tierra.</w:t>
+              <w:t xml:space="preserve">Realizar las conexiones de la Figura 1: cable del robot al control box (conector principal) y al tablero EL CID (señal del captor); control box al tablero EL CID (señal de posición); PC GRIS al control box (USB y Ethernet); PC EL CID al tablero EL CID (USB); tablero de excitación (Variac, cable de excitación, espira auxiliar y salida al tablero EL CID) y alimentaciones desde la red (regleta de enchufes), respetando el esquema de puesta a tierra.</w:t>
             </w:r>
           </w:p>
         </w:tc>
@@ -10534,19 +10534,22 @@
     </w:p>
     <w:p>
       <w:pPr>
+        <w:pStyle w:val="Heading3"/>
+        <w:keepNext/>
+        <w:spacing w:after="80" w:before="160"/>
+      </w:pPr>
+      <w:r>
+        <w:t xml:space="preserve">2.8.1 Amarre de las cuerdas de seguridad</w:t>
+      </w:r>
+    </w:p>
+    <w:p>
+      <w:pPr>
         <w:keepNext/>
         <w:spacing w:after="100" w:line="264"/>
         <w:jc w:val="both"/>
       </w:pPr>
       <w:r>
-        <w:rPr>
-          <w:b/>
-          <w:bCs/>
-        </w:rPr>
-        <w:t xml:space="preserve">Amarre de las cuerdas de seguridad: nudo ocho reconstruido (paso 27).</w:t>
-      </w:r>
-      <w:r>
-        <w:t xml:space="preserve"> Las cuerdas de seguridad (3 mm) se atan al punto de amarre del robot con un nudo ocho reconstruido, también llamado ocho por seno reconstituido. Se usa este nudo porque, bien hecho y apretado, no se corre ni se desata con los tirones y las vibraciones del ensayo: al tensarse, los ramales paralelos se aprietan entre sí y el nudo se bloquea. Además es fácil de controlar a simple vista, porque bien hecho siempre muestra la misma figura. La Figura 2 muestra la secuencia de atado en el robot.</w:t>
+        <w:t xml:space="preserve">Las cuerdas de seguridad (3 mm) se atan al ojal del robot con un nudo ocho reconstruido (paso 27), que no se corre ni se desata con los tirones ni con las vibraciones del ensayo. Se ata según la Figura 2 y se verifica con la Tabla 3.</w:t>
       </w:r>
     </w:p>
     <w:p>
@@ -10560,7 +10563,7 @@
           <wp:inline distT="0" distB="0" distL="0" distR="0">
             <wp:extent cx="6124575" cy="5743575"/>
             <wp:effectExtent t="0" r="0" b="0" l="0"/>
-            <wp:docPr id="1" name="nudo_ocho.png" descr="Figura 2: Nudo ocho reconstruido paso a paso en el punto de amarre del robot" title="Figura 2: Nudo ocho reconstruido paso a paso en el punto de amarre del robot"/>
+            <wp:docPr id="1" name="nudo_ocho.png" descr="Figura 2: Nudo ocho reconstruido paso a paso en el ojal del robot" title="Figura 2: Nudo ocho reconstruido paso a paso en el ojal del robot"/>
             <wp:cNvGraphicFramePr>
               <a:graphicFrameLocks xmlns:a="http://schemas.openxmlformats.org/drawingml/2006/main" noChangeAspect="1"/>
             </wp:cNvGraphicFramePr>
@@ -10609,627 +10612,8 @@
           <w:sz w:val="18"/>
           <w:szCs w:val="18"/>
         </w:rPr>
-        <w:t xml:space="preserve">Figura 2: Nudo ocho reconstruido paso a paso en el punto de amarre del robot</w:t>
+        <w:t xml:space="preserve">Figura 2: Nudo ocho reconstruido paso a paso en el ojal del robot</w:t>
       </w:r>
-    </w:p>
-    <w:p>
-      <w:pPr>
-        <w:keepNext/>
-        <w:spacing w:after="100" w:line="264"/>
-        <w:jc w:val="both"/>
-      </w:pPr>
-      <w:r>
-        <w:t xml:space="preserve">Secuencia de atado:</w:t>
-      </w:r>
-    </w:p>
-    <w:tbl>
-      <w:tblPr>
-        <w:tblW w:type="dxa" w:w="9638"/>
-        <w:tblBorders>
-          <w:top w:val="single" w:color="auto" w:sz="4"/>
-          <w:left w:val="single" w:color="auto" w:sz="4"/>
-          <w:bottom w:val="single" w:color="auto" w:sz="4"/>
-          <w:right w:val="single" w:color="auto" w:sz="4"/>
-          <w:insideH w:val="single" w:color="auto" w:sz="4"/>
-          <w:insideV w:val="single" w:color="auto" w:sz="4"/>
-        </w:tblBorders>
-      </w:tblPr>
-      <w:tblGrid>
-        <w:gridCol w:w="900"/>
-        <w:gridCol w:w="8738"/>
-      </w:tblGrid>
-      <w:tr>
-        <w:trPr>
-          <w:cantSplit/>
-          <w:tblHeader/>
-        </w:trPr>
-        <w:tc>
-          <w:tcPr>
-            <w:tcW w:type="dxa" w:w="900"/>
-            <w:tcBorders>
-              <w:top w:val="single" w:color="A6B4B8" w:sz="4"/>
-              <w:left w:val="single" w:color="A6B4B8" w:sz="4"/>
-              <w:bottom w:val="single" w:color="A6B4B8" w:sz="4"/>
-              <w:right w:val="single" w:color="A6B4B8" w:sz="4"/>
-            </w:tcBorders>
-            <w:shd w:fill="DAE0E2" w:val="clear"/>
-            <w:tcMar>
-              <w:top w:type="dxa" w:w="50"/>
-              <w:left w:type="dxa" w:w="90"/>
-              <w:bottom w:type="dxa" w:w="50"/>
-              <w:right w:type="dxa" w:w="90"/>
-            </w:tcMar>
-            <w:vAlign w:val="center"/>
-          </w:tcPr>
-          <w:p>
-            <w:pPr>
-              <w:keepNext/>
-              <w:spacing w:after="0" w:line="252"/>
-              <w:jc w:val="left"/>
-            </w:pPr>
-            <w:r>
-              <w:rPr>
-                <w:b/>
-                <w:bCs/>
-                <w:sz w:val="19"/>
-                <w:szCs w:val="19"/>
-              </w:rPr>
-              <w:t xml:space="preserve">Paso</w:t>
-            </w:r>
-          </w:p>
-        </w:tc>
-        <w:tc>
-          <w:tcPr>
-            <w:tcW w:type="dxa" w:w="8738"/>
-            <w:tcBorders>
-              <w:top w:val="single" w:color="A6B4B8" w:sz="4"/>
-              <w:left w:val="single" w:color="A6B4B8" w:sz="4"/>
-              <w:bottom w:val="single" w:color="A6B4B8" w:sz="4"/>
-              <w:right w:val="single" w:color="A6B4B8" w:sz="4"/>
-            </w:tcBorders>
-            <w:shd w:fill="DAE0E2" w:val="clear"/>
-            <w:tcMar>
-              <w:top w:type="dxa" w:w="50"/>
-              <w:left w:type="dxa" w:w="90"/>
-              <w:bottom w:type="dxa" w:w="50"/>
-              <w:right w:type="dxa" w:w="90"/>
-            </w:tcMar>
-            <w:vAlign w:val="center"/>
-          </w:tcPr>
-          <w:p>
-            <w:pPr>
-              <w:keepNext/>
-              <w:spacing w:after="0" w:line="252"/>
-              <w:jc w:val="left"/>
-            </w:pPr>
-            <w:r>
-              <w:rPr>
-                <w:b/>
-                <w:bCs/>
-                <w:sz w:val="19"/>
-                <w:szCs w:val="19"/>
-              </w:rPr>
-              <w:t xml:space="preserve">Acción</w:t>
-            </w:r>
-          </w:p>
-        </w:tc>
-      </w:tr>
-      <w:tr>
-        <w:trPr>
-          <w:cantSplit/>
-        </w:trPr>
-        <w:tc>
-          <w:tcPr>
-            <w:tcW w:type="dxa" w:w="900"/>
-            <w:tcBorders>
-              <w:top w:val="single" w:color="A6B4B8" w:sz="4"/>
-              <w:left w:val="single" w:color="A6B4B8" w:sz="4"/>
-              <w:bottom w:val="single" w:color="A6B4B8" w:sz="4"/>
-              <w:right w:val="single" w:color="A6B4B8" w:sz="4"/>
-            </w:tcBorders>
-            <w:tcMar>
-              <w:top w:type="dxa" w:w="50"/>
-              <w:left w:type="dxa" w:w="90"/>
-              <w:bottom w:type="dxa" w:w="50"/>
-              <w:right w:type="dxa" w:w="90"/>
-            </w:tcMar>
-            <w:vAlign w:val="top"/>
-          </w:tcPr>
-          <w:p>
-            <w:pPr>
-              <w:keepNext/>
-              <w:spacing w:after="0" w:line="252"/>
-              <w:jc w:val="center"/>
-            </w:pPr>
-            <w:r>
-              <w:rPr>
-                <w:b w:val="false"/>
-                <w:bCs w:val="false"/>
-                <w:sz w:val="19"/>
-                <w:szCs w:val="19"/>
-              </w:rPr>
-              <w:t xml:space="preserve">1</w:t>
-            </w:r>
-          </w:p>
-        </w:tc>
-        <w:tc>
-          <w:tcPr>
-            <w:tcW w:type="dxa" w:w="8738"/>
-            <w:tcBorders>
-              <w:top w:val="single" w:color="A6B4B8" w:sz="4"/>
-              <w:left w:val="single" w:color="A6B4B8" w:sz="4"/>
-              <w:bottom w:val="single" w:color="A6B4B8" w:sz="4"/>
-              <w:right w:val="single" w:color="A6B4B8" w:sz="4"/>
-            </w:tcBorders>
-            <w:tcMar>
-              <w:top w:type="dxa" w:w="50"/>
-              <w:left w:type="dxa" w:w="90"/>
-              <w:bottom w:type="dxa" w:w="50"/>
-              <w:right w:type="dxa" w:w="90"/>
-            </w:tcMar>
-            <w:vAlign w:val="top"/>
-          </w:tcPr>
-          <w:p>
-            <w:pPr>
-              <w:keepNext/>
-              <w:spacing w:after="0" w:line="252"/>
-              <w:jc w:val="left"/>
-            </w:pPr>
-            <w:r>
-              <w:rPr>
-                <w:b w:val="false"/>
-                <w:bCs w:val="false"/>
-                <w:sz w:val="19"/>
-                <w:szCs w:val="19"/>
-              </w:rPr>
-              <w:t xml:space="preserve">A unos 30 cm de la punta, hacer un bucle con la cuerda.</w:t>
-            </w:r>
-          </w:p>
-        </w:tc>
-      </w:tr>
-      <w:tr>
-        <w:trPr>
-          <w:cantSplit/>
-        </w:trPr>
-        <w:tc>
-          <w:tcPr>
-            <w:tcW w:type="dxa" w:w="900"/>
-            <w:tcBorders>
-              <w:top w:val="single" w:color="A6B4B8" w:sz="4"/>
-              <w:left w:val="single" w:color="A6B4B8" w:sz="4"/>
-              <w:bottom w:val="single" w:color="A6B4B8" w:sz="4"/>
-              <w:right w:val="single" w:color="A6B4B8" w:sz="4"/>
-            </w:tcBorders>
-            <w:tcMar>
-              <w:top w:type="dxa" w:w="50"/>
-              <w:left w:type="dxa" w:w="90"/>
-              <w:bottom w:type="dxa" w:w="50"/>
-              <w:right w:type="dxa" w:w="90"/>
-            </w:tcMar>
-            <w:vAlign w:val="top"/>
-          </w:tcPr>
-          <w:p>
-            <w:pPr>
-              <w:keepNext/>
-              <w:spacing w:after="0" w:line="252"/>
-              <w:jc w:val="center"/>
-            </w:pPr>
-            <w:r>
-              <w:rPr>
-                <w:b w:val="false"/>
-                <w:bCs w:val="false"/>
-                <w:sz w:val="19"/>
-                <w:szCs w:val="19"/>
-              </w:rPr>
-              <w:t xml:space="preserve">2</w:t>
-            </w:r>
-          </w:p>
-        </w:tc>
-        <w:tc>
-          <w:tcPr>
-            <w:tcW w:type="dxa" w:w="8738"/>
-            <w:tcBorders>
-              <w:top w:val="single" w:color="A6B4B8" w:sz="4"/>
-              <w:left w:val="single" w:color="A6B4B8" w:sz="4"/>
-              <w:bottom w:val="single" w:color="A6B4B8" w:sz="4"/>
-              <w:right w:val="single" w:color="A6B4B8" w:sz="4"/>
-            </w:tcBorders>
-            <w:tcMar>
-              <w:top w:type="dxa" w:w="50"/>
-              <w:left w:type="dxa" w:w="90"/>
-              <w:bottom w:type="dxa" w:w="50"/>
-              <w:right w:type="dxa" w:w="90"/>
-            </w:tcMar>
-            <w:vAlign w:val="top"/>
-          </w:tcPr>
-          <w:p>
-            <w:pPr>
-              <w:keepNext/>
-              <w:spacing w:after="0" w:line="252"/>
-              <w:jc w:val="left"/>
-            </w:pPr>
-            <w:r>
-              <w:rPr>
-                <w:b w:val="false"/>
-                <w:bCs w:val="false"/>
-                <w:sz w:val="19"/>
-                <w:szCs w:val="19"/>
-              </w:rPr>
-              <w:t xml:space="preserve">Dar una vuelta con la punta alrededor de la cuerda.</w:t>
-            </w:r>
-          </w:p>
-        </w:tc>
-      </w:tr>
-      <w:tr>
-        <w:trPr>
-          <w:cantSplit/>
-        </w:trPr>
-        <w:tc>
-          <w:tcPr>
-            <w:tcW w:type="dxa" w:w="900"/>
-            <w:tcBorders>
-              <w:top w:val="single" w:color="A6B4B8" w:sz="4"/>
-              <w:left w:val="single" w:color="A6B4B8" w:sz="4"/>
-              <w:bottom w:val="single" w:color="A6B4B8" w:sz="4"/>
-              <w:right w:val="single" w:color="A6B4B8" w:sz="4"/>
-            </w:tcBorders>
-            <w:tcMar>
-              <w:top w:type="dxa" w:w="50"/>
-              <w:left w:type="dxa" w:w="90"/>
-              <w:bottom w:type="dxa" w:w="50"/>
-              <w:right w:type="dxa" w:w="90"/>
-            </w:tcMar>
-            <w:vAlign w:val="top"/>
-          </w:tcPr>
-          <w:p>
-            <w:pPr>
-              <w:keepNext/>
-              <w:spacing w:after="0" w:line="252"/>
-              <w:jc w:val="center"/>
-            </w:pPr>
-            <w:r>
-              <w:rPr>
-                <w:b w:val="false"/>
-                <w:bCs w:val="false"/>
-                <w:sz w:val="19"/>
-                <w:szCs w:val="19"/>
-              </w:rPr>
-              <w:t xml:space="preserve">3</w:t>
-            </w:r>
-          </w:p>
-        </w:tc>
-        <w:tc>
-          <w:tcPr>
-            <w:tcW w:type="dxa" w:w="8738"/>
-            <w:tcBorders>
-              <w:top w:val="single" w:color="A6B4B8" w:sz="4"/>
-              <w:left w:val="single" w:color="A6B4B8" w:sz="4"/>
-              <w:bottom w:val="single" w:color="A6B4B8" w:sz="4"/>
-              <w:right w:val="single" w:color="A6B4B8" w:sz="4"/>
-            </w:tcBorders>
-            <w:tcMar>
-              <w:top w:type="dxa" w:w="50"/>
-              <w:left w:type="dxa" w:w="90"/>
-              <w:bottom w:type="dxa" w:w="50"/>
-              <w:right w:type="dxa" w:w="90"/>
-            </w:tcMar>
-            <w:vAlign w:val="top"/>
-          </w:tcPr>
-          <w:p>
-            <w:pPr>
-              <w:keepNext/>
-              <w:spacing w:after="0" w:line="252"/>
-              <w:jc w:val="left"/>
-            </w:pPr>
-            <w:r>
-              <w:rPr>
-                <w:b w:val="false"/>
-                <w:bCs w:val="false"/>
-                <w:sz w:val="19"/>
-                <w:szCs w:val="19"/>
-              </w:rPr>
-              <w:t xml:space="preserve">Pasar la punta por el bucle: queda un ocho simple, flojo.</w:t>
-            </w:r>
-          </w:p>
-        </w:tc>
-      </w:tr>
-      <w:tr>
-        <w:trPr>
-          <w:cantSplit/>
-        </w:trPr>
-        <w:tc>
-          <w:tcPr>
-            <w:tcW w:type="dxa" w:w="900"/>
-            <w:tcBorders>
-              <w:top w:val="single" w:color="A6B4B8" w:sz="4"/>
-              <w:left w:val="single" w:color="A6B4B8" w:sz="4"/>
-              <w:bottom w:val="single" w:color="A6B4B8" w:sz="4"/>
-              <w:right w:val="single" w:color="A6B4B8" w:sz="4"/>
-            </w:tcBorders>
-            <w:tcMar>
-              <w:top w:type="dxa" w:w="50"/>
-              <w:left w:type="dxa" w:w="90"/>
-              <w:bottom w:type="dxa" w:w="50"/>
-              <w:right w:type="dxa" w:w="90"/>
-            </w:tcMar>
-            <w:vAlign w:val="top"/>
-          </w:tcPr>
-          <w:p>
-            <w:pPr>
-              <w:keepNext/>
-              <w:spacing w:after="0" w:line="252"/>
-              <w:jc w:val="center"/>
-            </w:pPr>
-            <w:r>
-              <w:rPr>
-                <w:b w:val="false"/>
-                <w:bCs w:val="false"/>
-                <w:sz w:val="19"/>
-                <w:szCs w:val="19"/>
-              </w:rPr>
-              <w:t xml:space="preserve">4</w:t>
-            </w:r>
-          </w:p>
-        </w:tc>
-        <w:tc>
-          <w:tcPr>
-            <w:tcW w:type="dxa" w:w="8738"/>
-            <w:tcBorders>
-              <w:top w:val="single" w:color="A6B4B8" w:sz="4"/>
-              <w:left w:val="single" w:color="A6B4B8" w:sz="4"/>
-              <w:bottom w:val="single" w:color="A6B4B8" w:sz="4"/>
-              <w:right w:val="single" w:color="A6B4B8" w:sz="4"/>
-            </w:tcBorders>
-            <w:tcMar>
-              <w:top w:type="dxa" w:w="50"/>
-              <w:left w:type="dxa" w:w="90"/>
-              <w:bottom w:type="dxa" w:w="50"/>
-              <w:right w:type="dxa" w:w="90"/>
-            </w:tcMar>
-            <w:vAlign w:val="top"/>
-          </w:tcPr>
-          <w:p>
-            <w:pPr>
-              <w:keepNext/>
-              <w:spacing w:after="0" w:line="252"/>
-              <w:jc w:val="left"/>
-            </w:pPr>
-            <w:r>
-              <w:rPr>
-                <w:b w:val="false"/>
-                <w:bCs w:val="false"/>
-                <w:sz w:val="19"/>
-                <w:szCs w:val="19"/>
-              </w:rPr>
-              <w:t xml:space="preserve">Pasar la punta por el ojal de amarre del robot.</w:t>
-            </w:r>
-          </w:p>
-        </w:tc>
-      </w:tr>
-      <w:tr>
-        <w:trPr>
-          <w:cantSplit/>
-        </w:trPr>
-        <w:tc>
-          <w:tcPr>
-            <w:tcW w:type="dxa" w:w="900"/>
-            <w:tcBorders>
-              <w:top w:val="single" w:color="A6B4B8" w:sz="4"/>
-              <w:left w:val="single" w:color="A6B4B8" w:sz="4"/>
-              <w:bottom w:val="single" w:color="A6B4B8" w:sz="4"/>
-              <w:right w:val="single" w:color="A6B4B8" w:sz="4"/>
-            </w:tcBorders>
-            <w:tcMar>
-              <w:top w:type="dxa" w:w="50"/>
-              <w:left w:type="dxa" w:w="90"/>
-              <w:bottom w:type="dxa" w:w="50"/>
-              <w:right w:type="dxa" w:w="90"/>
-            </w:tcMar>
-            <w:vAlign w:val="top"/>
-          </w:tcPr>
-          <w:p>
-            <w:pPr>
-              <w:keepNext/>
-              <w:spacing w:after="0" w:line="252"/>
-              <w:jc w:val="center"/>
-            </w:pPr>
-            <w:r>
-              <w:rPr>
-                <w:b w:val="false"/>
-                <w:bCs w:val="false"/>
-                <w:sz w:val="19"/>
-                <w:szCs w:val="19"/>
-              </w:rPr>
-              <w:t xml:space="preserve">5</w:t>
-            </w:r>
-          </w:p>
-        </w:tc>
-        <w:tc>
-          <w:tcPr>
-            <w:tcW w:type="dxa" w:w="8738"/>
-            <w:tcBorders>
-              <w:top w:val="single" w:color="A6B4B8" w:sz="4"/>
-              <w:left w:val="single" w:color="A6B4B8" w:sz="4"/>
-              <w:bottom w:val="single" w:color="A6B4B8" w:sz="4"/>
-              <w:right w:val="single" w:color="A6B4B8" w:sz="4"/>
-            </w:tcBorders>
-            <w:tcMar>
-              <w:top w:type="dxa" w:w="50"/>
-              <w:left w:type="dxa" w:w="90"/>
-              <w:bottom w:type="dxa" w:w="50"/>
-              <w:right w:type="dxa" w:w="90"/>
-            </w:tcMar>
-            <w:vAlign w:val="top"/>
-          </w:tcPr>
-          <w:p>
-            <w:pPr>
-              <w:keepNext/>
-              <w:spacing w:after="0" w:line="252"/>
-              <w:jc w:val="left"/>
-            </w:pPr>
-            <w:r>
-              <w:rPr>
-                <w:b w:val="false"/>
-                <w:bCs w:val="false"/>
-                <w:sz w:val="19"/>
-                <w:szCs w:val="19"/>
-              </w:rPr>
-              <w:t xml:space="preserve">Volver con la punta por el mismo camino del ocho, en sentido inverso y siempre al lado de la cuerda, sin cruzarla.</w:t>
-            </w:r>
-          </w:p>
-        </w:tc>
-      </w:tr>
-      <w:tr>
-        <w:trPr>
-          <w:cantSplit/>
-        </w:trPr>
-        <w:tc>
-          <w:tcPr>
-            <w:tcW w:type="dxa" w:w="900"/>
-            <w:tcBorders>
-              <w:top w:val="single" w:color="A6B4B8" w:sz="4"/>
-              <w:left w:val="single" w:color="A6B4B8" w:sz="4"/>
-              <w:bottom w:val="single" w:color="A6B4B8" w:sz="4"/>
-              <w:right w:val="single" w:color="A6B4B8" w:sz="4"/>
-            </w:tcBorders>
-            <w:tcMar>
-              <w:top w:type="dxa" w:w="50"/>
-              <w:left w:type="dxa" w:w="90"/>
-              <w:bottom w:type="dxa" w:w="50"/>
-              <w:right w:type="dxa" w:w="90"/>
-            </w:tcMar>
-            <w:vAlign w:val="top"/>
-          </w:tcPr>
-          <w:p>
-            <w:pPr>
-              <w:keepNext/>
-              <w:spacing w:after="0" w:line="252"/>
-              <w:jc w:val="center"/>
-            </w:pPr>
-            <w:r>
-              <w:rPr>
-                <w:b w:val="false"/>
-                <w:bCs w:val="false"/>
-                <w:sz w:val="19"/>
-                <w:szCs w:val="19"/>
-              </w:rPr>
-              <w:t xml:space="preserve">6</w:t>
-            </w:r>
-          </w:p>
-        </w:tc>
-        <w:tc>
-          <w:tcPr>
-            <w:tcW w:type="dxa" w:w="8738"/>
-            <w:tcBorders>
-              <w:top w:val="single" w:color="A6B4B8" w:sz="4"/>
-              <w:left w:val="single" w:color="A6B4B8" w:sz="4"/>
-              <w:bottom w:val="single" w:color="A6B4B8" w:sz="4"/>
-              <w:right w:val="single" w:color="A6B4B8" w:sz="4"/>
-            </w:tcBorders>
-            <w:tcMar>
-              <w:top w:type="dxa" w:w="50"/>
-              <w:left w:type="dxa" w:w="90"/>
-              <w:bottom w:type="dxa" w:w="50"/>
-              <w:right w:type="dxa" w:w="90"/>
-            </w:tcMar>
-            <w:vAlign w:val="top"/>
-          </w:tcPr>
-          <w:p>
-            <w:pPr>
-              <w:keepNext/>
-              <w:spacing w:after="0" w:line="252"/>
-              <w:jc w:val="left"/>
-            </w:pPr>
-            <w:r>
-              <w:rPr>
-                <w:b w:val="false"/>
-                <w:bCs w:val="false"/>
-                <w:sz w:val="19"/>
-                <w:szCs w:val="19"/>
-              </w:rPr>
-              <w:t xml:space="preserve">Seguir hasta que la punta salga del nudo junto a la cuerda: queda un ocho doble.</w:t>
-            </w:r>
-          </w:p>
-        </w:tc>
-      </w:tr>
-      <w:tr>
-        <w:trPr>
-          <w:cantSplit/>
-        </w:trPr>
-        <w:tc>
-          <w:tcPr>
-            <w:tcW w:type="dxa" w:w="900"/>
-            <w:tcBorders>
-              <w:top w:val="single" w:color="A6B4B8" w:sz="4"/>
-              <w:left w:val="single" w:color="A6B4B8" w:sz="4"/>
-              <w:bottom w:val="single" w:color="A6B4B8" w:sz="4"/>
-              <w:right w:val="single" w:color="A6B4B8" w:sz="4"/>
-            </w:tcBorders>
-            <w:tcMar>
-              <w:top w:type="dxa" w:w="50"/>
-              <w:left w:type="dxa" w:w="90"/>
-              <w:bottom w:type="dxa" w:w="50"/>
-              <w:right w:type="dxa" w:w="90"/>
-            </w:tcMar>
-            <w:vAlign w:val="top"/>
-          </w:tcPr>
-          <w:p>
-            <w:pPr>
-              <w:keepNext/>
-              <w:spacing w:after="0" w:line="252"/>
-              <w:jc w:val="center"/>
-            </w:pPr>
-            <w:r>
-              <w:rPr>
-                <w:b w:val="false"/>
-                <w:bCs w:val="false"/>
-                <w:sz w:val="19"/>
-                <w:szCs w:val="19"/>
-              </w:rPr>
-              <w:t xml:space="preserve">7</w:t>
-            </w:r>
-          </w:p>
-        </w:tc>
-        <w:tc>
-          <w:tcPr>
-            <w:tcW w:type="dxa" w:w="8738"/>
-            <w:tcBorders>
-              <w:top w:val="single" w:color="A6B4B8" w:sz="4"/>
-              <w:left w:val="single" w:color="A6B4B8" w:sz="4"/>
-              <w:bottom w:val="single" w:color="A6B4B8" w:sz="4"/>
-              <w:right w:val="single" w:color="A6B4B8" w:sz="4"/>
-            </w:tcBorders>
-            <w:tcMar>
-              <w:top w:type="dxa" w:w="50"/>
-              <w:left w:type="dxa" w:w="90"/>
-              <w:bottom w:type="dxa" w:w="50"/>
-              <w:right w:type="dxa" w:w="90"/>
-            </w:tcMar>
-            <w:vAlign w:val="top"/>
-          </w:tcPr>
-          <w:p>
-            <w:pPr>
-              <w:keepNext/>
-              <w:spacing w:after="0" w:line="252"/>
-              <w:jc w:val="left"/>
-            </w:pPr>
-            <w:r>
-              <w:rPr>
-                <w:b w:val="false"/>
-                <w:bCs w:val="false"/>
-                <w:sz w:val="19"/>
-                <w:szCs w:val="19"/>
-              </w:rPr>
-              <w:t xml:space="preserve">Acomodar el nudo (cuerdas de a pares, paralelas y sin cruzarse) y apretarlo tirando por separado de las cuatro puntas. Dejar de 3 cm a 5 cm de punta libre.</w:t>
-            </w:r>
-          </w:p>
-        </w:tc>
-      </w:tr>
-    </w:tbl>
-    <w:p>
-      <w:pPr>
-        <w:spacing w:after="120" w:before="0"/>
-      </w:pPr>
     </w:p>
     <w:p>
       <w:pPr>
@@ -11289,6 +10673,7 @@
           </w:tcPr>
           <w:p>
             <w:pPr>
+              <w:keepNext/>
               <w:spacing w:after="0" w:line="252"/>
               <w:jc w:val="left"/>
             </w:pPr>
@@ -11323,6 +10708,7 @@
           </w:tcPr>
           <w:p>
             <w:pPr>
+              <w:keepNext/>
               <w:spacing w:after="0" w:line="252"/>
               <w:jc w:val="left"/>
             </w:pPr>
@@ -11361,6 +10747,7 @@
           </w:tcPr>
           <w:p>
             <w:pPr>
+              <w:keepNext/>
               <w:spacing w:after="0" w:line="252"/>
               <w:jc w:val="left"/>
             </w:pPr>
@@ -11394,6 +10781,7 @@
           </w:tcPr>
           <w:p>
             <w:pPr>
+              <w:keepNext/>
               <w:spacing w:after="0" w:line="252"/>
               <w:jc w:val="left"/>
             </w:pPr>
@@ -11432,6 +10820,7 @@
           </w:tcPr>
           <w:p>
             <w:pPr>
+              <w:keepNext/>
               <w:spacing w:after="0" w:line="252"/>
               <w:jc w:val="left"/>
             </w:pPr>
@@ -11465,6 +10854,7 @@
           </w:tcPr>
           <w:p>
             <w:pPr>
+              <w:keepNext/>
               <w:spacing w:after="0" w:line="252"/>
               <w:jc w:val="left"/>
             </w:pPr>
@@ -11503,6 +10893,7 @@
           </w:tcPr>
           <w:p>
             <w:pPr>
+              <w:keepNext/>
               <w:spacing w:after="0" w:line="252"/>
               <w:jc w:val="left"/>
             </w:pPr>
@@ -11536,6 +10927,7 @@
           </w:tcPr>
           <w:p>
             <w:pPr>
+              <w:keepNext/>
               <w:spacing w:after="0" w:line="252"/>
               <w:jc w:val="left"/>
             </w:pPr>
@@ -11574,6 +10966,7 @@
           </w:tcPr>
           <w:p>
             <w:pPr>
+              <w:keepNext/>
               <w:spacing w:after="0" w:line="252"/>
               <w:jc w:val="left"/>
             </w:pPr>
@@ -11607,6 +11000,7 @@
           </w:tcPr>
           <w:p>
             <w:pPr>
+              <w:keepNext/>
               <w:spacing w:after="0" w:line="252"/>
               <w:jc w:val="left"/>
             </w:pPr>
@@ -11645,6 +11039,7 @@
           </w:tcPr>
           <w:p>
             <w:pPr>
+              <w:keepNext/>
               <w:spacing w:after="0" w:line="252"/>
               <w:jc w:val="left"/>
             </w:pPr>
@@ -11678,6 +11073,7 @@
           </w:tcPr>
           <w:p>
             <w:pPr>
+              <w:keepNext/>
               <w:spacing w:after="0" w:line="252"/>
               <w:jc w:val="left"/>
             </w:pPr>
@@ -11741,7 +11137,7 @@
               <w:t xml:space="preserve">Importante: </w:t>
             </w:r>
             <w:r>
-              <w:t xml:space="preserve">si algún control no se cumple, desatar el nudo y volver a hacerlo desde el paso 1. Revisar el nudo al inicio de cada jornada y cada vez que la cuerda haya quedado enganchada o haya soportado un tirón.</w:t>
+              <w:t xml:space="preserve">si algún control no se cumple, desatar el nudo y volver a hacerlo desde el paso 1 de la Figura 2. Revisar el nudo al inicio de cada jornada y cada vez que la cuerda haya quedado enganchada o haya soportado un tirón.</w:t>
             </w:r>
           </w:p>
         </w:tc>

</xml_diff>

<commit_message>
EPG001: sin el riesgo ni la advertencia de tablero en desarrollo
Se mantiene la regla de la ficha del Variac (paso 17).

Co-Authored-By: Claude Opus 5.5 <noreply@anthropic.com>
Claude-Session: https://claude.ai/code/session_01Nz5qZw2jp5HghH6VEfj4aK
</commit_message>
<xml_diff>
--- a/procedimientos_gris/00503-00-EPG001 Procedimiento Inspeccion Robotizada GRIS.docx
+++ b/procedimientos_gris/00503-00-EPG001 Procedimiento Inspeccion Robotizada GRIS.docx
@@ -2524,110 +2524,6 @@
                 <w:sz w:val="19"/>
                 <w:szCs w:val="19"/>
               </w:rPr>
-              <w:t xml:space="preserve">Tablero de excitación en desarrollo; ficha del Variac con contactos macho expuestos.</w:t>
-            </w:r>
-          </w:p>
-        </w:tc>
-        <w:tc>
-          <w:tcPr>
-            <w:tcW w:type="dxa" w:w="2900"/>
-            <w:tcBorders>
-              <w:top w:val="single" w:color="A6B4B8" w:sz="4"/>
-              <w:left w:val="single" w:color="A6B4B8" w:sz="4"/>
-              <w:bottom w:val="single" w:color="A6B4B8" w:sz="4"/>
-              <w:right w:val="single" w:color="A6B4B8" w:sz="4"/>
-            </w:tcBorders>
-            <w:tcMar>
-              <w:top w:type="dxa" w:w="50"/>
-              <w:left w:type="dxa" w:w="90"/>
-              <w:bottom w:type="dxa" w:w="50"/>
-              <w:right w:type="dxa" w:w="90"/>
-            </w:tcMar>
-            <w:vAlign w:val="top"/>
-          </w:tcPr>
-          <w:p>
-            <w:pPr>
-              <w:spacing w:after="0" w:line="252"/>
-              <w:jc w:val="left"/>
-            </w:pPr>
-            <w:r>
-              <w:rPr>
-                <w:b w:val="false"/>
-                <w:bCs w:val="false"/>
-                <w:sz w:val="19"/>
-                <w:szCs w:val="19"/>
-              </w:rPr>
-              <w:t xml:space="preserve">Choque eléctrico.</w:t>
-            </w:r>
-          </w:p>
-        </w:tc>
-        <w:tc>
-          <w:tcPr>
-            <w:tcW w:type="dxa" w:w="3238"/>
-            <w:tcBorders>
-              <w:top w:val="single" w:color="A6B4B8" w:sz="4"/>
-              <w:left w:val="single" w:color="A6B4B8" w:sz="4"/>
-              <w:bottom w:val="single" w:color="A6B4B8" w:sz="4"/>
-              <w:right w:val="single" w:color="A6B4B8" w:sz="4"/>
-            </w:tcBorders>
-            <w:tcMar>
-              <w:top w:type="dxa" w:w="50"/>
-              <w:left w:type="dxa" w:w="90"/>
-              <w:bottom w:type="dxa" w:w="50"/>
-              <w:right w:type="dxa" w:w="90"/>
-            </w:tcMar>
-            <w:vAlign w:val="top"/>
-          </w:tcPr>
-          <w:p>
-            <w:pPr>
-              <w:spacing w:after="0" w:line="252"/>
-              <w:jc w:val="left"/>
-            </w:pPr>
-            <w:r>
-              <w:rPr>
-                <w:b w:val="false"/>
-                <w:bCs w:val="false"/>
-                <w:sz w:val="19"/>
-                <w:szCs w:val="19"/>
-              </w:rPr>
-              <w:t xml:space="preserve">No operar ni manipular el tablero con tensión; conectar el Variac a la red solo con la ficha ya conectada (paso 17).</w:t>
-            </w:r>
-          </w:p>
-        </w:tc>
-      </w:tr>
-      <w:tr>
-        <w:trPr>
-          <w:cantSplit/>
-        </w:trPr>
-        <w:tc>
-          <w:tcPr>
-            <w:tcW w:type="dxa" w:w="3500"/>
-            <w:tcBorders>
-              <w:top w:val="single" w:color="A6B4B8" w:sz="4"/>
-              <w:left w:val="single" w:color="A6B4B8" w:sz="4"/>
-              <w:bottom w:val="single" w:color="A6B4B8" w:sz="4"/>
-              <w:right w:val="single" w:color="A6B4B8" w:sz="4"/>
-            </w:tcBorders>
-            <w:tcMar>
-              <w:top w:type="dxa" w:w="50"/>
-              <w:left w:type="dxa" w:w="90"/>
-              <w:bottom w:type="dxa" w:w="50"/>
-              <w:right w:type="dxa" w:w="90"/>
-            </w:tcMar>
-            <w:vAlign w:val="top"/>
-          </w:tcPr>
-          <w:p>
-            <w:pPr>
-              <w:spacing w:after="0" w:line="252"/>
-              <w:jc w:val="left"/>
-            </w:pPr>
-            <w:r>
-              <w:rPr>
-                <w:b w:val="false"/>
-                <w:bCs w:val="false"/>
-                <w:sz w:val="19"/>
-                <w:szCs w:val="19"/>
-              </w:rPr>
               <w:t xml:space="preserve">Riesgo eléctrico: equipos alimentados en 220 V CA y arrollamiento de excitación energizado.</w:t>
             </w:r>
           </w:p>
@@ -9254,7 +9150,7 @@
               <w:t xml:space="preserve">Precaución: </w:t>
             </w:r>
             <w:r>
-              <w:t xml:space="preserve">el tablero de excitación se encuentra en desarrollo. No operarlo ni manipularlo con tensión. La ficha que viene del Variac queda con los contactos macho expuestos: nunca manipularla con el Variac conectado a la red (paso 17).</w:t>
+              <w:t xml:space="preserve">la ficha que viene del Variac queda con los contactos macho expuestos: nunca manipularla con el Variac conectado a la red (paso 17).</w:t>
             </w:r>
           </w:p>
         </w:tc>

</xml_diff>

<commit_message>
EPG001: «punta de resina» (resin tip) en lugar de «gota de resina»
Co-Authored-By: Claude Opus 5.5 <noreply@anthropic.com>
Claude-Session: https://claude.ai/code/session_01Nz5qZw2jp5HghH6VEfj4aK
</commit_message>
<xml_diff>
--- a/procedimientos_gris/00503-00-EPG001 Procedimiento Inspeccion Robotizada GRIS.docx
+++ b/procedimientos_gris/00503-00-EPG001 Procedimiento Inspeccion Robotizada GRIS.docx
@@ -1900,7 +1900,7 @@
                 <w:sz w:val="19"/>
                 <w:szCs w:val="19"/>
               </w:rPr>
-              <w:t xml:space="preserve">Pérdida de adherencia del robot al pasar sobre una gota de resina de gran altura, en especial en la parte superior del estator.</w:t>
+              <w:t xml:space="preserve">Pérdida de adherencia del robot al pasar sobre una punta de resina de gran altura, en especial en la parte superior del estator.</w:t>
             </w:r>
           </w:p>
         </w:tc>
@@ -2108,7 +2108,7 @@
                 <w:sz w:val="19"/>
                 <w:szCs w:val="19"/>
               </w:rPr>
-              <w:t xml:space="preserve">Robot atascado en el entrehierro (gota de resina, pérdida de energía o falla del robot).</w:t>
+              <w:t xml:space="preserve">Robot atascado en el entrehierro (punta de resina, pérdida de energía o falla del robot).</w:t>
             </w:r>
           </w:p>
         </w:tc>
@@ -11249,7 +11249,7 @@
                 <w:sz w:val="19"/>
                 <w:szCs w:val="19"/>
               </w:rPr>
-              <w:t xml:space="preserve">Realizar una pasada lenta de reconocimiento con las cámaras para detectar gotas de resina, rebabas, obstáculos o cualquier condición que impida el paso o la adherencia del robot.</w:t>
+              <w:t xml:space="preserve">Realizar una pasada lenta de reconocimiento con las cámaras para detectar puntas de resina, rebabas, obstáculos o cualquier condición que impida el paso o la adherencia del robot.</w:t>
             </w:r>
           </w:p>
         </w:tc>

</xml_diff>

<commit_message>
EPG001: definición «punta de resina» (resin tip)
Co-Authored-By: Claude Opus 5.5 <noreply@anthropic.com>
Claude-Session: https://claude.ai/code/session_01Nz5qZw2jp5HghH6VEfj4aK
</commit_message>
<xml_diff>
--- a/procedimientos_gris/00503-00-EPG001 Procedimiento Inspeccion Robotizada GRIS.docx
+++ b/procedimientos_gris/00503-00-EPG001 Procedimiento Inspeccion Robotizada GRIS.docx
@@ -1461,7 +1461,7 @@
                 <w:sz w:val="19"/>
                 <w:szCs w:val="19"/>
               </w:rPr>
-              <w:t xml:space="preserve">Gota de resina</w:t>
+              <w:t xml:space="preserve">Punta de resina</w:t>
             </w:r>
           </w:p>
         </w:tc>
@@ -1494,7 +1494,7 @@
                 <w:sz w:val="19"/>
                 <w:szCs w:val="19"/>
               </w:rPr>
-              <w:t xml:space="preserve">Protuberancia de resina sobre la superficie del estator (resin drip) que puede dificultar el paso o la adherencia del robot.</w:t>
+              <w:t xml:space="preserve">Protuberancia de resina sobre la superficie del estator (resin tip) que puede dificultar el paso o la adherencia del robot.</w:t>
             </w:r>
           </w:p>
         </w:tc>

</xml_diff>

<commit_message>
Aplicar comentarios de revisión aprobados en EPG001 y EPG002
- Variac pasa a autotransformador en textos, tablas y Figura 1.
- Captor sin la denominación Chattock; falla simulada de calibración.
- Ranura 1 en el punto muerto inferior (PMI), numeración ascendente
  según el sentido de rotación.
- Riesgos: fuerza de tensionado constante, 110-220 V CA, rampa con
  exposición a golpes y cortes y nuevos controles.
- Robot con sistema de cámaras de inspección; se quita el bloque de
  calibración WTT; mesa de trabajo; corriente de excitación 5 A a 40 A.

Co-Authored-By: Claude Opus 5.5 <noreply@anthropic.com>
Claude-Session: https://claude.ai/code/session_01Nz5qZw2jp5HghH6VEfj4aK
</commit_message>
<xml_diff>
--- a/procedimientos_gris/00503-00-EPG001 Procedimiento Inspeccion Robotizada GRIS.docx
+++ b/procedimientos_gris/00503-00-EPG001 Procedimiento Inspeccion Robotizada GRIS.docx
@@ -997,7 +997,7 @@
                 <w:sz w:val="19"/>
                 <w:szCs w:val="19"/>
               </w:rPr>
-              <w:t xml:space="preserve">Ensayo de detección electromagnética de imperfecciones del núcleo (Electromagnetic Core Imperfection Detection). Se realiza excitando el núcleo a un flujo reducido y midiendo con captor Chattock.</w:t>
+              <w:t xml:space="preserve">Ensayo de detección electromagnética de imperfecciones del núcleo (Electromagnetic Core Imperfection Detection). Se realiza excitando el núcleo a un flujo reducido y midiendo con el captor.</w:t>
             </w:r>
           </w:p>
         </w:tc>
@@ -1106,7 +1106,7 @@
                 <w:sz w:val="19"/>
                 <w:szCs w:val="19"/>
               </w:rPr>
-              <w:t xml:space="preserve">Captor Chattock</w:t>
+              <w:t xml:space="preserve">Captor</w:t>
             </w:r>
           </w:p>
         </w:tc>
@@ -1210,7 +1210,7 @@
                 <w:sz w:val="19"/>
                 <w:szCs w:val="19"/>
               </w:rPr>
-              <w:t xml:space="preserve">Conductor alojado en una ranura que permite medir la tensión por espira y generar la falla controlada de calibración.</w:t>
+              <w:t xml:space="preserve">Conductor alojado en una ranura que permite medir la tensión por espira y generar la falla simulada de calibración.</w:t>
             </w:r>
           </w:p>
         </w:tc>
@@ -1248,7 +1248,7 @@
                 <w:sz w:val="19"/>
                 <w:szCs w:val="19"/>
               </w:rPr>
-              <w:t xml:space="preserve">Variac</w:t>
+              <w:t xml:space="preserve">Autotransformador</w:t>
             </w:r>
           </w:p>
         </w:tc>
@@ -1281,7 +1281,7 @@
                 <w:sz w:val="19"/>
                 <w:szCs w:val="19"/>
               </w:rPr>
-              <w:t xml:space="preserve">Fuente de CA de tensión variable que alimenta el circuito de excitación.</w:t>
+              <w:t xml:space="preserve">Equipo de tensión de salida variable que alimenta el circuito de excitación.</w:t>
             </w:r>
           </w:p>
         </w:tc>
@@ -1603,7 +1603,7 @@
                 <w:sz w:val="19"/>
                 <w:szCs w:val="19"/>
               </w:rPr>
-              <w:t xml:space="preserve">PMS</w:t>
+              <w:t xml:space="preserve">PMI</w:t>
             </w:r>
           </w:p>
         </w:tc>
@@ -1636,7 +1636,7 @@
                 <w:sz w:val="19"/>
                 <w:szCs w:val="19"/>
               </w:rPr>
-              <w:t xml:space="preserve">Punto muerto superior (Top Dead Centre, TDC).</w:t>
+              <w:t xml:space="preserve">Punto muerto inferior (Bottom Dead Centre, BDC).</w:t>
             </w:r>
           </w:p>
         </w:tc>
@@ -1966,7 +1966,7 @@
                 <w:sz w:val="19"/>
                 <w:szCs w:val="19"/>
               </w:rPr>
-              <w:t xml:space="preserve">Pasada de reconocimiento (paso 31); cuerdas de seguridad con tensión constante.</w:t>
+              <w:t xml:space="preserve">Pasada de reconocimiento (paso 31); cuerdas de seguridad con fuerza de tensionado constante.</w:t>
             </w:r>
           </w:p>
         </w:tc>
@@ -2524,7 +2524,7 @@
                 <w:sz w:val="19"/>
                 <w:szCs w:val="19"/>
               </w:rPr>
-              <w:t xml:space="preserve">Riesgo eléctrico: equipos alimentados en 220 V CA y arrollamiento de excitación energizado.</w:t>
+              <w:t xml:space="preserve">Riesgo eléctrico: equipos alimentados en 110-220 V CA y arrollamiento de excitación energizado.</w:t>
             </w:r>
           </w:p>
         </w:tc>
@@ -2628,7 +2628,7 @@
                 <w:sz w:val="19"/>
                 <w:szCs w:val="19"/>
               </w:rPr>
-              <w:t xml:space="preserve">Manipulación de la rampa con esfuerzos elevados en posiciones incómodas.</w:t>
+              <w:t xml:space="preserve">Manipulación de la rampa con esfuerzos elevados, en posiciones incómodas y con exposición a golpes y cortes.</w:t>
             </w:r>
           </w:p>
         </w:tc>
@@ -2694,7 +2694,7 @@
                 <w:sz w:val="19"/>
                 <w:szCs w:val="19"/>
               </w:rPr>
-              <w:t xml:space="preserve">EPP; rieles limados y sin rebabas.</w:t>
+              <w:t xml:space="preserve">EPP; sujetarse correctamente; trabajar entre dos personas de ser necesario.</w:t>
             </w:r>
           </w:p>
         </w:tc>
@@ -4287,7 +4287,7 @@
                 <w:sz w:val="19"/>
                 <w:szCs w:val="19"/>
               </w:rPr>
-              <w:t xml:space="preserve">Desplazamiento axial dentro del entrehierro. Porta las cámaras inferiores y laterales, el captor Chattock y el detector WTT.</w:t>
+              <w:t xml:space="preserve">Desplazamiento axial dentro del entrehierro. Porta el sistema de cámaras de inspección, el captor y el detector WTT.</w:t>
             </w:r>
           </w:p>
         </w:tc>
@@ -4721,7 +4721,7 @@
                 <w:sz w:val="19"/>
                 <w:szCs w:val="19"/>
               </w:rPr>
-              <w:t xml:space="preserve">Tablero EL CID y captor Chattock</w:t>
+              <w:t xml:space="preserve">Tablero EL CID y captor</w:t>
             </w:r>
           </w:p>
         </w:tc>
@@ -4792,7 +4792,7 @@
                 <w:sz w:val="19"/>
                 <w:szCs w:val="19"/>
               </w:rPr>
-              <w:t xml:space="preserve">Variac</w:t>
+              <w:t xml:space="preserve">Autotransformador</w:t>
             </w:r>
           </w:p>
         </w:tc>
@@ -5147,7 +5147,7 @@
                 <w:sz w:val="19"/>
                 <w:szCs w:val="19"/>
               </w:rPr>
-              <w:t xml:space="preserve">Detector WTT y bloque de calibración</w:t>
+              <w:t xml:space="preserve">Detector WTT</w:t>
             </w:r>
           </w:p>
         </w:tc>
@@ -6967,7 +6967,7 @@
                 <w:sz w:val="19"/>
                 <w:szCs w:val="19"/>
               </w:rPr>
-              <w:t xml:space="preserve">Calcular la excitación del núcleo (tensión por espira, número de espiras, tensión y corriente del Variac y sección del conductor) y registrarla en RME-ELC-01, o solicitarla a Ingeniería.</w:t>
+              <w:t xml:space="preserve">Calcular la excitación del núcleo (tensión por espira, número de espiras, tensión y corriente del autotransformador y sección del conductor) y registrarla en RME-ELC-01, o solicitarla a Ingeniería.</w:t>
             </w:r>
           </w:p>
         </w:tc>
@@ -7279,7 +7279,7 @@
                 <w:sz w:val="19"/>
                 <w:szCs w:val="19"/>
               </w:rPr>
-              <w:t xml:space="preserve">Confirmar la disponibilidad de alimentación para la PC GRIS, la PC EL CID, el control box, el tablero EL CID y el Variac. Verificar la protección diferencial.</w:t>
+              <w:t xml:space="preserve">Confirmar la disponibilidad de alimentación para la PC GRIS, la PC EL CID, el control box, el tablero EL CID y el autotransformador. Verificar la protección diferencial.</w:t>
             </w:r>
           </w:p>
         </w:tc>
@@ -7519,7 +7519,7 @@
                 <w:sz w:val="19"/>
                 <w:szCs w:val="19"/>
               </w:rPr>
-              <w:t xml:space="preserve">Preparar un área de trabajo despejada o un banco en un extremo del generador, con visibilidad de la pantalla del sistema desde el interior del estator o desde el puesto de operación.</w:t>
+              <w:t xml:space="preserve">Disponer una mesa de trabajo en un extremo del generador, con visibilidad de la pantalla del sistema desde el interior del estator o desde el puesto de operación.</w:t>
             </w:r>
           </w:p>
         </w:tc>
@@ -8152,7 +8152,7 @@
                 <w:sz w:val="19"/>
                 <w:szCs w:val="19"/>
               </w:rPr>
-              <w:t xml:space="preserve">Según la convención previa del Cliente. Si no existe, la ranura ubicada en el punto muerto superior (PMS).</w:t>
+              <w:t xml:space="preserve">Según la convención previa del Cliente. Si no existe, la ranura ubicada en el punto muerto inferior (PMI); las ranuras se numeran en forma ascendente siguiendo el sentido de rotación de la máquina en operación.</w:t>
             </w:r>
           </w:p>
         </w:tc>
@@ -8747,7 +8747,7 @@
                 <w:sz w:val="19"/>
                 <w:szCs w:val="19"/>
               </w:rPr>
-              <w:t xml:space="preserve">Con el Variac desconectado de la red, conectar su ficha al tablero de excitación. Recién entonces conectar el Variac a la red. Para desconectar, seguir el orden inverso: primero desconectar el Variac de la red y luego la ficha.</w:t>
+              <w:t xml:space="preserve">Con el autotransformador desconectado de la red, conectar su ficha al tablero de excitación. Recién entonces conectar el autotransformador a la red. Para desconectar, seguir el orden inverso: primero desconectar el autotransformador de la red y luego la ficha.</w:t>
             </w:r>
           </w:p>
         </w:tc>
@@ -9150,7 +9150,7 @@
               <w:t xml:space="preserve">Precaución: </w:t>
             </w:r>
             <w:r>
-              <w:t xml:space="preserve">la ficha que viene del Variac queda con los contactos macho expuestos: nunca manipularla con el Variac conectado a la red (paso 17).</w:t>
+              <w:t xml:space="preserve">la ficha que viene del autotransformador queda con los contactos macho expuestos: nunca manipularla con el autotransformador conectado a la red (paso 17).</w:t>
             </w:r>
           </w:p>
         </w:tc>
@@ -9782,7 +9782,7 @@
                 <w:sz w:val="19"/>
                 <w:szCs w:val="19"/>
               </w:rPr>
-              <w:t xml:space="preserve">Ajustar las cámaras inferiores, las cámaras laterales y el captor Chattock según la geometría de la ranura y del entrehierro. Instalar las guías centrales adecuadas, dejando una holgura recomendada de 1 a 2 mm.</w:t>
+              <w:t xml:space="preserve">Ajustar las cámaras inferiores, las cámaras laterales y el captor según la geometría de la ranura y del entrehierro. Instalar las guías centrales adecuadas, dejando una holgura recomendada de 1 a 2 mm.</w:t>
             </w:r>
           </w:p>
         </w:tc>
@@ -9886,7 +9886,7 @@
                 <w:sz w:val="19"/>
                 <w:szCs w:val="19"/>
               </w:rPr>
-              <w:t xml:space="preserve">Realizar las conexiones de la Figura 1: cable del robot al control box (conector principal) y al tablero EL CID (señal del captor); control box al tablero EL CID (señal de posición); PC GRIS al control box (USB y Ethernet); PC EL CID al tablero EL CID (USB); tablero de excitación (Variac, cable de excitación, espira auxiliar y salida al tablero EL CID) y alimentaciones desde la red (regleta de enchufes), respetando el esquema de puesta a tierra.</w:t>
+              <w:t xml:space="preserve">Realizar las conexiones de la Figura 1: cable del robot al control box (conector principal) y al tablero EL CID (señal del captor); control box al tablero EL CID (señal de posición); PC GRIS al control box (USB y Ethernet); PC EL CID al tablero EL CID (USB); tablero de excitación (autotransformador, cable de excitación, espira auxiliar y salida al tablero EL CID) y alimentaciones desde la red (regleta de enchufes), respetando el esquema de puesta a tierra.</w:t>
             </w:r>
           </w:p>
         </w:tc>
@@ -11665,7 +11665,7 @@
                 <w:sz w:val="19"/>
                 <w:szCs w:val="19"/>
               </w:rPr>
-              <w:t xml:space="preserve">Calibrar el sistema EL CID: elevar gradualmente la tensión de excitación hasta el valor calculado, verificar la tensión por espira, realizar la medición de falla controlada con la espira auxiliar y el robot, y ajustar la constante del captor (KF).</w:t>
+              <w:t xml:space="preserve">Calibrar el sistema EL CID: elevar gradualmente la tensión de excitación hasta el valor calculado, verificar la tensión por espira, realizar la medición de la falla simulada de calibración con la espira auxiliar y el robot, y ajustar la constante del captor (KF).</w:t>
             </w:r>
           </w:p>
         </w:tc>
@@ -12316,7 +12316,7 @@
                 <w:sz w:val="19"/>
                 <w:szCs w:val="19"/>
               </w:rPr>
-              <w:t xml:space="preserve">Durante todo movimiento del robot, un operador acompaña el cable y las cuerdas de seguridad manteniendo una tensión constante, para evitar atrapamientos y que el robot los pise.</w:t>
+              <w:t xml:space="preserve">Durante todo movimiento del robot, un operador acompaña el cable y las cuerdas de seguridad manteniendo una fuerza de tensionado constante, para evitar atrapamientos y que el robot los pise.</w:t>
             </w:r>
           </w:p>
         </w:tc>
@@ -14083,7 +14083,7 @@
                 <w:sz w:val="19"/>
                 <w:szCs w:val="19"/>
               </w:rPr>
-              <w:t xml:space="preserve">Desmontar el robot, la rampa, el tablero EL CID, el control box, el tablero de excitación, el Variac, el arrollamiento de excitación, la espira auxiliar, las barreras y la cartelería. Limpiar el área y cerrar los permisos.</w:t>
+              <w:t xml:space="preserve">Desmontar el robot, la rampa, el tablero EL CID, el control box, el tablero de excitación, el autotransformador, el arrollamiento de excitación, la espira auxiliar, las barreras y la cartelería. Limpiar el área y cerrar los permisos.</w:t>
             </w:r>
           </w:p>
         </w:tc>

</xml_diff>

<commit_message>
Revisión integral: anexo A del esquema, fecha unificada y coherencia
- Esquema general de conexiones pasa a Anexo A del EPG001, en PDF A3
  aparte; el nudo ocho pasa a ser la Figura 1.
- Tabla 2: sentido de numeración según el sentido de rotación.
- Fecha de revisión 29/10/2026 en EPG001, EPG002, EPG003, ZRQ001 y anexo.
- Etapa 2.5 remite al apéndice 2.4 del EPG002 y al RME-ELC-01; falla
  simulada de calibración en EPG002; rótulo «Captor» en el esquema.

Co-Authored-By: Claude Opus 5.5 <noreply@anthropic.com>
Claude-Session: https://claude.ai/code/session_01Nz5qZw2jp5HghH6VEfj4aK
</commit_message>
<xml_diff>
--- a/procedimientos_gris/00503-00-EPG001 Procedimiento Inspeccion Robotizada GRIS.docx
+++ b/procedimientos_gris/00503-00-EPG001 Procedimiento Inspeccion Robotizada GRIS.docx
@@ -425,7 +425,7 @@
           <w:sz w:val="19"/>
         </w:rPr>
         <w:tab/>
-        <w:t>7</w:t>
+        <w:t>8</w:t>
       </w:r>
     </w:p>
     <w:p>
@@ -469,7 +469,7 @@
           <w:sz w:val="19"/>
         </w:rPr>
         <w:tab/>
-        <w:t>12</w:t>
+        <w:t>11</w:t>
       </w:r>
     </w:p>
     <w:p>
@@ -491,7 +491,7 @@
           <w:sz w:val="19"/>
         </w:rPr>
         <w:tab/>
-        <w:t>12</w:t>
+        <w:t>11</w:t>
       </w:r>
     </w:p>
     <w:p>
@@ -513,7 +513,7 @@
           <w:sz w:val="19"/>
         </w:rPr>
         <w:tab/>
-        <w:t>14</w:t>
+        <w:t>13</w:t>
       </w:r>
     </w:p>
     <w:p>
@@ -536,7 +536,7 @@
           <w:sz w:val="19"/>
         </w:rPr>
         <w:tab/>
-        <w:t>14</w:t>
+        <w:t>13</w:t>
       </w:r>
       <w:r>
         <w:fldChar w:fldCharType="end"/>
@@ -3093,6 +3093,77 @@
           </w:p>
         </w:tc>
       </w:tr>
+      <w:tr>
+        <w:trPr>
+          <w:cantSplit/>
+        </w:trPr>
+        <w:tc>
+          <w:tcPr>
+            <w:tcW w:type="dxa" w:w="3800"/>
+            <w:tcBorders>
+              <w:top w:val="single" w:color="A6B4B8" w:sz="4"/>
+              <w:left w:val="single" w:color="A6B4B8" w:sz="4"/>
+              <w:bottom w:val="single" w:color="A6B4B8" w:sz="4"/>
+              <w:right w:val="single" w:color="A6B4B8" w:sz="4"/>
+            </w:tcBorders>
+            <w:tcMar>
+              <w:top w:type="dxa" w:w="50"/>
+              <w:left w:type="dxa" w:w="90"/>
+              <w:bottom w:type="dxa" w:w="50"/>
+              <w:right w:type="dxa" w:w="90"/>
+            </w:tcMar>
+            <w:vAlign w:val="top"/>
+          </w:tcPr>
+          <w:p>
+            <w:pPr>
+              <w:spacing w:after="0" w:line="252"/>
+              <w:jc w:val="left"/>
+            </w:pPr>
+            <w:r>
+              <w:rPr>
+                <w:b w:val="false"/>
+                <w:bCs w:val="false"/>
+                <w:sz w:val="19"/>
+                <w:szCs w:val="19"/>
+              </w:rPr>
+              <w:t xml:space="preserve">00503-00-EPG001 Anexo A – Esquema general de conexiones</w:t>
+            </w:r>
+          </w:p>
+        </w:tc>
+        <w:tc>
+          <w:tcPr>
+            <w:tcW w:type="dxa" w:w="5838"/>
+            <w:tcBorders>
+              <w:top w:val="single" w:color="A6B4B8" w:sz="4"/>
+              <w:left w:val="single" w:color="A6B4B8" w:sz="4"/>
+              <w:bottom w:val="single" w:color="A6B4B8" w:sz="4"/>
+              <w:right w:val="single" w:color="A6B4B8" w:sz="4"/>
+            </w:tcBorders>
+            <w:tcMar>
+              <w:top w:type="dxa" w:w="50"/>
+              <w:left w:type="dxa" w:w="90"/>
+              <w:bottom w:type="dxa" w:w="50"/>
+              <w:right w:type="dxa" w:w="90"/>
+            </w:tcMar>
+            <w:vAlign w:val="top"/>
+          </w:tcPr>
+          <w:p>
+            <w:pPr>
+              <w:spacing w:after="0" w:line="252"/>
+              <w:jc w:val="left"/>
+            </w:pPr>
+            <w:r>
+              <w:rPr>
+                <w:b w:val="false"/>
+                <w:bCs w:val="false"/>
+                <w:sz w:val="19"/>
+                <w:szCs w:val="19"/>
+              </w:rPr>
+              <w:t xml:space="preserve">Esquema de conexiones del robot, el control box, los tableros, las PC y el circuito de excitación, en hoja A3 aparte (archivo A3 separado).</w:t>
+            </w:r>
+          </w:p>
+        </w:tc>
+      </w:tr>
     </w:tbl>
     <w:p>
       <w:pPr>
@@ -3441,7 +3512,7 @@
                 <w:sz w:val="19"/>
                 <w:szCs w:val="19"/>
               </w:rPr>
-              <w:t xml:space="preserve">00503-00-EPG002 – Protocolo 1</w:t>
+              <w:t xml:space="preserve">00503-00-EPG002, apartado 2.4 / RME-ELC-01</w:t>
             </w:r>
           </w:p>
         </w:tc>
@@ -3753,7 +3824,7 @@
                 <w:sz w:val="19"/>
                 <w:szCs w:val="19"/>
               </w:rPr>
-              <w:t xml:space="preserve">00503-00-EPG002 – Protocolo 3 / 00503-00-EPG003 / Figura 1</w:t>
+              <w:t xml:space="preserve">00503-00-EPG002 – Protocolo 3 / 00503-00-EPG003 / Anexo A</w:t>
             </w:r>
           </w:p>
         </w:tc>
@@ -8152,7 +8223,7 @@
                 <w:sz w:val="19"/>
                 <w:szCs w:val="19"/>
               </w:rPr>
-              <w:t xml:space="preserve">Según la convención previa del Cliente. Si no existe, la ranura ubicada en el punto muerto inferior (PMI); las ranuras se numeran en forma ascendente siguiendo el sentido de rotación de la máquina en operación.</w:t>
+              <w:t xml:space="preserve">Según la convención previa del Cliente. Si no existe, la ranura ubicada en el punto muerto inferior (PMI).</w:t>
             </w:r>
           </w:p>
         </w:tc>
@@ -8223,7 +8294,7 @@
                 <w:sz w:val="19"/>
                 <w:szCs w:val="19"/>
               </w:rPr>
-              <w:t xml:space="preserve">Según la convención previa del Cliente. Si no existe, sentido horario visto desde el lado DE.</w:t>
+              <w:t xml:space="preserve">Según la convención previa del Cliente. Si no existe, en forma ascendente siguiendo el sentido de rotación de la máquina en operación.</w:t>
             </w:r>
           </w:p>
         </w:tc>
@@ -8676,7 +8747,7 @@
                 <w:sz w:val="19"/>
                 <w:szCs w:val="19"/>
               </w:rPr>
-              <w:t xml:space="preserve">00503-00-EPG002 – Protocolo 1 / Figura 1</w:t>
+              <w:t xml:space="preserve">00503-00-EPG002 – Protocolo 1 / Anexo A</w:t>
             </w:r>
           </w:p>
         </w:tc>
@@ -8780,7 +8851,7 @@
                 <w:sz w:val="19"/>
                 <w:szCs w:val="19"/>
               </w:rPr>
-              <w:t xml:space="preserve">Apartado 2.1 / Figura 1</w:t>
+              <w:t xml:space="preserve">Apartado 2.1 / Anexo A</w:t>
             </w:r>
           </w:p>
         </w:tc>
@@ -9172,7 +9243,7 @@
         <w:jc w:val="both"/>
       </w:pPr>
       <w:r>
-        <w:t xml:space="preserve">Las conexiones se realizan según el esquema general de la Figura 1.</w:t>
+        <w:t xml:space="preserve">Las conexiones se realizan según el esquema general de conexiones del Anexo A (archivo A3 separado).</w:t>
       </w:r>
     </w:p>
     <w:tbl>
@@ -9886,7 +9957,7 @@
                 <w:sz w:val="19"/>
                 <w:szCs w:val="19"/>
               </w:rPr>
-              <w:t xml:space="preserve">Realizar las conexiones de la Figura 1: cable del robot al control box (conector principal) y al tablero EL CID (señal del captor); control box al tablero EL CID (señal de posición); PC GRIS al control box (USB y Ethernet); PC EL CID al tablero EL CID (USB); tablero de excitación (autotransformador, cable de excitación, espira auxiliar y salida al tablero EL CID) y alimentaciones desde la red (regleta de enchufes), respetando el esquema de puesta a tierra.</w:t>
+              <w:t xml:space="preserve">Realizar las conexiones del Anexo A: cable del robot al control box (conector principal) y al tablero EL CID (señal del captor); control box al tablero EL CID (señal de posición); PC GRIS al control box (USB y Ethernet); PC EL CID al tablero EL CID (USB); tablero de excitación (autotransformador, cable de excitación, espira auxiliar y salida al tablero EL CID) y alimentaciones desde la red (regleta de enchufes), respetando el esquema de puesta a tierra.</w:t>
             </w:r>
           </w:p>
         </w:tc>
@@ -9919,7 +9990,7 @@
                 <w:sz w:val="19"/>
                 <w:szCs w:val="19"/>
               </w:rPr>
-              <w:t xml:space="preserve">Figura 1 / 00503-00-EPG002 – Protocolo 1 / 00503-00-EPG003, apartado 3.1</w:t>
+              <w:t xml:space="preserve">Anexo A / 00503-00-EPG002 – Protocolo 1 / 00503-00-EPG003, apartado 3.1</w:t>
             </w:r>
           </w:p>
         </w:tc>
@@ -10023,7 +10094,7 @@
                 <w:sz w:val="19"/>
                 <w:szCs w:val="19"/>
               </w:rPr>
-              <w:t xml:space="preserve">Figura 2 / Tabla 3</w:t>
+              <w:t xml:space="preserve">Figura 1 / Tabla 3</w:t>
             </w:r>
           </w:p>
         </w:tc>
@@ -10341,93 +10412,6 @@
         </w:tc>
       </w:tr>
     </w:tbl>
-    <w:p>
-      <w:pPr>
-        <w:sectPr>
-          <w:headerReference w:type="default" r:id="rId7"/>
-          <w:footerReference w:type="default" r:id="rId8"/>
-          <w:pgSz w:w="11906" w:h="16838" w:orient="portrait"/>
-          <w:pgMar w:top="2100" w:right="1134" w:bottom="1700" w:left="1134" w:header="500" w:footer="400" w:gutter="0"/>
-          <w:pgNumType/>
-          <w:docGrid w:linePitch="360"/>
-        </w:sectPr>
-      </w:pPr>
-    </w:p>
-    <w:p>
-      <w:pPr>
-        <w:keepNext/>
-        <w:spacing w:after="60" w:before="0"/>
-        <w:jc w:val="center"/>
-      </w:pPr>
-      <w:r>
-        <w:drawing>
-          <wp:inline distT="0" distB="0" distL="0" distR="0">
-            <wp:extent cx="13468350" cy="7772400"/>
-            <wp:effectExtent t="0" r="0" b="0" l="0"/>
-            <wp:docPr id="1" name="esquema_general.png" descr="Figura 1: Esquema general de conexiones del sistema GRIS" title="Figura 1: Esquema general de conexiones del sistema GRIS"/>
-            <wp:cNvGraphicFramePr>
-              <a:graphicFrameLocks xmlns:a="http://schemas.openxmlformats.org/drawingml/2006/main" noChangeAspect="1"/>
-            </wp:cNvGraphicFramePr>
-            <a:graphic xmlns:a="http://schemas.openxmlformats.org/drawingml/2006/main">
-              <a:graphicData uri="http://schemas.openxmlformats.org/drawingml/2006/picture">
-                <pic:pic xmlns:pic="http://schemas.openxmlformats.org/drawingml/2006/picture">
-                  <pic:nvPicPr>
-                    <pic:cNvPr id="0" name="" descr=""/>
-                    <pic:cNvPicPr>
-                      <a:picLocks noChangeAspect="1" noChangeArrowheads="1"/>
-                    </pic:cNvPicPr>
-                  </pic:nvPicPr>
-                  <pic:blipFill>
-                    <a:blip r:embed="rId13" cstate="none"/>
-                    <a:srcRect/>
-                    <a:stretch>
-                      <a:fillRect/>
-                    </a:stretch>
-                  </pic:blipFill>
-                  <pic:spPr bwMode="auto">
-                    <a:xfrm>
-                      <a:off x="0" y="0"/>
-                      <a:ext cx="13468350" cy="7772400"/>
-                    </a:xfrm>
-                    <a:prstGeom prst="rect">
-                      <a:avLst/>
-                    </a:prstGeom>
-                  </pic:spPr>
-                </pic:pic>
-              </a:graphicData>
-            </a:graphic>
-          </wp:inline>
-        </w:drawing>
-      </w:r>
-    </w:p>
-    <w:p>
-      <w:pPr>
-        <w:jc w:val="center"/>
-      </w:pPr>
-      <w:r>
-        <w:rPr>
-          <w:i/>
-          <w:iCs/>
-          <w:color w:val="6D8289"/>
-          <w:sz w:val="18"/>
-          <w:szCs w:val="18"/>
-        </w:rPr>
-        <w:t xml:space="preserve">Figura 1: Esquema general de conexiones del sistema GRIS</w:t>
-      </w:r>
-    </w:p>
-    <w:p>
-      <w:pPr>
-        <w:sectPr>
-          <w:headerReference w:type="default" r:id="rId9"/>
-          <w:footerReference w:type="default" r:id="rId10"/>
-          <w:type w:val="nextPage"/>
-          <w:pgSz w:w="23811" w:h="16838" w:orient="landscape"/>
-          <w:pgMar w:top="2100" w:right="1134" w:bottom="1700" w:left="1134" w:header="500" w:footer="400" w:gutter="0"/>
-          <w:pgNumType/>
-          <w:docGrid w:linePitch="360"/>
-        </w:sectPr>
-      </w:pPr>
-    </w:p>
     <w:p>
       <w:pPr>
         <w:pStyle w:val="Heading3"/>
@@ -10445,7 +10429,7 @@
         <w:jc w:val="both"/>
       </w:pPr>
       <w:r>
-        <w:t xml:space="preserve">Las cuerdas de seguridad (3 mm) se atan al ojal del robot con un nudo ocho reconstruido (paso 27), que no se corre ni se desata con los tirones ni con las vibraciones del ensayo. Se ata según la Figura 2 y se verifica con la Tabla 3.</w:t>
+        <w:t xml:space="preserve">Las cuerdas de seguridad (3 mm) se atan al ojal del robot con un nudo ocho reconstruido (paso 27), que no se corre ni se desata con los tirones ni con las vibraciones del ensayo. Se ata según la Figura 1 y se verifica con la Tabla 3.</w:t>
       </w:r>
     </w:p>
     <w:p>
@@ -10459,7 +10443,7 @@
           <wp:inline distT="0" distB="0" distL="0" distR="0">
             <wp:extent cx="6124575" cy="5743575"/>
             <wp:effectExtent t="0" r="0" b="0" l="0"/>
-            <wp:docPr id="1" name="nudo_ocho.png" descr="Figura 2: Nudo ocho reconstruido paso a paso en el ojal del robot" title="Figura 2: Nudo ocho reconstruido paso a paso en el ojal del robot"/>
+            <wp:docPr id="1" name="nudo_ocho.png" descr="Figura 1: Nudo ocho reconstruido paso a paso en el ojal del robot" title="Figura 1: Nudo ocho reconstruido paso a paso en el ojal del robot"/>
             <wp:cNvGraphicFramePr>
               <a:graphicFrameLocks xmlns:a="http://schemas.openxmlformats.org/drawingml/2006/main" noChangeAspect="1"/>
             </wp:cNvGraphicFramePr>
@@ -10473,7 +10457,7 @@
                     </pic:cNvPicPr>
                   </pic:nvPicPr>
                   <pic:blipFill>
-                    <a:blip r:embed="rId14" cstate="none"/>
+                    <a:blip r:embed="rId9" cstate="none"/>
                     <a:srcRect/>
                     <a:stretch>
                       <a:fillRect/>
@@ -10508,7 +10492,7 @@
           <w:sz w:val="18"/>
           <w:szCs w:val="18"/>
         </w:rPr>
-        <w:t xml:space="preserve">Figura 2: Nudo ocho reconstruido paso a paso en el ojal del robot</w:t>
+        <w:t xml:space="preserve">Figura 1: Nudo ocho reconstruido paso a paso en el ojal del robot</w:t>
       </w:r>
     </w:p>
     <w:p>
@@ -11033,7 +11017,7 @@
               <w:t xml:space="preserve">Importante: </w:t>
             </w:r>
             <w:r>
-              <w:t xml:space="preserve">si algún control no se cumple, desatar el nudo y volver a hacerlo desde el paso 1 de la Figura 2. Revisar el nudo al inicio de cada jornada y cada vez que la cuerda haya quedado enganchada o haya soportado un tirón.</w:t>
+              <w:t xml:space="preserve">si algún control no se cumple, desatar el nudo y volver a hacerlo desde el paso 1 de la Figura 1. Revisar el nudo al inicio de cada jornada y cada vez que la cuerda haya quedado enganchada o haya soportado un tirón.</w:t>
             </w:r>
           </w:p>
         </w:tc>
@@ -14614,7 +14598,7 @@
                 <w:sz w:val="19"/>
                 <w:szCs w:val="19"/>
               </w:rPr>
-              <w:t xml:space="preserve">28/10/2026</w:t>
+              <w:t xml:space="preserve">29/10/2026</w:t>
             </w:r>
           </w:p>
         </w:tc>
@@ -15058,8 +15042,8 @@
       </w:r>
     </w:p>
     <w:sectPr>
-      <w:headerReference w:type="default" r:id="rId11"/>
-      <w:footerReference w:type="default" r:id="rId12"/>
+      <w:headerReference w:type="default" r:id="rId7"/>
+      <w:footerReference w:type="default" r:id="rId8"/>
       <w:pgSz w:w="11906" w:h="16838" w:orient="portrait"/>
       <w:pgMar w:top="2100" w:right="1134" w:bottom="1700" w:left="1134" w:header="500" w:footer="400" w:gutter="0"/>
       <w:pgNumType/>
@@ -15111,302 +15095,6 @@
 </file>
 
 <file path=word/footer1.xml><?xml version="1.0" encoding="utf-8"?>
-<w:ftr xmlns:wpc="http://schemas.microsoft.com/office/word/2010/wordprocessingCanvas" xmlns:mc="http://schemas.openxmlformats.org/markup-compatibility/2006" xmlns:o="urn:schemas-microsoft-com:office:office" xmlns:r="http://schemas.openxmlformats.org/officeDocument/2006/relationships" xmlns:m="http://schemas.openxmlformats.org/officeDocument/2006/math" xmlns:v="urn:schemas-microsoft-com:vml" xmlns:wp14="http://schemas.microsoft.com/office/word/2010/wordprocessingDrawing" xmlns:wp="http://schemas.openxmlformats.org/drawingml/2006/wordprocessingDrawing" xmlns:w10="urn:schemas-microsoft-com:office:word" xmlns:w="http://schemas.openxmlformats.org/wordprocessingml/2006/main" xmlns:w14="http://schemas.microsoft.com/office/word/2010/wordml" xmlns:w15="http://schemas.microsoft.com/office/word/2012/wordml" xmlns:wpg="http://schemas.microsoft.com/office/word/2010/wordprocessingGroup" xmlns:wpi="http://schemas.microsoft.com/office/word/2010/wordprocessingInk" xmlns:wne="http://schemas.microsoft.com/office/word/2006/wordml" xmlns:wps="http://schemas.microsoft.com/office/word/2010/wordprocessingShape">
-  <w:p>
-    <w:pPr>
-      <w:spacing w:after="80"/>
-      <w:jc w:val="center"/>
-    </w:pPr>
-    <w:r>
-      <w:rPr>
-        <w:b/>
-        <w:bCs/>
-        <w:i/>
-        <w:iCs/>
-        <w:sz w:val="16"/>
-        <w:szCs w:val="16"/>
-      </w:rPr>
-      <w:t xml:space="preserve">SI ESTE DOCUMENTO SE ENCUENTRA IMPRESO SE CONSIDERA COPIA NO CONTROLADA</w:t>
-    </w:r>
-  </w:p>
-  <w:tbl>
-    <w:tblPr>
-      <w:tblW w:type="dxa" w:w="9638"/>
-      <w:tblBorders>
-        <w:top w:val="single" w:color="auto" w:sz="4"/>
-        <w:left w:val="single" w:color="auto" w:sz="4"/>
-        <w:bottom w:val="single" w:color="auto" w:sz="4"/>
-        <w:right w:val="single" w:color="auto" w:sz="4"/>
-        <w:insideH w:val="single" w:color="auto" w:sz="4"/>
-        <w:insideV w:val="single" w:color="auto" w:sz="4"/>
-      </w:tblBorders>
-    </w:tblPr>
-    <w:tblGrid>
-      <w:gridCol w:w="6638"/>
-      <w:gridCol w:w="3000"/>
-    </w:tblGrid>
-    <w:tr>
-      <w:tc>
-        <w:tcPr>
-          <w:tcW w:type="dxa" w:w="6638"/>
-          <w:tcBorders>
-            <w:top w:val="none" w:color="FFFFFF" w:sz="0"/>
-            <w:left w:val="none" w:color="FFFFFF" w:sz="0"/>
-            <w:bottom w:val="none" w:color="FFFFFF" w:sz="0"/>
-            <w:right w:val="none" w:color="FFFFFF" w:sz="0"/>
-          </w:tcBorders>
-          <w:tcMar>
-            <w:top w:type="dxa" w:w="50"/>
-            <w:left w:type="dxa" w:w="90"/>
-            <w:bottom w:type="dxa" w:w="50"/>
-            <w:right w:type="dxa" w:w="90"/>
-          </w:tcMar>
-          <w:vAlign w:val="center"/>
-        </w:tcPr>
-        <w:p>
-          <w:pPr>
-            <w:spacing w:after="0"/>
-          </w:pPr>
-          <w:r>
-            <w:rPr>
-              <w:color w:val="595959"/>
-              <w:sz w:val="16"/>
-              <w:szCs w:val="16"/>
-            </w:rPr>
-            <w:t xml:space="preserve">www.mecanalisis.com.ar | +54 261 476 9010</w:t>
-          </w:r>
-        </w:p>
-        <w:p>
-          <w:pPr>
-            <w:spacing w:after="0"/>
-          </w:pPr>
-          <w:r>
-            <w:rPr>
-              <w:color w:val="595959"/>
-              <w:sz w:val="16"/>
-              <w:szCs w:val="16"/>
-            </w:rPr>
-            <w:t xml:space="preserve">Pedro del Castillo 3160 . 5519 Guaymallén – Mendoza, Argentina.</w:t>
-          </w:r>
-        </w:p>
-      </w:tc>
-      <w:tc>
-        <w:tcPr>
-          <w:tcW w:type="dxa" w:w="3000"/>
-          <w:tcBorders>
-            <w:top w:val="none" w:color="FFFFFF" w:sz="0"/>
-            <w:left w:val="none" w:color="FFFFFF" w:sz="0"/>
-            <w:bottom w:val="none" w:color="FFFFFF" w:sz="0"/>
-            <w:right w:val="none" w:color="FFFFFF" w:sz="0"/>
-          </w:tcBorders>
-          <w:tcMar>
-            <w:top w:type="dxa" w:w="50"/>
-            <w:left w:type="dxa" w:w="90"/>
-            <w:bottom w:type="dxa" w:w="50"/>
-            <w:right w:type="dxa" w:w="90"/>
-          </w:tcMar>
-          <w:vAlign w:val="center"/>
-        </w:tcPr>
-        <w:p>
-          <w:pPr>
-            <w:jc w:val="right"/>
-          </w:pPr>
-          <w:r>
-            <w:drawing>
-              <wp:inline distT="0" distB="0" distL="0" distR="0">
-                <wp:extent cx="1428750" cy="400050"/>
-                <wp:effectExtent t="0" r="0" b="0" l="0"/>
-                <wp:docPr id="1" name="logo" descr="Logo Mecanálisis" title="Mecanálisis"/>
-                <wp:cNvGraphicFramePr>
-                  <a:graphicFrameLocks xmlns:a="http://schemas.openxmlformats.org/drawingml/2006/main" noChangeAspect="1"/>
-                </wp:cNvGraphicFramePr>
-                <a:graphic xmlns:a="http://schemas.openxmlformats.org/drawingml/2006/main">
-                  <a:graphicData uri="http://schemas.openxmlformats.org/drawingml/2006/picture">
-                    <pic:pic xmlns:pic="http://schemas.openxmlformats.org/drawingml/2006/picture">
-                      <pic:nvPicPr>
-                        <pic:cNvPr id="0" name="" descr=""/>
-                        <pic:cNvPicPr>
-                          <a:picLocks noChangeAspect="1" noChangeArrowheads="1"/>
-                        </pic:cNvPicPr>
-                      </pic:nvPicPr>
-                      <pic:blipFill>
-                        <a:blip r:embed="rId0" cstate="none"/>
-                        <a:srcRect/>
-                        <a:stretch>
-                          <a:fillRect/>
-                        </a:stretch>
-                      </pic:blipFill>
-                      <pic:spPr bwMode="auto">
-                        <a:xfrm>
-                          <a:off x="0" y="0"/>
-                          <a:ext cx="1428750" cy="400050"/>
-                        </a:xfrm>
-                        <a:prstGeom prst="rect">
-                          <a:avLst/>
-                        </a:prstGeom>
-                      </pic:spPr>
-                    </pic:pic>
-                  </a:graphicData>
-                </a:graphic>
-              </wp:inline>
-            </w:drawing>
-          </w:r>
-        </w:p>
-      </w:tc>
-    </w:tr>
-  </w:tbl>
-</w:ftr>
-</file>
-
-<file path=word/footer2.xml><?xml version="1.0" encoding="utf-8"?>
-<w:ftr xmlns:wpc="http://schemas.microsoft.com/office/word/2010/wordprocessingCanvas" xmlns:mc="http://schemas.openxmlformats.org/markup-compatibility/2006" xmlns:o="urn:schemas-microsoft-com:office:office" xmlns:r="http://schemas.openxmlformats.org/officeDocument/2006/relationships" xmlns:m="http://schemas.openxmlformats.org/officeDocument/2006/math" xmlns:v="urn:schemas-microsoft-com:vml" xmlns:wp14="http://schemas.microsoft.com/office/word/2010/wordprocessingDrawing" xmlns:wp="http://schemas.openxmlformats.org/drawingml/2006/wordprocessingDrawing" xmlns:w10="urn:schemas-microsoft-com:office:word" xmlns:w="http://schemas.openxmlformats.org/wordprocessingml/2006/main" xmlns:w14="http://schemas.microsoft.com/office/word/2010/wordml" xmlns:w15="http://schemas.microsoft.com/office/word/2012/wordml" xmlns:wpg="http://schemas.microsoft.com/office/word/2010/wordprocessingGroup" xmlns:wpi="http://schemas.microsoft.com/office/word/2010/wordprocessingInk" xmlns:wne="http://schemas.microsoft.com/office/word/2006/wordml" xmlns:wps="http://schemas.microsoft.com/office/word/2010/wordprocessingShape">
-  <w:p>
-    <w:pPr>
-      <w:spacing w:after="80"/>
-      <w:jc w:val="center"/>
-    </w:pPr>
-    <w:r>
-      <w:rPr>
-        <w:b/>
-        <w:bCs/>
-        <w:i/>
-        <w:iCs/>
-        <w:sz w:val="16"/>
-        <w:szCs w:val="16"/>
-      </w:rPr>
-      <w:t xml:space="preserve">SI ESTE DOCUMENTO SE ENCUENTRA IMPRESO SE CONSIDERA COPIA NO CONTROLADA</w:t>
-    </w:r>
-  </w:p>
-  <w:tbl>
-    <w:tblPr>
-      <w:tblW w:type="dxa" w:w="21543"/>
-      <w:tblBorders>
-        <w:top w:val="single" w:color="auto" w:sz="4"/>
-        <w:left w:val="single" w:color="auto" w:sz="4"/>
-        <w:bottom w:val="single" w:color="auto" w:sz="4"/>
-        <w:right w:val="single" w:color="auto" w:sz="4"/>
-        <w:insideH w:val="single" w:color="auto" w:sz="4"/>
-        <w:insideV w:val="single" w:color="auto" w:sz="4"/>
-      </w:tblBorders>
-    </w:tblPr>
-    <w:tblGrid>
-      <w:gridCol w:w="18543"/>
-      <w:gridCol w:w="3000"/>
-    </w:tblGrid>
-    <w:tr>
-      <w:tc>
-        <w:tcPr>
-          <w:tcW w:type="dxa" w:w="18543"/>
-          <w:tcBorders>
-            <w:top w:val="none" w:color="FFFFFF" w:sz="0"/>
-            <w:left w:val="none" w:color="FFFFFF" w:sz="0"/>
-            <w:bottom w:val="none" w:color="FFFFFF" w:sz="0"/>
-            <w:right w:val="none" w:color="FFFFFF" w:sz="0"/>
-          </w:tcBorders>
-          <w:tcMar>
-            <w:top w:type="dxa" w:w="50"/>
-            <w:left w:type="dxa" w:w="90"/>
-            <w:bottom w:type="dxa" w:w="50"/>
-            <w:right w:type="dxa" w:w="90"/>
-          </w:tcMar>
-          <w:vAlign w:val="center"/>
-        </w:tcPr>
-        <w:p>
-          <w:pPr>
-            <w:spacing w:after="0"/>
-          </w:pPr>
-          <w:r>
-            <w:rPr>
-              <w:color w:val="595959"/>
-              <w:sz w:val="16"/>
-              <w:szCs w:val="16"/>
-            </w:rPr>
-            <w:t xml:space="preserve">www.mecanalisis.com.ar | +54 261 476 9010</w:t>
-          </w:r>
-        </w:p>
-        <w:p>
-          <w:pPr>
-            <w:spacing w:after="0"/>
-          </w:pPr>
-          <w:r>
-            <w:rPr>
-              <w:color w:val="595959"/>
-              <w:sz w:val="16"/>
-              <w:szCs w:val="16"/>
-            </w:rPr>
-            <w:t xml:space="preserve">Pedro del Castillo 3160 . 5519 Guaymallén – Mendoza, Argentina.</w:t>
-          </w:r>
-        </w:p>
-      </w:tc>
-      <w:tc>
-        <w:tcPr>
-          <w:tcW w:type="dxa" w:w="3000"/>
-          <w:tcBorders>
-            <w:top w:val="none" w:color="FFFFFF" w:sz="0"/>
-            <w:left w:val="none" w:color="FFFFFF" w:sz="0"/>
-            <w:bottom w:val="none" w:color="FFFFFF" w:sz="0"/>
-            <w:right w:val="none" w:color="FFFFFF" w:sz="0"/>
-          </w:tcBorders>
-          <w:tcMar>
-            <w:top w:type="dxa" w:w="50"/>
-            <w:left w:type="dxa" w:w="90"/>
-            <w:bottom w:type="dxa" w:w="50"/>
-            <w:right w:type="dxa" w:w="90"/>
-          </w:tcMar>
-          <w:vAlign w:val="center"/>
-        </w:tcPr>
-        <w:p>
-          <w:pPr>
-            <w:jc w:val="right"/>
-          </w:pPr>
-          <w:r>
-            <w:drawing>
-              <wp:inline distT="0" distB="0" distL="0" distR="0">
-                <wp:extent cx="1428750" cy="400050"/>
-                <wp:effectExtent t="0" r="0" b="0" l="0"/>
-                <wp:docPr id="1" name="logo" descr="Logo Mecanálisis" title="Mecanálisis"/>
-                <wp:cNvGraphicFramePr>
-                  <a:graphicFrameLocks xmlns:a="http://schemas.openxmlformats.org/drawingml/2006/main" noChangeAspect="1"/>
-                </wp:cNvGraphicFramePr>
-                <a:graphic xmlns:a="http://schemas.openxmlformats.org/drawingml/2006/main">
-                  <a:graphicData uri="http://schemas.openxmlformats.org/drawingml/2006/picture">
-                    <pic:pic xmlns:pic="http://schemas.openxmlformats.org/drawingml/2006/picture">
-                      <pic:nvPicPr>
-                        <pic:cNvPr id="0" name="" descr=""/>
-                        <pic:cNvPicPr>
-                          <a:picLocks noChangeAspect="1" noChangeArrowheads="1"/>
-                        </pic:cNvPicPr>
-                      </pic:nvPicPr>
-                      <pic:blipFill>
-                        <a:blip r:embed="rId0" cstate="none"/>
-                        <a:srcRect/>
-                        <a:stretch>
-                          <a:fillRect/>
-                        </a:stretch>
-                      </pic:blipFill>
-                      <pic:spPr bwMode="auto">
-                        <a:xfrm>
-                          <a:off x="0" y="0"/>
-                          <a:ext cx="1428750" cy="400050"/>
-                        </a:xfrm>
-                        <a:prstGeom prst="rect">
-                          <a:avLst/>
-                        </a:prstGeom>
-                      </pic:spPr>
-                    </pic:pic>
-                  </a:graphicData>
-                </a:graphic>
-              </wp:inline>
-            </w:drawing>
-          </w:r>
-        </w:p>
-      </w:tc>
-    </w:tr>
-  </w:tbl>
-</w:ftr>
-</file>
-
-<file path=word/footer3.xml><?xml version="1.0" encoding="utf-8"?>
 <w:ftr xmlns:wpc="http://schemas.microsoft.com/office/word/2010/wordprocessingCanvas" xmlns:mc="http://schemas.openxmlformats.org/markup-compatibility/2006" xmlns:o="urn:schemas-microsoft-com:office:office" xmlns:r="http://schemas.openxmlformats.org/officeDocument/2006/relationships" xmlns:m="http://schemas.openxmlformats.org/officeDocument/2006/math" xmlns:v="urn:schemas-microsoft-com:vml" xmlns:wp14="http://schemas.microsoft.com/office/word/2010/wordprocessingDrawing" xmlns:wp="http://schemas.openxmlformats.org/drawingml/2006/wordprocessingDrawing" xmlns:w10="urn:schemas-microsoft-com:office:word" xmlns:w="http://schemas.openxmlformats.org/wordprocessingml/2006/main" xmlns:w14="http://schemas.microsoft.com/office/word/2010/wordml" xmlns:w15="http://schemas.microsoft.com/office/word/2012/wordml" xmlns:wpg="http://schemas.microsoft.com/office/word/2010/wordprocessingGroup" xmlns:wpi="http://schemas.microsoft.com/office/word/2010/wordprocessingInk" xmlns:wne="http://schemas.microsoft.com/office/word/2006/wordml" xmlns:wps="http://schemas.microsoft.com/office/word/2010/wordprocessingShape">
   <w:p>
     <w:pPr>
@@ -15851,617 +15539,7 @@
               <w:sz w:val="16"/>
               <w:szCs w:val="16"/>
             </w:rPr>
-            <w:t xml:space="preserve">28/10/2026</w:t>
-          </w:r>
-        </w:p>
-      </w:tc>
-    </w:tr>
-  </w:tbl>
-  <w:p>
-    <w:pPr>
-      <w:spacing w:after="0" w:before="60"/>
-      <w:jc w:val="right"/>
-    </w:pPr>
-    <w:r>
-      <w:rPr>
-        <w:color w:val="6D8289"/>
-        <w:sz w:val="28"/>
-        <w:szCs w:val="28"/>
-      </w:rPr>
-      <w:fldChar w:fldCharType="begin"/>
-      <w:instrText xml:space="preserve">PAGE</w:instrText>
-      <w:fldChar w:fldCharType="separate"/>
-      <w:fldChar w:fldCharType="end"/>
-    </w:r>
-    <w:r>
-      <w:rPr>
-        <w:color w:val="6D8289"/>
-        <w:sz w:val="28"/>
-        <w:szCs w:val="28"/>
-      </w:rPr>
-      <w:t xml:space="preserve">/</w:t>
-    </w:r>
-    <w:r>
-      <w:rPr>
-        <w:color w:val="6D8289"/>
-        <w:sz w:val="28"/>
-        <w:szCs w:val="28"/>
-      </w:rPr>
-      <w:fldChar w:fldCharType="begin"/>
-      <w:instrText xml:space="preserve">NUMPAGES</w:instrText>
-      <w:fldChar w:fldCharType="separate"/>
-      <w:fldChar w:fldCharType="end"/>
-    </w:r>
-  </w:p>
-</w:hdr>
-</file>
-
-<file path=word/header2.xml><?xml version="1.0" encoding="utf-8"?>
-<w:hdr xmlns:wpc="http://schemas.microsoft.com/office/word/2010/wordprocessingCanvas" xmlns:mc="http://schemas.openxmlformats.org/markup-compatibility/2006" xmlns:o="urn:schemas-microsoft-com:office:office" xmlns:r="http://schemas.openxmlformats.org/officeDocument/2006/relationships" xmlns:m="http://schemas.openxmlformats.org/officeDocument/2006/math" xmlns:v="urn:schemas-microsoft-com:vml" xmlns:wp14="http://schemas.microsoft.com/office/word/2010/wordprocessingDrawing" xmlns:wp="http://schemas.openxmlformats.org/drawingml/2006/wordprocessingDrawing" xmlns:w10="urn:schemas-microsoft-com:office:word" xmlns:w="http://schemas.openxmlformats.org/wordprocessingml/2006/main" xmlns:w14="http://schemas.microsoft.com/office/word/2010/wordml" xmlns:w15="http://schemas.microsoft.com/office/word/2012/wordml" xmlns:wpg="http://schemas.microsoft.com/office/word/2010/wordprocessingGroup" xmlns:wpi="http://schemas.microsoft.com/office/word/2010/wordprocessingInk" xmlns:wne="http://schemas.microsoft.com/office/word/2006/wordml" xmlns:wps="http://schemas.microsoft.com/office/word/2010/wordprocessingShape" xmlns:cx="http://schemas.microsoft.com/office/drawing/2014/chartex" xmlns:cx1="http://schemas.microsoft.com/office/drawing/2015/9/8/chartex" xmlns:cx2="http://schemas.microsoft.com/office/drawing/2015/10/21/chartex" xmlns:cx3="http://schemas.microsoft.com/office/drawing/2016/5/9/chartex" xmlns:cx4="http://schemas.microsoft.com/office/drawing/2016/5/10/chartex" xmlns:cx5="http://schemas.microsoft.com/office/drawing/2016/5/11/chartex" xmlns:cx6="http://schemas.microsoft.com/office/drawing/2016/5/12/chartex" xmlns:cx7="http://schemas.microsoft.com/office/drawing/2016/5/13/chartex" xmlns:cx8="http://schemas.microsoft.com/office/drawing/2016/5/14/chartex" xmlns:w16cid="http://schemas.microsoft.com/office/word/2016/wordml/cid" xmlns:w16se="http://schemas.microsoft.com/office/word/2015/wordml/symex">
-  <w:tbl>
-    <w:tblPr>
-      <w:tblW w:type="dxa" w:w="21543"/>
-      <w:tblBorders>
-        <w:top w:val="single" w:color="auto" w:sz="4"/>
-        <w:left w:val="single" w:color="auto" w:sz="4"/>
-        <w:bottom w:val="single" w:color="auto" w:sz="4"/>
-        <w:right w:val="single" w:color="auto" w:sz="4"/>
-        <w:insideH w:val="single" w:color="auto" w:sz="4"/>
-        <w:insideV w:val="single" w:color="auto" w:sz="4"/>
-      </w:tblBorders>
-    </w:tblPr>
-    <w:tblGrid>
-      <w:gridCol w:w="1750"/>
-      <w:gridCol w:w="15805"/>
-      <w:gridCol w:w="1900"/>
-      <w:gridCol w:w="2088"/>
-    </w:tblGrid>
-    <w:tr>
-      <w:tc>
-        <w:tcPr>
-          <w:tcW w:type="dxa" w:w="1750"/>
-          <w:tcBorders>
-            <w:top w:val="none" w:color="FFFFFF" w:sz="0"/>
-            <w:left w:val="none" w:color="FFFFFF" w:sz="0"/>
-            <w:bottom w:val="none" w:color="FFFFFF" w:sz="0"/>
-            <w:right w:val="none" w:color="FFFFFF" w:sz="0"/>
-          </w:tcBorders>
-          <w:tcMar>
-            <w:top w:type="dxa" w:w="50"/>
-            <w:left w:type="dxa" w:w="90"/>
-            <w:bottom w:type="dxa" w:w="50"/>
-            <w:right w:type="dxa" w:w="90"/>
-          </w:tcMar>
-          <w:vAlign w:val="top"/>
-        </w:tcPr>
-        <w:p>
-          <w:pPr>
-            <w:spacing w:after="20"/>
-            <w:jc w:val="left"/>
-          </w:pPr>
-          <w:r>
-            <w:rPr>
-              <w:rFonts w:ascii="Calibri" w:cs="Calibri" w:eastAsia="Calibri" w:hAnsi="Calibri"/>
-              <w:sz w:val="14"/>
-              <w:szCs w:val="14"/>
-            </w:rPr>
-            <w:t xml:space="preserve">TIPO DE DOCUMENTO</w:t>
-          </w:r>
-        </w:p>
-        <w:p>
-          <w:pPr>
-            <w:spacing w:after="20"/>
-            <w:jc w:val="left"/>
-          </w:pPr>
-          <w:r>
-            <w:rPr>
-              <w:rFonts w:ascii="Calibri" w:cs="Calibri" w:eastAsia="Calibri" w:hAnsi="Calibri"/>
-              <w:sz w:val="14"/>
-              <w:szCs w:val="14"/>
-            </w:rPr>
-            <w:t xml:space="preserve">TÍTULO DE DOCUMENTO</w:t>
-          </w:r>
-        </w:p>
-      </w:tc>
-      <w:tc>
-        <w:tcPr>
-          <w:tcW w:type="dxa" w:w="15805"/>
-          <w:tcBorders>
-            <w:top w:val="none" w:color="FFFFFF" w:sz="0"/>
-            <w:left w:val="none" w:color="FFFFFF" w:sz="0"/>
-            <w:bottom w:val="none" w:color="FFFFFF" w:sz="0"/>
-            <w:right w:val="none" w:color="FFFFFF" w:sz="0"/>
-          </w:tcBorders>
-          <w:tcMar>
-            <w:top w:type="dxa" w:w="50"/>
-            <w:left w:type="dxa" w:w="90"/>
-            <w:bottom w:type="dxa" w:w="50"/>
-            <w:right w:type="dxa" w:w="90"/>
-          </w:tcMar>
-          <w:vAlign w:val="top"/>
-        </w:tcPr>
-        <w:p>
-          <w:pPr>
-            <w:spacing w:after="0"/>
-            <w:jc w:val="left"/>
-          </w:pPr>
-          <w:r>
-            <w:rPr>
-              <w:rFonts w:ascii="Calibri" w:cs="Calibri" w:eastAsia="Calibri" w:hAnsi="Calibri"/>
-              <w:b/>
-              <w:bCs/>
-              <w:color w:val="6D8289"/>
-              <w:sz w:val="16"/>
-              <w:szCs w:val="16"/>
-            </w:rPr>
-            <w:t xml:space="preserve">PROCEDIMIENTO</w:t>
-          </w:r>
-        </w:p>
-        <w:p>
-          <w:pPr>
-            <w:spacing w:after="0"/>
-            <w:jc w:val="left"/>
-          </w:pPr>
-          <w:r>
-            <w:rPr>
-              <w:rFonts w:ascii="Calibri" w:cs="Calibri" w:eastAsia="Calibri" w:hAnsi="Calibri"/>
-              <w:b/>
-              <w:bCs/>
-              <w:color w:val="6D8289"/>
-              <w:sz w:val="16"/>
-              <w:szCs w:val="16"/>
-            </w:rPr>
-            <w:t xml:space="preserve">INSPECCIÓN ROBOTIZADA GRIS</w:t>
-          </w:r>
-        </w:p>
-        <w:p>
-          <w:pPr>
-            <w:spacing w:after="0"/>
-            <w:jc w:val="left"/>
-          </w:pPr>
-          <w:r>
-            <w:rPr>
-              <w:rFonts w:ascii="Calibri" w:cs="Calibri" w:eastAsia="Calibri" w:hAnsi="Calibri"/>
-              <w:b/>
-              <w:bCs/>
-              <w:color w:val="6D8289"/>
-              <w:sz w:val="16"/>
-              <w:szCs w:val="16"/>
-            </w:rPr>
-            <w:t xml:space="preserve">ENSAYOS EL CID Y WTT EN ENTREHIERRO</w:t>
-          </w:r>
-        </w:p>
-      </w:tc>
-      <w:tc>
-        <w:tcPr>
-          <w:tcW w:type="dxa" w:w="1900"/>
-          <w:tcBorders>
-            <w:top w:val="none" w:color="FFFFFF" w:sz="0"/>
-            <w:left w:val="none" w:color="FFFFFF" w:sz="0"/>
-            <w:bottom w:val="none" w:color="FFFFFF" w:sz="0"/>
-            <w:right w:val="none" w:color="FFFFFF" w:sz="0"/>
-          </w:tcBorders>
-          <w:tcMar>
-            <w:top w:type="dxa" w:w="50"/>
-            <w:left w:type="dxa" w:w="90"/>
-            <w:bottom w:type="dxa" w:w="50"/>
-            <w:right w:type="dxa" w:w="90"/>
-          </w:tcMar>
-          <w:vAlign w:val="top"/>
-        </w:tcPr>
-        <w:p>
-          <w:pPr>
-            <w:spacing w:after="40" w:before="40"/>
-            <w:jc w:val="right"/>
-          </w:pPr>
-          <w:r>
-            <w:rPr>
-              <w:sz w:val="14"/>
-              <w:szCs w:val="14"/>
-            </w:rPr>
-            <w:t xml:space="preserve">CÓDIGO</w:t>
-          </w:r>
-        </w:p>
-        <w:p>
-          <w:pPr>
-            <w:spacing w:after="20"/>
-            <w:jc w:val="right"/>
-          </w:pPr>
-          <w:r>
-            <w:rPr>
-              <w:rFonts w:ascii="Calibri" w:cs="Calibri" w:eastAsia="Calibri" w:hAnsi="Calibri"/>
-              <w:sz w:val="14"/>
-              <w:szCs w:val="14"/>
-            </w:rPr>
-            <w:t xml:space="preserve">VERSIÓN</w:t>
-          </w:r>
-        </w:p>
-        <w:p>
-          <w:pPr>
-            <w:spacing w:after="20"/>
-            <w:jc w:val="right"/>
-          </w:pPr>
-          <w:r>
-            <w:rPr>
-              <w:rFonts w:ascii="Calibri" w:cs="Calibri" w:eastAsia="Calibri" w:hAnsi="Calibri"/>
-              <w:sz w:val="14"/>
-              <w:szCs w:val="14"/>
-            </w:rPr>
-            <w:t xml:space="preserve">FECHA DE REVISIÓN</w:t>
-          </w:r>
-        </w:p>
-      </w:tc>
-      <w:tc>
-        <w:tcPr>
-          <w:tcW w:type="dxa" w:w="2088"/>
-          <w:tcBorders>
-            <w:top w:val="none" w:color="FFFFFF" w:sz="0"/>
-            <w:left w:val="none" w:color="FFFFFF" w:sz="0"/>
-            <w:bottom w:val="none" w:color="FFFFFF" w:sz="0"/>
-            <w:right w:val="single" w:color="E36C0A" w:sz="12"/>
-          </w:tcBorders>
-          <w:tcMar>
-            <w:top w:type="dxa" w:w="50"/>
-            <w:left w:type="dxa" w:w="90"/>
-            <w:bottom w:type="dxa" w:w="50"/>
-            <w:right w:type="dxa" w:w="90"/>
-          </w:tcMar>
-          <w:vAlign w:val="top"/>
-        </w:tcPr>
-        <w:p>
-          <w:pPr>
-            <w:spacing w:after="0"/>
-            <w:jc w:val="right"/>
-          </w:pPr>
-          <w:r>
-            <w:rPr>
-              <w:rFonts w:ascii="Calibri" w:cs="Calibri" w:eastAsia="Calibri" w:hAnsi="Calibri"/>
-              <w:b/>
-              <w:bCs/>
-              <w:color w:val="E36C0A"/>
-              <w:sz w:val="22"/>
-              <w:szCs w:val="22"/>
-            </w:rPr>
-            <w:t xml:space="preserve">00503-00-EPG001</w:t>
-          </w:r>
-        </w:p>
-        <w:p>
-          <w:pPr>
-            <w:spacing w:after="0"/>
-            <w:jc w:val="right"/>
-          </w:pPr>
-          <w:r>
-            <w:rPr>
-              <w:rFonts w:ascii="Calibri" w:cs="Calibri" w:eastAsia="Calibri" w:hAnsi="Calibri"/>
-              <w:b/>
-              <w:bCs/>
-              <w:color w:val="E36C0A"/>
-              <w:sz w:val="16"/>
-              <w:szCs w:val="16"/>
-            </w:rPr>
-            <w:t xml:space="preserve">00</w:t>
-          </w:r>
-        </w:p>
-        <w:p>
-          <w:pPr>
-            <w:spacing w:after="0"/>
-            <w:jc w:val="right"/>
-          </w:pPr>
-          <w:r>
-            <w:rPr>
-              <w:rFonts w:ascii="Calibri" w:cs="Calibri" w:eastAsia="Calibri" w:hAnsi="Calibri"/>
-              <w:b/>
-              <w:bCs/>
-              <w:color w:val="E36C0A"/>
-              <w:sz w:val="16"/>
-              <w:szCs w:val="16"/>
-            </w:rPr>
-            <w:t xml:space="preserve">28/10/2026</w:t>
-          </w:r>
-        </w:p>
-      </w:tc>
-    </w:tr>
-  </w:tbl>
-  <w:p>
-    <w:pPr>
-      <w:spacing w:after="0" w:before="60"/>
-      <w:jc w:val="right"/>
-    </w:pPr>
-    <w:r>
-      <w:rPr>
-        <w:color w:val="6D8289"/>
-        <w:sz w:val="28"/>
-        <w:szCs w:val="28"/>
-      </w:rPr>
-      <w:fldChar w:fldCharType="begin"/>
-      <w:instrText xml:space="preserve">PAGE</w:instrText>
-      <w:fldChar w:fldCharType="separate"/>
-      <w:fldChar w:fldCharType="end"/>
-    </w:r>
-    <w:r>
-      <w:rPr>
-        <w:color w:val="6D8289"/>
-        <w:sz w:val="28"/>
-        <w:szCs w:val="28"/>
-      </w:rPr>
-      <w:t xml:space="preserve">/</w:t>
-    </w:r>
-    <w:r>
-      <w:rPr>
-        <w:color w:val="6D8289"/>
-        <w:sz w:val="28"/>
-        <w:szCs w:val="28"/>
-      </w:rPr>
-      <w:fldChar w:fldCharType="begin"/>
-      <w:instrText xml:space="preserve">NUMPAGES</w:instrText>
-      <w:fldChar w:fldCharType="separate"/>
-      <w:fldChar w:fldCharType="end"/>
-    </w:r>
-  </w:p>
-</w:hdr>
-</file>
-
-<file path=word/header3.xml><?xml version="1.0" encoding="utf-8"?>
-<w:hdr xmlns:wpc="http://schemas.microsoft.com/office/word/2010/wordprocessingCanvas" xmlns:mc="http://schemas.openxmlformats.org/markup-compatibility/2006" xmlns:o="urn:schemas-microsoft-com:office:office" xmlns:r="http://schemas.openxmlformats.org/officeDocument/2006/relationships" xmlns:m="http://schemas.openxmlformats.org/officeDocument/2006/math" xmlns:v="urn:schemas-microsoft-com:vml" xmlns:wp14="http://schemas.microsoft.com/office/word/2010/wordprocessingDrawing" xmlns:wp="http://schemas.openxmlformats.org/drawingml/2006/wordprocessingDrawing" xmlns:w10="urn:schemas-microsoft-com:office:word" xmlns:w="http://schemas.openxmlformats.org/wordprocessingml/2006/main" xmlns:w14="http://schemas.microsoft.com/office/word/2010/wordml" xmlns:w15="http://schemas.microsoft.com/office/word/2012/wordml" xmlns:wpg="http://schemas.microsoft.com/office/word/2010/wordprocessingGroup" xmlns:wpi="http://schemas.microsoft.com/office/word/2010/wordprocessingInk" xmlns:wne="http://schemas.microsoft.com/office/word/2006/wordml" xmlns:wps="http://schemas.microsoft.com/office/word/2010/wordprocessingShape" xmlns:cx="http://schemas.microsoft.com/office/drawing/2014/chartex" xmlns:cx1="http://schemas.microsoft.com/office/drawing/2015/9/8/chartex" xmlns:cx2="http://schemas.microsoft.com/office/drawing/2015/10/21/chartex" xmlns:cx3="http://schemas.microsoft.com/office/drawing/2016/5/9/chartex" xmlns:cx4="http://schemas.microsoft.com/office/drawing/2016/5/10/chartex" xmlns:cx5="http://schemas.microsoft.com/office/drawing/2016/5/11/chartex" xmlns:cx6="http://schemas.microsoft.com/office/drawing/2016/5/12/chartex" xmlns:cx7="http://schemas.microsoft.com/office/drawing/2016/5/13/chartex" xmlns:cx8="http://schemas.microsoft.com/office/drawing/2016/5/14/chartex" xmlns:w16cid="http://schemas.microsoft.com/office/word/2016/wordml/cid" xmlns:w16se="http://schemas.microsoft.com/office/word/2015/wordml/symex">
-  <w:tbl>
-    <w:tblPr>
-      <w:tblW w:type="dxa" w:w="9638"/>
-      <w:tblBorders>
-        <w:top w:val="single" w:color="auto" w:sz="4"/>
-        <w:left w:val="single" w:color="auto" w:sz="4"/>
-        <w:bottom w:val="single" w:color="auto" w:sz="4"/>
-        <w:right w:val="single" w:color="auto" w:sz="4"/>
-        <w:insideH w:val="single" w:color="auto" w:sz="4"/>
-        <w:insideV w:val="single" w:color="auto" w:sz="4"/>
-      </w:tblBorders>
-    </w:tblPr>
-    <w:tblGrid>
-      <w:gridCol w:w="1750"/>
-      <w:gridCol w:w="3900"/>
-      <w:gridCol w:w="1900"/>
-      <w:gridCol w:w="2088"/>
-    </w:tblGrid>
-    <w:tr>
-      <w:tc>
-        <w:tcPr>
-          <w:tcW w:type="dxa" w:w="1750"/>
-          <w:tcBorders>
-            <w:top w:val="none" w:color="FFFFFF" w:sz="0"/>
-            <w:left w:val="none" w:color="FFFFFF" w:sz="0"/>
-            <w:bottom w:val="none" w:color="FFFFFF" w:sz="0"/>
-            <w:right w:val="none" w:color="FFFFFF" w:sz="0"/>
-          </w:tcBorders>
-          <w:tcMar>
-            <w:top w:type="dxa" w:w="50"/>
-            <w:left w:type="dxa" w:w="90"/>
-            <w:bottom w:type="dxa" w:w="50"/>
-            <w:right w:type="dxa" w:w="90"/>
-          </w:tcMar>
-          <w:vAlign w:val="top"/>
-        </w:tcPr>
-        <w:p>
-          <w:pPr>
-            <w:spacing w:after="20"/>
-            <w:jc w:val="left"/>
-          </w:pPr>
-          <w:r>
-            <w:rPr>
-              <w:rFonts w:ascii="Calibri" w:cs="Calibri" w:eastAsia="Calibri" w:hAnsi="Calibri"/>
-              <w:sz w:val="14"/>
-              <w:szCs w:val="14"/>
-            </w:rPr>
-            <w:t xml:space="preserve">TIPO DE DOCUMENTO</w:t>
-          </w:r>
-        </w:p>
-        <w:p>
-          <w:pPr>
-            <w:spacing w:after="20"/>
-            <w:jc w:val="left"/>
-          </w:pPr>
-          <w:r>
-            <w:rPr>
-              <w:rFonts w:ascii="Calibri" w:cs="Calibri" w:eastAsia="Calibri" w:hAnsi="Calibri"/>
-              <w:sz w:val="14"/>
-              <w:szCs w:val="14"/>
-            </w:rPr>
-            <w:t xml:space="preserve">TÍTULO DE DOCUMENTO</w:t>
-          </w:r>
-        </w:p>
-      </w:tc>
-      <w:tc>
-        <w:tcPr>
-          <w:tcW w:type="dxa" w:w="3900"/>
-          <w:tcBorders>
-            <w:top w:val="none" w:color="FFFFFF" w:sz="0"/>
-            <w:left w:val="none" w:color="FFFFFF" w:sz="0"/>
-            <w:bottom w:val="none" w:color="FFFFFF" w:sz="0"/>
-            <w:right w:val="none" w:color="FFFFFF" w:sz="0"/>
-          </w:tcBorders>
-          <w:tcMar>
-            <w:top w:type="dxa" w:w="50"/>
-            <w:left w:type="dxa" w:w="90"/>
-            <w:bottom w:type="dxa" w:w="50"/>
-            <w:right w:type="dxa" w:w="90"/>
-          </w:tcMar>
-          <w:vAlign w:val="top"/>
-        </w:tcPr>
-        <w:p>
-          <w:pPr>
-            <w:spacing w:after="0"/>
-            <w:jc w:val="left"/>
-          </w:pPr>
-          <w:r>
-            <w:rPr>
-              <w:rFonts w:ascii="Calibri" w:cs="Calibri" w:eastAsia="Calibri" w:hAnsi="Calibri"/>
-              <w:b/>
-              <w:bCs/>
-              <w:color w:val="6D8289"/>
-              <w:sz w:val="16"/>
-              <w:szCs w:val="16"/>
-            </w:rPr>
-            <w:t xml:space="preserve">PROCEDIMIENTO</w:t>
-          </w:r>
-        </w:p>
-        <w:p>
-          <w:pPr>
-            <w:spacing w:after="0"/>
-            <w:jc w:val="left"/>
-          </w:pPr>
-          <w:r>
-            <w:rPr>
-              <w:rFonts w:ascii="Calibri" w:cs="Calibri" w:eastAsia="Calibri" w:hAnsi="Calibri"/>
-              <w:b/>
-              <w:bCs/>
-              <w:color w:val="6D8289"/>
-              <w:sz w:val="16"/>
-              <w:szCs w:val="16"/>
-            </w:rPr>
-            <w:t xml:space="preserve">INSPECCIÓN ROBOTIZADA GRIS</w:t>
-          </w:r>
-        </w:p>
-        <w:p>
-          <w:pPr>
-            <w:spacing w:after="0"/>
-            <w:jc w:val="left"/>
-          </w:pPr>
-          <w:r>
-            <w:rPr>
-              <w:rFonts w:ascii="Calibri" w:cs="Calibri" w:eastAsia="Calibri" w:hAnsi="Calibri"/>
-              <w:b/>
-              <w:bCs/>
-              <w:color w:val="6D8289"/>
-              <w:sz w:val="16"/>
-              <w:szCs w:val="16"/>
-            </w:rPr>
-            <w:t xml:space="preserve">ENSAYOS EL CID Y WTT EN ENTREHIERRO</w:t>
-          </w:r>
-        </w:p>
-      </w:tc>
-      <w:tc>
-        <w:tcPr>
-          <w:tcW w:type="dxa" w:w="1900"/>
-          <w:tcBorders>
-            <w:top w:val="none" w:color="FFFFFF" w:sz="0"/>
-            <w:left w:val="none" w:color="FFFFFF" w:sz="0"/>
-            <w:bottom w:val="none" w:color="FFFFFF" w:sz="0"/>
-            <w:right w:val="none" w:color="FFFFFF" w:sz="0"/>
-          </w:tcBorders>
-          <w:tcMar>
-            <w:top w:type="dxa" w:w="50"/>
-            <w:left w:type="dxa" w:w="90"/>
-            <w:bottom w:type="dxa" w:w="50"/>
-            <w:right w:type="dxa" w:w="90"/>
-          </w:tcMar>
-          <w:vAlign w:val="top"/>
-        </w:tcPr>
-        <w:p>
-          <w:pPr>
-            <w:spacing w:after="40" w:before="40"/>
-            <w:jc w:val="right"/>
-          </w:pPr>
-          <w:r>
-            <w:rPr>
-              <w:sz w:val="14"/>
-              <w:szCs w:val="14"/>
-            </w:rPr>
-            <w:t xml:space="preserve">CÓDIGO</w:t>
-          </w:r>
-        </w:p>
-        <w:p>
-          <w:pPr>
-            <w:spacing w:after="20"/>
-            <w:jc w:val="right"/>
-          </w:pPr>
-          <w:r>
-            <w:rPr>
-              <w:rFonts w:ascii="Calibri" w:cs="Calibri" w:eastAsia="Calibri" w:hAnsi="Calibri"/>
-              <w:sz w:val="14"/>
-              <w:szCs w:val="14"/>
-            </w:rPr>
-            <w:t xml:space="preserve">VERSIÓN</w:t>
-          </w:r>
-        </w:p>
-        <w:p>
-          <w:pPr>
-            <w:spacing w:after="20"/>
-            <w:jc w:val="right"/>
-          </w:pPr>
-          <w:r>
-            <w:rPr>
-              <w:rFonts w:ascii="Calibri" w:cs="Calibri" w:eastAsia="Calibri" w:hAnsi="Calibri"/>
-              <w:sz w:val="14"/>
-              <w:szCs w:val="14"/>
-            </w:rPr>
-            <w:t xml:space="preserve">FECHA DE REVISIÓN</w:t>
-          </w:r>
-        </w:p>
-      </w:tc>
-      <w:tc>
-        <w:tcPr>
-          <w:tcW w:type="dxa" w:w="2088"/>
-          <w:tcBorders>
-            <w:top w:val="none" w:color="FFFFFF" w:sz="0"/>
-            <w:left w:val="none" w:color="FFFFFF" w:sz="0"/>
-            <w:bottom w:val="none" w:color="FFFFFF" w:sz="0"/>
-            <w:right w:val="single" w:color="E36C0A" w:sz="12"/>
-          </w:tcBorders>
-          <w:tcMar>
-            <w:top w:type="dxa" w:w="50"/>
-            <w:left w:type="dxa" w:w="90"/>
-            <w:bottom w:type="dxa" w:w="50"/>
-            <w:right w:type="dxa" w:w="90"/>
-          </w:tcMar>
-          <w:vAlign w:val="top"/>
-        </w:tcPr>
-        <w:p>
-          <w:pPr>
-            <w:spacing w:after="0"/>
-            <w:jc w:val="right"/>
-          </w:pPr>
-          <w:r>
-            <w:rPr>
-              <w:rFonts w:ascii="Calibri" w:cs="Calibri" w:eastAsia="Calibri" w:hAnsi="Calibri"/>
-              <w:b/>
-              <w:bCs/>
-              <w:color w:val="E36C0A"/>
-              <w:sz w:val="22"/>
-              <w:szCs w:val="22"/>
-            </w:rPr>
-            <w:t xml:space="preserve">00503-00-EPG001</w:t>
-          </w:r>
-        </w:p>
-        <w:p>
-          <w:pPr>
-            <w:spacing w:after="0"/>
-            <w:jc w:val="right"/>
-          </w:pPr>
-          <w:r>
-            <w:rPr>
-              <w:rFonts w:ascii="Calibri" w:cs="Calibri" w:eastAsia="Calibri" w:hAnsi="Calibri"/>
-              <w:b/>
-              <w:bCs/>
-              <w:color w:val="E36C0A"/>
-              <w:sz w:val="16"/>
-              <w:szCs w:val="16"/>
-            </w:rPr>
-            <w:t xml:space="preserve">00</w:t>
-          </w:r>
-        </w:p>
-        <w:p>
-          <w:pPr>
-            <w:spacing w:after="0"/>
-            <w:jc w:val="right"/>
-          </w:pPr>
-          <w:r>
-            <w:rPr>
-              <w:rFonts w:ascii="Calibri" w:cs="Calibri" w:eastAsia="Calibri" w:hAnsi="Calibri"/>
-              <w:b/>
-              <w:bCs/>
-              <w:color w:val="E36C0A"/>
-              <w:sz w:val="16"/>
-              <w:szCs w:val="16"/>
-            </w:rPr>
-            <w:t xml:space="preserve">28/10/2026</w:t>
+            <w:t xml:space="preserve">29/10/2026</w:t>
           </w:r>
         </w:p>
       </w:tc>

</xml_diff>

<commit_message>
EPG001: secuencia de puesta en marcha y parada del control box
Apartado 2.8.2 con la Tabla 4 (cartel del control box), contra descargas
electrostáticas: el paso 27 la invoca al conectar el cable principal y el
cierre invoca la parada. Nota de reencendido sin la espera de 2 minutos y
dispositivo de cortocircuito en la Tabla 1.

Co-Authored-By: Claude Opus 5.5 <noreply@anthropic.com>
Claude-Session: https://claude.ai/code/session_01Nz5qZw2jp5HghH6VEfj4aK
</commit_message>
<xml_diff>
--- a/procedimientos_gris/00503-00-EPG001 Procedimiento Inspeccion Robotizada GRIS.docx
+++ b/procedimientos_gris/00503-00-EPG001 Procedimiento Inspeccion Robotizada GRIS.docx
@@ -469,7 +469,7 @@
           <w:sz w:val="19"/>
         </w:rPr>
         <w:tab/>
-        <w:t>11</w:t>
+        <w:t>12</w:t>
       </w:r>
     </w:p>
     <w:p>
@@ -491,7 +491,7 @@
           <w:sz w:val="19"/>
         </w:rPr>
         <w:tab/>
-        <w:t>11</w:t>
+        <w:t>12</w:t>
       </w:r>
     </w:p>
     <w:p>
@@ -536,7 +536,7 @@
           <w:sz w:val="19"/>
         </w:rPr>
         <w:tab/>
-        <w:t>13</w:t>
+        <w:t>14</w:t>
       </w:r>
       <w:r>
         <w:fldChar w:fldCharType="end"/>
@@ -1966,7 +1966,7 @@
                 <w:sz w:val="19"/>
                 <w:szCs w:val="19"/>
               </w:rPr>
-              <w:t xml:space="preserve">Pasada de reconocimiento (paso 31); cuerdas de seguridad con fuerza de tensionado constante.</w:t>
+              <w:t xml:space="preserve">Pasada de reconocimiento (paso 32); cuerdas de seguridad con fuerza de tensionado constante.</w:t>
             </w:r>
           </w:p>
         </w:tc>
@@ -2070,7 +2070,7 @@
                 <w:sz w:val="19"/>
                 <w:szCs w:val="19"/>
               </w:rPr>
-              <w:t xml:space="preserve">Límite de avance axial seguro (paso 33); cuerdas de seguridad.</w:t>
+              <w:t xml:space="preserve">Límite de avance axial seguro (paso 34); cuerdas de seguridad.</w:t>
             </w:r>
           </w:p>
         </w:tc>
@@ -2174,7 +2174,7 @@
                 <w:sz w:val="19"/>
                 <w:szCs w:val="19"/>
               </w:rPr>
-              <w:t xml:space="preserve">Recuperación con las cuerdas de seguridad (paso 27).</w:t>
+              <w:t xml:space="preserve">Recuperación con las cuerdas de seguridad (paso 28).</w:t>
             </w:r>
           </w:p>
         </w:tc>
@@ -2278,7 +2278,7 @@
                 <w:sz w:val="19"/>
                 <w:szCs w:val="19"/>
               </w:rPr>
-              <w:t xml:space="preserve">Riesgo residual evaluado en 00503-00-ZIT003 (todas las posiciones: bajo o muy bajo). Verificación pre y post-ensayo con 00503-00-ZRQ001 (pasos 29 y 48).</w:t>
+              <w:t xml:space="preserve">Riesgo residual evaluado en 00503-00-ZIT003 (todas las posiciones: bajo o muy bajo). Verificación pre y post-ensayo con 00503-00-ZRQ001 (pasos 30 y 49).</w:t>
             </w:r>
           </w:p>
         </w:tc>
@@ -3791,7 +3791,7 @@
                 <w:sz w:val="19"/>
                 <w:szCs w:val="19"/>
               </w:rPr>
-              <w:t xml:space="preserve">21 – 30</w:t>
+              <w:t xml:space="preserve">21 – 31</w:t>
             </w:r>
           </w:p>
         </w:tc>
@@ -3895,7 +3895,7 @@
                 <w:sz w:val="19"/>
                 <w:szCs w:val="19"/>
               </w:rPr>
-              <w:t xml:space="preserve">31 – 36</w:t>
+              <w:t xml:space="preserve">32 – 37</w:t>
             </w:r>
           </w:p>
         </w:tc>
@@ -3999,7 +3999,7 @@
                 <w:sz w:val="19"/>
                 <w:szCs w:val="19"/>
               </w:rPr>
-              <w:t xml:space="preserve">37 – 45</w:t>
+              <w:t xml:space="preserve">38 – 46</w:t>
             </w:r>
           </w:p>
         </w:tc>
@@ -4103,7 +4103,7 @@
                 <w:sz w:val="19"/>
                 <w:szCs w:val="19"/>
               </w:rPr>
-              <w:t xml:space="preserve">46 – 50</w:t>
+              <w:t xml:space="preserve">47 – 52</w:t>
             </w:r>
           </w:p>
         </w:tc>
@@ -4572,6 +4572,77 @@
                 <w:szCs w:val="19"/>
               </w:rPr>
               <w:t xml:space="preserve">Alimentación y control del robot.</w:t>
+            </w:r>
+          </w:p>
+        </w:tc>
+      </w:tr>
+      <w:tr>
+        <w:trPr>
+          <w:cantSplit/>
+        </w:trPr>
+        <w:tc>
+          <w:tcPr>
+            <w:tcW w:type="dxa" w:w="3600"/>
+            <w:tcBorders>
+              <w:top w:val="single" w:color="A6B4B8" w:sz="4"/>
+              <w:left w:val="single" w:color="A6B4B8" w:sz="4"/>
+              <w:bottom w:val="single" w:color="A6B4B8" w:sz="4"/>
+              <w:right w:val="single" w:color="A6B4B8" w:sz="4"/>
+            </w:tcBorders>
+            <w:tcMar>
+              <w:top w:type="dxa" w:w="50"/>
+              <w:left w:type="dxa" w:w="90"/>
+              <w:bottom w:type="dxa" w:w="50"/>
+              <w:right w:type="dxa" w:w="90"/>
+            </w:tcMar>
+            <w:vAlign w:val="top"/>
+          </w:tcPr>
+          <w:p>
+            <w:pPr>
+              <w:spacing w:after="0" w:line="252"/>
+              <w:jc w:val="left"/>
+            </w:pPr>
+            <w:r>
+              <w:rPr>
+                <w:b w:val="false"/>
+                <w:bCs w:val="false"/>
+                <w:sz w:val="19"/>
+                <w:szCs w:val="19"/>
+              </w:rPr>
+              <w:t xml:space="preserve">Dispositivo de cortocircuito del cable principal</w:t>
+            </w:r>
+          </w:p>
+        </w:tc>
+        <w:tc>
+          <w:tcPr>
+            <w:tcW w:type="dxa" w:w="6038"/>
+            <w:tcBorders>
+              <w:top w:val="single" w:color="A6B4B8" w:sz="4"/>
+              <w:left w:val="single" w:color="A6B4B8" w:sz="4"/>
+              <w:bottom w:val="single" w:color="A6B4B8" w:sz="4"/>
+              <w:right w:val="single" w:color="A6B4B8" w:sz="4"/>
+            </w:tcBorders>
+            <w:tcMar>
+              <w:top w:type="dxa" w:w="50"/>
+              <w:left w:type="dxa" w:w="90"/>
+              <w:bottom w:type="dxa" w:w="50"/>
+              <w:right w:type="dxa" w:w="90"/>
+            </w:tcMar>
+            <w:vAlign w:val="top"/>
+          </w:tcPr>
+          <w:p>
+            <w:pPr>
+              <w:spacing w:after="0" w:line="252"/>
+              <w:jc w:val="left"/>
+            </w:pPr>
+            <w:r>
+              <w:rPr>
+                <w:b w:val="false"/>
+                <w:bCs w:val="false"/>
+                <w:sz w:val="19"/>
+                <w:szCs w:val="19"/>
+              </w:rPr>
+              <w:t xml:space="preserve">Protección del robot contra descargas electrostáticas mientras el cable principal no está conectado al control box (Tabla 4).</w:t>
             </w:r>
           </w:p>
         </w:tc>
@@ -9059,7 +9130,7 @@
                 <w:sz w:val="19"/>
                 <w:szCs w:val="19"/>
               </w:rPr>
-              <w:t xml:space="preserve">Paso 45</w:t>
+              <w:t xml:space="preserve">Paso 46</w:t>
             </w:r>
           </w:p>
         </w:tc>
@@ -9957,7 +10028,7 @@
                 <w:sz w:val="19"/>
                 <w:szCs w:val="19"/>
               </w:rPr>
-              <w:t xml:space="preserve">Realizar las conexiones del Anexo A: cable del robot al control box (conector principal) y al tablero EL CID (señal del captor); control box al tablero EL CID (señal de posición); PC GRIS al control box (USB y Ethernet); PC EL CID al tablero EL CID (USB); tablero de excitación (autotransformador, cable de excitación, espira auxiliar y salida al tablero EL CID) y alimentaciones desde la red (regleta de enchufes), respetando el esquema de puesta a tierra.</w:t>
+              <w:t xml:space="preserve">Realizar las conexiones del Anexo A: cable del robot al tablero EL CID (señal del captor); control box al tablero EL CID (señal de posición); PC GRIS al control box (USB y Ethernet); PC EL CID al tablero EL CID (USB); tablero de excitación (autotransformador, cable de excitación, espira auxiliar y salida al tablero EL CID) y alimentaciones desde la red (regleta de enchufes), respetando el esquema de puesta a tierra.</w:t>
             </w:r>
           </w:p>
         </w:tc>
@@ -10061,7 +10132,7 @@
                 <w:sz w:val="19"/>
                 <w:szCs w:val="19"/>
               </w:rPr>
-              <w:t xml:space="preserve">Instalar las cuerdas de seguridad del robot y atarlas al punto de amarre con un nudo ocho reconstruido. Verificar el nudo según la Tabla 3.</w:t>
+              <w:t xml:space="preserve">Poner en marcha el control box y conectar el cable principal del robot siguiendo la secuencia de la Tabla 4, que protege los componentes del robot contra descargas electrostáticas. Repetir la secuencia cada vez que se conecte el cable principal.</w:t>
             </w:r>
           </w:p>
         </w:tc>
@@ -10094,7 +10165,7 @@
                 <w:sz w:val="19"/>
                 <w:szCs w:val="19"/>
               </w:rPr>
-              <w:t xml:space="preserve">Figura 1 / Tabla 3</w:t>
+              <w:t xml:space="preserve">Tabla 4</w:t>
             </w:r>
           </w:p>
         </w:tc>
@@ -10165,7 +10236,7 @@
                 <w:sz w:val="19"/>
                 <w:szCs w:val="19"/>
               </w:rPr>
-              <w:t xml:space="preserve">Configurar en ELCSoft los parámetros del ensayo y el paso de registro EL CID (recomendado: 7 mm). Configurar el paso de adquisición automática de fotografías y el paso de muestreo WTT.</w:t>
+              <w:t xml:space="preserve">Instalar las cuerdas de seguridad del robot y atarlas al punto de amarre con un nudo ocho reconstruido. Verificar el nudo según la Tabla 3.</w:t>
             </w:r>
           </w:p>
         </w:tc>
@@ -10198,7 +10269,7 @@
                 <w:sz w:val="19"/>
                 <w:szCs w:val="19"/>
               </w:rPr>
-              <w:t xml:space="preserve">00503-00-EPG002 – Protocolo 3 / 00503-00-EPG003, apartados 4.4 y 5.3</w:t>
+              <w:t xml:space="preserve">Figura 1 / Tabla 3</w:t>
             </w:r>
           </w:p>
         </w:tc>
@@ -10269,7 +10340,7 @@
                 <w:sz w:val="19"/>
                 <w:szCs w:val="19"/>
               </w:rPr>
-              <w:t xml:space="preserve">Realizar la verificación pre-ensayo de desprendimiento de piezas del robot y registrarla en el checklist antes de introducir el robot.</w:t>
+              <w:t xml:space="preserve">Configurar en ELCSoft los parámetros del ensayo y el paso de registro EL CID (recomendado: 7 mm). Configurar el paso de adquisición automática de fotografías y el paso de muestreo WTT.</w:t>
             </w:r>
           </w:p>
         </w:tc>
@@ -10302,7 +10373,7 @@
                 <w:sz w:val="19"/>
                 <w:szCs w:val="19"/>
               </w:rPr>
-              <w:t xml:space="preserve">00503-00-ZRQ001 (Pre-Test)</w:t>
+              <w:t xml:space="preserve">00503-00-EPG002 – Protocolo 3 / 00503-00-EPG003, apartados 4.4 y 5.3</w:t>
             </w:r>
           </w:p>
         </w:tc>
@@ -10341,6 +10412,110 @@
                 <w:szCs w:val="19"/>
               </w:rPr>
               <w:t xml:space="preserve">30</w:t>
+            </w:r>
+          </w:p>
+        </w:tc>
+        <w:tc>
+          <w:tcPr>
+            <w:tcW w:type="dxa" w:w="6878"/>
+            <w:tcBorders>
+              <w:top w:val="single" w:color="A6B4B8" w:sz="4"/>
+              <w:left w:val="single" w:color="A6B4B8" w:sz="4"/>
+              <w:bottom w:val="single" w:color="A6B4B8" w:sz="4"/>
+              <w:right w:val="single" w:color="A6B4B8" w:sz="4"/>
+            </w:tcBorders>
+            <w:tcMar>
+              <w:top w:type="dxa" w:w="50"/>
+              <w:left w:type="dxa" w:w="90"/>
+              <w:bottom w:type="dxa" w:w="50"/>
+              <w:right w:type="dxa" w:w="90"/>
+            </w:tcMar>
+            <w:vAlign w:val="top"/>
+          </w:tcPr>
+          <w:p>
+            <w:pPr>
+              <w:spacing w:after="0" w:line="252"/>
+              <w:jc w:val="left"/>
+            </w:pPr>
+            <w:r>
+              <w:rPr>
+                <w:b w:val="false"/>
+                <w:bCs w:val="false"/>
+                <w:sz w:val="19"/>
+                <w:szCs w:val="19"/>
+              </w:rPr>
+              <w:t xml:space="preserve">Realizar la verificación pre-ensayo de desprendimiento de piezas del robot y registrarla en el checklist antes de introducir el robot.</w:t>
+            </w:r>
+          </w:p>
+        </w:tc>
+        <w:tc>
+          <w:tcPr>
+            <w:tcW w:type="dxa" w:w="2200"/>
+            <w:tcBorders>
+              <w:top w:val="single" w:color="A6B4B8" w:sz="4"/>
+              <w:left w:val="single" w:color="A6B4B8" w:sz="4"/>
+              <w:bottom w:val="single" w:color="A6B4B8" w:sz="4"/>
+              <w:right w:val="single" w:color="A6B4B8" w:sz="4"/>
+            </w:tcBorders>
+            <w:tcMar>
+              <w:top w:type="dxa" w:w="50"/>
+              <w:left w:type="dxa" w:w="90"/>
+              <w:bottom w:type="dxa" w:w="50"/>
+              <w:right w:type="dxa" w:w="90"/>
+            </w:tcMar>
+            <w:vAlign w:val="top"/>
+          </w:tcPr>
+          <w:p>
+            <w:pPr>
+              <w:spacing w:after="0" w:line="252"/>
+              <w:jc w:val="left"/>
+            </w:pPr>
+            <w:r>
+              <w:rPr>
+                <w:b w:val="false"/>
+                <w:bCs w:val="false"/>
+                <w:sz w:val="19"/>
+                <w:szCs w:val="19"/>
+              </w:rPr>
+              <w:t xml:space="preserve">00503-00-ZRQ001 (Pre-Test)</w:t>
+            </w:r>
+          </w:p>
+        </w:tc>
+      </w:tr>
+      <w:tr>
+        <w:trPr>
+          <w:cantSplit/>
+        </w:trPr>
+        <w:tc>
+          <w:tcPr>
+            <w:tcW w:type="dxa" w:w="560"/>
+            <w:tcBorders>
+              <w:top w:val="single" w:color="A6B4B8" w:sz="4"/>
+              <w:left w:val="single" w:color="A6B4B8" w:sz="4"/>
+              <w:bottom w:val="single" w:color="A6B4B8" w:sz="4"/>
+              <w:right w:val="single" w:color="A6B4B8" w:sz="4"/>
+            </w:tcBorders>
+            <w:tcMar>
+              <w:top w:type="dxa" w:w="50"/>
+              <w:left w:type="dxa" w:w="90"/>
+              <w:bottom w:type="dxa" w:w="50"/>
+              <w:right w:type="dxa" w:w="90"/>
+            </w:tcMar>
+            <w:vAlign w:val="top"/>
+          </w:tcPr>
+          <w:p>
+            <w:pPr>
+              <w:spacing w:after="0" w:line="252"/>
+              <w:jc w:val="center"/>
+            </w:pPr>
+            <w:r>
+              <w:rPr>
+                <w:b/>
+                <w:bCs/>
+                <w:sz w:val="19"/>
+                <w:szCs w:val="19"/>
+              </w:rPr>
+              <w:t xml:space="preserve">31</w:t>
             </w:r>
           </w:p>
         </w:tc>
@@ -10429,7 +10604,7 @@
         <w:jc w:val="both"/>
       </w:pPr>
       <w:r>
-        <w:t xml:space="preserve">Las cuerdas de seguridad (3 mm) se atan al ojal del robot con un nudo ocho reconstruido (paso 27), que no se corre ni se desata con los tirones ni con las vibraciones del ensayo. Se ata según la Figura 1 y se verifica con la Tabla 3.</w:t>
+        <w:t xml:space="preserve">Las cuerdas de seguridad (3 mm) se atan al ojal del robot con un nudo ocho reconstruido (paso 28), que no se corre ni se desata con los tirones ni con las vibraciones del ensayo. Se ata según la Figura 1 y se verifica con la Tabla 3.</w:t>
       </w:r>
     </w:p>
     <w:p>
@@ -11025,6 +11200,1466 @@
     </w:tbl>
     <w:p>
       <w:pPr>
+        <w:pStyle w:val="Heading3"/>
+        <w:keepNext/>
+        <w:spacing w:after="80" w:before="160"/>
+      </w:pPr>
+      <w:r>
+        <w:t xml:space="preserve">2.8.2 Puesta en marcha y parada del control box</w:t>
+      </w:r>
+    </w:p>
+    <w:p>
+      <w:pPr>
+        <w:keepNext/>
+        <w:spacing w:after="100" w:line="264"/>
+        <w:jc w:val="both"/>
+      </w:pPr>
+      <w:r>
+        <w:t xml:space="preserve">Para reducir el riesgo de que una descarga electrostática dañe los componentes del robot, el cable principal se conecta y se desconecta siempre con la llave del control box en ABIERTO (OFF) y en el orden de la Tabla 4: mientras el cable no está conectado al control box, lleva colocado el dispositivo de cortocircuito conectado a tierra. La secuencia de puesta en marcha se aplica cada vez que se conecta el cable principal (paso 27) y la de parada, cada vez que se desconecta.</w:t>
+      </w:r>
+    </w:p>
+    <w:p>
+      <w:pPr>
+        <w:keepNext/>
+        <w:spacing w:after="100" w:line="264"/>
+        <w:jc w:val="both"/>
+      </w:pPr>
+      <w:r>
+        <w:rPr>
+          <w:b/>
+          <w:bCs/>
+        </w:rPr>
+        <w:t xml:space="preserve">Tabla 4: Secuencias de puesta en marcha y de parada del control box.</w:t>
+      </w:r>
+    </w:p>
+    <w:tbl>
+      <w:tblPr>
+        <w:tblW w:type="dxa" w:w="9638"/>
+        <w:tblBorders>
+          <w:top w:val="single" w:color="auto" w:sz="4"/>
+          <w:left w:val="single" w:color="auto" w:sz="4"/>
+          <w:bottom w:val="single" w:color="auto" w:sz="4"/>
+          <w:right w:val="single" w:color="auto" w:sz="4"/>
+          <w:insideH w:val="single" w:color="auto" w:sz="4"/>
+          <w:insideV w:val="single" w:color="auto" w:sz="4"/>
+        </w:tblBorders>
+      </w:tblPr>
+      <w:tblGrid>
+        <w:gridCol w:w="700"/>
+        <w:gridCol w:w="8938"/>
+      </w:tblGrid>
+      <w:tr>
+        <w:trPr>
+          <w:cantSplit/>
+          <w:tblHeader/>
+        </w:trPr>
+        <w:tc>
+          <w:tcPr>
+            <w:tcW w:type="dxa" w:w="700"/>
+            <w:tcBorders>
+              <w:top w:val="single" w:color="A6B4B8" w:sz="4"/>
+              <w:left w:val="single" w:color="A6B4B8" w:sz="4"/>
+              <w:bottom w:val="single" w:color="A6B4B8" w:sz="4"/>
+              <w:right w:val="single" w:color="A6B4B8" w:sz="4"/>
+            </w:tcBorders>
+            <w:shd w:fill="DAE0E2" w:val="clear"/>
+            <w:tcMar>
+              <w:top w:type="dxa" w:w="50"/>
+              <w:left w:type="dxa" w:w="90"/>
+              <w:bottom w:type="dxa" w:w="50"/>
+              <w:right w:type="dxa" w:w="90"/>
+            </w:tcMar>
+            <w:vAlign w:val="center"/>
+          </w:tcPr>
+          <w:p>
+            <w:pPr>
+              <w:keepNext/>
+              <w:spacing w:after="0" w:line="252"/>
+              <w:jc w:val="left"/>
+            </w:pPr>
+            <w:r>
+              <w:rPr>
+                <w:b/>
+                <w:bCs/>
+                <w:sz w:val="19"/>
+                <w:szCs w:val="19"/>
+              </w:rPr>
+              <w:t xml:space="preserve">Nº</w:t>
+            </w:r>
+          </w:p>
+        </w:tc>
+        <w:tc>
+          <w:tcPr>
+            <w:tcW w:type="dxa" w:w="8938"/>
+            <w:tcBorders>
+              <w:top w:val="single" w:color="A6B4B8" w:sz="4"/>
+              <w:left w:val="single" w:color="A6B4B8" w:sz="4"/>
+              <w:bottom w:val="single" w:color="A6B4B8" w:sz="4"/>
+              <w:right w:val="single" w:color="A6B4B8" w:sz="4"/>
+            </w:tcBorders>
+            <w:shd w:fill="DAE0E2" w:val="clear"/>
+            <w:tcMar>
+              <w:top w:type="dxa" w:w="50"/>
+              <w:left w:type="dxa" w:w="90"/>
+              <w:bottom w:type="dxa" w:w="50"/>
+              <w:right w:type="dxa" w:w="90"/>
+            </w:tcMar>
+            <w:vAlign w:val="center"/>
+          </w:tcPr>
+          <w:p>
+            <w:pPr>
+              <w:keepNext/>
+              <w:spacing w:after="0" w:line="252"/>
+              <w:jc w:val="left"/>
+            </w:pPr>
+            <w:r>
+              <w:rPr>
+                <w:b/>
+                <w:bCs/>
+                <w:sz w:val="19"/>
+                <w:szCs w:val="19"/>
+              </w:rPr>
+              <w:t xml:space="preserve">Puesta en marcha</w:t>
+            </w:r>
+          </w:p>
+        </w:tc>
+      </w:tr>
+      <w:tr>
+        <w:trPr>
+          <w:cantSplit/>
+        </w:trPr>
+        <w:tc>
+          <w:tcPr>
+            <w:tcW w:type="dxa" w:w="700"/>
+            <w:tcBorders>
+              <w:top w:val="single" w:color="A6B4B8" w:sz="4"/>
+              <w:left w:val="single" w:color="A6B4B8" w:sz="4"/>
+              <w:bottom w:val="single" w:color="A6B4B8" w:sz="4"/>
+              <w:right w:val="single" w:color="A6B4B8" w:sz="4"/>
+            </w:tcBorders>
+            <w:tcMar>
+              <w:top w:type="dxa" w:w="50"/>
+              <w:left w:type="dxa" w:w="90"/>
+              <w:bottom w:type="dxa" w:w="50"/>
+              <w:right w:type="dxa" w:w="90"/>
+            </w:tcMar>
+            <w:vAlign w:val="top"/>
+          </w:tcPr>
+          <w:p>
+            <w:pPr>
+              <w:keepNext/>
+              <w:spacing w:after="0" w:line="252"/>
+              <w:jc w:val="left"/>
+            </w:pPr>
+            <w:r>
+              <w:rPr>
+                <w:b w:val="false"/>
+                <w:bCs w:val="false"/>
+                <w:sz w:val="19"/>
+                <w:szCs w:val="19"/>
+              </w:rPr>
+              <w:t xml:space="preserve">1</w:t>
+            </w:r>
+          </w:p>
+        </w:tc>
+        <w:tc>
+          <w:tcPr>
+            <w:tcW w:type="dxa" w:w="8938"/>
+            <w:tcBorders>
+              <w:top w:val="single" w:color="A6B4B8" w:sz="4"/>
+              <w:left w:val="single" w:color="A6B4B8" w:sz="4"/>
+              <w:bottom w:val="single" w:color="A6B4B8" w:sz="4"/>
+              <w:right w:val="single" w:color="A6B4B8" w:sz="4"/>
+            </w:tcBorders>
+            <w:tcMar>
+              <w:top w:type="dxa" w:w="50"/>
+              <w:left w:type="dxa" w:w="90"/>
+              <w:bottom w:type="dxa" w:w="50"/>
+              <w:right w:type="dxa" w:w="90"/>
+            </w:tcMar>
+            <w:vAlign w:val="top"/>
+          </w:tcPr>
+          <w:p>
+            <w:pPr>
+              <w:keepNext/>
+              <w:spacing w:after="0" w:line="252"/>
+              <w:jc w:val="left"/>
+            </w:pPr>
+            <w:r>
+              <w:rPr>
+                <w:b w:val="false"/>
+                <w:bCs w:val="false"/>
+                <w:sz w:val="19"/>
+                <w:szCs w:val="19"/>
+              </w:rPr>
+              <w:t xml:space="preserve">Colocar el dispositivo de cortocircuito en el cable principal y conectarlo a tierra.</w:t>
+            </w:r>
+          </w:p>
+        </w:tc>
+      </w:tr>
+      <w:tr>
+        <w:trPr>
+          <w:cantSplit/>
+        </w:trPr>
+        <w:tc>
+          <w:tcPr>
+            <w:tcW w:type="dxa" w:w="700"/>
+            <w:tcBorders>
+              <w:top w:val="single" w:color="A6B4B8" w:sz="4"/>
+              <w:left w:val="single" w:color="A6B4B8" w:sz="4"/>
+              <w:bottom w:val="single" w:color="A6B4B8" w:sz="4"/>
+              <w:right w:val="single" w:color="A6B4B8" w:sz="4"/>
+            </w:tcBorders>
+            <w:tcMar>
+              <w:top w:type="dxa" w:w="50"/>
+              <w:left w:type="dxa" w:w="90"/>
+              <w:bottom w:type="dxa" w:w="50"/>
+              <w:right w:type="dxa" w:w="90"/>
+            </w:tcMar>
+            <w:vAlign w:val="top"/>
+          </w:tcPr>
+          <w:p>
+            <w:pPr>
+              <w:keepNext/>
+              <w:spacing w:after="0" w:line="252"/>
+              <w:jc w:val="left"/>
+            </w:pPr>
+            <w:r>
+              <w:rPr>
+                <w:b w:val="false"/>
+                <w:bCs w:val="false"/>
+                <w:sz w:val="19"/>
+                <w:szCs w:val="19"/>
+              </w:rPr>
+              <w:t xml:space="preserve">2</w:t>
+            </w:r>
+          </w:p>
+        </w:tc>
+        <w:tc>
+          <w:tcPr>
+            <w:tcW w:type="dxa" w:w="8938"/>
+            <w:tcBorders>
+              <w:top w:val="single" w:color="A6B4B8" w:sz="4"/>
+              <w:left w:val="single" w:color="A6B4B8" w:sz="4"/>
+              <w:bottom w:val="single" w:color="A6B4B8" w:sz="4"/>
+              <w:right w:val="single" w:color="A6B4B8" w:sz="4"/>
+            </w:tcBorders>
+            <w:tcMar>
+              <w:top w:type="dxa" w:w="50"/>
+              <w:left w:type="dxa" w:w="90"/>
+              <w:bottom w:type="dxa" w:w="50"/>
+              <w:right w:type="dxa" w:w="90"/>
+            </w:tcMar>
+            <w:vAlign w:val="top"/>
+          </w:tcPr>
+          <w:p>
+            <w:pPr>
+              <w:keepNext/>
+              <w:spacing w:after="0" w:line="252"/>
+              <w:jc w:val="left"/>
+            </w:pPr>
+            <w:r>
+              <w:rPr>
+                <w:b w:val="false"/>
+                <w:bCs w:val="false"/>
+                <w:sz w:val="19"/>
+                <w:szCs w:val="19"/>
+              </w:rPr>
+              <w:t xml:space="preserve">Conectar el control box a la red eléctrica.</w:t>
+            </w:r>
+          </w:p>
+        </w:tc>
+      </w:tr>
+      <w:tr>
+        <w:trPr>
+          <w:cantSplit/>
+        </w:trPr>
+        <w:tc>
+          <w:tcPr>
+            <w:tcW w:type="dxa" w:w="700"/>
+            <w:tcBorders>
+              <w:top w:val="single" w:color="A6B4B8" w:sz="4"/>
+              <w:left w:val="single" w:color="A6B4B8" w:sz="4"/>
+              <w:bottom w:val="single" w:color="A6B4B8" w:sz="4"/>
+              <w:right w:val="single" w:color="A6B4B8" w:sz="4"/>
+            </w:tcBorders>
+            <w:tcMar>
+              <w:top w:type="dxa" w:w="50"/>
+              <w:left w:type="dxa" w:w="90"/>
+              <w:bottom w:type="dxa" w:w="50"/>
+              <w:right w:type="dxa" w:w="90"/>
+            </w:tcMar>
+            <w:vAlign w:val="top"/>
+          </w:tcPr>
+          <w:p>
+            <w:pPr>
+              <w:keepNext/>
+              <w:spacing w:after="0" w:line="252"/>
+              <w:jc w:val="left"/>
+            </w:pPr>
+            <w:r>
+              <w:rPr>
+                <w:b w:val="false"/>
+                <w:bCs w:val="false"/>
+                <w:sz w:val="19"/>
+                <w:szCs w:val="19"/>
+              </w:rPr>
+              <w:t xml:space="preserve">3</w:t>
+            </w:r>
+          </w:p>
+        </w:tc>
+        <w:tc>
+          <w:tcPr>
+            <w:tcW w:type="dxa" w:w="8938"/>
+            <w:tcBorders>
+              <w:top w:val="single" w:color="A6B4B8" w:sz="4"/>
+              <w:left w:val="single" w:color="A6B4B8" w:sz="4"/>
+              <w:bottom w:val="single" w:color="A6B4B8" w:sz="4"/>
+              <w:right w:val="single" w:color="A6B4B8" w:sz="4"/>
+            </w:tcBorders>
+            <w:tcMar>
+              <w:top w:type="dxa" w:w="50"/>
+              <w:left w:type="dxa" w:w="90"/>
+              <w:bottom w:type="dxa" w:w="50"/>
+              <w:right w:type="dxa" w:w="90"/>
+            </w:tcMar>
+            <w:vAlign w:val="top"/>
+          </w:tcPr>
+          <w:p>
+            <w:pPr>
+              <w:keepNext/>
+              <w:spacing w:after="0" w:line="252"/>
+              <w:jc w:val="left"/>
+            </w:pPr>
+            <w:r>
+              <w:rPr>
+                <w:b w:val="false"/>
+                <w:bCs w:val="false"/>
+                <w:sz w:val="19"/>
+                <w:szCs w:val="19"/>
+              </w:rPr>
+              <w:t xml:space="preserve">Verificar que la llave del control box esté en ABIERTO (OFF).</w:t>
+            </w:r>
+          </w:p>
+        </w:tc>
+      </w:tr>
+      <w:tr>
+        <w:trPr>
+          <w:cantSplit/>
+        </w:trPr>
+        <w:tc>
+          <w:tcPr>
+            <w:tcW w:type="dxa" w:w="700"/>
+            <w:tcBorders>
+              <w:top w:val="single" w:color="A6B4B8" w:sz="4"/>
+              <w:left w:val="single" w:color="A6B4B8" w:sz="4"/>
+              <w:bottom w:val="single" w:color="A6B4B8" w:sz="4"/>
+              <w:right w:val="single" w:color="A6B4B8" w:sz="4"/>
+            </w:tcBorders>
+            <w:tcMar>
+              <w:top w:type="dxa" w:w="50"/>
+              <w:left w:type="dxa" w:w="90"/>
+              <w:bottom w:type="dxa" w:w="50"/>
+              <w:right w:type="dxa" w:w="90"/>
+            </w:tcMar>
+            <w:vAlign w:val="top"/>
+          </w:tcPr>
+          <w:p>
+            <w:pPr>
+              <w:keepNext/>
+              <w:spacing w:after="0" w:line="252"/>
+              <w:jc w:val="left"/>
+            </w:pPr>
+            <w:r>
+              <w:rPr>
+                <w:b w:val="false"/>
+                <w:bCs w:val="false"/>
+                <w:sz w:val="19"/>
+                <w:szCs w:val="19"/>
+              </w:rPr>
+              <w:t xml:space="preserve">4</w:t>
+            </w:r>
+          </w:p>
+        </w:tc>
+        <w:tc>
+          <w:tcPr>
+            <w:tcW w:type="dxa" w:w="8938"/>
+            <w:tcBorders>
+              <w:top w:val="single" w:color="A6B4B8" w:sz="4"/>
+              <w:left w:val="single" w:color="A6B4B8" w:sz="4"/>
+              <w:bottom w:val="single" w:color="A6B4B8" w:sz="4"/>
+              <w:right w:val="single" w:color="A6B4B8" w:sz="4"/>
+            </w:tcBorders>
+            <w:tcMar>
+              <w:top w:type="dxa" w:w="50"/>
+              <w:left w:type="dxa" w:w="90"/>
+              <w:bottom w:type="dxa" w:w="50"/>
+              <w:right w:type="dxa" w:w="90"/>
+            </w:tcMar>
+            <w:vAlign w:val="top"/>
+          </w:tcPr>
+          <w:p>
+            <w:pPr>
+              <w:keepNext/>
+              <w:spacing w:after="0" w:line="252"/>
+              <w:jc w:val="left"/>
+            </w:pPr>
+            <w:r>
+              <w:rPr>
+                <w:b w:val="false"/>
+                <w:bCs w:val="false"/>
+                <w:sz w:val="19"/>
+                <w:szCs w:val="19"/>
+              </w:rPr>
+              <w:t xml:space="preserve">Conectar los cables USB y Ethernet entre el control box y la PC GRIS.</w:t>
+            </w:r>
+          </w:p>
+        </w:tc>
+      </w:tr>
+      <w:tr>
+        <w:trPr>
+          <w:cantSplit/>
+        </w:trPr>
+        <w:tc>
+          <w:tcPr>
+            <w:tcW w:type="dxa" w:w="700"/>
+            <w:tcBorders>
+              <w:top w:val="single" w:color="A6B4B8" w:sz="4"/>
+              <w:left w:val="single" w:color="A6B4B8" w:sz="4"/>
+              <w:bottom w:val="single" w:color="A6B4B8" w:sz="4"/>
+              <w:right w:val="single" w:color="A6B4B8" w:sz="4"/>
+            </w:tcBorders>
+            <w:tcMar>
+              <w:top w:type="dxa" w:w="50"/>
+              <w:left w:type="dxa" w:w="90"/>
+              <w:bottom w:type="dxa" w:w="50"/>
+              <w:right w:type="dxa" w:w="90"/>
+            </w:tcMar>
+            <w:vAlign w:val="top"/>
+          </w:tcPr>
+          <w:p>
+            <w:pPr>
+              <w:keepNext/>
+              <w:spacing w:after="0" w:line="252"/>
+              <w:jc w:val="left"/>
+            </w:pPr>
+            <w:r>
+              <w:rPr>
+                <w:b w:val="false"/>
+                <w:bCs w:val="false"/>
+                <w:sz w:val="19"/>
+                <w:szCs w:val="19"/>
+              </w:rPr>
+              <w:t xml:space="preserve">5</w:t>
+            </w:r>
+          </w:p>
+        </w:tc>
+        <w:tc>
+          <w:tcPr>
+            <w:tcW w:type="dxa" w:w="8938"/>
+            <w:tcBorders>
+              <w:top w:val="single" w:color="A6B4B8" w:sz="4"/>
+              <w:left w:val="single" w:color="A6B4B8" w:sz="4"/>
+              <w:bottom w:val="single" w:color="A6B4B8" w:sz="4"/>
+              <w:right w:val="single" w:color="A6B4B8" w:sz="4"/>
+            </w:tcBorders>
+            <w:tcMar>
+              <w:top w:type="dxa" w:w="50"/>
+              <w:left w:type="dxa" w:w="90"/>
+              <w:bottom w:type="dxa" w:w="50"/>
+              <w:right w:type="dxa" w:w="90"/>
+            </w:tcMar>
+            <w:vAlign w:val="top"/>
+          </w:tcPr>
+          <w:p>
+            <w:pPr>
+              <w:keepNext/>
+              <w:spacing w:after="0" w:line="252"/>
+              <w:jc w:val="left"/>
+            </w:pPr>
+            <w:r>
+              <w:rPr>
+                <w:b w:val="false"/>
+                <w:bCs w:val="false"/>
+                <w:sz w:val="19"/>
+                <w:szCs w:val="19"/>
+              </w:rPr>
+              <w:t xml:space="preserve">Conectar el cable principal al control box.</w:t>
+            </w:r>
+          </w:p>
+        </w:tc>
+      </w:tr>
+      <w:tr>
+        <w:trPr>
+          <w:cantSplit/>
+        </w:trPr>
+        <w:tc>
+          <w:tcPr>
+            <w:tcW w:type="dxa" w:w="700"/>
+            <w:tcBorders>
+              <w:top w:val="single" w:color="A6B4B8" w:sz="4"/>
+              <w:left w:val="single" w:color="A6B4B8" w:sz="4"/>
+              <w:bottom w:val="single" w:color="A6B4B8" w:sz="4"/>
+              <w:right w:val="single" w:color="A6B4B8" w:sz="4"/>
+            </w:tcBorders>
+            <w:tcMar>
+              <w:top w:type="dxa" w:w="50"/>
+              <w:left w:type="dxa" w:w="90"/>
+              <w:bottom w:type="dxa" w:w="50"/>
+              <w:right w:type="dxa" w:w="90"/>
+            </w:tcMar>
+            <w:vAlign w:val="top"/>
+          </w:tcPr>
+          <w:p>
+            <w:pPr>
+              <w:keepNext/>
+              <w:spacing w:after="0" w:line="252"/>
+              <w:jc w:val="left"/>
+            </w:pPr>
+            <w:r>
+              <w:rPr>
+                <w:b w:val="false"/>
+                <w:bCs w:val="false"/>
+                <w:sz w:val="19"/>
+                <w:szCs w:val="19"/>
+              </w:rPr>
+              <w:t xml:space="preserve">6</w:t>
+            </w:r>
+          </w:p>
+        </w:tc>
+        <w:tc>
+          <w:tcPr>
+            <w:tcW w:type="dxa" w:w="8938"/>
+            <w:tcBorders>
+              <w:top w:val="single" w:color="A6B4B8" w:sz="4"/>
+              <w:left w:val="single" w:color="A6B4B8" w:sz="4"/>
+              <w:bottom w:val="single" w:color="A6B4B8" w:sz="4"/>
+              <w:right w:val="single" w:color="A6B4B8" w:sz="4"/>
+            </w:tcBorders>
+            <w:tcMar>
+              <w:top w:type="dxa" w:w="50"/>
+              <w:left w:type="dxa" w:w="90"/>
+              <w:bottom w:type="dxa" w:w="50"/>
+              <w:right w:type="dxa" w:w="90"/>
+            </w:tcMar>
+            <w:vAlign w:val="top"/>
+          </w:tcPr>
+          <w:p>
+            <w:pPr>
+              <w:keepNext/>
+              <w:spacing w:after="0" w:line="252"/>
+              <w:jc w:val="left"/>
+            </w:pPr>
+            <w:r>
+              <w:rPr>
+                <w:b w:val="false"/>
+                <w:bCs w:val="false"/>
+                <w:sz w:val="19"/>
+                <w:szCs w:val="19"/>
+              </w:rPr>
+              <w:t xml:space="preserve">Retirar</w:t>
+            </w:r>
+            <w:r>
+              <w:rPr>
+                <w:b w:val="false"/>
+                <w:bCs w:val="false"/>
+                <w:sz w:val="19"/>
+                <w:szCs w:val="19"/>
+              </w:rPr>
+              <w:t xml:space="preserve"> el dispositivo de cortocircuito del cable principal.</w:t>
+            </w:r>
+          </w:p>
+        </w:tc>
+      </w:tr>
+      <w:tr>
+        <w:trPr>
+          <w:cantSplit/>
+        </w:trPr>
+        <w:tc>
+          <w:tcPr>
+            <w:tcW w:type="dxa" w:w="700"/>
+            <w:tcBorders>
+              <w:top w:val="single" w:color="A6B4B8" w:sz="4"/>
+              <w:left w:val="single" w:color="A6B4B8" w:sz="4"/>
+              <w:bottom w:val="single" w:color="A6B4B8" w:sz="4"/>
+              <w:right w:val="single" w:color="A6B4B8" w:sz="4"/>
+            </w:tcBorders>
+            <w:tcMar>
+              <w:top w:type="dxa" w:w="50"/>
+              <w:left w:type="dxa" w:w="90"/>
+              <w:bottom w:type="dxa" w:w="50"/>
+              <w:right w:type="dxa" w:w="90"/>
+            </w:tcMar>
+            <w:vAlign w:val="top"/>
+          </w:tcPr>
+          <w:p>
+            <w:pPr>
+              <w:keepNext/>
+              <w:spacing w:after="0" w:line="252"/>
+              <w:jc w:val="left"/>
+            </w:pPr>
+            <w:r>
+              <w:rPr>
+                <w:b w:val="false"/>
+                <w:bCs w:val="false"/>
+                <w:sz w:val="19"/>
+                <w:szCs w:val="19"/>
+              </w:rPr>
+              <w:t xml:space="preserve">7</w:t>
+            </w:r>
+          </w:p>
+        </w:tc>
+        <w:tc>
+          <w:tcPr>
+            <w:tcW w:type="dxa" w:w="8938"/>
+            <w:tcBorders>
+              <w:top w:val="single" w:color="A6B4B8" w:sz="4"/>
+              <w:left w:val="single" w:color="A6B4B8" w:sz="4"/>
+              <w:bottom w:val="single" w:color="A6B4B8" w:sz="4"/>
+              <w:right w:val="single" w:color="A6B4B8" w:sz="4"/>
+            </w:tcBorders>
+            <w:tcMar>
+              <w:top w:type="dxa" w:w="50"/>
+              <w:left w:type="dxa" w:w="90"/>
+              <w:bottom w:type="dxa" w:w="50"/>
+              <w:right w:type="dxa" w:w="90"/>
+            </w:tcMar>
+            <w:vAlign w:val="top"/>
+          </w:tcPr>
+          <w:p>
+            <w:pPr>
+              <w:keepNext/>
+              <w:spacing w:after="0" w:line="252"/>
+              <w:jc w:val="left"/>
+            </w:pPr>
+            <w:r>
+              <w:rPr>
+                <w:b w:val="false"/>
+                <w:bCs w:val="false"/>
+                <w:sz w:val="19"/>
+                <w:szCs w:val="19"/>
+              </w:rPr>
+              <w:t xml:space="preserve">Conectar el cable principal al robot.</w:t>
+            </w:r>
+          </w:p>
+        </w:tc>
+      </w:tr>
+      <w:tr>
+        <w:trPr>
+          <w:cantSplit/>
+        </w:trPr>
+        <w:tc>
+          <w:tcPr>
+            <w:tcW w:type="dxa" w:w="700"/>
+            <w:tcBorders>
+              <w:top w:val="single" w:color="A6B4B8" w:sz="4"/>
+              <w:left w:val="single" w:color="A6B4B8" w:sz="4"/>
+              <w:bottom w:val="single" w:color="A6B4B8" w:sz="4"/>
+              <w:right w:val="single" w:color="A6B4B8" w:sz="4"/>
+            </w:tcBorders>
+            <w:tcMar>
+              <w:top w:type="dxa" w:w="50"/>
+              <w:left w:type="dxa" w:w="90"/>
+              <w:bottom w:type="dxa" w:w="50"/>
+              <w:right w:type="dxa" w:w="90"/>
+            </w:tcMar>
+            <w:vAlign w:val="top"/>
+          </w:tcPr>
+          <w:p>
+            <w:pPr>
+              <w:keepNext/>
+              <w:spacing w:after="0" w:line="252"/>
+              <w:jc w:val="left"/>
+            </w:pPr>
+            <w:r>
+              <w:rPr>
+                <w:b w:val="false"/>
+                <w:bCs w:val="false"/>
+                <w:sz w:val="19"/>
+                <w:szCs w:val="19"/>
+              </w:rPr>
+              <w:t xml:space="preserve">8</w:t>
+            </w:r>
+          </w:p>
+        </w:tc>
+        <w:tc>
+          <w:tcPr>
+            <w:tcW w:type="dxa" w:w="8938"/>
+            <w:tcBorders>
+              <w:top w:val="single" w:color="A6B4B8" w:sz="4"/>
+              <w:left w:val="single" w:color="A6B4B8" w:sz="4"/>
+              <w:bottom w:val="single" w:color="A6B4B8" w:sz="4"/>
+              <w:right w:val="single" w:color="A6B4B8" w:sz="4"/>
+            </w:tcBorders>
+            <w:tcMar>
+              <w:top w:type="dxa" w:w="50"/>
+              <w:left w:type="dxa" w:w="90"/>
+              <w:bottom w:type="dxa" w:w="50"/>
+              <w:right w:type="dxa" w:w="90"/>
+            </w:tcMar>
+            <w:vAlign w:val="top"/>
+          </w:tcPr>
+          <w:p>
+            <w:pPr>
+              <w:keepNext/>
+              <w:spacing w:after="0" w:line="252"/>
+              <w:jc w:val="left"/>
+            </w:pPr>
+            <w:r>
+              <w:rPr>
+                <w:b w:val="false"/>
+                <w:bCs w:val="false"/>
+                <w:sz w:val="19"/>
+                <w:szCs w:val="19"/>
+              </w:rPr>
+              <w:t xml:space="preserve">Energizar el control box (llave en CERRADO / ON).</w:t>
+            </w:r>
+          </w:p>
+        </w:tc>
+      </w:tr>
+      <w:tr>
+        <w:trPr>
+          <w:cantSplit/>
+        </w:trPr>
+        <w:tc>
+          <w:tcPr>
+            <w:tcW w:type="dxa" w:w="700"/>
+            <w:tcBorders>
+              <w:top w:val="single" w:color="A6B4B8" w:sz="4"/>
+              <w:left w:val="single" w:color="A6B4B8" w:sz="4"/>
+              <w:bottom w:val="single" w:color="A6B4B8" w:sz="4"/>
+              <w:right w:val="single" w:color="A6B4B8" w:sz="4"/>
+            </w:tcBorders>
+            <w:tcMar>
+              <w:top w:type="dxa" w:w="50"/>
+              <w:left w:type="dxa" w:w="90"/>
+              <w:bottom w:type="dxa" w:w="50"/>
+              <w:right w:type="dxa" w:w="90"/>
+            </w:tcMar>
+            <w:vAlign w:val="top"/>
+          </w:tcPr>
+          <w:p>
+            <w:pPr>
+              <w:keepNext/>
+              <w:spacing w:after="0" w:line="252"/>
+              <w:jc w:val="left"/>
+            </w:pPr>
+            <w:r>
+              <w:rPr>
+                <w:b w:val="false"/>
+                <w:bCs w:val="false"/>
+                <w:sz w:val="19"/>
+                <w:szCs w:val="19"/>
+              </w:rPr>
+              <w:t xml:space="preserve">9</w:t>
+            </w:r>
+          </w:p>
+        </w:tc>
+        <w:tc>
+          <w:tcPr>
+            <w:tcW w:type="dxa" w:w="8938"/>
+            <w:tcBorders>
+              <w:top w:val="single" w:color="A6B4B8" w:sz="4"/>
+              <w:left w:val="single" w:color="A6B4B8" w:sz="4"/>
+              <w:bottom w:val="single" w:color="A6B4B8" w:sz="4"/>
+              <w:right w:val="single" w:color="A6B4B8" w:sz="4"/>
+            </w:tcBorders>
+            <w:tcMar>
+              <w:top w:type="dxa" w:w="50"/>
+              <w:left w:type="dxa" w:w="90"/>
+              <w:bottom w:type="dxa" w:w="50"/>
+              <w:right w:type="dxa" w:w="90"/>
+            </w:tcMar>
+            <w:vAlign w:val="top"/>
+          </w:tcPr>
+          <w:p>
+            <w:pPr>
+              <w:keepNext/>
+              <w:spacing w:after="0" w:line="252"/>
+              <w:jc w:val="left"/>
+            </w:pPr>
+            <w:r>
+              <w:rPr>
+                <w:b w:val="false"/>
+                <w:bCs w:val="false"/>
+                <w:sz w:val="19"/>
+                <w:szCs w:val="19"/>
+              </w:rPr>
+              <w:t xml:space="preserve">Con el control box ya energizado, esperar 2 minutos y recién entonces iniciar el software GRIS.</w:t>
+            </w:r>
+          </w:p>
+        </w:tc>
+      </w:tr>
+    </w:tbl>
+    <w:p>
+      <w:pPr>
+        <w:spacing w:after="120" w:before="0"/>
+      </w:pPr>
+    </w:p>
+    <w:tbl>
+      <w:tblPr>
+        <w:tblW w:type="dxa" w:w="9638"/>
+        <w:tblBorders>
+          <w:top w:val="single" w:color="auto" w:sz="4"/>
+          <w:left w:val="single" w:color="auto" w:sz="4"/>
+          <w:bottom w:val="single" w:color="auto" w:sz="4"/>
+          <w:right w:val="single" w:color="auto" w:sz="4"/>
+          <w:insideH w:val="single" w:color="auto" w:sz="4"/>
+          <w:insideV w:val="single" w:color="auto" w:sz="4"/>
+        </w:tblBorders>
+      </w:tblPr>
+      <w:tblGrid>
+        <w:gridCol w:w="700"/>
+        <w:gridCol w:w="8938"/>
+      </w:tblGrid>
+      <w:tr>
+        <w:trPr>
+          <w:cantSplit/>
+          <w:tblHeader/>
+        </w:trPr>
+        <w:tc>
+          <w:tcPr>
+            <w:tcW w:type="dxa" w:w="700"/>
+            <w:tcBorders>
+              <w:top w:val="single" w:color="A6B4B8" w:sz="4"/>
+              <w:left w:val="single" w:color="A6B4B8" w:sz="4"/>
+              <w:bottom w:val="single" w:color="A6B4B8" w:sz="4"/>
+              <w:right w:val="single" w:color="A6B4B8" w:sz="4"/>
+            </w:tcBorders>
+            <w:shd w:fill="DAE0E2" w:val="clear"/>
+            <w:tcMar>
+              <w:top w:type="dxa" w:w="50"/>
+              <w:left w:type="dxa" w:w="90"/>
+              <w:bottom w:type="dxa" w:w="50"/>
+              <w:right w:type="dxa" w:w="90"/>
+            </w:tcMar>
+            <w:vAlign w:val="center"/>
+          </w:tcPr>
+          <w:p>
+            <w:pPr>
+              <w:keepNext/>
+              <w:spacing w:after="0" w:line="252"/>
+              <w:jc w:val="left"/>
+            </w:pPr>
+            <w:r>
+              <w:rPr>
+                <w:b/>
+                <w:bCs/>
+                <w:sz w:val="19"/>
+                <w:szCs w:val="19"/>
+              </w:rPr>
+              <w:t xml:space="preserve">Nº</w:t>
+            </w:r>
+          </w:p>
+        </w:tc>
+        <w:tc>
+          <w:tcPr>
+            <w:tcW w:type="dxa" w:w="8938"/>
+            <w:tcBorders>
+              <w:top w:val="single" w:color="A6B4B8" w:sz="4"/>
+              <w:left w:val="single" w:color="A6B4B8" w:sz="4"/>
+              <w:bottom w:val="single" w:color="A6B4B8" w:sz="4"/>
+              <w:right w:val="single" w:color="A6B4B8" w:sz="4"/>
+            </w:tcBorders>
+            <w:shd w:fill="DAE0E2" w:val="clear"/>
+            <w:tcMar>
+              <w:top w:type="dxa" w:w="50"/>
+              <w:left w:type="dxa" w:w="90"/>
+              <w:bottom w:type="dxa" w:w="50"/>
+              <w:right w:type="dxa" w:w="90"/>
+            </w:tcMar>
+            <w:vAlign w:val="center"/>
+          </w:tcPr>
+          <w:p>
+            <w:pPr>
+              <w:keepNext/>
+              <w:spacing w:after="0" w:line="252"/>
+              <w:jc w:val="left"/>
+            </w:pPr>
+            <w:r>
+              <w:rPr>
+                <w:b/>
+                <w:bCs/>
+                <w:sz w:val="19"/>
+                <w:szCs w:val="19"/>
+              </w:rPr>
+              <w:t xml:space="preserve">Parada / desenergización</w:t>
+            </w:r>
+          </w:p>
+        </w:tc>
+      </w:tr>
+      <w:tr>
+        <w:trPr>
+          <w:cantSplit/>
+        </w:trPr>
+        <w:tc>
+          <w:tcPr>
+            <w:tcW w:type="dxa" w:w="700"/>
+            <w:tcBorders>
+              <w:top w:val="single" w:color="A6B4B8" w:sz="4"/>
+              <w:left w:val="single" w:color="A6B4B8" w:sz="4"/>
+              <w:bottom w:val="single" w:color="A6B4B8" w:sz="4"/>
+              <w:right w:val="single" w:color="A6B4B8" w:sz="4"/>
+            </w:tcBorders>
+            <w:tcMar>
+              <w:top w:type="dxa" w:w="50"/>
+              <w:left w:type="dxa" w:w="90"/>
+              <w:bottom w:type="dxa" w:w="50"/>
+              <w:right w:type="dxa" w:w="90"/>
+            </w:tcMar>
+            <w:vAlign w:val="top"/>
+          </w:tcPr>
+          <w:p>
+            <w:pPr>
+              <w:keepNext/>
+              <w:spacing w:after="0" w:line="252"/>
+              <w:jc w:val="left"/>
+            </w:pPr>
+            <w:r>
+              <w:rPr>
+                <w:b w:val="false"/>
+                <w:bCs w:val="false"/>
+                <w:sz w:val="19"/>
+                <w:szCs w:val="19"/>
+              </w:rPr>
+              <w:t xml:space="preserve">1</w:t>
+            </w:r>
+          </w:p>
+        </w:tc>
+        <w:tc>
+          <w:tcPr>
+            <w:tcW w:type="dxa" w:w="8938"/>
+            <w:tcBorders>
+              <w:top w:val="single" w:color="A6B4B8" w:sz="4"/>
+              <w:left w:val="single" w:color="A6B4B8" w:sz="4"/>
+              <w:bottom w:val="single" w:color="A6B4B8" w:sz="4"/>
+              <w:right w:val="single" w:color="A6B4B8" w:sz="4"/>
+            </w:tcBorders>
+            <w:tcMar>
+              <w:top w:type="dxa" w:w="50"/>
+              <w:left w:type="dxa" w:w="90"/>
+              <w:bottom w:type="dxa" w:w="50"/>
+              <w:right w:type="dxa" w:w="90"/>
+            </w:tcMar>
+            <w:vAlign w:val="top"/>
+          </w:tcPr>
+          <w:p>
+            <w:pPr>
+              <w:keepNext/>
+              <w:spacing w:after="0" w:line="252"/>
+              <w:jc w:val="left"/>
+            </w:pPr>
+            <w:r>
+              <w:rPr>
+                <w:b w:val="false"/>
+                <w:bCs w:val="false"/>
+                <w:sz w:val="19"/>
+                <w:szCs w:val="19"/>
+              </w:rPr>
+              <w:t xml:space="preserve">Cerrar el software GRIS.</w:t>
+            </w:r>
+          </w:p>
+        </w:tc>
+      </w:tr>
+      <w:tr>
+        <w:trPr>
+          <w:cantSplit/>
+        </w:trPr>
+        <w:tc>
+          <w:tcPr>
+            <w:tcW w:type="dxa" w:w="700"/>
+            <w:tcBorders>
+              <w:top w:val="single" w:color="A6B4B8" w:sz="4"/>
+              <w:left w:val="single" w:color="A6B4B8" w:sz="4"/>
+              <w:bottom w:val="single" w:color="A6B4B8" w:sz="4"/>
+              <w:right w:val="single" w:color="A6B4B8" w:sz="4"/>
+            </w:tcBorders>
+            <w:tcMar>
+              <w:top w:type="dxa" w:w="50"/>
+              <w:left w:type="dxa" w:w="90"/>
+              <w:bottom w:type="dxa" w:w="50"/>
+              <w:right w:type="dxa" w:w="90"/>
+            </w:tcMar>
+            <w:vAlign w:val="top"/>
+          </w:tcPr>
+          <w:p>
+            <w:pPr>
+              <w:keepNext/>
+              <w:spacing w:after="0" w:line="252"/>
+              <w:jc w:val="left"/>
+            </w:pPr>
+            <w:r>
+              <w:rPr>
+                <w:b w:val="false"/>
+                <w:bCs w:val="false"/>
+                <w:sz w:val="19"/>
+                <w:szCs w:val="19"/>
+              </w:rPr>
+              <w:t xml:space="preserve">2</w:t>
+            </w:r>
+          </w:p>
+        </w:tc>
+        <w:tc>
+          <w:tcPr>
+            <w:tcW w:type="dxa" w:w="8938"/>
+            <w:tcBorders>
+              <w:top w:val="single" w:color="A6B4B8" w:sz="4"/>
+              <w:left w:val="single" w:color="A6B4B8" w:sz="4"/>
+              <w:bottom w:val="single" w:color="A6B4B8" w:sz="4"/>
+              <w:right w:val="single" w:color="A6B4B8" w:sz="4"/>
+            </w:tcBorders>
+            <w:tcMar>
+              <w:top w:type="dxa" w:w="50"/>
+              <w:left w:type="dxa" w:w="90"/>
+              <w:bottom w:type="dxa" w:w="50"/>
+              <w:right w:type="dxa" w:w="90"/>
+            </w:tcMar>
+            <w:vAlign w:val="top"/>
+          </w:tcPr>
+          <w:p>
+            <w:pPr>
+              <w:keepNext/>
+              <w:spacing w:after="0" w:line="252"/>
+              <w:jc w:val="left"/>
+            </w:pPr>
+            <w:r>
+              <w:rPr>
+                <w:b w:val="false"/>
+                <w:bCs w:val="false"/>
+                <w:sz w:val="19"/>
+                <w:szCs w:val="19"/>
+              </w:rPr>
+              <w:t xml:space="preserve">Poner la llave del control box en ABIERTO (OFF).</w:t>
+            </w:r>
+          </w:p>
+        </w:tc>
+      </w:tr>
+      <w:tr>
+        <w:trPr>
+          <w:cantSplit/>
+        </w:trPr>
+        <w:tc>
+          <w:tcPr>
+            <w:tcW w:type="dxa" w:w="700"/>
+            <w:tcBorders>
+              <w:top w:val="single" w:color="A6B4B8" w:sz="4"/>
+              <w:left w:val="single" w:color="A6B4B8" w:sz="4"/>
+              <w:bottom w:val="single" w:color="A6B4B8" w:sz="4"/>
+              <w:right w:val="single" w:color="A6B4B8" w:sz="4"/>
+            </w:tcBorders>
+            <w:tcMar>
+              <w:top w:type="dxa" w:w="50"/>
+              <w:left w:type="dxa" w:w="90"/>
+              <w:bottom w:type="dxa" w:w="50"/>
+              <w:right w:type="dxa" w:w="90"/>
+            </w:tcMar>
+            <w:vAlign w:val="top"/>
+          </w:tcPr>
+          <w:p>
+            <w:pPr>
+              <w:keepNext/>
+              <w:spacing w:after="0" w:line="252"/>
+              <w:jc w:val="left"/>
+            </w:pPr>
+            <w:r>
+              <w:rPr>
+                <w:b w:val="false"/>
+                <w:bCs w:val="false"/>
+                <w:sz w:val="19"/>
+                <w:szCs w:val="19"/>
+              </w:rPr>
+              <w:t xml:space="preserve">3</w:t>
+            </w:r>
+          </w:p>
+        </w:tc>
+        <w:tc>
+          <w:tcPr>
+            <w:tcW w:type="dxa" w:w="8938"/>
+            <w:tcBorders>
+              <w:top w:val="single" w:color="A6B4B8" w:sz="4"/>
+              <w:left w:val="single" w:color="A6B4B8" w:sz="4"/>
+              <w:bottom w:val="single" w:color="A6B4B8" w:sz="4"/>
+              <w:right w:val="single" w:color="A6B4B8" w:sz="4"/>
+            </w:tcBorders>
+            <w:tcMar>
+              <w:top w:type="dxa" w:w="50"/>
+              <w:left w:type="dxa" w:w="90"/>
+              <w:bottom w:type="dxa" w:w="50"/>
+              <w:right w:type="dxa" w:w="90"/>
+            </w:tcMar>
+            <w:vAlign w:val="top"/>
+          </w:tcPr>
+          <w:p>
+            <w:pPr>
+              <w:keepNext/>
+              <w:spacing w:after="0" w:line="252"/>
+              <w:jc w:val="left"/>
+            </w:pPr>
+            <w:r>
+              <w:rPr>
+                <w:b w:val="false"/>
+                <w:bCs w:val="false"/>
+                <w:sz w:val="19"/>
+                <w:szCs w:val="19"/>
+              </w:rPr>
+              <w:t xml:space="preserve">Desconectar el cable principal del robot.</w:t>
+            </w:r>
+          </w:p>
+        </w:tc>
+      </w:tr>
+      <w:tr>
+        <w:trPr>
+          <w:cantSplit/>
+        </w:trPr>
+        <w:tc>
+          <w:tcPr>
+            <w:tcW w:type="dxa" w:w="700"/>
+            <w:tcBorders>
+              <w:top w:val="single" w:color="A6B4B8" w:sz="4"/>
+              <w:left w:val="single" w:color="A6B4B8" w:sz="4"/>
+              <w:bottom w:val="single" w:color="A6B4B8" w:sz="4"/>
+              <w:right w:val="single" w:color="A6B4B8" w:sz="4"/>
+            </w:tcBorders>
+            <w:tcMar>
+              <w:top w:type="dxa" w:w="50"/>
+              <w:left w:type="dxa" w:w="90"/>
+              <w:bottom w:type="dxa" w:w="50"/>
+              <w:right w:type="dxa" w:w="90"/>
+            </w:tcMar>
+            <w:vAlign w:val="top"/>
+          </w:tcPr>
+          <w:p>
+            <w:pPr>
+              <w:keepNext/>
+              <w:spacing w:after="0" w:line="252"/>
+              <w:jc w:val="left"/>
+            </w:pPr>
+            <w:r>
+              <w:rPr>
+                <w:b w:val="false"/>
+                <w:bCs w:val="false"/>
+                <w:sz w:val="19"/>
+                <w:szCs w:val="19"/>
+              </w:rPr>
+              <w:t xml:space="preserve">4</w:t>
+            </w:r>
+          </w:p>
+        </w:tc>
+        <w:tc>
+          <w:tcPr>
+            <w:tcW w:type="dxa" w:w="8938"/>
+            <w:tcBorders>
+              <w:top w:val="single" w:color="A6B4B8" w:sz="4"/>
+              <w:left w:val="single" w:color="A6B4B8" w:sz="4"/>
+              <w:bottom w:val="single" w:color="A6B4B8" w:sz="4"/>
+              <w:right w:val="single" w:color="A6B4B8" w:sz="4"/>
+            </w:tcBorders>
+            <w:tcMar>
+              <w:top w:type="dxa" w:w="50"/>
+              <w:left w:type="dxa" w:w="90"/>
+              <w:bottom w:type="dxa" w:w="50"/>
+              <w:right w:type="dxa" w:w="90"/>
+            </w:tcMar>
+            <w:vAlign w:val="top"/>
+          </w:tcPr>
+          <w:p>
+            <w:pPr>
+              <w:keepNext/>
+              <w:spacing w:after="0" w:line="252"/>
+              <w:jc w:val="left"/>
+            </w:pPr>
+            <w:r>
+              <w:rPr>
+                <w:b w:val="false"/>
+                <w:bCs w:val="false"/>
+                <w:sz w:val="19"/>
+                <w:szCs w:val="19"/>
+              </w:rPr>
+              <w:t xml:space="preserve">Desconectar el cable principal del control box.</w:t>
+            </w:r>
+          </w:p>
+        </w:tc>
+      </w:tr>
+      <w:tr>
+        <w:trPr>
+          <w:cantSplit/>
+        </w:trPr>
+        <w:tc>
+          <w:tcPr>
+            <w:tcW w:type="dxa" w:w="700"/>
+            <w:tcBorders>
+              <w:top w:val="single" w:color="A6B4B8" w:sz="4"/>
+              <w:left w:val="single" w:color="A6B4B8" w:sz="4"/>
+              <w:bottom w:val="single" w:color="A6B4B8" w:sz="4"/>
+              <w:right w:val="single" w:color="A6B4B8" w:sz="4"/>
+            </w:tcBorders>
+            <w:tcMar>
+              <w:top w:type="dxa" w:w="50"/>
+              <w:left w:type="dxa" w:w="90"/>
+              <w:bottom w:type="dxa" w:w="50"/>
+              <w:right w:type="dxa" w:w="90"/>
+            </w:tcMar>
+            <w:vAlign w:val="top"/>
+          </w:tcPr>
+          <w:p>
+            <w:pPr>
+              <w:keepNext/>
+              <w:spacing w:after="0" w:line="252"/>
+              <w:jc w:val="left"/>
+            </w:pPr>
+            <w:r>
+              <w:rPr>
+                <w:b w:val="false"/>
+                <w:bCs w:val="false"/>
+                <w:sz w:val="19"/>
+                <w:szCs w:val="19"/>
+              </w:rPr>
+              <w:t xml:space="preserve">5</w:t>
+            </w:r>
+          </w:p>
+        </w:tc>
+        <w:tc>
+          <w:tcPr>
+            <w:tcW w:type="dxa" w:w="8938"/>
+            <w:tcBorders>
+              <w:top w:val="single" w:color="A6B4B8" w:sz="4"/>
+              <w:left w:val="single" w:color="A6B4B8" w:sz="4"/>
+              <w:bottom w:val="single" w:color="A6B4B8" w:sz="4"/>
+              <w:right w:val="single" w:color="A6B4B8" w:sz="4"/>
+            </w:tcBorders>
+            <w:tcMar>
+              <w:top w:type="dxa" w:w="50"/>
+              <w:left w:type="dxa" w:w="90"/>
+              <w:bottom w:type="dxa" w:w="50"/>
+              <w:right w:type="dxa" w:w="90"/>
+            </w:tcMar>
+            <w:vAlign w:val="top"/>
+          </w:tcPr>
+          <w:p>
+            <w:pPr>
+              <w:keepNext/>
+              <w:spacing w:after="0" w:line="252"/>
+              <w:jc w:val="left"/>
+            </w:pPr>
+            <w:r>
+              <w:rPr>
+                <w:b w:val="false"/>
+                <w:bCs w:val="false"/>
+                <w:sz w:val="19"/>
+                <w:szCs w:val="19"/>
+              </w:rPr>
+              <w:t xml:space="preserve">Colocar el dispositivo de cortocircuito en el cable principal y conectarlo a tierra.</w:t>
+            </w:r>
+          </w:p>
+        </w:tc>
+      </w:tr>
+      <w:tr>
+        <w:trPr>
+          <w:cantSplit/>
+        </w:trPr>
+        <w:tc>
+          <w:tcPr>
+            <w:tcW w:type="dxa" w:w="700"/>
+            <w:tcBorders>
+              <w:top w:val="single" w:color="A6B4B8" w:sz="4"/>
+              <w:left w:val="single" w:color="A6B4B8" w:sz="4"/>
+              <w:bottom w:val="single" w:color="A6B4B8" w:sz="4"/>
+              <w:right w:val="single" w:color="A6B4B8" w:sz="4"/>
+            </w:tcBorders>
+            <w:tcMar>
+              <w:top w:type="dxa" w:w="50"/>
+              <w:left w:type="dxa" w:w="90"/>
+              <w:bottom w:type="dxa" w:w="50"/>
+              <w:right w:type="dxa" w:w="90"/>
+            </w:tcMar>
+            <w:vAlign w:val="top"/>
+          </w:tcPr>
+          <w:p>
+            <w:pPr>
+              <w:keepNext/>
+              <w:spacing w:after="0" w:line="252"/>
+              <w:jc w:val="left"/>
+            </w:pPr>
+            <w:r>
+              <w:rPr>
+                <w:b w:val="false"/>
+                <w:bCs w:val="false"/>
+                <w:sz w:val="19"/>
+                <w:szCs w:val="19"/>
+              </w:rPr>
+              <w:t xml:space="preserve">6</w:t>
+            </w:r>
+          </w:p>
+        </w:tc>
+        <w:tc>
+          <w:tcPr>
+            <w:tcW w:type="dxa" w:w="8938"/>
+            <w:tcBorders>
+              <w:top w:val="single" w:color="A6B4B8" w:sz="4"/>
+              <w:left w:val="single" w:color="A6B4B8" w:sz="4"/>
+              <w:bottom w:val="single" w:color="A6B4B8" w:sz="4"/>
+              <w:right w:val="single" w:color="A6B4B8" w:sz="4"/>
+            </w:tcBorders>
+            <w:tcMar>
+              <w:top w:type="dxa" w:w="50"/>
+              <w:left w:type="dxa" w:w="90"/>
+              <w:bottom w:type="dxa" w:w="50"/>
+              <w:right w:type="dxa" w:w="90"/>
+            </w:tcMar>
+            <w:vAlign w:val="top"/>
+          </w:tcPr>
+          <w:p>
+            <w:pPr>
+              <w:keepNext/>
+              <w:spacing w:after="0" w:line="252"/>
+              <w:jc w:val="left"/>
+            </w:pPr>
+            <w:r>
+              <w:rPr>
+                <w:b w:val="false"/>
+                <w:bCs w:val="false"/>
+                <w:sz w:val="19"/>
+                <w:szCs w:val="19"/>
+              </w:rPr>
+              <w:t xml:space="preserve">Desconectar los cables USB y Ethernet.</w:t>
+            </w:r>
+          </w:p>
+        </w:tc>
+      </w:tr>
+      <w:tr>
+        <w:trPr>
+          <w:cantSplit/>
+        </w:trPr>
+        <w:tc>
+          <w:tcPr>
+            <w:tcW w:type="dxa" w:w="700"/>
+            <w:tcBorders>
+              <w:top w:val="single" w:color="A6B4B8" w:sz="4"/>
+              <w:left w:val="single" w:color="A6B4B8" w:sz="4"/>
+              <w:bottom w:val="single" w:color="A6B4B8" w:sz="4"/>
+              <w:right w:val="single" w:color="A6B4B8" w:sz="4"/>
+            </w:tcBorders>
+            <w:tcMar>
+              <w:top w:type="dxa" w:w="50"/>
+              <w:left w:type="dxa" w:w="90"/>
+              <w:bottom w:type="dxa" w:w="50"/>
+              <w:right w:type="dxa" w:w="90"/>
+            </w:tcMar>
+            <w:vAlign w:val="top"/>
+          </w:tcPr>
+          <w:p>
+            <w:pPr>
+              <w:keepNext/>
+              <w:spacing w:after="0" w:line="252"/>
+              <w:jc w:val="left"/>
+            </w:pPr>
+            <w:r>
+              <w:rPr>
+                <w:b w:val="false"/>
+                <w:bCs w:val="false"/>
+                <w:sz w:val="19"/>
+                <w:szCs w:val="19"/>
+              </w:rPr>
+              <w:t xml:space="preserve">7</w:t>
+            </w:r>
+          </w:p>
+        </w:tc>
+        <w:tc>
+          <w:tcPr>
+            <w:tcW w:type="dxa" w:w="8938"/>
+            <w:tcBorders>
+              <w:top w:val="single" w:color="A6B4B8" w:sz="4"/>
+              <w:left w:val="single" w:color="A6B4B8" w:sz="4"/>
+              <w:bottom w:val="single" w:color="A6B4B8" w:sz="4"/>
+              <w:right w:val="single" w:color="A6B4B8" w:sz="4"/>
+            </w:tcBorders>
+            <w:tcMar>
+              <w:top w:type="dxa" w:w="50"/>
+              <w:left w:type="dxa" w:w="90"/>
+              <w:bottom w:type="dxa" w:w="50"/>
+              <w:right w:type="dxa" w:w="90"/>
+            </w:tcMar>
+            <w:vAlign w:val="top"/>
+          </w:tcPr>
+          <w:p>
+            <w:pPr>
+              <w:keepNext/>
+              <w:spacing w:after="0" w:line="252"/>
+              <w:jc w:val="left"/>
+            </w:pPr>
+            <w:r>
+              <w:rPr>
+                <w:b w:val="false"/>
+                <w:bCs w:val="false"/>
+                <w:sz w:val="19"/>
+                <w:szCs w:val="19"/>
+              </w:rPr>
+              <w:t xml:space="preserve">Desconectar el control box de la red eléctrica.</w:t>
+            </w:r>
+          </w:p>
+        </w:tc>
+      </w:tr>
+    </w:tbl>
+    <w:p>
+      <w:pPr>
+        <w:spacing w:after="120" w:before="0"/>
+      </w:pPr>
+    </w:p>
+    <w:tbl>
+      <w:tblPr>
+        <w:tblW w:type="dxa" w:w="9638"/>
+        <w:tblBorders>
+          <w:top w:val="single" w:color="auto" w:sz="4"/>
+          <w:left w:val="single" w:color="auto" w:sz="4"/>
+          <w:bottom w:val="single" w:color="auto" w:sz="4"/>
+          <w:right w:val="single" w:color="auto" w:sz="4"/>
+          <w:insideH w:val="single" w:color="auto" w:sz="4"/>
+          <w:insideV w:val="single" w:color="auto" w:sz="4"/>
+        </w:tblBorders>
+      </w:tblPr>
+      <w:tblGrid>
+        <w:gridCol w:w="9638"/>
+      </w:tblGrid>
+      <w:tr>
+        <w:tc>
+          <w:tcPr>
+            <w:tcW w:type="dxa" w:w="9638"/>
+            <w:tcBorders>
+              <w:top w:val="single" w:color="6D8289" w:sz="4"/>
+              <w:left w:val="single" w:color="6D8289" w:sz="24"/>
+              <w:bottom w:val="single" w:color="6D8289" w:sz="4"/>
+              <w:right w:val="single" w:color="6D8289" w:sz="4"/>
+            </w:tcBorders>
+            <w:shd w:fill="EEF2F3" w:val="clear"/>
+            <w:tcMar>
+              <w:top w:type="dxa" w:w="80"/>
+              <w:left w:type="dxa" w:w="160"/>
+              <w:bottom w:type="dxa" w:w="80"/>
+              <w:right w:type="dxa" w:w="160"/>
+            </w:tcMar>
+          </w:tcPr>
+          <w:p>
+            <w:pPr>
+              <w:spacing w:after="0" w:line="264"/>
+              <w:jc w:val="both"/>
+            </w:pPr>
+            <w:r>
+              <w:rPr>
+                <w:b/>
+                <w:bCs/>
+                <w:color w:val="6D8289"/>
+              </w:rPr>
+              <w:t xml:space="preserve">Reencendido: </w:t>
+            </w:r>
+            <w:r>
+              <w:t xml:space="preserve">si el cable principal sigue conectado al control box y al robot, para volver a encender basta con poner la llave en CERRADO (ON) e iniciar el software de inmediato: no es necesaria la espera de 2 minutos del punto 9. Para apagar, cerrar el software y poner la llave en ABIERTO (OFF).</w:t>
+            </w:r>
+          </w:p>
+        </w:tc>
+      </w:tr>
+    </w:tbl>
+    <w:p>
+      <w:pPr>
         <w:pStyle w:val="Heading2"/>
         <w:keepNext/>
         <w:spacing w:after="100" w:before="220"/>
@@ -11200,7 +12835,7 @@
                 <w:sz w:val="19"/>
                 <w:szCs w:val="19"/>
               </w:rPr>
-              <w:t xml:space="preserve">31</w:t>
+              <w:t xml:space="preserve">32</w:t>
             </w:r>
           </w:p>
         </w:tc>
@@ -11304,7 +12939,7 @@
                 <w:sz w:val="19"/>
                 <w:szCs w:val="19"/>
               </w:rPr>
-              <w:t xml:space="preserve">32</w:t>
+              <w:t xml:space="preserve">33</w:t>
             </w:r>
           </w:p>
         </w:tc>
@@ -11408,7 +13043,7 @@
                 <w:sz w:val="19"/>
                 <w:szCs w:val="19"/>
               </w:rPr>
-              <w:t xml:space="preserve">33</w:t>
+              <w:t xml:space="preserve">34</w:t>
             </w:r>
           </w:p>
         </w:tc>
@@ -11512,7 +13147,7 @@
                 <w:sz w:val="19"/>
                 <w:szCs w:val="19"/>
               </w:rPr>
-              <w:t xml:space="preserve">34</w:t>
+              <w:t xml:space="preserve">35</w:t>
             </w:r>
           </w:p>
         </w:tc>
@@ -11616,7 +13251,7 @@
                 <w:sz w:val="19"/>
                 <w:szCs w:val="19"/>
               </w:rPr>
-              <w:t xml:space="preserve">35</w:t>
+              <w:t xml:space="preserve">36</w:t>
             </w:r>
           </w:p>
         </w:tc>
@@ -11720,7 +13355,7 @@
                 <w:sz w:val="19"/>
                 <w:szCs w:val="19"/>
               </w:rPr>
-              <w:t xml:space="preserve">36</w:t>
+              <w:t xml:space="preserve">37</w:t>
             </w:r>
           </w:p>
         </w:tc>
@@ -11849,7 +13484,7 @@
               <w:t xml:space="preserve">Ciclo repetitivo: </w:t>
             </w:r>
             <w:r>
-              <w:t xml:space="preserve">los pasos 37 a 44 se repiten para cada ranura a inspeccionar. El paso 45 se ejecuta cuando se alcanza la condición indicada.</w:t>
+              <w:t xml:space="preserve">los pasos 38 a 45 se repiten para cada ranura a inspeccionar. El paso 46 se ejecuta cuando se alcanza la condición indicada.</w:t>
             </w:r>
           </w:p>
         </w:tc>
@@ -12059,7 +13694,7 @@
                 <w:sz w:val="19"/>
                 <w:szCs w:val="19"/>
               </w:rPr>
-              <w:t xml:space="preserve">37</w:t>
+              <w:t xml:space="preserve">38</w:t>
             </w:r>
           </w:p>
         </w:tc>
@@ -12163,7 +13798,7 @@
                 <w:sz w:val="19"/>
                 <w:szCs w:val="19"/>
               </w:rPr>
-              <w:t xml:space="preserve">38</w:t>
+              <w:t xml:space="preserve">39</w:t>
             </w:r>
           </w:p>
         </w:tc>
@@ -12267,7 +13902,7 @@
                 <w:sz w:val="19"/>
                 <w:szCs w:val="19"/>
               </w:rPr>
-              <w:t xml:space="preserve">39</w:t>
+              <w:t xml:space="preserve">40</w:t>
             </w:r>
           </w:p>
         </w:tc>
@@ -12412,7 +14047,7 @@
                 <w:sz w:val="19"/>
                 <w:szCs w:val="19"/>
               </w:rPr>
-              <w:t xml:space="preserve">40</w:t>
+              <w:t xml:space="preserve">41</w:t>
             </w:r>
           </w:p>
         </w:tc>
@@ -12445,7 +14080,7 @@
                 <w:sz w:val="19"/>
                 <w:szCs w:val="19"/>
               </w:rPr>
-              <w:t xml:space="preserve">Avanzar axialmente a velocidad constante (recomendada: 50 mm/s) registrando el EL CID, sin superar el límite de avance seguro definido en el paso 33. Activar las cámaras laterales y monitorearlas junto con las demás para detectar anomalías.</w:t>
+              <w:t xml:space="preserve">Avanzar axialmente a velocidad constante (recomendada: 50 mm/s) registrando el EL CID, sin superar el límite de avance seguro definido en el paso 34. Activar las cámaras laterales y monitorearlas junto con las demás para detectar anomalías.</w:t>
             </w:r>
           </w:p>
         </w:tc>
@@ -12516,7 +14151,7 @@
                 <w:sz w:val="19"/>
                 <w:szCs w:val="19"/>
               </w:rPr>
-              <w:t xml:space="preserve">41</w:t>
+              <w:t xml:space="preserve">42</w:t>
             </w:r>
           </w:p>
         </w:tc>
@@ -12661,7 +14296,7 @@
                 <w:sz w:val="19"/>
                 <w:szCs w:val="19"/>
               </w:rPr>
-              <w:t xml:space="preserve">42</w:t>
+              <w:t xml:space="preserve">43</w:t>
             </w:r>
           </w:p>
         </w:tc>
@@ -12765,7 +14400,7 @@
                 <w:sz w:val="19"/>
                 <w:szCs w:val="19"/>
               </w:rPr>
-              <w:t xml:space="preserve">43</w:t>
+              <w:t xml:space="preserve">44</w:t>
             </w:r>
           </w:p>
         </w:tc>
@@ -12910,7 +14545,7 @@
                 <w:sz w:val="19"/>
                 <w:szCs w:val="19"/>
               </w:rPr>
-              <w:t xml:space="preserve">44</w:t>
+              <w:t xml:space="preserve">45</w:t>
             </w:r>
           </w:p>
         </w:tc>
@@ -12943,7 +14578,7 @@
                 <w:sz w:val="19"/>
                 <w:szCs w:val="19"/>
               </w:rPr>
-              <w:t xml:space="preserve">Desplazar la rampa a la ranura siguiente, verificar la alineación y repetir desde el paso 37.</w:t>
+              <w:t xml:space="preserve">Desplazar la rampa a la ranura siguiente, verificar la alineación y repetir desde el paso 38.</w:t>
             </w:r>
           </w:p>
         </w:tc>
@@ -13014,7 +14649,7 @@
                 <w:sz w:val="19"/>
                 <w:szCs w:val="19"/>
               </w:rPr>
-              <w:t xml:space="preserve">45</w:t>
+              <w:t xml:space="preserve">46</w:t>
             </w:r>
           </w:p>
         </w:tc>
@@ -13722,7 +15357,7 @@
                 <w:sz w:val="19"/>
                 <w:szCs w:val="19"/>
               </w:rPr>
-              <w:t xml:space="preserve">46</w:t>
+              <w:t xml:space="preserve">47</w:t>
             </w:r>
           </w:p>
         </w:tc>
@@ -13826,7 +15461,7 @@
                 <w:sz w:val="19"/>
                 <w:szCs w:val="19"/>
               </w:rPr>
-              <w:t xml:space="preserve">47</w:t>
+              <w:t xml:space="preserve">48</w:t>
             </w:r>
           </w:p>
         </w:tc>
@@ -13930,7 +15565,7 @@
                 <w:sz w:val="19"/>
                 <w:szCs w:val="19"/>
               </w:rPr>
-              <w:t xml:space="preserve">48</w:t>
+              <w:t xml:space="preserve">49</w:t>
             </w:r>
           </w:p>
         </w:tc>
@@ -14034,7 +15669,7 @@
                 <w:sz w:val="19"/>
                 <w:szCs w:val="19"/>
               </w:rPr>
-              <w:t xml:space="preserve">49</w:t>
+              <w:t xml:space="preserve">50</w:t>
             </w:r>
           </w:p>
         </w:tc>
@@ -14067,7 +15702,7 @@
                 <w:sz w:val="19"/>
                 <w:szCs w:val="19"/>
               </w:rPr>
-              <w:t xml:space="preserve">Desmontar el robot, la rampa, el tablero EL CID, el control box, el tablero de excitación, el autotransformador, el arrollamiento de excitación, la espira auxiliar, las barreras y la cartelería. Limpiar el área y cerrar los permisos.</w:t>
+              <w:t xml:space="preserve">Desenergizar el control box y desconectar el cable principal del robot siguiendo la secuencia de parada de la Tabla 4.</w:t>
             </w:r>
           </w:p>
         </w:tc>
@@ -14100,7 +15735,7 @@
                 <w:sz w:val="19"/>
                 <w:szCs w:val="19"/>
               </w:rPr>
-              <w:t xml:space="preserve">Permiso de trabajo</w:t>
+              <w:t xml:space="preserve">Tabla 4</w:t>
             </w:r>
           </w:p>
         </w:tc>
@@ -14138,7 +15773,111 @@
                 <w:sz w:val="19"/>
                 <w:szCs w:val="19"/>
               </w:rPr>
-              <w:t xml:space="preserve">50</w:t>
+              <w:t xml:space="preserve">51</w:t>
+            </w:r>
+          </w:p>
+        </w:tc>
+        <w:tc>
+          <w:tcPr>
+            <w:tcW w:type="dxa" w:w="6878"/>
+            <w:tcBorders>
+              <w:top w:val="single" w:color="A6B4B8" w:sz="4"/>
+              <w:left w:val="single" w:color="A6B4B8" w:sz="4"/>
+              <w:bottom w:val="single" w:color="A6B4B8" w:sz="4"/>
+              <w:right w:val="single" w:color="A6B4B8" w:sz="4"/>
+            </w:tcBorders>
+            <w:tcMar>
+              <w:top w:type="dxa" w:w="50"/>
+              <w:left w:type="dxa" w:w="90"/>
+              <w:bottom w:type="dxa" w:w="50"/>
+              <w:right w:type="dxa" w:w="90"/>
+            </w:tcMar>
+            <w:vAlign w:val="top"/>
+          </w:tcPr>
+          <w:p>
+            <w:pPr>
+              <w:spacing w:after="0" w:line="252"/>
+              <w:jc w:val="left"/>
+            </w:pPr>
+            <w:r>
+              <w:rPr>
+                <w:b w:val="false"/>
+                <w:bCs w:val="false"/>
+                <w:sz w:val="19"/>
+                <w:szCs w:val="19"/>
+              </w:rPr>
+              <w:t xml:space="preserve">Desmontar el robot, la rampa, el tablero EL CID, el control box, el tablero de excitación, el autotransformador, el arrollamiento de excitación, la espira auxiliar, las barreras y la cartelería. Limpiar el área y cerrar los permisos.</w:t>
+            </w:r>
+          </w:p>
+        </w:tc>
+        <w:tc>
+          <w:tcPr>
+            <w:tcW w:type="dxa" w:w="2200"/>
+            <w:tcBorders>
+              <w:top w:val="single" w:color="A6B4B8" w:sz="4"/>
+              <w:left w:val="single" w:color="A6B4B8" w:sz="4"/>
+              <w:bottom w:val="single" w:color="A6B4B8" w:sz="4"/>
+              <w:right w:val="single" w:color="A6B4B8" w:sz="4"/>
+            </w:tcBorders>
+            <w:tcMar>
+              <w:top w:type="dxa" w:w="50"/>
+              <w:left w:type="dxa" w:w="90"/>
+              <w:bottom w:type="dxa" w:w="50"/>
+              <w:right w:type="dxa" w:w="90"/>
+            </w:tcMar>
+            <w:vAlign w:val="top"/>
+          </w:tcPr>
+          <w:p>
+            <w:pPr>
+              <w:spacing w:after="0" w:line="252"/>
+              <w:jc w:val="left"/>
+            </w:pPr>
+            <w:r>
+              <w:rPr>
+                <w:b w:val="false"/>
+                <w:bCs w:val="false"/>
+                <w:sz w:val="19"/>
+                <w:szCs w:val="19"/>
+              </w:rPr>
+              <w:t xml:space="preserve">Permiso de trabajo</w:t>
+            </w:r>
+          </w:p>
+        </w:tc>
+      </w:tr>
+      <w:tr>
+        <w:trPr>
+          <w:cantSplit/>
+        </w:trPr>
+        <w:tc>
+          <w:tcPr>
+            <w:tcW w:type="dxa" w:w="560"/>
+            <w:tcBorders>
+              <w:top w:val="single" w:color="A6B4B8" w:sz="4"/>
+              <w:left w:val="single" w:color="A6B4B8" w:sz="4"/>
+              <w:bottom w:val="single" w:color="A6B4B8" w:sz="4"/>
+              <w:right w:val="single" w:color="A6B4B8" w:sz="4"/>
+            </w:tcBorders>
+            <w:tcMar>
+              <w:top w:type="dxa" w:w="50"/>
+              <w:left w:type="dxa" w:w="90"/>
+              <w:bottom w:type="dxa" w:w="50"/>
+              <w:right w:type="dxa" w:w="90"/>
+            </w:tcMar>
+            <w:vAlign w:val="top"/>
+          </w:tcPr>
+          <w:p>
+            <w:pPr>
+              <w:spacing w:after="0" w:line="252"/>
+              <w:jc w:val="center"/>
+            </w:pPr>
+            <w:r>
+              <w:rPr>
+                <w:b/>
+                <w:bCs/>
+                <w:sz w:val="19"/>
+                <w:szCs w:val="19"/>
+              </w:rPr>
+              <w:t xml:space="preserve">52</w:t>
             </w:r>
           </w:p>
         </w:tc>

</xml_diff>

<commit_message>
EPG001: quitar la espera de 2 minutos de la puesta en marcha del control box
Co-Authored-By: Claude Opus 5.5 <noreply@anthropic.com>
Claude-Session: https://claude.ai/code/session_01Nz5qZw2jp5HghH6VEfj4aK
</commit_message>
<xml_diff>
--- a/procedimientos_gris/00503-00-EPG001 Procedimiento Inspeccion Robotizada GRIS.docx
+++ b/procedimientos_gris/00503-00-EPG001 Procedimiento Inspeccion Robotizada GRIS.docx
@@ -11985,7 +11985,7 @@
                 <w:sz w:val="19"/>
                 <w:szCs w:val="19"/>
               </w:rPr>
-              <w:t xml:space="preserve">Con el control box ya energizado, esperar 2 minutos y recién entonces iniciar el software GRIS.</w:t>
+              <w:t xml:space="preserve">Iniciar el software GRIS.</w:t>
             </w:r>
           </w:p>
         </w:tc>
@@ -12652,7 +12652,7 @@
               <w:t xml:space="preserve">Reencendido: </w:t>
             </w:r>
             <w:r>
-              <w:t xml:space="preserve">si el cable principal sigue conectado al control box y al robot, para volver a encender basta con poner la llave en CERRADO (ON) e iniciar el software de inmediato: no es necesaria la espera de 2 minutos del punto 9. Para apagar, cerrar el software y poner la llave en ABIERTO (OFF).</w:t>
+              <w:t xml:space="preserve">si el cable principal sigue conectado al control box y al robot, para volver a encender basta con poner la llave en CERRADO (ON) e iniciar el software. Para apagar, cerrar el software y poner la llave en ABIERTO (OFF).</w:t>
             </w:r>
           </w:p>
         </w:tc>

</xml_diff>

<commit_message>
EPG001: quitar la tabla de verificación del nudo ocho
La secuencia del control box pasa a ser la Tabla 3.

Co-Authored-By: Claude Opus 5.5 <noreply@anthropic.com>
Claude-Session: https://claude.ai/code/session_01Nz5qZw2jp5HghH6VEfj4aK
</commit_message>
<xml_diff>
--- a/procedimientos_gris/00503-00-EPG001 Procedimiento Inspeccion Robotizada GRIS.docx
+++ b/procedimientos_gris/00503-00-EPG001 Procedimiento Inspeccion Robotizada GRIS.docx
@@ -469,7 +469,7 @@
           <w:sz w:val="19"/>
         </w:rPr>
         <w:tab/>
-        <w:t>12</w:t>
+        <w:t>11</w:t>
       </w:r>
     </w:p>
     <w:p>
@@ -4642,7 +4642,7 @@
                 <w:sz w:val="19"/>
                 <w:szCs w:val="19"/>
               </w:rPr>
-              <w:t xml:space="preserve">Protección del robot contra descargas electrostáticas mientras el cable principal no está conectado al control box (Tabla 4).</w:t>
+              <w:t xml:space="preserve">Protección del robot contra descargas electrostáticas mientras el cable principal no está conectado al control box (Tabla 3).</w:t>
             </w:r>
           </w:p>
         </w:tc>
@@ -10132,7 +10132,7 @@
                 <w:sz w:val="19"/>
                 <w:szCs w:val="19"/>
               </w:rPr>
-              <w:t xml:space="preserve">Poner en marcha el control box y conectar el cable principal del robot siguiendo la secuencia de la Tabla 4, que protege los componentes del robot contra descargas electrostáticas. Repetir la secuencia cada vez que se conecte el cable principal.</w:t>
+              <w:t xml:space="preserve">Poner en marcha el control box y conectar el cable principal del robot siguiendo la secuencia de la Tabla 3, que protege los componentes del robot contra descargas electrostáticas. Repetir la secuencia cada vez que se conecte el cable principal.</w:t>
             </w:r>
           </w:p>
         </w:tc>
@@ -10165,7 +10165,7 @@
                 <w:sz w:val="19"/>
                 <w:szCs w:val="19"/>
               </w:rPr>
-              <w:t xml:space="preserve">Tabla 4</w:t>
+              <w:t xml:space="preserve">Tabla 3</w:t>
             </w:r>
           </w:p>
         </w:tc>
@@ -10236,7 +10236,7 @@
                 <w:sz w:val="19"/>
                 <w:szCs w:val="19"/>
               </w:rPr>
-              <w:t xml:space="preserve">Instalar las cuerdas de seguridad del robot y atarlas al punto de amarre con un nudo ocho reconstruido. Verificar el nudo según la Tabla 3.</w:t>
+              <w:t xml:space="preserve">Instalar las cuerdas de seguridad del robot y atarlas al punto de amarre con un nudo ocho reconstruido.</w:t>
             </w:r>
           </w:p>
         </w:tc>
@@ -10269,7 +10269,7 @@
                 <w:sz w:val="19"/>
                 <w:szCs w:val="19"/>
               </w:rPr>
-              <w:t xml:space="preserve">Figura 1 / Tabla 3</w:t>
+              <w:t xml:space="preserve">Figura 1</w:t>
             </w:r>
           </w:p>
         </w:tc>
@@ -10604,7 +10604,7 @@
         <w:jc w:val="both"/>
       </w:pPr>
       <w:r>
-        <w:t xml:space="preserve">Las cuerdas de seguridad (3 mm) se atan al ojal del robot con un nudo ocho reconstruido (paso 28), que no se corre ni se desata con los tirones ni con las vibraciones del ensayo. Se ata según la Figura 1 y se verifica con la Tabla 3.</w:t>
+        <w:t xml:space="preserve">Las cuerdas de seguridad (3 mm) se atan al ojal del robot con un nudo ocho reconstruido (paso 28), que no se corre ni se desata con los tirones ni con las vibraciones del ensayo. Se ata según la Figura 1.</w:t>
       </w:r>
     </w:p>
     <w:p>
@@ -10672,534 +10672,6 @@
     </w:p>
     <w:p>
       <w:pPr>
-        <w:keepNext/>
-        <w:spacing w:after="100" w:line="264"/>
-        <w:jc w:val="both"/>
-      </w:pPr>
-      <w:r>
-        <w:rPr>
-          <w:b/>
-          <w:bCs/>
-        </w:rPr>
-        <w:t xml:space="preserve">Tabla 3: Verificación del nudo ocho reconstruido.</w:t>
-      </w:r>
-      <w:r>
-        <w:t xml:space="preserve"> La realiza el operador que lo ató y la repite un segundo operador antes de introducir el robot en el entrehierro:</w:t>
-      </w:r>
-    </w:p>
-    <w:tbl>
-      <w:tblPr>
-        <w:tblW w:type="dxa" w:w="9638"/>
-        <w:tblBorders>
-          <w:top w:val="single" w:color="auto" w:sz="4"/>
-          <w:left w:val="single" w:color="auto" w:sz="4"/>
-          <w:bottom w:val="single" w:color="auto" w:sz="4"/>
-          <w:right w:val="single" w:color="auto" w:sz="4"/>
-          <w:insideH w:val="single" w:color="auto" w:sz="4"/>
-          <w:insideV w:val="single" w:color="auto" w:sz="4"/>
-        </w:tblBorders>
-      </w:tblPr>
-      <w:tblGrid>
-        <w:gridCol w:w="2400"/>
-        <w:gridCol w:w="7238"/>
-      </w:tblGrid>
-      <w:tr>
-        <w:trPr>
-          <w:cantSplit/>
-          <w:tblHeader/>
-        </w:trPr>
-        <w:tc>
-          <w:tcPr>
-            <w:tcW w:type="dxa" w:w="2400"/>
-            <w:tcBorders>
-              <w:top w:val="single" w:color="A6B4B8" w:sz="4"/>
-              <w:left w:val="single" w:color="A6B4B8" w:sz="4"/>
-              <w:bottom w:val="single" w:color="A6B4B8" w:sz="4"/>
-              <w:right w:val="single" w:color="A6B4B8" w:sz="4"/>
-            </w:tcBorders>
-            <w:shd w:fill="DAE0E2" w:val="clear"/>
-            <w:tcMar>
-              <w:top w:type="dxa" w:w="50"/>
-              <w:left w:type="dxa" w:w="90"/>
-              <w:bottom w:type="dxa" w:w="50"/>
-              <w:right w:type="dxa" w:w="90"/>
-            </w:tcMar>
-            <w:vAlign w:val="center"/>
-          </w:tcPr>
-          <w:p>
-            <w:pPr>
-              <w:keepNext/>
-              <w:spacing w:after="0" w:line="252"/>
-              <w:jc w:val="left"/>
-            </w:pPr>
-            <w:r>
-              <w:rPr>
-                <w:b/>
-                <w:bCs/>
-                <w:sz w:val="19"/>
-                <w:szCs w:val="19"/>
-              </w:rPr>
-              <w:t xml:space="preserve">Control</w:t>
-            </w:r>
-          </w:p>
-        </w:tc>
-        <w:tc>
-          <w:tcPr>
-            <w:tcW w:type="dxa" w:w="7238"/>
-            <w:tcBorders>
-              <w:top w:val="single" w:color="A6B4B8" w:sz="4"/>
-              <w:left w:val="single" w:color="A6B4B8" w:sz="4"/>
-              <w:bottom w:val="single" w:color="A6B4B8" w:sz="4"/>
-              <w:right w:val="single" w:color="A6B4B8" w:sz="4"/>
-            </w:tcBorders>
-            <w:shd w:fill="DAE0E2" w:val="clear"/>
-            <w:tcMar>
-              <w:top w:type="dxa" w:w="50"/>
-              <w:left w:type="dxa" w:w="90"/>
-              <w:bottom w:type="dxa" w:w="50"/>
-              <w:right w:type="dxa" w:w="90"/>
-            </w:tcMar>
-            <w:vAlign w:val="center"/>
-          </w:tcPr>
-          <w:p>
-            <w:pPr>
-              <w:keepNext/>
-              <w:spacing w:after="0" w:line="252"/>
-              <w:jc w:val="left"/>
-            </w:pPr>
-            <w:r>
-              <w:rPr>
-                <w:b/>
-                <w:bCs/>
-                <w:sz w:val="19"/>
-                <w:szCs w:val="19"/>
-              </w:rPr>
-              <w:t xml:space="preserve">Criterio de aceptación</w:t>
-            </w:r>
-          </w:p>
-        </w:tc>
-      </w:tr>
-      <w:tr>
-        <w:trPr>
-          <w:cantSplit/>
-        </w:trPr>
-        <w:tc>
-          <w:tcPr>
-            <w:tcW w:type="dxa" w:w="2400"/>
-            <w:tcBorders>
-              <w:top w:val="single" w:color="A6B4B8" w:sz="4"/>
-              <w:left w:val="single" w:color="A6B4B8" w:sz="4"/>
-              <w:bottom w:val="single" w:color="A6B4B8" w:sz="4"/>
-              <w:right w:val="single" w:color="A6B4B8" w:sz="4"/>
-            </w:tcBorders>
-            <w:tcMar>
-              <w:top w:type="dxa" w:w="50"/>
-              <w:left w:type="dxa" w:w="90"/>
-              <w:bottom w:type="dxa" w:w="50"/>
-              <w:right w:type="dxa" w:w="90"/>
-            </w:tcMar>
-            <w:vAlign w:val="top"/>
-          </w:tcPr>
-          <w:p>
-            <w:pPr>
-              <w:keepNext/>
-              <w:spacing w:after="0" w:line="252"/>
-              <w:jc w:val="left"/>
-            </w:pPr>
-            <w:r>
-              <w:rPr>
-                <w:b w:val="false"/>
-                <w:bCs w:val="false"/>
-                <w:sz w:val="19"/>
-                <w:szCs w:val="19"/>
-              </w:rPr>
-              <w:t xml:space="preserve">Figura</w:t>
-            </w:r>
-          </w:p>
-        </w:tc>
-        <w:tc>
-          <w:tcPr>
-            <w:tcW w:type="dxa" w:w="7238"/>
-            <w:tcBorders>
-              <w:top w:val="single" w:color="A6B4B8" w:sz="4"/>
-              <w:left w:val="single" w:color="A6B4B8" w:sz="4"/>
-              <w:bottom w:val="single" w:color="A6B4B8" w:sz="4"/>
-              <w:right w:val="single" w:color="A6B4B8" w:sz="4"/>
-            </w:tcBorders>
-            <w:tcMar>
-              <w:top w:type="dxa" w:w="50"/>
-              <w:left w:type="dxa" w:w="90"/>
-              <w:bottom w:type="dxa" w:w="50"/>
-              <w:right w:type="dxa" w:w="90"/>
-            </w:tcMar>
-            <w:vAlign w:val="top"/>
-          </w:tcPr>
-          <w:p>
-            <w:pPr>
-              <w:keepNext/>
-              <w:spacing w:after="0" w:line="252"/>
-              <w:jc w:val="left"/>
-            </w:pPr>
-            <w:r>
-              <w:rPr>
-                <w:b w:val="false"/>
-                <w:bCs w:val="false"/>
-                <w:sz w:val="19"/>
-                <w:szCs w:val="19"/>
-              </w:rPr>
-              <w:t xml:space="preserve">Se ve un ocho completo, formado en todo su recorrido por pares de cuerdas paralelas.</w:t>
-            </w:r>
-          </w:p>
-        </w:tc>
-      </w:tr>
-      <w:tr>
-        <w:trPr>
-          <w:cantSplit/>
-        </w:trPr>
-        <w:tc>
-          <w:tcPr>
-            <w:tcW w:type="dxa" w:w="2400"/>
-            <w:tcBorders>
-              <w:top w:val="single" w:color="A6B4B8" w:sz="4"/>
-              <w:left w:val="single" w:color="A6B4B8" w:sz="4"/>
-              <w:bottom w:val="single" w:color="A6B4B8" w:sz="4"/>
-              <w:right w:val="single" w:color="A6B4B8" w:sz="4"/>
-            </w:tcBorders>
-            <w:tcMar>
-              <w:top w:type="dxa" w:w="50"/>
-              <w:left w:type="dxa" w:w="90"/>
-              <w:bottom w:type="dxa" w:w="50"/>
-              <w:right w:type="dxa" w:w="90"/>
-            </w:tcMar>
-            <w:vAlign w:val="top"/>
-          </w:tcPr>
-          <w:p>
-            <w:pPr>
-              <w:keepNext/>
-              <w:spacing w:after="0" w:line="252"/>
-              <w:jc w:val="left"/>
-            </w:pPr>
-            <w:r>
-              <w:rPr>
-                <w:b w:val="false"/>
-                <w:bCs w:val="false"/>
-                <w:sz w:val="19"/>
-                <w:szCs w:val="19"/>
-              </w:rPr>
-              <w:t xml:space="preserve">Ramales</w:t>
-            </w:r>
-          </w:p>
-        </w:tc>
-        <w:tc>
-          <w:tcPr>
-            <w:tcW w:type="dxa" w:w="7238"/>
-            <w:tcBorders>
-              <w:top w:val="single" w:color="A6B4B8" w:sz="4"/>
-              <w:left w:val="single" w:color="A6B4B8" w:sz="4"/>
-              <w:bottom w:val="single" w:color="A6B4B8" w:sz="4"/>
-              <w:right w:val="single" w:color="A6B4B8" w:sz="4"/>
-            </w:tcBorders>
-            <w:tcMar>
-              <w:top w:type="dxa" w:w="50"/>
-              <w:left w:type="dxa" w:w="90"/>
-              <w:bottom w:type="dxa" w:w="50"/>
-              <w:right w:type="dxa" w:w="90"/>
-            </w:tcMar>
-            <w:vAlign w:val="top"/>
-          </w:tcPr>
-          <w:p>
-            <w:pPr>
-              <w:keepNext/>
-              <w:spacing w:after="0" w:line="252"/>
-              <w:jc w:val="left"/>
-            </w:pPr>
-            <w:r>
-              <w:rPr>
-                <w:b w:val="false"/>
-                <w:bCs w:val="false"/>
-                <w:sz w:val="19"/>
-                <w:szCs w:val="19"/>
-              </w:rPr>
-              <w:t xml:space="preserve">Los dos ramales de cada par van juntos, sin cruzarse ni montarse uno sobre el otro.</w:t>
-            </w:r>
-          </w:p>
-        </w:tc>
-      </w:tr>
-      <w:tr>
-        <w:trPr>
-          <w:cantSplit/>
-        </w:trPr>
-        <w:tc>
-          <w:tcPr>
-            <w:tcW w:type="dxa" w:w="2400"/>
-            <w:tcBorders>
-              <w:top w:val="single" w:color="A6B4B8" w:sz="4"/>
-              <w:left w:val="single" w:color="A6B4B8" w:sz="4"/>
-              <w:bottom w:val="single" w:color="A6B4B8" w:sz="4"/>
-              <w:right w:val="single" w:color="A6B4B8" w:sz="4"/>
-            </w:tcBorders>
-            <w:tcMar>
-              <w:top w:type="dxa" w:w="50"/>
-              <w:left w:type="dxa" w:w="90"/>
-              <w:bottom w:type="dxa" w:w="50"/>
-              <w:right w:type="dxa" w:w="90"/>
-            </w:tcMar>
-            <w:vAlign w:val="top"/>
-          </w:tcPr>
-          <w:p>
-            <w:pPr>
-              <w:keepNext/>
-              <w:spacing w:after="0" w:line="252"/>
-              <w:jc w:val="left"/>
-            </w:pPr>
-            <w:r>
-              <w:rPr>
-                <w:b w:val="false"/>
-                <w:bCs w:val="false"/>
-                <w:sz w:val="19"/>
-                <w:szCs w:val="19"/>
-              </w:rPr>
-              <w:t xml:space="preserve">Recorrido</w:t>
-            </w:r>
-          </w:p>
-        </w:tc>
-        <w:tc>
-          <w:tcPr>
-            <w:tcW w:type="dxa" w:w="7238"/>
-            <w:tcBorders>
-              <w:top w:val="single" w:color="A6B4B8" w:sz="4"/>
-              <w:left w:val="single" w:color="A6B4B8" w:sz="4"/>
-              <w:bottom w:val="single" w:color="A6B4B8" w:sz="4"/>
-              <w:right w:val="single" w:color="A6B4B8" w:sz="4"/>
-            </w:tcBorders>
-            <w:tcMar>
-              <w:top w:type="dxa" w:w="50"/>
-              <w:left w:type="dxa" w:w="90"/>
-              <w:bottom w:type="dxa" w:w="50"/>
-              <w:right w:type="dxa" w:w="90"/>
-            </w:tcMar>
-            <w:vAlign w:val="top"/>
-          </w:tcPr>
-          <w:p>
-            <w:pPr>
-              <w:keepNext/>
-              <w:spacing w:after="0" w:line="252"/>
-              <w:jc w:val="left"/>
-            </w:pPr>
-            <w:r>
-              <w:rPr>
-                <w:b w:val="false"/>
-                <w:bCs w:val="false"/>
-                <w:sz w:val="19"/>
-                <w:szCs w:val="19"/>
-              </w:rPr>
-              <w:t xml:space="preserve">El lazo pasa por el ojal de amarre del robot y la punta sale del nudo junto a la cuerda.</w:t>
-            </w:r>
-          </w:p>
-        </w:tc>
-      </w:tr>
-      <w:tr>
-        <w:trPr>
-          <w:cantSplit/>
-        </w:trPr>
-        <w:tc>
-          <w:tcPr>
-            <w:tcW w:type="dxa" w:w="2400"/>
-            <w:tcBorders>
-              <w:top w:val="single" w:color="A6B4B8" w:sz="4"/>
-              <w:left w:val="single" w:color="A6B4B8" w:sz="4"/>
-              <w:bottom w:val="single" w:color="A6B4B8" w:sz="4"/>
-              <w:right w:val="single" w:color="A6B4B8" w:sz="4"/>
-            </w:tcBorders>
-            <w:tcMar>
-              <w:top w:type="dxa" w:w="50"/>
-              <w:left w:type="dxa" w:w="90"/>
-              <w:bottom w:type="dxa" w:w="50"/>
-              <w:right w:type="dxa" w:w="90"/>
-            </w:tcMar>
-            <w:vAlign w:val="top"/>
-          </w:tcPr>
-          <w:p>
-            <w:pPr>
-              <w:keepNext/>
-              <w:spacing w:after="0" w:line="252"/>
-              <w:jc w:val="left"/>
-            </w:pPr>
-            <w:r>
-              <w:rPr>
-                <w:b w:val="false"/>
-                <w:bCs w:val="false"/>
-                <w:sz w:val="19"/>
-                <w:szCs w:val="19"/>
-              </w:rPr>
-              <w:t xml:space="preserve">Apriete</w:t>
-            </w:r>
-          </w:p>
-        </w:tc>
-        <w:tc>
-          <w:tcPr>
-            <w:tcW w:type="dxa" w:w="7238"/>
-            <w:tcBorders>
-              <w:top w:val="single" w:color="A6B4B8" w:sz="4"/>
-              <w:left w:val="single" w:color="A6B4B8" w:sz="4"/>
-              <w:bottom w:val="single" w:color="A6B4B8" w:sz="4"/>
-              <w:right w:val="single" w:color="A6B4B8" w:sz="4"/>
-            </w:tcBorders>
-            <w:tcMar>
-              <w:top w:type="dxa" w:w="50"/>
-              <w:left w:type="dxa" w:w="90"/>
-              <w:bottom w:type="dxa" w:w="50"/>
-              <w:right w:type="dxa" w:w="90"/>
-            </w:tcMar>
-            <w:vAlign w:val="top"/>
-          </w:tcPr>
-          <w:p>
-            <w:pPr>
-              <w:keepNext/>
-              <w:spacing w:after="0" w:line="252"/>
-              <w:jc w:val="left"/>
-            </w:pPr>
-            <w:r>
-              <w:rPr>
-                <w:b w:val="false"/>
-                <w:bCs w:val="false"/>
-                <w:sz w:val="19"/>
-                <w:szCs w:val="19"/>
-              </w:rPr>
-              <w:t xml:space="preserve">El nudo no se deforma ni se corre al tirar con fuerza de la cuerda y del lazo.</w:t>
-            </w:r>
-          </w:p>
-        </w:tc>
-      </w:tr>
-      <w:tr>
-        <w:trPr>
-          <w:cantSplit/>
-        </w:trPr>
-        <w:tc>
-          <w:tcPr>
-            <w:tcW w:type="dxa" w:w="2400"/>
-            <w:tcBorders>
-              <w:top w:val="single" w:color="A6B4B8" w:sz="4"/>
-              <w:left w:val="single" w:color="A6B4B8" w:sz="4"/>
-              <w:bottom w:val="single" w:color="A6B4B8" w:sz="4"/>
-              <w:right w:val="single" w:color="A6B4B8" w:sz="4"/>
-            </w:tcBorders>
-            <w:tcMar>
-              <w:top w:type="dxa" w:w="50"/>
-              <w:left w:type="dxa" w:w="90"/>
-              <w:bottom w:type="dxa" w:w="50"/>
-              <w:right w:type="dxa" w:w="90"/>
-            </w:tcMar>
-            <w:vAlign w:val="top"/>
-          </w:tcPr>
-          <w:p>
-            <w:pPr>
-              <w:keepNext/>
-              <w:spacing w:after="0" w:line="252"/>
-              <w:jc w:val="left"/>
-            </w:pPr>
-            <w:r>
-              <w:rPr>
-                <w:b w:val="false"/>
-                <w:bCs w:val="false"/>
-                <w:sz w:val="19"/>
-                <w:szCs w:val="19"/>
-              </w:rPr>
-              <w:t xml:space="preserve">Punta libre</w:t>
-            </w:r>
-          </w:p>
-        </w:tc>
-        <w:tc>
-          <w:tcPr>
-            <w:tcW w:type="dxa" w:w="7238"/>
-            <w:tcBorders>
-              <w:top w:val="single" w:color="A6B4B8" w:sz="4"/>
-              <w:left w:val="single" w:color="A6B4B8" w:sz="4"/>
-              <w:bottom w:val="single" w:color="A6B4B8" w:sz="4"/>
-              <w:right w:val="single" w:color="A6B4B8" w:sz="4"/>
-            </w:tcBorders>
-            <w:tcMar>
-              <w:top w:type="dxa" w:w="50"/>
-              <w:left w:type="dxa" w:w="90"/>
-              <w:bottom w:type="dxa" w:w="50"/>
-              <w:right w:type="dxa" w:w="90"/>
-            </w:tcMar>
-            <w:vAlign w:val="top"/>
-          </w:tcPr>
-          <w:p>
-            <w:pPr>
-              <w:keepNext/>
-              <w:spacing w:after="0" w:line="252"/>
-              <w:jc w:val="left"/>
-            </w:pPr>
-            <w:r>
-              <w:rPr>
-                <w:b w:val="false"/>
-                <w:bCs w:val="false"/>
-                <w:sz w:val="19"/>
-                <w:szCs w:val="19"/>
-              </w:rPr>
-              <w:t xml:space="preserve">Entre 3 cm y 5 cm (unas 10 a 15 veces el diámetro de la cuerda). Más corto puede salirse del nudo; más largo puede engancharse o quedar debajo del robot.</w:t>
-            </w:r>
-          </w:p>
-        </w:tc>
-      </w:tr>
-    </w:tbl>
-    <w:tbl>
-      <w:tblPr>
-        <w:tblW w:type="dxa" w:w="9638"/>
-        <w:tblBorders>
-          <w:top w:val="single" w:color="auto" w:sz="4"/>
-          <w:left w:val="single" w:color="auto" w:sz="4"/>
-          <w:bottom w:val="single" w:color="auto" w:sz="4"/>
-          <w:right w:val="single" w:color="auto" w:sz="4"/>
-          <w:insideH w:val="single" w:color="auto" w:sz="4"/>
-          <w:insideV w:val="single" w:color="auto" w:sz="4"/>
-        </w:tblBorders>
-      </w:tblPr>
-      <w:tblGrid>
-        <w:gridCol w:w="9638"/>
-      </w:tblGrid>
-      <w:tr>
-        <w:tc>
-          <w:tcPr>
-            <w:tcW w:type="dxa" w:w="9638"/>
-            <w:tcBorders>
-              <w:top w:val="single" w:color="6D8289" w:sz="4"/>
-              <w:left w:val="single" w:color="6D8289" w:sz="24"/>
-              <w:bottom w:val="single" w:color="6D8289" w:sz="4"/>
-              <w:right w:val="single" w:color="6D8289" w:sz="4"/>
-            </w:tcBorders>
-            <w:shd w:fill="EEF2F3" w:val="clear"/>
-            <w:tcMar>
-              <w:top w:type="dxa" w:w="80"/>
-              <w:left w:type="dxa" w:w="160"/>
-              <w:bottom w:type="dxa" w:w="80"/>
-              <w:right w:type="dxa" w:w="160"/>
-            </w:tcMar>
-          </w:tcPr>
-          <w:p>
-            <w:pPr>
-              <w:spacing w:after="0" w:line="264"/>
-              <w:jc w:val="both"/>
-            </w:pPr>
-            <w:r>
-              <w:rPr>
-                <w:b/>
-                <w:bCs/>
-                <w:color w:val="6D8289"/>
-              </w:rPr>
-              <w:t xml:space="preserve">Importante: </w:t>
-            </w:r>
-            <w:r>
-              <w:t xml:space="preserve">si algún control no se cumple, desatar el nudo y volver a hacerlo desde el paso 1 de la Figura 1. Revisar el nudo al inicio de cada jornada y cada vez que la cuerda haya quedado enganchada o haya soportado un tirón.</w:t>
-            </w:r>
-          </w:p>
-        </w:tc>
-      </w:tr>
-    </w:tbl>
-    <w:p>
-      <w:pPr>
         <w:pStyle w:val="Heading3"/>
         <w:keepNext/>
         <w:spacing w:after="80" w:before="160"/>
@@ -11215,7 +10687,7 @@
         <w:jc w:val="both"/>
       </w:pPr>
       <w:r>
-        <w:t xml:space="preserve">Para reducir el riesgo de que una descarga electrostática dañe los componentes del robot, el cable principal se conecta y se desconecta siempre con la llave del control box en ABIERTO (OFF) y en el orden de la Tabla 4: mientras el cable no está conectado al control box, lleva colocado el dispositivo de cortocircuito conectado a tierra. La secuencia de puesta en marcha se aplica cada vez que se conecta el cable principal (paso 27) y la de parada, cada vez que se desconecta.</w:t>
+        <w:t xml:space="preserve">Para reducir el riesgo de que una descarga electrostática dañe los componentes del robot, el cable principal se conecta y se desconecta siempre con la llave del control box en ABIERTO (OFF) y en el orden de la Tabla 3: mientras el cable no está conectado al control box, lleva colocado el dispositivo de cortocircuito conectado a tierra. La secuencia de puesta en marcha se aplica cada vez que se conecta el cable principal (paso 27) y la de parada, cada vez que se desconecta.</w:t>
       </w:r>
     </w:p>
     <w:p>
@@ -11229,7 +10701,7 @@
           <w:b/>
           <w:bCs/>
         </w:rPr>
-        <w:t xml:space="preserve">Tabla 4: Secuencias de puesta en marcha y de parada del control box.</w:t>
+        <w:t xml:space="preserve">Tabla 3: Secuencias de puesta en marcha y de parada del control box.</w:t>
       </w:r>
     </w:p>
     <w:tbl>
@@ -15702,7 +15174,7 @@
                 <w:sz w:val="19"/>
                 <w:szCs w:val="19"/>
               </w:rPr>
-              <w:t xml:space="preserve">Desenergizar el control box y desconectar el cable principal del robot siguiendo la secuencia de parada de la Tabla 4.</w:t>
+              <w:t xml:space="preserve">Desenergizar el control box y desconectar el cable principal del robot siguiendo la secuencia de parada de la Tabla 3.</w:t>
             </w:r>
           </w:p>
         </w:tc>
@@ -15735,7 +15207,7 @@
                 <w:sz w:val="19"/>
                 <w:szCs w:val="19"/>
               </w:rPr>
-              <w:t xml:space="preserve">Tabla 4</w:t>
+              <w:t xml:space="preserve">Tabla 3</w:t>
             </w:r>
           </w:p>
         </w:tc>

</xml_diff>

<commit_message>
EPG001: quitar «Punta de resina» de las definiciones
Co-Authored-By: Claude Opus 5.5 <noreply@anthropic.com>
Claude-Session: https://claude.ai/code/session_01Nz5qZw2jp5HghH6VEfj4aK
</commit_message>
<xml_diff>
--- a/procedimientos_gris/00503-00-EPG001 Procedimiento Inspeccion Robotizada GRIS.docx
+++ b/procedimientos_gris/00503-00-EPG001 Procedimiento Inspeccion Robotizada GRIS.docx
@@ -1424,77 +1424,6 @@
                 <w:szCs w:val="19"/>
               </w:rPr>
               <w:t xml:space="preserve">Software de adquisición y visualización del ensayo EL CID.</w:t>
-            </w:r>
-          </w:p>
-        </w:tc>
-      </w:tr>
-      <w:tr>
-        <w:trPr>
-          <w:cantSplit/>
-        </w:trPr>
-        <w:tc>
-          <w:tcPr>
-            <w:tcW w:type="dxa" w:w="1700"/>
-            <w:tcBorders>
-              <w:top w:val="single" w:color="A6B4B8" w:sz="4"/>
-              <w:left w:val="single" w:color="A6B4B8" w:sz="4"/>
-              <w:bottom w:val="single" w:color="A6B4B8" w:sz="4"/>
-              <w:right w:val="single" w:color="A6B4B8" w:sz="4"/>
-            </w:tcBorders>
-            <w:tcMar>
-              <w:top w:type="dxa" w:w="50"/>
-              <w:left w:type="dxa" w:w="90"/>
-              <w:bottom w:type="dxa" w:w="50"/>
-              <w:right w:type="dxa" w:w="90"/>
-            </w:tcMar>
-            <w:vAlign w:val="top"/>
-          </w:tcPr>
-          <w:p>
-            <w:pPr>
-              <w:spacing w:after="0" w:line="252"/>
-              <w:jc w:val="left"/>
-            </w:pPr>
-            <w:r>
-              <w:rPr>
-                <w:b w:val="false"/>
-                <w:bCs w:val="false"/>
-                <w:sz w:val="19"/>
-                <w:szCs w:val="19"/>
-              </w:rPr>
-              <w:t xml:space="preserve">Punta de resina</w:t>
-            </w:r>
-          </w:p>
-        </w:tc>
-        <w:tc>
-          <w:tcPr>
-            <w:tcW w:type="dxa" w:w="7938"/>
-            <w:tcBorders>
-              <w:top w:val="single" w:color="A6B4B8" w:sz="4"/>
-              <w:left w:val="single" w:color="A6B4B8" w:sz="4"/>
-              <w:bottom w:val="single" w:color="A6B4B8" w:sz="4"/>
-              <w:right w:val="single" w:color="A6B4B8" w:sz="4"/>
-            </w:tcBorders>
-            <w:tcMar>
-              <w:top w:type="dxa" w:w="50"/>
-              <w:left w:type="dxa" w:w="90"/>
-              <w:bottom w:type="dxa" w:w="50"/>
-              <w:right w:type="dxa" w:w="90"/>
-            </w:tcMar>
-            <w:vAlign w:val="top"/>
-          </w:tcPr>
-          <w:p>
-            <w:pPr>
-              <w:spacing w:after="0" w:line="252"/>
-              <w:jc w:val="left"/>
-            </w:pPr>
-            <w:r>
-              <w:rPr>
-                <w:b w:val="false"/>
-                <w:bCs w:val="false"/>
-                <w:sz w:val="19"/>
-                <w:szCs w:val="19"/>
-              </w:rPr>
-              <w:t xml:space="preserve">Protuberancia de resina sobre la superficie del estator (resin tip) que puede dificultar el paso o la adherencia del robot.</w:t>
             </w:r>
           </w:p>
         </w:tc>

</xml_diff>

<commit_message>
EPG001: guía breve de uso; quitar definición de autotransformador y detector WTT
- Apartado «Cómo usar este procedimiento» al inicio del contenido.
- Sin la definición de autotransformador (EPG001 y EPG002).
- El detector WTT, integrado en el robot, deja de figurar como equipo.

Co-Authored-By: Claude Opus 5.5 <noreply@anthropic.com>
Claude-Session: https://claude.ai/code/session_01Nz5qZw2jp5HghH6VEfj4aK
</commit_message>
<xml_diff>
--- a/procedimientos_gris/00503-00-EPG001 Procedimiento Inspeccion Robotizada GRIS.docx
+++ b/procedimientos_gris/00503-00-EPG001 Procedimiento Inspeccion Robotizada GRIS.docx
@@ -337,7 +337,7 @@
           <w:sz w:val="19"/>
         </w:rPr>
         <w:tab/>
-        <w:t>4</w:t>
+        <w:t>5</w:t>
       </w:r>
     </w:p>
     <w:p>
@@ -381,7 +381,7 @@
           <w:sz w:val="19"/>
         </w:rPr>
         <w:tab/>
-        <w:t>6</w:t>
+        <w:t>7</w:t>
       </w:r>
     </w:p>
     <w:p>
@@ -1248,77 +1248,6 @@
                 <w:sz w:val="19"/>
                 <w:szCs w:val="19"/>
               </w:rPr>
-              <w:t xml:space="preserve">Autotransformador</w:t>
-            </w:r>
-          </w:p>
-        </w:tc>
-        <w:tc>
-          <w:tcPr>
-            <w:tcW w:type="dxa" w:w="7938"/>
-            <w:tcBorders>
-              <w:top w:val="single" w:color="A6B4B8" w:sz="4"/>
-              <w:left w:val="single" w:color="A6B4B8" w:sz="4"/>
-              <w:bottom w:val="single" w:color="A6B4B8" w:sz="4"/>
-              <w:right w:val="single" w:color="A6B4B8" w:sz="4"/>
-            </w:tcBorders>
-            <w:tcMar>
-              <w:top w:type="dxa" w:w="50"/>
-              <w:left w:type="dxa" w:w="90"/>
-              <w:bottom w:type="dxa" w:w="50"/>
-              <w:right w:type="dxa" w:w="90"/>
-            </w:tcMar>
-            <w:vAlign w:val="top"/>
-          </w:tcPr>
-          <w:p>
-            <w:pPr>
-              <w:spacing w:after="0" w:line="252"/>
-              <w:jc w:val="left"/>
-            </w:pPr>
-            <w:r>
-              <w:rPr>
-                <w:b w:val="false"/>
-                <w:bCs w:val="false"/>
-                <w:sz w:val="19"/>
-                <w:szCs w:val="19"/>
-              </w:rPr>
-              <w:t xml:space="preserve">Equipo de tensión de salida variable que alimenta el circuito de excitación.</w:t>
-            </w:r>
-          </w:p>
-        </w:tc>
-      </w:tr>
-      <w:tr>
-        <w:trPr>
-          <w:cantSplit/>
-        </w:trPr>
-        <w:tc>
-          <w:tcPr>
-            <w:tcW w:type="dxa" w:w="1700"/>
-            <w:tcBorders>
-              <w:top w:val="single" w:color="A6B4B8" w:sz="4"/>
-              <w:left w:val="single" w:color="A6B4B8" w:sz="4"/>
-              <w:bottom w:val="single" w:color="A6B4B8" w:sz="4"/>
-              <w:right w:val="single" w:color="A6B4B8" w:sz="4"/>
-            </w:tcBorders>
-            <w:tcMar>
-              <w:top w:type="dxa" w:w="50"/>
-              <w:left w:type="dxa" w:w="90"/>
-              <w:bottom w:type="dxa" w:w="50"/>
-              <w:right w:type="dxa" w:w="90"/>
-            </w:tcMar>
-            <w:vAlign w:val="top"/>
-          </w:tcPr>
-          <w:p>
-            <w:pPr>
-              <w:spacing w:after="0" w:line="252"/>
-              <w:jc w:val="left"/>
-            </w:pPr>
-            <w:r>
-              <w:rPr>
-                <w:b w:val="false"/>
-                <w:bCs w:val="false"/>
-                <w:sz w:val="19"/>
-                <w:szCs w:val="19"/>
-              </w:rPr>
               <w:t xml:space="preserve">Tablero de excitación</w:t>
             </w:r>
           </w:p>
@@ -1651,6 +1580,95 @@
       <w:r>
         <w:t xml:space="preserve">2. CONTENIDO</w:t>
       </w:r>
+    </w:p>
+    <w:p>
+      <w:pPr>
+        <w:keepNext/>
+        <w:spacing w:after="100" w:line="264"/>
+        <w:jc w:val="both"/>
+      </w:pPr>
+      <w:r>
+        <w:rPr>
+          <w:b/>
+          <w:bCs/>
+        </w:rPr>
+        <w:t xml:space="preserve">Cómo usar este procedimiento</w:t>
+      </w:r>
+    </w:p>
+    <w:p>
+      <w:pPr>
+        <w:pStyle w:val="ListParagraph"/>
+        <w:numPr>
+          <w:ilvl w:val="0"/>
+          <w:numId w:val="2"/>
+        </w:numPr>
+        <w:spacing w:after="60" w:line="264"/>
+        <w:jc w:val="both"/>
+      </w:pPr>
+      <w:r>
+        <w:t xml:space="preserve">Leer los riesgos del apartado 2.1 antes de iniciar el trabajo.</w:t>
+      </w:r>
+    </w:p>
+    <w:p>
+      <w:pPr>
+        <w:pStyle w:val="ListParagraph"/>
+        <w:numPr>
+          <w:ilvl w:val="0"/>
+          <w:numId w:val="2"/>
+        </w:numPr>
+        <w:spacing w:after="60" w:line="264"/>
+        <w:jc w:val="both"/>
+      </w:pPr>
+      <w:r>
+        <w:t xml:space="preserve">Ejecutar los pasos numerados en orden, de la etapa 2.4 a la 2.11 (resumen en el apartado 2.3).</w:t>
+      </w:r>
+    </w:p>
+    <w:p>
+      <w:pPr>
+        <w:pStyle w:val="ListParagraph"/>
+        <w:numPr>
+          <w:ilvl w:val="0"/>
+          <w:numId w:val="2"/>
+        </w:numPr>
+        <w:spacing w:after="60" w:line="264"/>
+        <w:jc w:val="both"/>
+      </w:pPr>
+      <w:r>
+        <w:t xml:space="preserve">La columna «Referencia» indica dónde está el detalle de cada paso: protocolos EL CID (00503-00-EPG002), manual del software (00503-00-EPG003), esquema de conexiones (Anexo A) o checklist (00503-00-ZRQ001).</w:t>
+      </w:r>
+    </w:p>
+    <w:p>
+      <w:pPr>
+        <w:pStyle w:val="ListParagraph"/>
+        <w:numPr>
+          <w:ilvl w:val="0"/>
+          <w:numId w:val="2"/>
+        </w:numPr>
+        <w:spacing w:after="60" w:line="264"/>
+        <w:jc w:val="both"/>
+      </w:pPr>
+      <w:r>
+        <w:t xml:space="preserve">Tener impreso el Anexo A y el checklist 00503-00-ZRQ001 antes de comenzar.</w:t>
+      </w:r>
+    </w:p>
+    <w:p>
+      <w:pPr>
+        <w:pStyle w:val="ListParagraph"/>
+        <w:numPr>
+          <w:ilvl w:val="0"/>
+          <w:numId w:val="2"/>
+        </w:numPr>
+        <w:spacing w:after="60" w:line="264"/>
+        <w:jc w:val="both"/>
+      </w:pPr>
+      <w:r>
+        <w:t xml:space="preserve">Los recuadros con borde naranja indican precauciones de seguridad; los de borde gris, información complementaria.</w:t>
+      </w:r>
+    </w:p>
+    <w:p>
+      <w:pPr>
+        <w:spacing w:after="120" w:before="0"/>
+      </w:pPr>
     </w:p>
     <w:p>
       <w:pPr>
@@ -5181,77 +5199,6 @@
                 <w:szCs w:val="19"/>
               </w:rPr>
               <w:t xml:space="preserve">Puesta a tierra única desde el estator (00503-00-EPG002 – Protocolo 1).</w:t>
-            </w:r>
-          </w:p>
-        </w:tc>
-      </w:tr>
-      <w:tr>
-        <w:trPr>
-          <w:cantSplit/>
-        </w:trPr>
-        <w:tc>
-          <w:tcPr>
-            <w:tcW w:type="dxa" w:w="3600"/>
-            <w:tcBorders>
-              <w:top w:val="single" w:color="A6B4B8" w:sz="4"/>
-              <w:left w:val="single" w:color="A6B4B8" w:sz="4"/>
-              <w:bottom w:val="single" w:color="A6B4B8" w:sz="4"/>
-              <w:right w:val="single" w:color="A6B4B8" w:sz="4"/>
-            </w:tcBorders>
-            <w:tcMar>
-              <w:top w:type="dxa" w:w="50"/>
-              <w:left w:type="dxa" w:w="90"/>
-              <w:bottom w:type="dxa" w:w="50"/>
-              <w:right w:type="dxa" w:w="90"/>
-            </w:tcMar>
-            <w:vAlign w:val="top"/>
-          </w:tcPr>
-          <w:p>
-            <w:pPr>
-              <w:spacing w:after="0" w:line="252"/>
-              <w:jc w:val="left"/>
-            </w:pPr>
-            <w:r>
-              <w:rPr>
-                <w:b w:val="false"/>
-                <w:bCs w:val="false"/>
-                <w:sz w:val="19"/>
-                <w:szCs w:val="19"/>
-              </w:rPr>
-              <w:t xml:space="preserve">Detector WTT</w:t>
-            </w:r>
-          </w:p>
-        </w:tc>
-        <w:tc>
-          <w:tcPr>
-            <w:tcW w:type="dxa" w:w="6038"/>
-            <w:tcBorders>
-              <w:top w:val="single" w:color="A6B4B8" w:sz="4"/>
-              <w:left w:val="single" w:color="A6B4B8" w:sz="4"/>
-              <w:bottom w:val="single" w:color="A6B4B8" w:sz="4"/>
-              <w:right w:val="single" w:color="A6B4B8" w:sz="4"/>
-            </w:tcBorders>
-            <w:tcMar>
-              <w:top w:type="dxa" w:w="50"/>
-              <w:left w:type="dxa" w:w="90"/>
-              <w:bottom w:type="dxa" w:w="50"/>
-              <w:right w:type="dxa" w:w="90"/>
-            </w:tcMar>
-            <w:vAlign w:val="top"/>
-          </w:tcPr>
-          <w:p>
-            <w:pPr>
-              <w:spacing w:after="0" w:line="252"/>
-              <w:jc w:val="left"/>
-            </w:pPr>
-            <w:r>
-              <w:rPr>
-                <w:b w:val="false"/>
-                <w:bCs w:val="false"/>
-                <w:sz w:val="19"/>
-                <w:szCs w:val="19"/>
-              </w:rPr>
-              <w:t xml:space="preserve">Verificación del ajuste de cuñas.</w:t>
             </w:r>
           </w:p>
         </w:tc>
@@ -16837,6 +16784,12 @@
       <w:startOverride w:val="1"/>
     </w:lvlOverride>
   </w:num>
+  <w:num w:numId="2">
+    <w:abstractNumId w:val="2"/>
+    <w:lvlOverride w:ilvl="0">
+      <w:startOverride w:val="1"/>
+    </w:lvlOverride>
+  </w:num>
 </w:numbering>
 </file>
 

</xml_diff>

<commit_message>
EPG001: guía de lectura (secciones, pasos y columnas); quitar cita EPRI
Co-Authored-By: Claude Opus 5.5 <noreply@anthropic.com>
Claude-Session: https://claude.ai/code/session_01Nz5qZw2jp5HghH6VEfj4aK
</commit_message>
<xml_diff>
--- a/procedimientos_gris/00503-00-EPG001 Procedimiento Inspeccion Robotizada GRIS.docx
+++ b/procedimientos_gris/00503-00-EPG001 Procedimiento Inspeccion Robotizada GRIS.docx
@@ -1592,7 +1592,7 @@
           <w:b/>
           <w:bCs/>
         </w:rPr>
-        <w:t xml:space="preserve">Cómo usar este procedimiento</w:t>
+        <w:t xml:space="preserve">Cómo leer este procedimiento</w:t>
       </w:r>
     </w:p>
     <w:p>
@@ -1606,7 +1606,14 @@
         <w:jc w:val="both"/>
       </w:pPr>
       <w:r>
-        <w:t xml:space="preserve">Leer los riesgos del apartado 2.1 antes de iniciar el trabajo.</w:t>
+        <w:rPr>
+          <w:b/>
+          <w:bCs/>
+        </w:rPr>
+        <w:t xml:space="preserve">Secciones:</w:t>
+      </w:r>
+      <w:r>
+        <w:t xml:space="preserve"> la inspección se divide en etapas, que son los apartados 2.4 a 2.11. El apartado 2.3 resume las etapas con sus pasos. Los subapartados (por ejemplo, 2.8.1) amplían un paso con figuras o tablas.</w:t>
       </w:r>
     </w:p>
     <w:p>
@@ -1620,7 +1627,14 @@
         <w:jc w:val="both"/>
       </w:pPr>
       <w:r>
-        <w:t xml:space="preserve">Ejecutar los pasos numerados en orden, de la etapa 2.4 a la 2.11 (resumen en el apartado 2.3).</w:t>
+        <w:rPr>
+          <w:b/>
+          <w:bCs/>
+        </w:rPr>
+        <w:t xml:space="preserve">Pasos:</w:t>
+      </w:r>
+      <w:r>
+        <w:t xml:space="preserve"> cada etapa tiene una tabla de pasos. La columna «Nº» lleva un número correlativo y único en todo el procedimiento: cuando el texto dice «paso 27», remite a ese número.</w:t>
       </w:r>
     </w:p>
     <w:p>
@@ -1634,7 +1648,14 @@
         <w:jc w:val="both"/>
       </w:pPr>
       <w:r>
-        <w:t xml:space="preserve">La columna «Referencia» indica dónde está el detalle de cada paso: protocolos EL CID (00503-00-EPG002), manual del software (00503-00-EPG003), esquema de conexiones (Anexo A) o checklist (00503-00-ZRQ001).</w:t>
+        <w:rPr>
+          <w:b/>
+          <w:bCs/>
+        </w:rPr>
+        <w:t xml:space="preserve">Columnas:</w:t>
+      </w:r>
+      <w:r>
+        <w:t xml:space="preserve"> «Actividad» indica qué hacer; «Referencia», el documento y apartado donde está el detalle (por ejemplo, «00503-00-EPG003, apartado 4.3»). Un guion (—) indica que no hay documento asociado.</w:t>
       </w:r>
     </w:p>
     <w:p>
@@ -1648,21 +1669,14 @@
         <w:jc w:val="both"/>
       </w:pPr>
       <w:r>
-        <w:t xml:space="preserve">Tener impreso el Anexo A y el checklist 00503-00-ZRQ001 antes de comenzar.</w:t>
+        <w:rPr>
+          <w:b/>
+          <w:bCs/>
+        </w:rPr>
+        <w:t xml:space="preserve">Recuadros:</w:t>
       </w:r>
-    </w:p>
-    <w:p>
-      <w:pPr>
-        <w:pStyle w:val="ListParagraph"/>
-        <w:numPr>
-          <w:ilvl w:val="0"/>
-          <w:numId w:val="2"/>
-        </w:numPr>
-        <w:spacing w:after="60" w:line="264"/>
-        <w:jc w:val="both"/>
-      </w:pPr>
       <w:r>
-        <w:t xml:space="preserve">Los recuadros con borde naranja indican precauciones de seguridad; los de borde gris, información complementaria.</w:t>
+        <w:t xml:space="preserve"> borde naranja, precaución de seguridad; borde gris, información complementaria.</w:t>
       </w:r>
     </w:p>
     <w:p>
@@ -1686,7 +1700,7 @@
         <w:jc w:val="both"/>
       </w:pPr>
       <w:r>
-        <w:t xml:space="preserve">Antes de iniciar el trabajo, todo el personal debe conocer los siguientes riesgos, que pueden ocasionar accidentes o incidentes, y las medidas de este procedimiento que los controlan. Los riesgos propios de la inspección robotizada se toman de la Tabla 4-4 del informe EPRI 3002013612 (2018), «Generator Robotic Inspection and Test Guidelines», en lo que aplica al sistema GRIS:</w:t>
+        <w:t xml:space="preserve">Antes de iniciar el trabajo, todo el personal debe conocer los siguientes riesgos, que pueden ocasionar accidentes o incidentes, y las medidas de este procedimiento que los controlan.</w:t>
       </w:r>
     </w:p>
     <w:tbl>

</xml_diff>